<commit_message>
Record core design decisions (planning doc v0.2)
- D-02..D-09 decided, D-01 partial (tone and world)
- Add tools/docs/build_planning.js to regenerate the planning doc
- Main scene scales the test image to fit the viewport
</commit_message>
<xml_diff>
--- a/docs/Planejamento_Projeto_RPG.docx
+++ b/docs/Planejamento_Projeto_RPG.docx
@@ -217,7 +217,7 @@
                 <w:sz w:val="19"/>
                 <w:szCs w:val="19"/>
               </w:rPr>
-              <w:t xml:space="preserve">0.1 — planejamento inicial</w:t>
+              <w:t xml:space="preserve">0.2 — decisões fundamentais</w:t>
             </w:r>
           </w:p>
         </w:tc>
@@ -302,6 +302,62 @@
                 <w:sz w:val="19"/>
                 <w:szCs w:val="19"/>
               </w:rPr>
+              <w:t xml:space="preserve">Última atualização</w:t>
+            </w:r>
+          </w:p>
+        </w:tc>
+        <w:tc>
+          <w:tcPr>
+            <w:tcW w:type="dxa" w:w="6265"/>
+            <w:tcBorders>
+              <w:top w:val="single" w:color="B7C3D0" w:sz="4"/>
+              <w:left w:val="single" w:color="B7C3D0" w:sz="4"/>
+              <w:bottom w:val="single" w:color="B7C3D0" w:sz="4"/>
+              <w:right w:val="single" w:color="B7C3D0" w:sz="4"/>
+            </w:tcBorders>
+            <w:tcMar>
+              <w:top w:type="dxa" w:w="60"/>
+              <w:left w:type="dxa" w:w="100"/>
+              <w:bottom w:type="dxa" w:w="60"/>
+              <w:right w:type="dxa" w:w="100"/>
+            </w:tcMar>
+            <w:vAlign w:val="center"/>
+          </w:tcPr>
+          <w:p>
+            <w:r>
+              <w:rPr>
+                <w:sz w:val="19"/>
+                <w:szCs w:val="19"/>
+              </w:rPr>
+              <w:t xml:space="preserve">24/09/2026</w:t>
+            </w:r>
+          </w:p>
+        </w:tc>
+      </w:tr>
+      <w:tr>
+        <w:tc>
+          <w:tcPr>
+            <w:tcW w:type="dxa" w:w="3373"/>
+            <w:tcBorders>
+              <w:top w:val="single" w:color="B7C3D0" w:sz="4"/>
+              <w:left w:val="single" w:color="B7C3D0" w:sz="4"/>
+              <w:bottom w:val="single" w:color="B7C3D0" w:sz="4"/>
+              <w:right w:val="single" w:color="B7C3D0" w:sz="4"/>
+            </w:tcBorders>
+            <w:tcMar>
+              <w:top w:type="dxa" w:w="60"/>
+              <w:left w:type="dxa" w:w="100"/>
+              <w:bottom w:type="dxa" w:w="60"/>
+              <w:right w:type="dxa" w:w="100"/>
+            </w:tcMar>
+            <w:vAlign w:val="center"/>
+          </w:tcPr>
+          <w:p>
+            <w:r>
+              <w:rPr>
+                <w:sz w:val="19"/>
+                <w:szCs w:val="19"/>
+              </w:rPr>
               <w:t xml:space="preserve">Pasta do projeto</w:t>
             </w:r>
           </w:p>
@@ -330,6 +386,62 @@
                 <w:szCs w:val="19"/>
               </w:rPr>
               <w:t xml:space="preserve">D:\Projeto RPG</w:t>
+            </w:r>
+          </w:p>
+        </w:tc>
+      </w:tr>
+      <w:tr>
+        <w:tc>
+          <w:tcPr>
+            <w:tcW w:type="dxa" w:w="3373"/>
+            <w:tcBorders>
+              <w:top w:val="single" w:color="B7C3D0" w:sz="4"/>
+              <w:left w:val="single" w:color="B7C3D0" w:sz="4"/>
+              <w:bottom w:val="single" w:color="B7C3D0" w:sz="4"/>
+              <w:right w:val="single" w:color="B7C3D0" w:sz="4"/>
+            </w:tcBorders>
+            <w:tcMar>
+              <w:top w:type="dxa" w:w="60"/>
+              <w:left w:type="dxa" w:w="100"/>
+              <w:bottom w:type="dxa" w:w="60"/>
+              <w:right w:type="dxa" w:w="100"/>
+            </w:tcMar>
+            <w:vAlign w:val="center"/>
+          </w:tcPr>
+          <w:p>
+            <w:r>
+              <w:rPr>
+                <w:sz w:val="19"/>
+                <w:szCs w:val="19"/>
+              </w:rPr>
+              <w:t xml:space="preserve">Repositório</w:t>
+            </w:r>
+          </w:p>
+        </w:tc>
+        <w:tc>
+          <w:tcPr>
+            <w:tcW w:type="dxa" w:w="6265"/>
+            <w:tcBorders>
+              <w:top w:val="single" w:color="B7C3D0" w:sz="4"/>
+              <w:left w:val="single" w:color="B7C3D0" w:sz="4"/>
+              <w:bottom w:val="single" w:color="B7C3D0" w:sz="4"/>
+              <w:right w:val="single" w:color="B7C3D0" w:sz="4"/>
+            </w:tcBorders>
+            <w:tcMar>
+              <w:top w:type="dxa" w:w="60"/>
+              <w:left w:type="dxa" w:w="100"/>
+              <w:bottom w:type="dxa" w:w="60"/>
+              <w:right w:type="dxa" w:w="100"/>
+            </w:tcMar>
+            <w:vAlign w:val="center"/>
+          </w:tcPr>
+          <w:p>
+            <w:r>
+              <w:rPr>
+                <w:sz w:val="19"/>
+                <w:szCs w:val="19"/>
+              </w:rPr>
+              <w:t xml:space="preserve">github.com/RudyAlmeida/projeto-rpg</w:t>
             </w:r>
           </w:p>
         </w:tc>
@@ -1074,17 +1186,47 @@
         <w:rPr>
           <w:b/>
           <w:bCs/>
+        </w:rPr>
+        <w:t xml:space="preserve">Mundo:</w:t>
+      </w:r>
+      <w:r>
+        <w:t xml:space="preserve"> fantasia clássica mesclada com steampunk — reinos, magia e ruínas antigas convivendo com engrenagens, vapor, dirigíveis e máquinas.</w:t>
+      </w:r>
+    </w:p>
+    <w:p>
+      <w:pPr>
+        <w:spacing w:after="120"/>
+      </w:pPr>
+      <w:r>
+        <w:rPr>
+          <w:b/>
+          <w:bCs/>
+        </w:rPr>
+        <w:t xml:space="preserve">Tom:</w:t>
+      </w:r>
+      <w:r>
+        <w:t xml:space="preserve"> mistura equilibrada — começa leve e aventureiro e ganha peso dramático a cada ato.</w:t>
+      </w:r>
+    </w:p>
+    <w:p>
+      <w:pPr>
+        <w:spacing w:after="120"/>
+      </w:pPr>
+      <w:r>
+        <w:rPr>
+          <w:b/>
+          <w:bCs/>
           <w:i/>
           <w:iCs/>
         </w:rPr>
-        <w:t xml:space="preserve">Premissa da história:</w:t>
+        <w:t xml:space="preserve">Premissa e título:</w:t>
       </w:r>
       <w:r>
         <w:rPr>
           <w:i/>
           <w:iCs/>
         </w:rPr>
-        <w:t xml:space="preserve"> a definir na Fase 0 (ver 7. Narrativa).</w:t>
+        <w:t xml:space="preserve"> a definir (ver 7. Narrativa).</w:t>
       </w:r>
     </w:p>
     <w:p>
@@ -1690,7 +1832,7 @@
                 <w:sz w:val="19"/>
                 <w:szCs w:val="19"/>
               </w:rPr>
-              <w:t xml:space="preserve">Perspectiva</w:t>
+              <w:t xml:space="preserve">Estilo visual</w:t>
             </w:r>
           </w:p>
         </w:tc>
@@ -1717,7 +1859,7 @@
                 <w:sz w:val="19"/>
                 <w:szCs w:val="19"/>
               </w:rPr>
-              <w:t xml:space="preserve">2D top-down / 3/4 (estilo SNES/HD-2D)</w:t>
+              <w:t xml:space="preserve">Pixel art 16-bit (estilo SNES)</w:t>
             </w:r>
           </w:p>
         </w:tc>
@@ -1744,7 +1886,7 @@
                 <w:sz w:val="19"/>
                 <w:szCs w:val="19"/>
               </w:rPr>
-              <w:t xml:space="preserve">A decidir</w:t>
+              <w:t xml:space="preserve">Decidido (D-02)</w:t>
             </w:r>
           </w:p>
         </w:tc>
@@ -1773,7 +1915,7 @@
                 <w:sz w:val="19"/>
                 <w:szCs w:val="19"/>
               </w:rPr>
-              <w:t xml:space="preserve">Plataforma</w:t>
+              <w:t xml:space="preserve">Perspectiva</w:t>
             </w:r>
           </w:p>
         </w:tc>
@@ -1800,7 +1942,7 @@
                 <w:sz w:val="19"/>
                 <w:szCs w:val="19"/>
               </w:rPr>
-              <w:t xml:space="preserve">PC (Windows) — outras depois</w:t>
+              <w:t xml:space="preserve">2D top-down 3/4</w:t>
             </w:r>
           </w:p>
         </w:tc>
@@ -1827,7 +1969,7 @@
                 <w:sz w:val="19"/>
                 <w:szCs w:val="19"/>
               </w:rPr>
-              <w:t xml:space="preserve">Proposta</w:t>
+              <w:t xml:space="preserve">Decidido (D-02)</w:t>
             </w:r>
           </w:p>
         </w:tc>
@@ -1856,6 +1998,255 @@
                 <w:sz w:val="19"/>
                 <w:szCs w:val="19"/>
               </w:rPr>
+              <w:t xml:space="preserve">Combate</w:t>
+            </w:r>
+          </w:p>
+        </w:tc>
+        <w:tc>
+          <w:tcPr>
+            <w:tcW w:type="dxa" w:w="5301"/>
+            <w:tcBorders>
+              <w:top w:val="single" w:color="B7C3D0" w:sz="4"/>
+              <w:left w:val="single" w:color="B7C3D0" w:sz="4"/>
+              <w:bottom w:val="single" w:color="B7C3D0" w:sz="4"/>
+              <w:right w:val="single" w:color="B7C3D0" w:sz="4"/>
+            </w:tcBorders>
+            <w:tcMar>
+              <w:top w:type="dxa" w:w="60"/>
+              <w:left w:type="dxa" w:w="100"/>
+              <w:bottom w:type="dxa" w:w="60"/>
+              <w:right w:type="dxa" w:w="100"/>
+            </w:tcMar>
+            <w:vAlign w:val="center"/>
+          </w:tcPr>
+          <w:p>
+            <w:r>
+              <w:rPr>
+                <w:sz w:val="19"/>
+                <w:szCs w:val="19"/>
+              </w:rPr>
+              <w:t xml:space="preserve">Híbrido: turnos CTB + comandos com timing</w:t>
+            </w:r>
+          </w:p>
+        </w:tc>
+        <w:tc>
+          <w:tcPr>
+            <w:tcW w:type="dxa" w:w="1927"/>
+            <w:tcBorders>
+              <w:top w:val="single" w:color="B7C3D0" w:sz="4"/>
+              <w:left w:val="single" w:color="B7C3D0" w:sz="4"/>
+              <w:bottom w:val="single" w:color="B7C3D0" w:sz="4"/>
+              <w:right w:val="single" w:color="B7C3D0" w:sz="4"/>
+            </w:tcBorders>
+            <w:tcMar>
+              <w:top w:type="dxa" w:w="60"/>
+              <w:left w:type="dxa" w:w="100"/>
+              <w:bottom w:type="dxa" w:w="60"/>
+              <w:right w:type="dxa" w:w="100"/>
+            </w:tcMar>
+            <w:vAlign w:val="center"/>
+          </w:tcPr>
+          <w:p>
+            <w:r>
+              <w:rPr>
+                <w:sz w:val="19"/>
+                <w:szCs w:val="19"/>
+              </w:rPr>
+              <w:t xml:space="preserve">Decidido (D-03)</w:t>
+            </w:r>
+          </w:p>
+        </w:tc>
+      </w:tr>
+      <w:tr>
+        <w:tc>
+          <w:tcPr>
+            <w:tcW w:type="dxa" w:w="2410"/>
+            <w:tcBorders>
+              <w:top w:val="single" w:color="B7C3D0" w:sz="4"/>
+              <w:left w:val="single" w:color="B7C3D0" w:sz="4"/>
+              <w:bottom w:val="single" w:color="B7C3D0" w:sz="4"/>
+              <w:right w:val="single" w:color="B7C3D0" w:sz="4"/>
+            </w:tcBorders>
+            <w:tcMar>
+              <w:top w:type="dxa" w:w="60"/>
+              <w:left w:type="dxa" w:w="100"/>
+              <w:bottom w:type="dxa" w:w="60"/>
+              <w:right w:type="dxa" w:w="100"/>
+            </w:tcMar>
+            <w:vAlign w:val="center"/>
+          </w:tcPr>
+          <w:p>
+            <w:r>
+              <w:rPr>
+                <w:sz w:val="19"/>
+                <w:szCs w:val="19"/>
+              </w:rPr>
+              <w:t xml:space="preserve">Batalhas</w:t>
+            </w:r>
+          </w:p>
+        </w:tc>
+        <w:tc>
+          <w:tcPr>
+            <w:tcW w:type="dxa" w:w="5301"/>
+            <w:tcBorders>
+              <w:top w:val="single" w:color="B7C3D0" w:sz="4"/>
+              <w:left w:val="single" w:color="B7C3D0" w:sz="4"/>
+              <w:bottom w:val="single" w:color="B7C3D0" w:sz="4"/>
+              <w:right w:val="single" w:color="B7C3D0" w:sz="4"/>
+            </w:tcBorders>
+            <w:tcMar>
+              <w:top w:type="dxa" w:w="60"/>
+              <w:left w:type="dxa" w:w="100"/>
+              <w:bottom w:type="dxa" w:w="60"/>
+              <w:right w:type="dxa" w:w="100"/>
+            </w:tcMar>
+            <w:vAlign w:val="center"/>
+          </w:tcPr>
+          <w:p>
+            <w:r>
+              <w:rPr>
+                <w:sz w:val="19"/>
+                <w:szCs w:val="19"/>
+              </w:rPr>
+              <w:t xml:space="preserve">No próprio mapa, inimigos visíveis</w:t>
+            </w:r>
+          </w:p>
+        </w:tc>
+        <w:tc>
+          <w:tcPr>
+            <w:tcW w:type="dxa" w:w="1927"/>
+            <w:tcBorders>
+              <w:top w:val="single" w:color="B7C3D0" w:sz="4"/>
+              <w:left w:val="single" w:color="B7C3D0" w:sz="4"/>
+              <w:bottom w:val="single" w:color="B7C3D0" w:sz="4"/>
+              <w:right w:val="single" w:color="B7C3D0" w:sz="4"/>
+            </w:tcBorders>
+            <w:tcMar>
+              <w:top w:type="dxa" w:w="60"/>
+              <w:left w:type="dxa" w:w="100"/>
+              <w:bottom w:type="dxa" w:w="60"/>
+              <w:right w:type="dxa" w:w="100"/>
+            </w:tcMar>
+            <w:vAlign w:val="center"/>
+          </w:tcPr>
+          <w:p>
+            <w:r>
+              <w:rPr>
+                <w:sz w:val="19"/>
+                <w:szCs w:val="19"/>
+              </w:rPr>
+              <w:t xml:space="preserve">Decidido (D-04)</w:t>
+            </w:r>
+          </w:p>
+        </w:tc>
+      </w:tr>
+      <w:tr>
+        <w:tc>
+          <w:tcPr>
+            <w:tcW w:type="dxa" w:w="2410"/>
+            <w:tcBorders>
+              <w:top w:val="single" w:color="B7C3D0" w:sz="4"/>
+              <w:left w:val="single" w:color="B7C3D0" w:sz="4"/>
+              <w:bottom w:val="single" w:color="B7C3D0" w:sz="4"/>
+              <w:right w:val="single" w:color="B7C3D0" w:sz="4"/>
+            </w:tcBorders>
+            <w:tcMar>
+              <w:top w:type="dxa" w:w="60"/>
+              <w:left w:type="dxa" w:w="100"/>
+              <w:bottom w:type="dxa" w:w="60"/>
+              <w:right w:type="dxa" w:w="100"/>
+            </w:tcMar>
+            <w:vAlign w:val="center"/>
+          </w:tcPr>
+          <w:p>
+            <w:r>
+              <w:rPr>
+                <w:sz w:val="19"/>
+                <w:szCs w:val="19"/>
+              </w:rPr>
+              <w:t xml:space="preserve">Plataforma</w:t>
+            </w:r>
+          </w:p>
+        </w:tc>
+        <w:tc>
+          <w:tcPr>
+            <w:tcW w:type="dxa" w:w="5301"/>
+            <w:tcBorders>
+              <w:top w:val="single" w:color="B7C3D0" w:sz="4"/>
+              <w:left w:val="single" w:color="B7C3D0" w:sz="4"/>
+              <w:bottom w:val="single" w:color="B7C3D0" w:sz="4"/>
+              <w:right w:val="single" w:color="B7C3D0" w:sz="4"/>
+            </w:tcBorders>
+            <w:tcMar>
+              <w:top w:type="dxa" w:w="60"/>
+              <w:left w:type="dxa" w:w="100"/>
+              <w:bottom w:type="dxa" w:w="60"/>
+              <w:right w:type="dxa" w:w="100"/>
+            </w:tcMar>
+            <w:vAlign w:val="center"/>
+          </w:tcPr>
+          <w:p>
+            <w:r>
+              <w:rPr>
+                <w:sz w:val="19"/>
+                <w:szCs w:val="19"/>
+              </w:rPr>
+              <w:t xml:space="preserve">PC (Windows) — outras depois</w:t>
+            </w:r>
+          </w:p>
+        </w:tc>
+        <w:tc>
+          <w:tcPr>
+            <w:tcW w:type="dxa" w:w="1927"/>
+            <w:tcBorders>
+              <w:top w:val="single" w:color="B7C3D0" w:sz="4"/>
+              <w:left w:val="single" w:color="B7C3D0" w:sz="4"/>
+              <w:bottom w:val="single" w:color="B7C3D0" w:sz="4"/>
+              <w:right w:val="single" w:color="B7C3D0" w:sz="4"/>
+            </w:tcBorders>
+            <w:tcMar>
+              <w:top w:type="dxa" w:w="60"/>
+              <w:left w:type="dxa" w:w="100"/>
+              <w:bottom w:type="dxa" w:w="60"/>
+              <w:right w:type="dxa" w:w="100"/>
+            </w:tcMar>
+            <w:vAlign w:val="center"/>
+          </w:tcPr>
+          <w:p>
+            <w:r>
+              <w:rPr>
+                <w:sz w:val="19"/>
+                <w:szCs w:val="19"/>
+              </w:rPr>
+              <w:t xml:space="preserve">Proposta</w:t>
+            </w:r>
+          </w:p>
+        </w:tc>
+      </w:tr>
+      <w:tr>
+        <w:tc>
+          <w:tcPr>
+            <w:tcW w:type="dxa" w:w="2410"/>
+            <w:tcBorders>
+              <w:top w:val="single" w:color="B7C3D0" w:sz="4"/>
+              <w:left w:val="single" w:color="B7C3D0" w:sz="4"/>
+              <w:bottom w:val="single" w:color="B7C3D0" w:sz="4"/>
+              <w:right w:val="single" w:color="B7C3D0" w:sz="4"/>
+            </w:tcBorders>
+            <w:tcMar>
+              <w:top w:type="dxa" w:w="60"/>
+              <w:left w:type="dxa" w:w="100"/>
+              <w:bottom w:type="dxa" w:w="60"/>
+              <w:right w:type="dxa" w:w="100"/>
+            </w:tcMar>
+            <w:vAlign w:val="center"/>
+          </w:tcPr>
+          <w:p>
+            <w:r>
+              <w:rPr>
+                <w:sz w:val="19"/>
+                <w:szCs w:val="19"/>
+              </w:rPr>
               <w:t xml:space="preserve">Resolução base</w:t>
             </w:r>
           </w:p>
@@ -1883,7 +2274,7 @@
                 <w:sz w:val="19"/>
                 <w:szCs w:val="19"/>
               </w:rPr>
-              <w:t xml:space="preserve">640×360 escalada (pixel art) ou 1920×1080 (HD)</w:t>
+              <w:t xml:space="preserve">640×360, escala inteira (1280×720, 1920×1080…)</w:t>
             </w:r>
           </w:p>
         </w:tc>
@@ -1910,7 +2301,7 @@
                 <w:sz w:val="19"/>
                 <w:szCs w:val="19"/>
               </w:rPr>
-              <w:t xml:space="preserve">A decidir</w:t>
+              <w:t xml:space="preserve">Decidido (D-07)</w:t>
             </w:r>
           </w:p>
         </w:tc>
@@ -2484,7 +2875,7 @@
                 <w:sz w:val="19"/>
                 <w:szCs w:val="19"/>
               </w:rPr>
-              <w:t xml:space="preserve">Codex MCP (Arte)</w:t>
+              <w:t xml:space="preserve">Codex (Arte)</w:t>
             </w:r>
           </w:p>
         </w:tc>
@@ -2511,7 +2902,7 @@
                 <w:sz w:val="19"/>
                 <w:szCs w:val="19"/>
               </w:rPr>
-              <w:t xml:space="preserve">Geração de imagens: conceitos, sprites, tilesets, retratos, ícones, UI, fundos de batalha, efeitos. Orquestrado pelo Claude a partir do guia de estilo.</w:t>
+              <w:t xml:space="preserve">Geração de imagens: conceitos, sprites, tilesets, retratos, ícones, UI, fundos, efeitos. Chamado pelo Claude via Codex CLI (tools/gen_image.ps1) a partir do guia de estilo.</w:t>
             </w:r>
           </w:p>
         </w:tc>
@@ -2540,7 +2931,7 @@
                 <w:sz w:val="19"/>
                 <w:szCs w:val="19"/>
               </w:rPr>
-              <w:t xml:space="preserve">A definir (Áudio)</w:t>
+              <w:t xml:space="preserve">IA de áudio (a escolher)</w:t>
             </w:r>
           </w:p>
         </w:tc>
@@ -2567,7 +2958,7 @@
                 <w:sz w:val="19"/>
                 <w:szCs w:val="19"/>
               </w:rPr>
-              <w:t xml:space="preserve">Música e efeitos sonoros — ver seção 9. Codex não gera áudio.</w:t>
+              <w:t xml:space="preserve">Música e efeitos sonoros gerados por IA — ver seção 9.</w:t>
             </w:r>
           </w:p>
         </w:tc>
@@ -3057,7 +3448,7 @@
                 <w:sz w:val="19"/>
                 <w:szCs w:val="19"/>
               </w:rPr>
-              <w:t xml:space="preserve">Codex MCP</w:t>
+              <w:t xml:space="preserve">Codex CLI 0.156.1</w:t>
             </w:r>
           </w:p>
         </w:tc>
@@ -3084,7 +3475,7 @@
                 <w:sz w:val="19"/>
                 <w:szCs w:val="19"/>
               </w:rPr>
-              <w:t xml:space="preserve">Geração de imagens</w:t>
+              <w:t xml:space="preserve">Geração de imagens (gpt-5.5 + image_gen embutido)</w:t>
             </w:r>
           </w:p>
         </w:tc>
@@ -3111,7 +3502,7 @@
                 <w:sz w:val="19"/>
                 <w:szCs w:val="19"/>
               </w:rPr>
-              <w:t xml:space="preserve">Servidor MCP "codex" (conectado)</w:t>
+              <w:t xml:space="preserve">tools\codex-cli, via tools\gen_image.ps1 (sem MCP)</w:t>
             </w:r>
           </w:p>
         </w:tc>
@@ -3140,7 +3531,7 @@
                 <w:sz w:val="19"/>
                 <w:szCs w:val="19"/>
               </w:rPr>
-              <w:t xml:space="preserve">Git</w:t>
+              <w:t xml:space="preserve">Git + GitHub</w:t>
             </w:r>
           </w:p>
         </w:tc>
@@ -3167,7 +3558,7 @@
                 <w:sz w:val="19"/>
                 <w:szCs w:val="19"/>
               </w:rPr>
-              <w:t xml:space="preserve">Controle de versão (recomendado)</w:t>
+              <w:t xml:space="preserve">Controle de versão</w:t>
             </w:r>
           </w:p>
         </w:tc>
@@ -3194,7 +3585,7 @@
                 <w:sz w:val="19"/>
                 <w:szCs w:val="19"/>
               </w:rPr>
-              <w:t xml:space="preserve">Projeto ainda não é repositório — criar na Fase 0</w:t>
+              <w:t xml:space="preserve">github.com/RudyAlmeida/projeto-rpg (branch main)</w:t>
             </w:r>
           </w:p>
         </w:tc>
@@ -3396,7 +3787,7 @@
         <w:pStyle w:val="Heading3"/>
       </w:pPr>
       <w:r>
-        <w:t xml:space="preserve">Modelo de turnos</w:t>
+        <w:t xml:space="preserve">Modelo de turnos (D-03: híbrido)</w:t>
       </w:r>
     </w:p>
     <w:p>
@@ -3404,7 +3795,7 @@
         <w:spacing w:after="120"/>
       </w:pPr>
       <w:r>
-        <w:t xml:space="preserve">Proposta: linha do tempo CTB (estilo FFX), com ordem de turnos visível e ações que alteram a ordem.</w:t>
+        <w:t xml:space="preserve">Linha do tempo CTB (estilo FFX) com ordem de turnos visível e ações que alteram a ordem, somada a comandos com timing: apertar o botão no momento certo durante ataques e técnicas aumenta o efeito, e durante ataques inimigos reduz o dano (estilo Sea of Stars / Super Mario RPG).</w:t>
       </w:r>
     </w:p>
     <w:p>
@@ -3417,14 +3808,20 @@
         <w:spacing w:after="60"/>
       </w:pPr>
       <w:r>
-        <w:t xml:space="preserve">Alternativa: ATB (FFVII / Chrono Trigger) — barras que enchem em tempo real. </w:t>
+        <w:t xml:space="preserve">O jogo pausa na escolha do comando; o timing só vale durante a execução da ação.</w:t>
       </w:r>
+    </w:p>
+    <w:p>
+      <w:pPr>
+        <w:pStyle w:val="ListParagraph"/>
+        <w:numPr>
+          <w:ilvl w:val="0"/>
+          <w:numId w:val="2"/>
+        </w:numPr>
+        <w:spacing w:after="60"/>
+      </w:pPr>
       <w:r>
-        <w:rPr>
-          <w:b/>
-          <w:bCs/>
-        </w:rPr>
-        <w:t xml:space="preserve">Decisão pendente (D-03).</w:t>
+        <w:t xml:space="preserve">Opção de acessibilidade: timing automático.</w:t>
       </w:r>
     </w:p>
     <w:p>
@@ -3612,14 +4009,27 @@
         <w:spacing w:after="60"/>
       </w:pPr>
       <w:r>
-        <w:t xml:space="preserve">Batalha no próprio cenário ou arena dedicada. </w:t>
-      </w:r>
-      <w:r>
         <w:rPr>
           <w:b/>
           <w:bCs/>
         </w:rPr>
-        <w:t xml:space="preserve">Decisão pendente (D-04).</w:t>
+        <w:t xml:space="preserve">D-04:</w:t>
+      </w:r>
+      <w:r>
+        <w:t xml:space="preserve"> batalha no próprio cenário, sem troca de tela; o grupo e os inimigos se posicionam no local do encontro.</w:t>
+      </w:r>
+    </w:p>
+    <w:p>
+      <w:pPr>
+        <w:pStyle w:val="ListParagraph"/>
+        <w:numPr>
+          <w:ilvl w:val="0"/>
+          <w:numId w:val="2"/>
+        </w:numPr>
+        <w:spacing w:after="60"/>
+      </w:pPr>
+      <w:r>
+        <w:t xml:space="preserve">Mapas precisam ter áreas de combate com espaço suficiente para as posições de batalha.</w:t>
       </w:r>
     </w:p>
     <w:p>
@@ -3653,24 +4063,14 @@
         <w:spacing w:after="60"/>
       </w:pPr>
       <w:r>
-        <w:t xml:space="preserve">Níveis por experiência + sistema de progressão (tabuleiro estilo Sphere Grid </w:t>
-      </w:r>
-      <w:r>
         <w:rPr>
           <w:b/>
           <w:bCs/>
         </w:rPr>
-        <w:t xml:space="preserve">ou</w:t>
+        <w:t xml:space="preserve">D-05 (híbrido):</w:t>
       </w:r>
       <w:r>
-        <w:t xml:space="preserve"> gemas equipáveis estilo Materia). </w:t>
-      </w:r>
-      <w:r>
-        <w:rPr>
-          <w:b/>
-          <w:bCs/>
-        </w:rPr>
-        <w:t xml:space="preserve">Decisão pendente (D-05).</w:t>
+        <w:t xml:space="preserve"> níveis por experiência + árvore de habilidades própria de cada personagem (identidade) + gemas equipáveis que sobem de nível com o uso (personalização).</w:t>
       </w:r>
     </w:p>
     <w:p>
@@ -3683,7 +4083,7 @@
         <w:spacing w:after="60"/>
       </w:pPr>
       <w:r>
-        <w:t xml:space="preserve">Equipamento: arma, armadura, acessório (com slots para gemas se adotarmos Materia).</w:t>
+        <w:t xml:space="preserve">Equipamento: arma, armadura, acessório, com slots para gemas.</w:t>
       </w:r>
     </w:p>
     <w:p>
@@ -3730,7 +4130,7 @@
         <w:spacing w:after="60"/>
       </w:pPr>
       <w:r>
-        <w:t xml:space="preserve">Cidades, dungeons, mapa-múndi com veículos (barco, aeronave).</w:t>
+        <w:t xml:space="preserve">Cidades, dungeons, mapa-múndi com veículos (barco a vapor, dirigível).</w:t>
       </w:r>
     </w:p>
     <w:p>
@@ -3782,14 +4182,14 @@
         <w:spacing w:after="60"/>
       </w:pPr>
       <w:r>
-        <w:t xml:space="preserve">Viagem no tempo entre eras (opcional — Chrono Trigger). </w:t>
-      </w:r>
-      <w:r>
         <w:rPr>
           <w:b/>
           <w:bCs/>
         </w:rPr>
-        <w:t xml:space="preserve">Decisão pendente (D-06).</w:t>
+        <w:t xml:space="preserve">D-06:</w:t>
+      </w:r>
+      <w:r>
+        <w:t xml:space="preserve"> sem viagem no tempo — um único mundo com regiões bem distintas.</w:t>
       </w:r>
     </w:p>
     <w:p>
@@ -5233,7 +5633,7 @@
         <w:pageBreakBefore/>
       </w:pPr>
       <w:r>
-        <w:t xml:space="preserve">6. Direção de arte e pipeline de imagens (Codex MCP)</w:t>
+        <w:t xml:space="preserve">6. Direção de arte e pipeline de imagens (Codex)</w:t>
       </w:r>
     </w:p>
     <w:p>
@@ -5241,7 +5641,7 @@
         <w:pStyle w:val="Heading2"/>
       </w:pPr>
       <w:r>
-        <w:t xml:space="preserve">6.1 Estilo visual</w:t>
+        <w:t xml:space="preserve">6.1 Estilo visual — D-02: pixel art 16-bit</w:t>
       </w:r>
     </w:p>
     <w:p>
@@ -5249,14 +5649,7 @@
         <w:spacing w:after="120"/>
       </w:pPr>
       <w:r>
-        <w:rPr>
-          <w:b/>
-          <w:bCs/>
-        </w:rPr>
-        <w:t xml:space="preserve">Decisão pendente (D-02).</w:t>
-      </w:r>
-      <w:r>
-        <w:t xml:space="preserve"> Opções:</w:t>
+        <w:t xml:space="preserve">Estilo SNES (Chrono Trigger, FF6, Sea of Stars), com temática de fantasia clássica + steampunk: pedra, madeira e magia ao lado de latão, cobre, engrenagens e vapor. Validado com a imagem de teste codex_test_01.png.</w:t>
       </w:r>
     </w:p>
     <w:tbl>
@@ -5272,10 +5665,8 @@
         </w:tblBorders>
       </w:tblPr>
       <w:tblGrid>
-        <w:gridCol w:w="1735"/>
-        <w:gridCol w:w="2602"/>
-        <w:gridCol w:w="2410"/>
-        <w:gridCol w:w="2891"/>
+        <w:gridCol w:w="3373"/>
+        <w:gridCol w:w="6265"/>
       </w:tblGrid>
       <w:tr>
         <w:trPr>
@@ -5283,7 +5674,7 @@
         </w:trPr>
         <w:tc>
           <w:tcPr>
-            <w:tcW w:type="dxa" w:w="1735"/>
+            <w:tcW w:type="dxa" w:w="3373"/>
             <w:tcBorders>
               <w:top w:val="single" w:color="B7C3D0" w:sz="4"/>
               <w:left w:val="single" w:color="B7C3D0" w:sz="4"/>
@@ -5308,13 +5699,13 @@
                 <w:sz w:val="19"/>
                 <w:szCs w:val="19"/>
               </w:rPr>
-              <w:t xml:space="preserve">Opção</w:t>
-            </w:r>
-          </w:p>
-        </w:tc>
-        <w:tc>
-          <w:tcPr>
-            <w:tcW w:type="dxa" w:w="2602"/>
+              <w:t xml:space="preserve">Especificação</w:t>
+            </w:r>
+          </w:p>
+        </w:tc>
+        <w:tc>
+          <w:tcPr>
+            <w:tcW w:type="dxa" w:w="6265"/>
             <w:tcBorders>
               <w:top w:val="single" w:color="B7C3D0" w:sz="4"/>
               <w:left w:val="single" w:color="B7C3D0" w:sz="4"/>
@@ -5339,69 +5730,7 @@
                 <w:sz w:val="19"/>
                 <w:szCs w:val="19"/>
               </w:rPr>
-              <w:t xml:space="preserve">Descrição</w:t>
-            </w:r>
-          </w:p>
-        </w:tc>
-        <w:tc>
-          <w:tcPr>
-            <w:tcW w:type="dxa" w:w="2410"/>
-            <w:tcBorders>
-              <w:top w:val="single" w:color="B7C3D0" w:sz="4"/>
-              <w:left w:val="single" w:color="B7C3D0" w:sz="4"/>
-              <w:bottom w:val="single" w:color="B7C3D0" w:sz="4"/>
-              <w:right w:val="single" w:color="B7C3D0" w:sz="4"/>
-            </w:tcBorders>
-            <w:shd w:fill="1F3A5F" w:color="auto" w:val="clear"/>
-            <w:tcMar>
-              <w:top w:type="dxa" w:w="60"/>
-              <w:left w:type="dxa" w:w="100"/>
-              <w:bottom w:type="dxa" w:w="60"/>
-              <w:right w:type="dxa" w:w="100"/>
-            </w:tcMar>
-            <w:vAlign w:val="center"/>
-          </w:tcPr>
-          <w:p>
-            <w:r>
-              <w:rPr>
-                <w:b/>
-                <w:bCs/>
-                <w:color w:val="FFFFFF"/>
-                <w:sz w:val="19"/>
-                <w:szCs w:val="19"/>
-              </w:rPr>
-              <w:t xml:space="preserve">Prós</w:t>
-            </w:r>
-          </w:p>
-        </w:tc>
-        <w:tc>
-          <w:tcPr>
-            <w:tcW w:type="dxa" w:w="2891"/>
-            <w:tcBorders>
-              <w:top w:val="single" w:color="B7C3D0" w:sz="4"/>
-              <w:left w:val="single" w:color="B7C3D0" w:sz="4"/>
-              <w:bottom w:val="single" w:color="B7C3D0" w:sz="4"/>
-              <w:right w:val="single" w:color="B7C3D0" w:sz="4"/>
-            </w:tcBorders>
-            <w:shd w:fill="1F3A5F" w:color="auto" w:val="clear"/>
-            <w:tcMar>
-              <w:top w:type="dxa" w:w="60"/>
-              <w:left w:type="dxa" w:w="100"/>
-              <w:bottom w:type="dxa" w:w="60"/>
-              <w:right w:type="dxa" w:w="100"/>
-            </w:tcMar>
-            <w:vAlign w:val="center"/>
-          </w:tcPr>
-          <w:p>
-            <w:r>
-              <w:rPr>
-                <w:b/>
-                <w:bCs/>
-                <w:color w:val="FFFFFF"/>
-                <w:sz w:val="19"/>
-                <w:szCs w:val="19"/>
-              </w:rPr>
-              <w:t xml:space="preserve">Contras</w:t>
+              <w:t xml:space="preserve">Valor</w:t>
             </w:r>
           </w:p>
         </w:tc>
@@ -5409,109 +5738,55 @@
       <w:tr>
         <w:tc>
           <w:tcPr>
-            <w:tcW w:type="dxa" w:w="1735"/>
-            <w:tcBorders>
-              <w:top w:val="single" w:color="B7C3D0" w:sz="4"/>
-              <w:left w:val="single" w:color="B7C3D0" w:sz="4"/>
-              <w:bottom w:val="single" w:color="B7C3D0" w:sz="4"/>
-              <w:right w:val="single" w:color="B7C3D0" w:sz="4"/>
-            </w:tcBorders>
-            <w:tcMar>
-              <w:top w:type="dxa" w:w="60"/>
-              <w:left w:type="dxa" w:w="100"/>
-              <w:bottom w:type="dxa" w:w="60"/>
-              <w:right w:type="dxa" w:w="100"/>
-            </w:tcMar>
-            <w:vAlign w:val="center"/>
-          </w:tcPr>
-          <w:p>
-            <w:r>
-              <w:rPr>
-                <w:sz w:val="19"/>
-                <w:szCs w:val="19"/>
-              </w:rPr>
-              <w:t xml:space="preserve">A. Pixel art 16-bit</w:t>
-            </w:r>
-          </w:p>
-        </w:tc>
-        <w:tc>
-          <w:tcPr>
-            <w:tcW w:type="dxa" w:w="2602"/>
-            <w:tcBorders>
-              <w:top w:val="single" w:color="B7C3D0" w:sz="4"/>
-              <w:left w:val="single" w:color="B7C3D0" w:sz="4"/>
-              <w:bottom w:val="single" w:color="B7C3D0" w:sz="4"/>
-              <w:right w:val="single" w:color="B7C3D0" w:sz="4"/>
-            </w:tcBorders>
-            <w:tcMar>
-              <w:top w:type="dxa" w:w="60"/>
-              <w:left w:type="dxa" w:w="100"/>
-              <w:bottom w:type="dxa" w:w="60"/>
-              <w:right w:type="dxa" w:w="100"/>
-            </w:tcMar>
-            <w:vAlign w:val="center"/>
-          </w:tcPr>
-          <w:p>
-            <w:r>
-              <w:rPr>
-                <w:sz w:val="19"/>
-                <w:szCs w:val="19"/>
-              </w:rPr>
-              <w:t xml:space="preserve">Estilo SNES (Chrono Trigger, FF6)</w:t>
-            </w:r>
-          </w:p>
-        </w:tc>
-        <w:tc>
-          <w:tcPr>
-            <w:tcW w:type="dxa" w:w="2410"/>
-            <w:tcBorders>
-              <w:top w:val="single" w:color="B7C3D0" w:sz="4"/>
-              <w:left w:val="single" w:color="B7C3D0" w:sz="4"/>
-              <w:bottom w:val="single" w:color="B7C3D0" w:sz="4"/>
-              <w:right w:val="single" w:color="B7C3D0" w:sz="4"/>
-            </w:tcBorders>
-            <w:tcMar>
-              <w:top w:type="dxa" w:w="60"/>
-              <w:left w:type="dxa" w:w="100"/>
-              <w:bottom w:type="dxa" w:w="60"/>
-              <w:right w:type="dxa" w:w="100"/>
-            </w:tcMar>
-            <w:vAlign w:val="center"/>
-          </w:tcPr>
-          <w:p>
-            <w:r>
-              <w:rPr>
-                <w:sz w:val="19"/>
-                <w:szCs w:val="19"/>
-              </w:rPr>
-              <w:t xml:space="preserve">Nostálgico, coerente, leve</w:t>
-            </w:r>
-          </w:p>
-        </w:tc>
-        <w:tc>
-          <w:tcPr>
-            <w:tcW w:type="dxa" w:w="2891"/>
-            <w:tcBorders>
-              <w:top w:val="single" w:color="B7C3D0" w:sz="4"/>
-              <w:left w:val="single" w:color="B7C3D0" w:sz="4"/>
-              <w:bottom w:val="single" w:color="B7C3D0" w:sz="4"/>
-              <w:right w:val="single" w:color="B7C3D0" w:sz="4"/>
-            </w:tcBorders>
-            <w:tcMar>
-              <w:top w:type="dxa" w:w="60"/>
-              <w:left w:type="dxa" w:w="100"/>
-              <w:bottom w:type="dxa" w:w="60"/>
-              <w:right w:type="dxa" w:w="100"/>
-            </w:tcMar>
-            <w:vAlign w:val="center"/>
-          </w:tcPr>
-          <w:p>
-            <w:r>
-              <w:rPr>
-                <w:sz w:val="19"/>
-                <w:szCs w:val="19"/>
-              </w:rPr>
-              <w:t xml:space="preserve">Consistência entre sprites gerados por IA é mais difícil em animação</w:t>
+            <w:tcW w:type="dxa" w:w="3373"/>
+            <w:tcBorders>
+              <w:top w:val="single" w:color="B7C3D0" w:sz="4"/>
+              <w:left w:val="single" w:color="B7C3D0" w:sz="4"/>
+              <w:bottom w:val="single" w:color="B7C3D0" w:sz="4"/>
+              <w:right w:val="single" w:color="B7C3D0" w:sz="4"/>
+            </w:tcBorders>
+            <w:tcMar>
+              <w:top w:type="dxa" w:w="60"/>
+              <w:left w:type="dxa" w:w="100"/>
+              <w:bottom w:type="dxa" w:w="60"/>
+              <w:right w:type="dxa" w:w="100"/>
+            </w:tcMar>
+            <w:vAlign w:val="center"/>
+          </w:tcPr>
+          <w:p>
+            <w:r>
+              <w:rPr>
+                <w:sz w:val="19"/>
+                <w:szCs w:val="19"/>
+              </w:rPr>
+              <w:t xml:space="preserve">Resolução base</w:t>
+            </w:r>
+          </w:p>
+        </w:tc>
+        <w:tc>
+          <w:tcPr>
+            <w:tcW w:type="dxa" w:w="6265"/>
+            <w:tcBorders>
+              <w:top w:val="single" w:color="B7C3D0" w:sz="4"/>
+              <w:left w:val="single" w:color="B7C3D0" w:sz="4"/>
+              <w:bottom w:val="single" w:color="B7C3D0" w:sz="4"/>
+              <w:right w:val="single" w:color="B7C3D0" w:sz="4"/>
+            </w:tcBorders>
+            <w:tcMar>
+              <w:top w:type="dxa" w:w="60"/>
+              <w:left w:type="dxa" w:w="100"/>
+              <w:bottom w:type="dxa" w:w="60"/>
+              <w:right w:type="dxa" w:w="100"/>
+            </w:tcMar>
+            <w:vAlign w:val="center"/>
+          </w:tcPr>
+          <w:p>
+            <w:r>
+              <w:rPr>
+                <w:sz w:val="19"/>
+                <w:szCs w:val="19"/>
+              </w:rPr>
+              <w:t xml:space="preserve">640×360, escala inteira, filtro Nearest</w:t>
             </w:r>
           </w:p>
         </w:tc>
@@ -5519,109 +5794,55 @@
       <w:tr>
         <w:tc>
           <w:tcPr>
-            <w:tcW w:type="dxa" w:w="1735"/>
-            <w:tcBorders>
-              <w:top w:val="single" w:color="B7C3D0" w:sz="4"/>
-              <w:left w:val="single" w:color="B7C3D0" w:sz="4"/>
-              <w:bottom w:val="single" w:color="B7C3D0" w:sz="4"/>
-              <w:right w:val="single" w:color="B7C3D0" w:sz="4"/>
-            </w:tcBorders>
-            <w:tcMar>
-              <w:top w:type="dxa" w:w="60"/>
-              <w:left w:type="dxa" w:w="100"/>
-              <w:bottom w:type="dxa" w:w="60"/>
-              <w:right w:type="dxa" w:w="100"/>
-            </w:tcMar>
-            <w:vAlign w:val="center"/>
-          </w:tcPr>
-          <w:p>
-            <w:r>
-              <w:rPr>
-                <w:sz w:val="19"/>
-                <w:szCs w:val="19"/>
-              </w:rPr>
-              <w:t xml:space="preserve">B. HD-2D</w:t>
-            </w:r>
-          </w:p>
-        </w:tc>
-        <w:tc>
-          <w:tcPr>
-            <w:tcW w:type="dxa" w:w="2602"/>
-            <w:tcBorders>
-              <w:top w:val="single" w:color="B7C3D0" w:sz="4"/>
-              <w:left w:val="single" w:color="B7C3D0" w:sz="4"/>
-              <w:bottom w:val="single" w:color="B7C3D0" w:sz="4"/>
-              <w:right w:val="single" w:color="B7C3D0" w:sz="4"/>
-            </w:tcBorders>
-            <w:tcMar>
-              <w:top w:type="dxa" w:w="60"/>
-              <w:left w:type="dxa" w:w="100"/>
-              <w:bottom w:type="dxa" w:w="60"/>
-              <w:right w:type="dxa" w:w="100"/>
-            </w:tcMar>
-            <w:vAlign w:val="center"/>
-          </w:tcPr>
-          <w:p>
-            <w:r>
-              <w:rPr>
-                <w:sz w:val="19"/>
-                <w:szCs w:val="19"/>
-              </w:rPr>
-              <w:t xml:space="preserve">Sprites pixel art + cenários com iluminação moderna</w:t>
-            </w:r>
-          </w:p>
-        </w:tc>
-        <w:tc>
-          <w:tcPr>
-            <w:tcW w:type="dxa" w:w="2410"/>
-            <w:tcBorders>
-              <w:top w:val="single" w:color="B7C3D0" w:sz="4"/>
-              <w:left w:val="single" w:color="B7C3D0" w:sz="4"/>
-              <w:bottom w:val="single" w:color="B7C3D0" w:sz="4"/>
-              <w:right w:val="single" w:color="B7C3D0" w:sz="4"/>
-            </w:tcBorders>
-            <w:tcMar>
-              <w:top w:type="dxa" w:w="60"/>
-              <w:left w:type="dxa" w:w="100"/>
-              <w:bottom w:type="dxa" w:w="60"/>
-              <w:right w:type="dxa" w:w="100"/>
-            </w:tcMar>
-            <w:vAlign w:val="center"/>
-          </w:tcPr>
-          <w:p>
-            <w:r>
-              <w:rPr>
-                <w:sz w:val="19"/>
-                <w:szCs w:val="19"/>
-              </w:rPr>
-              <w:t xml:space="preserve">Visual moderno e marcante</w:t>
-            </w:r>
-          </w:p>
-        </w:tc>
-        <w:tc>
-          <w:tcPr>
-            <w:tcW w:type="dxa" w:w="2891"/>
-            <w:tcBorders>
-              <w:top w:val="single" w:color="B7C3D0" w:sz="4"/>
-              <w:left w:val="single" w:color="B7C3D0" w:sz="4"/>
-              <w:bottom w:val="single" w:color="B7C3D0" w:sz="4"/>
-              <w:right w:val="single" w:color="B7C3D0" w:sz="4"/>
-            </w:tcBorders>
-            <w:tcMar>
-              <w:top w:type="dxa" w:w="60"/>
-              <w:left w:type="dxa" w:w="100"/>
-              <w:bottom w:type="dxa" w:w="60"/>
-              <w:right w:type="dxa" w:w="100"/>
-            </w:tcMar>
-            <w:vAlign w:val="center"/>
-          </w:tcPr>
-          <w:p>
-            <w:r>
-              <w:rPr>
-                <w:sz w:val="19"/>
-                <w:szCs w:val="19"/>
-              </w:rPr>
-              <w:t xml:space="preserve">Mais complexo tecnicamente (3D + sprites)</w:t>
+            <w:tcW w:type="dxa" w:w="3373"/>
+            <w:tcBorders>
+              <w:top w:val="single" w:color="B7C3D0" w:sz="4"/>
+              <w:left w:val="single" w:color="B7C3D0" w:sz="4"/>
+              <w:bottom w:val="single" w:color="B7C3D0" w:sz="4"/>
+              <w:right w:val="single" w:color="B7C3D0" w:sz="4"/>
+            </w:tcBorders>
+            <w:tcMar>
+              <w:top w:type="dxa" w:w="60"/>
+              <w:left w:type="dxa" w:w="100"/>
+              <w:bottom w:type="dxa" w:w="60"/>
+              <w:right w:type="dxa" w:w="100"/>
+            </w:tcMar>
+            <w:vAlign w:val="center"/>
+          </w:tcPr>
+          <w:p>
+            <w:r>
+              <w:rPr>
+                <w:sz w:val="19"/>
+                <w:szCs w:val="19"/>
+              </w:rPr>
+              <w:t xml:space="preserve">Tiles</w:t>
+            </w:r>
+          </w:p>
+        </w:tc>
+        <w:tc>
+          <w:tcPr>
+            <w:tcW w:type="dxa" w:w="6265"/>
+            <w:tcBorders>
+              <w:top w:val="single" w:color="B7C3D0" w:sz="4"/>
+              <w:left w:val="single" w:color="B7C3D0" w:sz="4"/>
+              <w:bottom w:val="single" w:color="B7C3D0" w:sz="4"/>
+              <w:right w:val="single" w:color="B7C3D0" w:sz="4"/>
+            </w:tcBorders>
+            <w:tcMar>
+              <w:top w:type="dxa" w:w="60"/>
+              <w:left w:type="dxa" w:w="100"/>
+              <w:bottom w:type="dxa" w:w="60"/>
+              <w:right w:type="dxa" w:w="100"/>
+            </w:tcMar>
+            <w:vAlign w:val="center"/>
+          </w:tcPr>
+          <w:p>
+            <w:r>
+              <w:rPr>
+                <w:sz w:val="19"/>
+                <w:szCs w:val="19"/>
+              </w:rPr>
+              <w:t xml:space="preserve">16×16 px</w:t>
             </w:r>
           </w:p>
         </w:tc>
@@ -5629,109 +5850,223 @@
       <w:tr>
         <w:tc>
           <w:tcPr>
-            <w:tcW w:type="dxa" w:w="1735"/>
-            <w:tcBorders>
-              <w:top w:val="single" w:color="B7C3D0" w:sz="4"/>
-              <w:left w:val="single" w:color="B7C3D0" w:sz="4"/>
-              <w:bottom w:val="single" w:color="B7C3D0" w:sz="4"/>
-              <w:right w:val="single" w:color="B7C3D0" w:sz="4"/>
-            </w:tcBorders>
-            <w:tcMar>
-              <w:top w:type="dxa" w:w="60"/>
-              <w:left w:type="dxa" w:w="100"/>
-              <w:bottom w:type="dxa" w:w="60"/>
-              <w:right w:type="dxa" w:w="100"/>
-            </w:tcMar>
-            <w:vAlign w:val="center"/>
-          </w:tcPr>
-          <w:p>
-            <w:r>
-              <w:rPr>
-                <w:sz w:val="19"/>
-                <w:szCs w:val="19"/>
-              </w:rPr>
-              <w:t xml:space="preserve">C. 2D ilustrado HD</w:t>
-            </w:r>
-          </w:p>
-        </w:tc>
-        <w:tc>
-          <w:tcPr>
-            <w:tcW w:type="dxa" w:w="2602"/>
-            <w:tcBorders>
-              <w:top w:val="single" w:color="B7C3D0" w:sz="4"/>
-              <w:left w:val="single" w:color="B7C3D0" w:sz="4"/>
-              <w:bottom w:val="single" w:color="B7C3D0" w:sz="4"/>
-              <w:right w:val="single" w:color="B7C3D0" w:sz="4"/>
-            </w:tcBorders>
-            <w:tcMar>
-              <w:top w:type="dxa" w:w="60"/>
-              <w:left w:type="dxa" w:w="100"/>
-              <w:bottom w:type="dxa" w:w="60"/>
-              <w:right w:type="dxa" w:w="100"/>
-            </w:tcMar>
-            <w:vAlign w:val="center"/>
-          </w:tcPr>
-          <w:p>
-            <w:r>
-              <w:rPr>
-                <w:sz w:val="19"/>
-                <w:szCs w:val="19"/>
-              </w:rPr>
-              <w:t xml:space="preserve">Arte pintada em alta resolução</w:t>
-            </w:r>
-          </w:p>
-        </w:tc>
-        <w:tc>
-          <w:tcPr>
-            <w:tcW w:type="dxa" w:w="2410"/>
-            <w:tcBorders>
-              <w:top w:val="single" w:color="B7C3D0" w:sz="4"/>
-              <w:left w:val="single" w:color="B7C3D0" w:sz="4"/>
-              <w:bottom w:val="single" w:color="B7C3D0" w:sz="4"/>
-              <w:right w:val="single" w:color="B7C3D0" w:sz="4"/>
-            </w:tcBorders>
-            <w:tcMar>
-              <w:top w:type="dxa" w:w="60"/>
-              <w:left w:type="dxa" w:w="100"/>
-              <w:bottom w:type="dxa" w:w="60"/>
-              <w:right w:type="dxa" w:w="100"/>
-            </w:tcMar>
-            <w:vAlign w:val="center"/>
-          </w:tcPr>
-          <w:p>
-            <w:r>
-              <w:rPr>
-                <w:sz w:val="19"/>
-                <w:szCs w:val="19"/>
-              </w:rPr>
-              <w:t xml:space="preserve">Aproveita bem a geração de imagens</w:t>
-            </w:r>
-          </w:p>
-        </w:tc>
-        <w:tc>
-          <w:tcPr>
-            <w:tcW w:type="dxa" w:w="2891"/>
-            <w:tcBorders>
-              <w:top w:val="single" w:color="B7C3D0" w:sz="4"/>
-              <w:left w:val="single" w:color="B7C3D0" w:sz="4"/>
-              <w:bottom w:val="single" w:color="B7C3D0" w:sz="4"/>
-              <w:right w:val="single" w:color="B7C3D0" w:sz="4"/>
-            </w:tcBorders>
-            <w:tcMar>
-              <w:top w:type="dxa" w:w="60"/>
-              <w:left w:type="dxa" w:w="100"/>
-              <w:bottom w:type="dxa" w:w="60"/>
-              <w:right w:type="dxa" w:w="100"/>
-            </w:tcMar>
-            <w:vAlign w:val="center"/>
-          </w:tcPr>
-          <w:p>
-            <w:r>
-              <w:rPr>
-                <w:sz w:val="19"/>
-                <w:szCs w:val="19"/>
-              </w:rPr>
-              <w:t xml:space="preserve">Animação de personagens exige mais trabalho</w:t>
+            <w:tcW w:type="dxa" w:w="3373"/>
+            <w:tcBorders>
+              <w:top w:val="single" w:color="B7C3D0" w:sz="4"/>
+              <w:left w:val="single" w:color="B7C3D0" w:sz="4"/>
+              <w:bottom w:val="single" w:color="B7C3D0" w:sz="4"/>
+              <w:right w:val="single" w:color="B7C3D0" w:sz="4"/>
+            </w:tcBorders>
+            <w:tcMar>
+              <w:top w:type="dxa" w:w="60"/>
+              <w:left w:type="dxa" w:w="100"/>
+              <w:bottom w:type="dxa" w:w="60"/>
+              <w:right w:type="dxa" w:w="100"/>
+            </w:tcMar>
+            <w:vAlign w:val="center"/>
+          </w:tcPr>
+          <w:p>
+            <w:r>
+              <w:rPr>
+                <w:sz w:val="19"/>
+                <w:szCs w:val="19"/>
+              </w:rPr>
+              <w:t xml:space="preserve">Personagens (mapa/batalha)</w:t>
+            </w:r>
+          </w:p>
+        </w:tc>
+        <w:tc>
+          <w:tcPr>
+            <w:tcW w:type="dxa" w:w="6265"/>
+            <w:tcBorders>
+              <w:top w:val="single" w:color="B7C3D0" w:sz="4"/>
+              <w:left w:val="single" w:color="B7C3D0" w:sz="4"/>
+              <w:bottom w:val="single" w:color="B7C3D0" w:sz="4"/>
+              <w:right w:val="single" w:color="B7C3D0" w:sz="4"/>
+            </w:tcBorders>
+            <w:tcMar>
+              <w:top w:type="dxa" w:w="60"/>
+              <w:left w:type="dxa" w:w="100"/>
+              <w:bottom w:type="dxa" w:w="60"/>
+              <w:right w:type="dxa" w:w="100"/>
+            </w:tcMar>
+            <w:vAlign w:val="center"/>
+          </w:tcPr>
+          <w:p>
+            <w:r>
+              <w:rPr>
+                <w:sz w:val="19"/>
+                <w:szCs w:val="19"/>
+              </w:rPr>
+              <w:t xml:space="preserve">~32×48 px</w:t>
+            </w:r>
+          </w:p>
+        </w:tc>
+      </w:tr>
+      <w:tr>
+        <w:tc>
+          <w:tcPr>
+            <w:tcW w:type="dxa" w:w="3373"/>
+            <w:tcBorders>
+              <w:top w:val="single" w:color="B7C3D0" w:sz="4"/>
+              <w:left w:val="single" w:color="B7C3D0" w:sz="4"/>
+              <w:bottom w:val="single" w:color="B7C3D0" w:sz="4"/>
+              <w:right w:val="single" w:color="B7C3D0" w:sz="4"/>
+            </w:tcBorders>
+            <w:tcMar>
+              <w:top w:type="dxa" w:w="60"/>
+              <w:left w:type="dxa" w:w="100"/>
+              <w:bottom w:type="dxa" w:w="60"/>
+              <w:right w:type="dxa" w:w="100"/>
+            </w:tcMar>
+            <w:vAlign w:val="center"/>
+          </w:tcPr>
+          <w:p>
+            <w:r>
+              <w:rPr>
+                <w:sz w:val="19"/>
+                <w:szCs w:val="19"/>
+              </w:rPr>
+              <w:t xml:space="preserve">Retratos de diálogo</w:t>
+            </w:r>
+          </w:p>
+        </w:tc>
+        <w:tc>
+          <w:tcPr>
+            <w:tcW w:type="dxa" w:w="6265"/>
+            <w:tcBorders>
+              <w:top w:val="single" w:color="B7C3D0" w:sz="4"/>
+              <w:left w:val="single" w:color="B7C3D0" w:sz="4"/>
+              <w:bottom w:val="single" w:color="B7C3D0" w:sz="4"/>
+              <w:right w:val="single" w:color="B7C3D0" w:sz="4"/>
+            </w:tcBorders>
+            <w:tcMar>
+              <w:top w:type="dxa" w:w="60"/>
+              <w:left w:type="dxa" w:w="100"/>
+              <w:bottom w:type="dxa" w:w="60"/>
+              <w:right w:type="dxa" w:w="100"/>
+            </w:tcMar>
+            <w:vAlign w:val="center"/>
+          </w:tcPr>
+          <w:p>
+            <w:r>
+              <w:rPr>
+                <w:sz w:val="19"/>
+                <w:szCs w:val="19"/>
+              </w:rPr>
+              <w:t xml:space="preserve">a definir no guia de estilo (ex.: 64×64)</w:t>
+            </w:r>
+          </w:p>
+        </w:tc>
+      </w:tr>
+      <w:tr>
+        <w:tc>
+          <w:tcPr>
+            <w:tcW w:type="dxa" w:w="3373"/>
+            <w:tcBorders>
+              <w:top w:val="single" w:color="B7C3D0" w:sz="4"/>
+              <w:left w:val="single" w:color="B7C3D0" w:sz="4"/>
+              <w:bottom w:val="single" w:color="B7C3D0" w:sz="4"/>
+              <w:right w:val="single" w:color="B7C3D0" w:sz="4"/>
+            </w:tcBorders>
+            <w:tcMar>
+              <w:top w:type="dxa" w:w="60"/>
+              <w:left w:type="dxa" w:w="100"/>
+              <w:bottom w:type="dxa" w:w="60"/>
+              <w:right w:type="dxa" w:w="100"/>
+            </w:tcMar>
+            <w:vAlign w:val="center"/>
+          </w:tcPr>
+          <w:p>
+            <w:r>
+              <w:rPr>
+                <w:sz w:val="19"/>
+                <w:szCs w:val="19"/>
+              </w:rPr>
+              <w:t xml:space="preserve">Paleta</w:t>
+            </w:r>
+          </w:p>
+        </w:tc>
+        <w:tc>
+          <w:tcPr>
+            <w:tcW w:type="dxa" w:w="6265"/>
+            <w:tcBorders>
+              <w:top w:val="single" w:color="B7C3D0" w:sz="4"/>
+              <w:left w:val="single" w:color="B7C3D0" w:sz="4"/>
+              <w:bottom w:val="single" w:color="B7C3D0" w:sz="4"/>
+              <w:right w:val="single" w:color="B7C3D0" w:sz="4"/>
+            </w:tcBorders>
+            <w:tcMar>
+              <w:top w:type="dxa" w:w="60"/>
+              <w:left w:type="dxa" w:w="100"/>
+              <w:bottom w:type="dxa" w:w="60"/>
+              <w:right w:type="dxa" w:w="100"/>
+            </w:tcMar>
+            <w:vAlign w:val="center"/>
+          </w:tcPr>
+          <w:p>
+            <w:r>
+              <w:rPr>
+                <w:sz w:val="19"/>
+                <w:szCs w:val="19"/>
+              </w:rPr>
+              <w:t xml:space="preserve">limitada e fixa, definida no guia de estilo</w:t>
+            </w:r>
+          </w:p>
+        </w:tc>
+      </w:tr>
+      <w:tr>
+        <w:tc>
+          <w:tcPr>
+            <w:tcW w:type="dxa" w:w="3373"/>
+            <w:tcBorders>
+              <w:top w:val="single" w:color="B7C3D0" w:sz="4"/>
+              <w:left w:val="single" w:color="B7C3D0" w:sz="4"/>
+              <w:bottom w:val="single" w:color="B7C3D0" w:sz="4"/>
+              <w:right w:val="single" w:color="B7C3D0" w:sz="4"/>
+            </w:tcBorders>
+            <w:tcMar>
+              <w:top w:type="dxa" w:w="60"/>
+              <w:left w:type="dxa" w:w="100"/>
+              <w:bottom w:type="dxa" w:w="60"/>
+              <w:right w:type="dxa" w:w="100"/>
+            </w:tcMar>
+            <w:vAlign w:val="center"/>
+          </w:tcPr>
+          <w:p>
+            <w:r>
+              <w:rPr>
+                <w:sz w:val="19"/>
+                <w:szCs w:val="19"/>
+              </w:rPr>
+              <w:t xml:space="preserve">Contorno / luz</w:t>
+            </w:r>
+          </w:p>
+        </w:tc>
+        <w:tc>
+          <w:tcPr>
+            <w:tcW w:type="dxa" w:w="6265"/>
+            <w:tcBorders>
+              <w:top w:val="single" w:color="B7C3D0" w:sz="4"/>
+              <w:left w:val="single" w:color="B7C3D0" w:sz="4"/>
+              <w:bottom w:val="single" w:color="B7C3D0" w:sz="4"/>
+              <w:right w:val="single" w:color="B7C3D0" w:sz="4"/>
+            </w:tcBorders>
+            <w:tcMar>
+              <w:top w:type="dxa" w:w="60"/>
+              <w:left w:type="dxa" w:w="100"/>
+              <w:bottom w:type="dxa" w:w="60"/>
+              <w:right w:type="dxa" w:w="100"/>
+            </w:tcMar>
+            <w:vAlign w:val="center"/>
+          </w:tcPr>
+          <w:p>
+            <w:r>
+              <w:rPr>
+                <w:sz w:val="19"/>
+                <w:szCs w:val="19"/>
+              </w:rPr>
+              <w:t xml:space="preserve">contorno escuro, luz vinda de cima à esquerda</w:t>
             </w:r>
           </w:p>
         </w:tc>
@@ -6707,6 +7042,29 @@
       </w:pPr>
       <w:r>
         <w:t xml:space="preserve">6.3 Pipeline de geração</w:t>
+      </w:r>
+    </w:p>
+    <w:p>
+      <w:pPr>
+        <w:pStyle w:val="ListParagraph"/>
+        <w:numPr>
+          <w:ilvl w:val="0"/>
+          <w:numId w:val="4"/>
+        </w:numPr>
+        <w:spacing w:after="60"/>
+      </w:pPr>
+      <w:r>
+        <w:t xml:space="preserve">Gerar com </w:t>
+      </w:r>
+      <w:r>
+        <w:rPr>
+          <w:b/>
+          <w:bCs/>
+        </w:rPr>
+        <w:t xml:space="preserve">tools/gen_image.ps1</w:t>
+      </w:r>
+      <w:r>
+        <w:t xml:space="preserve"> (Codex CLI 0.156.1, gpt-5.5, image_gen embutido), que salva direto em game/.</w:t>
       </w:r>
     </w:p>
     <w:p>
@@ -7282,7 +7640,7 @@
                 <w:sz w:val="19"/>
                 <w:szCs w:val="19"/>
               </w:rPr>
-              <w:t xml:space="preserve">Tom (sombrio, esperançoso, épico…)</w:t>
+              <w:t xml:space="preserve">Tom</w:t>
             </w:r>
           </w:p>
         </w:tc>
@@ -7303,7 +7661,15 @@
             </w:tcMar>
             <w:vAlign w:val="center"/>
           </w:tcPr>
-          <w:p/>
+          <w:p>
+            <w:r>
+              <w:rPr>
+                <w:sz w:val="19"/>
+                <w:szCs w:val="19"/>
+              </w:rPr>
+              <w:t xml:space="preserve">Mistura equilibrada: começa leve e aventureiro, fica mais sério e dramático a cada ato</w:t>
+            </w:r>
+          </w:p>
         </w:tc>
         <w:tc>
           <w:tcPr>
@@ -7328,7 +7694,7 @@
                 <w:sz w:val="19"/>
                 <w:szCs w:val="19"/>
               </w:rPr>
-              <w:t xml:space="preserve">☐ Pendente</w:t>
+              <w:t xml:space="preserve">☑ Concluída</w:t>
             </w:r>
           </w:p>
         </w:tc>
@@ -7378,7 +7744,15 @@
             </w:tcMar>
             <w:vAlign w:val="center"/>
           </w:tcPr>
-          <w:p/>
+          <w:p>
+            <w:r>
+              <w:rPr>
+                <w:sz w:val="19"/>
+                <w:szCs w:val="19"/>
+              </w:rPr>
+              <w:t xml:space="preserve">Fantasia clássica + steampunk</w:t>
+            </w:r>
+          </w:p>
         </w:tc>
         <w:tc>
           <w:tcPr>
@@ -7403,7 +7777,7 @@
                 <w:sz w:val="19"/>
                 <w:szCs w:val="19"/>
               </w:rPr>
-              <w:t xml:space="preserve">☐ Pendente</w:t>
+              <w:t xml:space="preserve">☑ Concluída</w:t>
             </w:r>
           </w:p>
         </w:tc>
@@ -7432,7 +7806,7 @@
                 <w:sz w:val="19"/>
                 <w:szCs w:val="19"/>
               </w:rPr>
-              <w:t xml:space="preserve">Eras / regiões</w:t>
+              <w:t xml:space="preserve">Regiões</w:t>
             </w:r>
           </w:p>
         </w:tc>
@@ -7453,7 +7827,15 @@
             </w:tcMar>
             <w:vAlign w:val="center"/>
           </w:tcPr>
-          <w:p/>
+          <w:p>
+            <w:r>
+              <w:rPr>
+                <w:sz w:val="19"/>
+                <w:szCs w:val="19"/>
+              </w:rPr>
+              <w:t xml:space="preserve">Um único mundo (sem viagem no tempo — D-06)</w:t>
+            </w:r>
+          </w:p>
         </w:tc>
         <w:tc>
           <w:tcPr>
@@ -7478,7 +7860,7 @@
                 <w:sz w:val="19"/>
                 <w:szCs w:val="19"/>
               </w:rPr>
-              <w:t xml:space="preserve">☐ Pendente</w:t>
+              <w:t xml:space="preserve">◐ Em andamento</w:t>
             </w:r>
           </w:p>
         </w:tc>
@@ -9909,328 +10291,77 @@
         <w:spacing w:after="120"/>
       </w:pPr>
       <w:r>
-        <w:t xml:space="preserve">O Codex MCP não gera áudio, então é preciso definir uma fonte. </w:t>
+        <w:rPr>
+          <w:b/>
+          <w:bCs/>
+        </w:rPr>
+        <w:t xml:space="preserve">D-08:</w:t>
+      </w:r>
+      <w:r>
+        <w:t xml:space="preserve"> música e efeitos sonoros gerados por IA. O Codex não gera áudio, então é preciso escolher a ferramenta.</w:t>
+      </w:r>
+    </w:p>
+    <w:p>
+      <w:pPr>
+        <w:pStyle w:val="ListParagraph"/>
+        <w:numPr>
+          <w:ilvl w:val="0"/>
+          <w:numId w:val="2"/>
+        </w:numPr>
+        <w:spacing w:after="60"/>
+      </w:pPr>
+      <w:r>
+        <w:t xml:space="preserve">Escolher a ferramenta de IA de áudio e confirmar que os termos permitem </w:t>
       </w:r>
       <w:r>
         <w:rPr>
           <w:b/>
           <w:bCs/>
         </w:rPr>
-        <w:t xml:space="preserve">Decisão pendente (D-08).</w:t>
+        <w:t xml:space="preserve">uso comercial</w:t>
+      </w:r>
+      <w:r>
+        <w:t xml:space="preserve"> e distribuição do jogo.</w:t>
       </w:r>
     </w:p>
-    <w:tbl>
-      <w:tblPr>
-        <w:tblW w:type="dxa" w:w="9638"/>
-        <w:tblBorders>
-          <w:top w:val="single" w:color="auto" w:sz="4"/>
-          <w:left w:val="single" w:color="auto" w:sz="4"/>
-          <w:bottom w:val="single" w:color="auto" w:sz="4"/>
-          <w:right w:val="single" w:color="auto" w:sz="4"/>
-          <w:insideH w:val="single" w:color="auto" w:sz="4"/>
-          <w:insideV w:val="single" w:color="auto" w:sz="4"/>
-        </w:tblBorders>
-      </w:tblPr>
-      <w:tblGrid>
-        <w:gridCol w:w="3855"/>
-        <w:gridCol w:w="5783"/>
-      </w:tblGrid>
-      <w:tr>
-        <w:trPr>
-          <w:tblHeader/>
-        </w:trPr>
-        <w:tc>
-          <w:tcPr>
-            <w:tcW w:type="dxa" w:w="3855"/>
-            <w:tcBorders>
-              <w:top w:val="single" w:color="B7C3D0" w:sz="4"/>
-              <w:left w:val="single" w:color="B7C3D0" w:sz="4"/>
-              <w:bottom w:val="single" w:color="B7C3D0" w:sz="4"/>
-              <w:right w:val="single" w:color="B7C3D0" w:sz="4"/>
-            </w:tcBorders>
-            <w:shd w:fill="1F3A5F" w:color="auto" w:val="clear"/>
-            <w:tcMar>
-              <w:top w:type="dxa" w:w="60"/>
-              <w:left w:type="dxa" w:w="100"/>
-              <w:bottom w:type="dxa" w:w="60"/>
-              <w:right w:type="dxa" w:w="100"/>
-            </w:tcMar>
-            <w:vAlign w:val="center"/>
-          </w:tcPr>
-          <w:p>
-            <w:r>
-              <w:rPr>
-                <w:b/>
-                <w:bCs/>
-                <w:color w:val="FFFFFF"/>
-                <w:sz w:val="19"/>
-                <w:szCs w:val="19"/>
-              </w:rPr>
-              <w:t xml:space="preserve">Opção</w:t>
-            </w:r>
-          </w:p>
-        </w:tc>
-        <w:tc>
-          <w:tcPr>
-            <w:tcW w:type="dxa" w:w="5783"/>
-            <w:tcBorders>
-              <w:top w:val="single" w:color="B7C3D0" w:sz="4"/>
-              <w:left w:val="single" w:color="B7C3D0" w:sz="4"/>
-              <w:bottom w:val="single" w:color="B7C3D0" w:sz="4"/>
-              <w:right w:val="single" w:color="B7C3D0" w:sz="4"/>
-            </w:tcBorders>
-            <w:shd w:fill="1F3A5F" w:color="auto" w:val="clear"/>
-            <w:tcMar>
-              <w:top w:type="dxa" w:w="60"/>
-              <w:left w:type="dxa" w:w="100"/>
-              <w:bottom w:type="dxa" w:w="60"/>
-              <w:right w:type="dxa" w:w="100"/>
-            </w:tcMar>
-            <w:vAlign w:val="center"/>
-          </w:tcPr>
-          <w:p>
-            <w:r>
-              <w:rPr>
-                <w:b/>
-                <w:bCs/>
-                <w:color w:val="FFFFFF"/>
-                <w:sz w:val="19"/>
-                <w:szCs w:val="19"/>
-              </w:rPr>
-              <w:t xml:space="preserve">Observação</w:t>
-            </w:r>
-          </w:p>
-        </w:tc>
-      </w:tr>
-      <w:tr>
-        <w:tc>
-          <w:tcPr>
-            <w:tcW w:type="dxa" w:w="3855"/>
-            <w:tcBorders>
-              <w:top w:val="single" w:color="B7C3D0" w:sz="4"/>
-              <w:left w:val="single" w:color="B7C3D0" w:sz="4"/>
-              <w:bottom w:val="single" w:color="B7C3D0" w:sz="4"/>
-              <w:right w:val="single" w:color="B7C3D0" w:sz="4"/>
-            </w:tcBorders>
-            <w:tcMar>
-              <w:top w:type="dxa" w:w="60"/>
-              <w:left w:type="dxa" w:w="100"/>
-              <w:bottom w:type="dxa" w:w="60"/>
-              <w:right w:type="dxa" w:w="100"/>
-            </w:tcMar>
-            <w:vAlign w:val="center"/>
-          </w:tcPr>
-          <w:p>
-            <w:r>
-              <w:rPr>
-                <w:sz w:val="19"/>
-                <w:szCs w:val="19"/>
-              </w:rPr>
-              <w:t xml:space="preserve">Bibliotecas livres (OpenGameArt, freesound, Kenney)</w:t>
-            </w:r>
-          </w:p>
-        </w:tc>
-        <w:tc>
-          <w:tcPr>
-            <w:tcW w:type="dxa" w:w="5783"/>
-            <w:tcBorders>
-              <w:top w:val="single" w:color="B7C3D0" w:sz="4"/>
-              <w:left w:val="single" w:color="B7C3D0" w:sz="4"/>
-              <w:bottom w:val="single" w:color="B7C3D0" w:sz="4"/>
-              <w:right w:val="single" w:color="B7C3D0" w:sz="4"/>
-            </w:tcBorders>
-            <w:tcMar>
-              <w:top w:type="dxa" w:w="60"/>
-              <w:left w:type="dxa" w:w="100"/>
-              <w:bottom w:type="dxa" w:w="60"/>
-              <w:right w:type="dxa" w:w="100"/>
-            </w:tcMar>
-            <w:vAlign w:val="center"/>
-          </w:tcPr>
-          <w:p>
-            <w:r>
-              <w:rPr>
-                <w:sz w:val="19"/>
-                <w:szCs w:val="19"/>
-              </w:rPr>
-              <w:t xml:space="preserve">Custo zero; verificar licença (CC0 / CC-BY) de cada faixa</w:t>
-            </w:r>
-          </w:p>
-        </w:tc>
-      </w:tr>
-      <w:tr>
-        <w:tc>
-          <w:tcPr>
-            <w:tcW w:type="dxa" w:w="3855"/>
-            <w:tcBorders>
-              <w:top w:val="single" w:color="B7C3D0" w:sz="4"/>
-              <w:left w:val="single" w:color="B7C3D0" w:sz="4"/>
-              <w:bottom w:val="single" w:color="B7C3D0" w:sz="4"/>
-              <w:right w:val="single" w:color="B7C3D0" w:sz="4"/>
-            </w:tcBorders>
-            <w:tcMar>
-              <w:top w:type="dxa" w:w="60"/>
-              <w:left w:type="dxa" w:w="100"/>
-              <w:bottom w:type="dxa" w:w="60"/>
-              <w:right w:type="dxa" w:w="100"/>
-            </w:tcMar>
-            <w:vAlign w:val="center"/>
-          </w:tcPr>
-          <w:p>
-            <w:r>
-              <w:rPr>
-                <w:sz w:val="19"/>
-                <w:szCs w:val="19"/>
-              </w:rPr>
-              <w:t xml:space="preserve">Pacotes pagos (itch.io, Unity Asset Store)</w:t>
-            </w:r>
-          </w:p>
-        </w:tc>
-        <w:tc>
-          <w:tcPr>
-            <w:tcW w:type="dxa" w:w="5783"/>
-            <w:tcBorders>
-              <w:top w:val="single" w:color="B7C3D0" w:sz="4"/>
-              <w:left w:val="single" w:color="B7C3D0" w:sz="4"/>
-              <w:bottom w:val="single" w:color="B7C3D0" w:sz="4"/>
-              <w:right w:val="single" w:color="B7C3D0" w:sz="4"/>
-            </w:tcBorders>
-            <w:tcMar>
-              <w:top w:type="dxa" w:w="60"/>
-              <w:left w:type="dxa" w:w="100"/>
-              <w:bottom w:type="dxa" w:w="60"/>
-              <w:right w:type="dxa" w:w="100"/>
-            </w:tcMar>
-            <w:vAlign w:val="center"/>
-          </w:tcPr>
-          <w:p>
-            <w:r>
-              <w:rPr>
-                <w:sz w:val="19"/>
-                <w:szCs w:val="19"/>
-              </w:rPr>
-              <w:t xml:space="preserve">Baixo custo e boa qualidade; verificar licença para uso em Godot</w:t>
-            </w:r>
-          </w:p>
-        </w:tc>
-      </w:tr>
-      <w:tr>
-        <w:tc>
-          <w:tcPr>
-            <w:tcW w:type="dxa" w:w="3855"/>
-            <w:tcBorders>
-              <w:top w:val="single" w:color="B7C3D0" w:sz="4"/>
-              <w:left w:val="single" w:color="B7C3D0" w:sz="4"/>
-              <w:bottom w:val="single" w:color="B7C3D0" w:sz="4"/>
-              <w:right w:val="single" w:color="B7C3D0" w:sz="4"/>
-            </w:tcBorders>
-            <w:tcMar>
-              <w:top w:type="dxa" w:w="60"/>
-              <w:left w:type="dxa" w:w="100"/>
-              <w:bottom w:type="dxa" w:w="60"/>
-              <w:right w:type="dxa" w:w="100"/>
-            </w:tcMar>
-            <w:vAlign w:val="center"/>
-          </w:tcPr>
-          <w:p>
-            <w:r>
-              <w:rPr>
-                <w:sz w:val="19"/>
-                <w:szCs w:val="19"/>
-              </w:rPr>
-              <w:t xml:space="preserve">Compositor contratado</w:t>
-            </w:r>
-          </w:p>
-        </w:tc>
-        <w:tc>
-          <w:tcPr>
-            <w:tcW w:type="dxa" w:w="5783"/>
-            <w:tcBorders>
-              <w:top w:val="single" w:color="B7C3D0" w:sz="4"/>
-              <w:left w:val="single" w:color="B7C3D0" w:sz="4"/>
-              <w:bottom w:val="single" w:color="B7C3D0" w:sz="4"/>
-              <w:right w:val="single" w:color="B7C3D0" w:sz="4"/>
-            </w:tcBorders>
-            <w:tcMar>
-              <w:top w:type="dxa" w:w="60"/>
-              <w:left w:type="dxa" w:w="100"/>
-              <w:bottom w:type="dxa" w:w="60"/>
-              <w:right w:type="dxa" w:w="100"/>
-            </w:tcMar>
-            <w:vAlign w:val="center"/>
-          </w:tcPr>
-          <w:p>
-            <w:r>
-              <w:rPr>
-                <w:sz w:val="19"/>
-                <w:szCs w:val="19"/>
-              </w:rPr>
-              <w:t xml:space="preserve">Trilha original; maior custo</w:t>
-            </w:r>
-          </w:p>
-        </w:tc>
-      </w:tr>
-      <w:tr>
-        <w:tc>
-          <w:tcPr>
-            <w:tcW w:type="dxa" w:w="3855"/>
-            <w:tcBorders>
-              <w:top w:val="single" w:color="B7C3D0" w:sz="4"/>
-              <w:left w:val="single" w:color="B7C3D0" w:sz="4"/>
-              <w:bottom w:val="single" w:color="B7C3D0" w:sz="4"/>
-              <w:right w:val="single" w:color="B7C3D0" w:sz="4"/>
-            </w:tcBorders>
-            <w:tcMar>
-              <w:top w:type="dxa" w:w="60"/>
-              <w:left w:type="dxa" w:w="100"/>
-              <w:bottom w:type="dxa" w:w="60"/>
-              <w:right w:type="dxa" w:w="100"/>
-            </w:tcMar>
-            <w:vAlign w:val="center"/>
-          </w:tcPr>
-          <w:p>
-            <w:r>
-              <w:rPr>
-                <w:sz w:val="19"/>
-                <w:szCs w:val="19"/>
-              </w:rPr>
-              <w:t xml:space="preserve">Ferramentas de música por IA</w:t>
-            </w:r>
-          </w:p>
-        </w:tc>
-        <w:tc>
-          <w:tcPr>
-            <w:tcW w:type="dxa" w:w="5783"/>
-            <w:tcBorders>
-              <w:top w:val="single" w:color="B7C3D0" w:sz="4"/>
-              <w:left w:val="single" w:color="B7C3D0" w:sz="4"/>
-              <w:bottom w:val="single" w:color="B7C3D0" w:sz="4"/>
-              <w:right w:val="single" w:color="B7C3D0" w:sz="4"/>
-            </w:tcBorders>
-            <w:tcMar>
-              <w:top w:type="dxa" w:w="60"/>
-              <w:left w:type="dxa" w:w="100"/>
-              <w:bottom w:type="dxa" w:w="60"/>
-              <w:right w:type="dxa" w:w="100"/>
-            </w:tcMar>
-            <w:vAlign w:val="center"/>
-          </w:tcPr>
-          <w:p>
-            <w:r>
-              <w:rPr>
-                <w:sz w:val="19"/>
-                <w:szCs w:val="19"/>
-              </w:rPr>
-              <w:t xml:space="preserve">Verificar termos de uso comercial</w:t>
-            </w:r>
-          </w:p>
-        </w:tc>
-      </w:tr>
-    </w:tbl>
     <w:p>
       <w:pPr>
-        <w:spacing w:after="120"/>
+        <w:pStyle w:val="ListParagraph"/>
+        <w:numPr>
+          <w:ilvl w:val="0"/>
+          <w:numId w:val="2"/>
+        </w:numPr>
+        <w:spacing w:after="60"/>
       </w:pPr>
+      <w:r>
+        <w:t xml:space="preserve">Estilo musical alvo: orquestra + chiptune/SNES, com temas de personagem e leitmotifs.</w:t>
+      </w:r>
+    </w:p>
+    <w:p>
+      <w:pPr>
+        <w:pStyle w:val="ListParagraph"/>
+        <w:numPr>
+          <w:ilvl w:val="0"/>
+          <w:numId w:val="2"/>
+        </w:numPr>
+        <w:spacing w:after="60"/>
+      </w:pPr>
+      <w:r>
+        <w:t xml:space="preserve">Formato no Godot: OGG Vorbis para música (com pontos de loop), WAV para efeitos curtos.</w:t>
+      </w:r>
+    </w:p>
+    <w:p>
+      <w:pPr>
+        <w:pStyle w:val="ListParagraph"/>
+        <w:numPr>
+          <w:ilvl w:val="0"/>
+          <w:numId w:val="2"/>
+        </w:numPr>
+        <w:spacing w:after="60"/>
+      </w:pPr>
+      <w:r>
+        <w:t xml:space="preserve">Guardar os prompts de áudio em assets/_prompts/, como nas imagens.</w:t>
+      </w:r>
     </w:p>
     <w:p>
       <w:pPr>
@@ -11525,7 +11656,7 @@
                 <w:sz w:val="19"/>
                 <w:szCs w:val="19"/>
               </w:rPr>
-              <w:t xml:space="preserve">☐ Pendente</w:t>
+              <w:t xml:space="preserve">☑ Concluída</w:t>
             </w:r>
           </w:p>
         </w:tc>
@@ -11552,7 +11683,7 @@
                 <w:sz w:val="19"/>
                 <w:szCs w:val="19"/>
               </w:rPr>
-              <w:t xml:space="preserve">Concluir após revisão</w:t>
+              <w:t xml:space="preserve">v0.2</w:t>
             </w:r>
           </w:p>
         </w:tc>
@@ -11662,7 +11793,7 @@
                 <w:sz w:val="19"/>
                 <w:szCs w:val="19"/>
               </w:rPr>
-              <w:t xml:space="preserve">☐ Pendente</w:t>
+              <w:t xml:space="preserve">◐ Em andamento</w:t>
             </w:r>
           </w:p>
         </w:tc>
@@ -11689,7 +11820,7 @@
                 <w:sz w:val="19"/>
                 <w:szCs w:val="19"/>
               </w:rPr>
-              <w:t xml:space="preserve">D-01</w:t>
+              <w:t xml:space="preserve">D-01: tom e mundo definidos; falta título e premissa</w:t>
             </w:r>
           </w:p>
         </w:tc>
@@ -11799,7 +11930,7 @@
                 <w:sz w:val="19"/>
                 <w:szCs w:val="19"/>
               </w:rPr>
-              <w:t xml:space="preserve">☐ Pendente</w:t>
+              <w:t xml:space="preserve">☑ Concluída</w:t>
             </w:r>
           </w:p>
         </w:tc>
@@ -11826,7 +11957,7 @@
                 <w:sz w:val="19"/>
                 <w:szCs w:val="19"/>
               </w:rPr>
-              <w:t xml:space="preserve">D-02</w:t>
+              <w:t xml:space="preserve">D-02: pixel art 16-bit</w:t>
             </w:r>
           </w:p>
         </w:tc>
@@ -11882,7 +12013,7 @@
                 <w:sz w:val="19"/>
                 <w:szCs w:val="19"/>
               </w:rPr>
-              <w:t xml:space="preserve">Definir modelo de combate (CTB vs ATB)</w:t>
+              <w:t xml:space="preserve">Definir modelo de combate</w:t>
             </w:r>
           </w:p>
         </w:tc>
@@ -11936,7 +12067,7 @@
                 <w:sz w:val="19"/>
                 <w:szCs w:val="19"/>
               </w:rPr>
-              <w:t xml:space="preserve">☐ Pendente</w:t>
+              <w:t xml:space="preserve">☑ Concluída</w:t>
             </w:r>
           </w:p>
         </w:tc>
@@ -11963,7 +12094,7 @@
                 <w:sz w:val="19"/>
                 <w:szCs w:val="19"/>
               </w:rPr>
-              <w:t xml:space="preserve">D-03</w:t>
+              <w:t xml:space="preserve">D-03: híbrido</w:t>
             </w:r>
           </w:p>
         </w:tc>
@@ -12073,7 +12204,7 @@
                 <w:sz w:val="19"/>
                 <w:szCs w:val="19"/>
               </w:rPr>
-              <w:t xml:space="preserve">☐ Pendente</w:t>
+              <w:t xml:space="preserve">☑ Concluída</w:t>
             </w:r>
           </w:p>
         </w:tc>
@@ -12100,7 +12231,7 @@
                 <w:sz w:val="19"/>
                 <w:szCs w:val="19"/>
               </w:rPr>
-              <w:t xml:space="preserve">D-04</w:t>
+              <w:t xml:space="preserve">D-04: no próprio mapa</w:t>
             </w:r>
           </w:p>
         </w:tc>
@@ -12210,7 +12341,7 @@
                 <w:sz w:val="19"/>
                 <w:szCs w:val="19"/>
               </w:rPr>
-              <w:t xml:space="preserve">☐ Pendente</w:t>
+              <w:t xml:space="preserve">☑ Concluída</w:t>
             </w:r>
           </w:p>
         </w:tc>
@@ -12237,7 +12368,7 @@
                 <w:sz w:val="19"/>
                 <w:szCs w:val="19"/>
               </w:rPr>
-              <w:t xml:space="preserve">D-05</w:t>
+              <w:t xml:space="preserve">D-05: híbrido</w:t>
             </w:r>
           </w:p>
         </w:tc>
@@ -12347,7 +12478,7 @@
                 <w:sz w:val="19"/>
                 <w:szCs w:val="19"/>
               </w:rPr>
-              <w:t xml:space="preserve">☐ Pendente</w:t>
+              <w:t xml:space="preserve">☑ Concluída</w:t>
             </w:r>
           </w:p>
         </w:tc>
@@ -12374,7 +12505,7 @@
                 <w:sz w:val="19"/>
                 <w:szCs w:val="19"/>
               </w:rPr>
-              <w:t xml:space="preserve">D-06</w:t>
+              <w:t xml:space="preserve">D-06: não</w:t>
             </w:r>
           </w:p>
         </w:tc>
@@ -12484,7 +12615,7 @@
                 <w:sz w:val="19"/>
                 <w:szCs w:val="19"/>
               </w:rPr>
-              <w:t xml:space="preserve">☐ Pendente</w:t>
+              <w:t xml:space="preserve">☑ Concluída</w:t>
             </w:r>
           </w:p>
         </w:tc>
@@ -12511,7 +12642,7 @@
                 <w:sz w:val="19"/>
                 <w:szCs w:val="19"/>
               </w:rPr>
-              <w:t xml:space="preserve">D-07</w:t>
+              <w:t xml:space="preserve">D-07: 640×360</w:t>
             </w:r>
           </w:p>
         </w:tc>
@@ -12621,7 +12752,7 @@
                 <w:sz w:val="19"/>
                 <w:szCs w:val="19"/>
               </w:rPr>
-              <w:t xml:space="preserve">☐ Pendente</w:t>
+              <w:t xml:space="preserve">☑ Concluída</w:t>
             </w:r>
           </w:p>
         </w:tc>
@@ -12648,7 +12779,7 @@
                 <w:sz w:val="19"/>
                 <w:szCs w:val="19"/>
               </w:rPr>
-              <w:t xml:space="preserve">D-08</w:t>
+              <w:t xml:space="preserve">D-08: IA; falta escolher a ferramenta</w:t>
             </w:r>
           </w:p>
         </w:tc>
@@ -12704,7 +12835,7 @@
                 <w:sz w:val="19"/>
                 <w:szCs w:val="19"/>
               </w:rPr>
-              <w:t xml:space="preserve">Inicializar Git e .gitignore</w:t>
+              <w:t xml:space="preserve">Inicializar Git e publicar no GitHub</w:t>
             </w:r>
           </w:p>
         </w:tc>
@@ -12758,7 +12889,7 @@
                 <w:sz w:val="19"/>
                 <w:szCs w:val="19"/>
               </w:rPr>
-              <w:t xml:space="preserve">☐ Pendente</w:t>
+              <w:t xml:space="preserve">☑ Concluída</w:t>
             </w:r>
           </w:p>
         </w:tc>
@@ -12779,7 +12910,15 @@
             </w:tcMar>
             <w:vAlign w:val="center"/>
           </w:tcPr>
-          <w:p/>
+          <w:p>
+            <w:r>
+              <w:rPr>
+                <w:sz w:val="19"/>
+                <w:szCs w:val="19"/>
+              </w:rPr>
+              <w:t xml:space="preserve">Commit 756f831</w:t>
+            </w:r>
+          </w:p>
         </w:tc>
       </w:tr>
       <w:tr>
@@ -12887,7 +13026,7 @@
                 <w:sz w:val="19"/>
                 <w:szCs w:val="19"/>
               </w:rPr>
-              <w:t xml:space="preserve">☐ Pendente</w:t>
+              <w:t xml:space="preserve">☑ Concluída</w:t>
             </w:r>
           </w:p>
         </w:tc>
@@ -12908,7 +13047,15 @@
             </w:tcMar>
             <w:vAlign w:val="center"/>
           </w:tcPr>
-          <w:p/>
+          <w:p>
+            <w:r>
+              <w:rPr>
+                <w:sz w:val="19"/>
+                <w:szCs w:val="19"/>
+              </w:rPr>
+              <w:t xml:space="preserve">game/</w:t>
+            </w:r>
+          </w:p>
         </w:tc>
       </w:tr>
       <w:tr>
@@ -13220,7 +13367,7 @@
                 <w:sz w:val="19"/>
                 <w:szCs w:val="19"/>
               </w:rPr>
-              <w:t xml:space="preserve">Testar geração de imagem via Codex MCP</w:t>
+              <w:t xml:space="preserve">Testar geração de imagem via Codex</w:t>
             </w:r>
           </w:p>
         </w:tc>
@@ -13274,7 +13421,7 @@
                 <w:sz w:val="19"/>
                 <w:szCs w:val="19"/>
               </w:rPr>
-              <w:t xml:space="preserve">☐ Pendente</w:t>
+              <w:t xml:space="preserve">☑ Concluída</w:t>
             </w:r>
           </w:p>
         </w:tc>
@@ -13301,7 +13448,7 @@
                 <w:sz w:val="19"/>
                 <w:szCs w:val="19"/>
               </w:rPr>
-              <w:t xml:space="preserve">Validar formato, tamanho, transparência</w:t>
+              <w:t xml:space="preserve">codex_test_01.png via Codex CLI (MCP incompatível)</w:t>
             </w:r>
           </w:p>
         </w:tc>
@@ -13357,7 +13504,7 @@
                 <w:sz w:val="19"/>
                 <w:szCs w:val="19"/>
               </w:rPr>
-              <w:t xml:space="preserve">Criar Guia de Estilo + prompt-base</w:t>
+              <w:t xml:space="preserve">Escolher ferramenta de IA de áudio</w:t>
             </w:r>
           </w:p>
         </w:tc>
@@ -13384,7 +13531,7 @@
                 <w:sz w:val="19"/>
                 <w:szCs w:val="19"/>
               </w:rPr>
-              <w:t xml:space="preserve">Claude + Diretor</w:t>
+              <w:t xml:space="preserve">Diretor + Claude</w:t>
             </w:r>
           </w:p>
         </w:tc>
@@ -13432,7 +13579,15 @@
             </w:tcMar>
             <w:vAlign w:val="center"/>
           </w:tcPr>
-          <w:p/>
+          <w:p>
+            <w:r>
+              <w:rPr>
+                <w:sz w:val="19"/>
+                <w:szCs w:val="19"/>
+              </w:rPr>
+              <w:t xml:space="preserve">Verificar uso comercial</w:t>
+            </w:r>
+          </w:p>
         </w:tc>
       </w:tr>
       <w:tr>
@@ -13486,7 +13641,7 @@
                 <w:sz w:val="19"/>
                 <w:szCs w:val="19"/>
               </w:rPr>
-              <w:t xml:space="preserve">Esboçar história em atos e o grupo principal</w:t>
+              <w:t xml:space="preserve">Criar Guia de Estilo + prompt-base</w:t>
             </w:r>
           </w:p>
         </w:tc>
@@ -13513,7 +13668,7 @@
                 <w:sz w:val="19"/>
                 <w:szCs w:val="19"/>
               </w:rPr>
-              <w:t xml:space="preserve">Diretor + Claude</w:t>
+              <w:t xml:space="preserve">Claude + Diretor</w:t>
             </w:r>
           </w:p>
         </w:tc>
@@ -13615,6 +13770,135 @@
                 <w:sz w:val="19"/>
                 <w:szCs w:val="19"/>
               </w:rPr>
+              <w:t xml:space="preserve">Esboçar história em atos e o grupo principal</w:t>
+            </w:r>
+          </w:p>
+        </w:tc>
+        <w:tc>
+          <w:tcPr>
+            <w:tcW w:type="dxa" w:w="1349"/>
+            <w:tcBorders>
+              <w:top w:val="single" w:color="B7C3D0" w:sz="4"/>
+              <w:left w:val="single" w:color="B7C3D0" w:sz="4"/>
+              <w:bottom w:val="single" w:color="B7C3D0" w:sz="4"/>
+              <w:right w:val="single" w:color="B7C3D0" w:sz="4"/>
+            </w:tcBorders>
+            <w:tcMar>
+              <w:top w:type="dxa" w:w="60"/>
+              <w:left w:type="dxa" w:w="100"/>
+              <w:bottom w:type="dxa" w:w="60"/>
+              <w:right w:type="dxa" w:w="100"/>
+            </w:tcMar>
+            <w:vAlign w:val="center"/>
+          </w:tcPr>
+          <w:p>
+            <w:r>
+              <w:rPr>
+                <w:sz w:val="19"/>
+                <w:szCs w:val="19"/>
+              </w:rPr>
+              <w:t xml:space="preserve">Diretor + Claude</w:t>
+            </w:r>
+          </w:p>
+        </w:tc>
+        <w:tc>
+          <w:tcPr>
+            <w:tcW w:type="dxa" w:w="1253"/>
+            <w:tcBorders>
+              <w:top w:val="single" w:color="B7C3D0" w:sz="4"/>
+              <w:left w:val="single" w:color="B7C3D0" w:sz="4"/>
+              <w:bottom w:val="single" w:color="B7C3D0" w:sz="4"/>
+              <w:right w:val="single" w:color="B7C3D0" w:sz="4"/>
+            </w:tcBorders>
+            <w:tcMar>
+              <w:top w:type="dxa" w:w="60"/>
+              <w:left w:type="dxa" w:w="100"/>
+              <w:bottom w:type="dxa" w:w="60"/>
+              <w:right w:type="dxa" w:w="100"/>
+            </w:tcMar>
+            <w:vAlign w:val="center"/>
+          </w:tcPr>
+          <w:p>
+            <w:r>
+              <w:rPr>
+                <w:sz w:val="19"/>
+                <w:szCs w:val="19"/>
+              </w:rPr>
+              <w:t xml:space="preserve">☐ Pendente</w:t>
+            </w:r>
+          </w:p>
+        </w:tc>
+        <w:tc>
+          <w:tcPr>
+            <w:tcW w:type="dxa" w:w="2024"/>
+            <w:tcBorders>
+              <w:top w:val="single" w:color="B7C3D0" w:sz="4"/>
+              <w:left w:val="single" w:color="B7C3D0" w:sz="4"/>
+              <w:bottom w:val="single" w:color="B7C3D0" w:sz="4"/>
+              <w:right w:val="single" w:color="B7C3D0" w:sz="4"/>
+            </w:tcBorders>
+            <w:tcMar>
+              <w:top w:type="dxa" w:w="60"/>
+              <w:left w:type="dxa" w:w="100"/>
+              <w:bottom w:type="dxa" w:w="60"/>
+              <w:right w:type="dxa" w:w="100"/>
+            </w:tcMar>
+            <w:vAlign w:val="center"/>
+          </w:tcPr>
+          <w:p/>
+        </w:tc>
+      </w:tr>
+      <w:tr>
+        <w:tc>
+          <w:tcPr>
+            <w:tcW w:type="dxa" w:w="771"/>
+            <w:tcBorders>
+              <w:top w:val="single" w:color="B7C3D0" w:sz="4"/>
+              <w:left w:val="single" w:color="B7C3D0" w:sz="4"/>
+              <w:bottom w:val="single" w:color="B7C3D0" w:sz="4"/>
+              <w:right w:val="single" w:color="B7C3D0" w:sz="4"/>
+            </w:tcBorders>
+            <w:tcMar>
+              <w:top w:type="dxa" w:w="60"/>
+              <w:left w:type="dxa" w:w="100"/>
+              <w:bottom w:type="dxa" w:w="60"/>
+              <w:right w:type="dxa" w:w="100"/>
+            </w:tcMar>
+            <w:vAlign w:val="center"/>
+          </w:tcPr>
+          <w:p>
+            <w:r>
+              <w:rPr>
+                <w:sz w:val="19"/>
+                <w:szCs w:val="19"/>
+              </w:rPr>
+              <w:t xml:space="preserve">F0.18</w:t>
+            </w:r>
+          </w:p>
+        </w:tc>
+        <w:tc>
+          <w:tcPr>
+            <w:tcW w:type="dxa" w:w="4241"/>
+            <w:tcBorders>
+              <w:top w:val="single" w:color="B7C3D0" w:sz="4"/>
+              <w:left w:val="single" w:color="B7C3D0" w:sz="4"/>
+              <w:bottom w:val="single" w:color="B7C3D0" w:sz="4"/>
+              <w:right w:val="single" w:color="B7C3D0" w:sz="4"/>
+            </w:tcBorders>
+            <w:tcMar>
+              <w:top w:type="dxa" w:w="60"/>
+              <w:left w:type="dxa" w:w="100"/>
+              <w:bottom w:type="dxa" w:w="60"/>
+              <w:right w:type="dxa" w:w="100"/>
+            </w:tcMar>
+            <w:vAlign w:val="center"/>
+          </w:tcPr>
+          <w:p>
+            <w:r>
+              <w:rPr>
+                <w:sz w:val="19"/>
+                <w:szCs w:val="19"/>
+              </w:rPr>
               <w:t xml:space="preserve">Escrever GDD do sistema de combate</w:t>
             </w:r>
           </w:p>
@@ -13696,7 +13980,7 @@
                 <w:sz w:val="19"/>
                 <w:szCs w:val="19"/>
               </w:rPr>
-              <w:t xml:space="preserve">Fórmulas de dano, turnos, status</w:t>
+              <w:t xml:space="preserve">Fórmulas de dano, turnos CTB, timing, status</w:t>
             </w:r>
           </w:p>
         </w:tc>
@@ -14929,7 +15213,7 @@
                 <w:sz w:val="19"/>
                 <w:szCs w:val="19"/>
               </w:rPr>
-              <w:t xml:space="preserve">Ordem de turnos (versão inicial)</w:t>
+              <w:t xml:space="preserve">Ordem de turnos CTB (versão inicial)</w:t>
             </w:r>
           </w:p>
         </w:tc>
@@ -15058,7 +15342,7 @@
                 <w:sz w:val="19"/>
                 <w:szCs w:val="19"/>
               </w:rPr>
-              <w:t xml:space="preserve">Vitória / derrota / retorno ao mapa</w:t>
+              <w:t xml:space="preserve">Primeiro comando com timing</w:t>
             </w:r>
           </w:p>
         </w:tc>
@@ -15133,7 +15417,15 @@
             </w:tcMar>
             <w:vAlign w:val="center"/>
           </w:tcPr>
-          <w:p/>
+          <w:p>
+            <w:r>
+              <w:rPr>
+                <w:sz w:val="19"/>
+                <w:szCs w:val="19"/>
+              </w:rPr>
+              <w:t xml:space="preserve">Validar a sensação do sistema híbrido</w:t>
+            </w:r>
+          </w:p>
         </w:tc>
       </w:tr>
       <w:tr>
@@ -15187,7 +15479,7 @@
                 <w:sz w:val="19"/>
                 <w:szCs w:val="19"/>
               </w:rPr>
-              <w:t xml:space="preserve">Primeiro sprite gerado pelo Codex integrado</w:t>
+              <w:t xml:space="preserve">Vitória / derrota / retorno ao mapa</w:t>
             </w:r>
           </w:p>
         </w:tc>
@@ -15290,6 +15582,135 @@
                 <w:szCs w:val="19"/>
               </w:rPr>
               <w:t xml:space="preserve">F1.11</w:t>
+            </w:r>
+          </w:p>
+        </w:tc>
+        <w:tc>
+          <w:tcPr>
+            <w:tcW w:type="dxa" w:w="4241"/>
+            <w:tcBorders>
+              <w:top w:val="single" w:color="B7C3D0" w:sz="4"/>
+              <w:left w:val="single" w:color="B7C3D0" w:sz="4"/>
+              <w:bottom w:val="single" w:color="B7C3D0" w:sz="4"/>
+              <w:right w:val="single" w:color="B7C3D0" w:sz="4"/>
+            </w:tcBorders>
+            <w:tcMar>
+              <w:top w:type="dxa" w:w="60"/>
+              <w:left w:type="dxa" w:w="100"/>
+              <w:bottom w:type="dxa" w:w="60"/>
+              <w:right w:type="dxa" w:w="100"/>
+            </w:tcMar>
+            <w:vAlign w:val="center"/>
+          </w:tcPr>
+          <w:p>
+            <w:r>
+              <w:rPr>
+                <w:sz w:val="19"/>
+                <w:szCs w:val="19"/>
+              </w:rPr>
+              <w:t xml:space="preserve">Primeiro sprite gerado pelo Codex integrado</w:t>
+            </w:r>
+          </w:p>
+        </w:tc>
+        <w:tc>
+          <w:tcPr>
+            <w:tcW w:type="dxa" w:w="1349"/>
+            <w:tcBorders>
+              <w:top w:val="single" w:color="B7C3D0" w:sz="4"/>
+              <w:left w:val="single" w:color="B7C3D0" w:sz="4"/>
+              <w:bottom w:val="single" w:color="B7C3D0" w:sz="4"/>
+              <w:right w:val="single" w:color="B7C3D0" w:sz="4"/>
+            </w:tcBorders>
+            <w:tcMar>
+              <w:top w:type="dxa" w:w="60"/>
+              <w:left w:type="dxa" w:w="100"/>
+              <w:bottom w:type="dxa" w:w="60"/>
+              <w:right w:type="dxa" w:w="100"/>
+            </w:tcMar>
+            <w:vAlign w:val="center"/>
+          </w:tcPr>
+          <w:p>
+            <w:r>
+              <w:rPr>
+                <w:sz w:val="19"/>
+                <w:szCs w:val="19"/>
+              </w:rPr>
+              <w:t xml:space="preserve">Claude</w:t>
+            </w:r>
+          </w:p>
+        </w:tc>
+        <w:tc>
+          <w:tcPr>
+            <w:tcW w:type="dxa" w:w="1253"/>
+            <w:tcBorders>
+              <w:top w:val="single" w:color="B7C3D0" w:sz="4"/>
+              <w:left w:val="single" w:color="B7C3D0" w:sz="4"/>
+              <w:bottom w:val="single" w:color="B7C3D0" w:sz="4"/>
+              <w:right w:val="single" w:color="B7C3D0" w:sz="4"/>
+            </w:tcBorders>
+            <w:tcMar>
+              <w:top w:type="dxa" w:w="60"/>
+              <w:left w:type="dxa" w:w="100"/>
+              <w:bottom w:type="dxa" w:w="60"/>
+              <w:right w:type="dxa" w:w="100"/>
+            </w:tcMar>
+            <w:vAlign w:val="center"/>
+          </w:tcPr>
+          <w:p>
+            <w:r>
+              <w:rPr>
+                <w:sz w:val="19"/>
+                <w:szCs w:val="19"/>
+              </w:rPr>
+              <w:t xml:space="preserve">☐ Pendente</w:t>
+            </w:r>
+          </w:p>
+        </w:tc>
+        <w:tc>
+          <w:tcPr>
+            <w:tcW w:type="dxa" w:w="2024"/>
+            <w:tcBorders>
+              <w:top w:val="single" w:color="B7C3D0" w:sz="4"/>
+              <w:left w:val="single" w:color="B7C3D0" w:sz="4"/>
+              <w:bottom w:val="single" w:color="B7C3D0" w:sz="4"/>
+              <w:right w:val="single" w:color="B7C3D0" w:sz="4"/>
+            </w:tcBorders>
+            <w:tcMar>
+              <w:top w:type="dxa" w:w="60"/>
+              <w:left w:type="dxa" w:w="100"/>
+              <w:bottom w:type="dxa" w:w="60"/>
+              <w:right w:type="dxa" w:w="100"/>
+            </w:tcMar>
+            <w:vAlign w:val="center"/>
+          </w:tcPr>
+          <w:p/>
+        </w:tc>
+      </w:tr>
+      <w:tr>
+        <w:tc>
+          <w:tcPr>
+            <w:tcW w:type="dxa" w:w="771"/>
+            <w:tcBorders>
+              <w:top w:val="single" w:color="B7C3D0" w:sz="4"/>
+              <w:left w:val="single" w:color="B7C3D0" w:sz="4"/>
+              <w:bottom w:val="single" w:color="B7C3D0" w:sz="4"/>
+              <w:right w:val="single" w:color="B7C3D0" w:sz="4"/>
+            </w:tcBorders>
+            <w:tcMar>
+              <w:top w:type="dxa" w:w="60"/>
+              <w:left w:type="dxa" w:w="100"/>
+              <w:bottom w:type="dxa" w:w="60"/>
+              <w:right w:type="dxa" w:w="100"/>
+            </w:tcMar>
+            <w:vAlign w:val="center"/>
+          </w:tcPr>
+          <w:p>
+            <w:r>
+              <w:rPr>
+                <w:sz w:val="19"/>
+                <w:szCs w:val="19"/>
+              </w:rPr>
+              <w:t xml:space="preserve">F1.12</w:t>
             </w:r>
           </w:p>
         </w:tc>
@@ -16738,7 +17159,7 @@
                 <w:sz w:val="19"/>
                 <w:szCs w:val="19"/>
               </w:rPr>
-              <w:t xml:space="preserve">Sistema de progressão (grid ou gemas)</w:t>
+              <w:t xml:space="preserve">Árvores de habilidade por personagem</w:t>
             </w:r>
           </w:p>
         </w:tc>
@@ -16819,7 +17240,7 @@
                 <w:sz w:val="19"/>
                 <w:szCs w:val="19"/>
               </w:rPr>
-              <w:t xml:space="preserve">Depende de D-05</w:t>
+              <w:t xml:space="preserve">D-05</w:t>
             </w:r>
           </w:p>
         </w:tc>
@@ -16875,7 +17296,7 @@
                 <w:sz w:val="19"/>
                 <w:szCs w:val="19"/>
               </w:rPr>
-              <w:t xml:space="preserve">Inventário e equipamento</w:t>
+              <w:t xml:space="preserve">Gemas equipáveis com nível</w:t>
             </w:r>
           </w:p>
         </w:tc>
@@ -16950,7 +17371,15 @@
             </w:tcMar>
             <w:vAlign w:val="center"/>
           </w:tcPr>
-          <w:p/>
+          <w:p>
+            <w:r>
+              <w:rPr>
+                <w:sz w:val="19"/>
+                <w:szCs w:val="19"/>
+              </w:rPr>
+              <w:t xml:space="preserve">D-05</w:t>
+            </w:r>
+          </w:p>
         </w:tc>
       </w:tr>
       <w:tr>
@@ -17004,7 +17433,7 @@
                 <w:sz w:val="19"/>
                 <w:szCs w:val="19"/>
               </w:rPr>
-              <w:t xml:space="preserve">Lojas e estalagens</w:t>
+              <w:t xml:space="preserve">Inventário e equipamento</w:t>
             </w:r>
           </w:p>
         </w:tc>
@@ -17133,7 +17562,7 @@
                 <w:sz w:val="19"/>
                 <w:szCs w:val="19"/>
               </w:rPr>
-              <w:t xml:space="preserve">Menu principal completo</w:t>
+              <w:t xml:space="preserve">Lojas e estalagens</w:t>
             </w:r>
           </w:p>
         </w:tc>
@@ -17262,7 +17691,7 @@
                 <w:sz w:val="19"/>
                 <w:szCs w:val="19"/>
               </w:rPr>
-              <w:t xml:space="preserve">Diálogo com retratos, escolhas e flags</w:t>
+              <w:t xml:space="preserve">Menu principal completo</w:t>
             </w:r>
           </w:p>
         </w:tc>
@@ -17391,7 +17820,7 @@
                 <w:sz w:val="19"/>
                 <w:szCs w:val="19"/>
               </w:rPr>
-              <w:t xml:space="preserve">Sistema de cutscenes</w:t>
+              <w:t xml:space="preserve">Diálogo com retratos, escolhas e flags</w:t>
             </w:r>
           </w:p>
         </w:tc>
@@ -17520,7 +17949,7 @@
                 <w:sz w:val="19"/>
                 <w:szCs w:val="19"/>
               </w:rPr>
-              <w:t xml:space="preserve">Missões e diário</w:t>
+              <w:t xml:space="preserve">Sistema de cutscenes</w:t>
             </w:r>
           </w:p>
         </w:tc>
@@ -17649,7 +18078,7 @@
                 <w:sz w:val="19"/>
                 <w:szCs w:val="19"/>
               </w:rPr>
-              <w:t xml:space="preserve">Salvar / carregar</w:t>
+              <w:t xml:space="preserve">Missões e diário</w:t>
             </w:r>
           </w:p>
         </w:tc>
@@ -17778,7 +18207,7 @@
                 <w:sz w:val="19"/>
                 <w:szCs w:val="19"/>
               </w:rPr>
-              <w:t xml:space="preserve">AudioManager</w:t>
+              <w:t xml:space="preserve">Salvar / carregar</w:t>
             </w:r>
           </w:p>
         </w:tc>
@@ -17907,7 +18336,7 @@
                 <w:sz w:val="19"/>
                 <w:szCs w:val="19"/>
               </w:rPr>
-              <w:t xml:space="preserve">Tela de opções e localização</w:t>
+              <w:t xml:space="preserve">AudioManager</w:t>
             </w:r>
           </w:p>
         </w:tc>
@@ -18010,6 +18439,135 @@
                 <w:szCs w:val="19"/>
               </w:rPr>
               <w:t xml:space="preserve">F2.19</w:t>
+            </w:r>
+          </w:p>
+        </w:tc>
+        <w:tc>
+          <w:tcPr>
+            <w:tcW w:type="dxa" w:w="4241"/>
+            <w:tcBorders>
+              <w:top w:val="single" w:color="B7C3D0" w:sz="4"/>
+              <w:left w:val="single" w:color="B7C3D0" w:sz="4"/>
+              <w:bottom w:val="single" w:color="B7C3D0" w:sz="4"/>
+              <w:right w:val="single" w:color="B7C3D0" w:sz="4"/>
+            </w:tcBorders>
+            <w:tcMar>
+              <w:top w:type="dxa" w:w="60"/>
+              <w:left w:type="dxa" w:w="100"/>
+              <w:bottom w:type="dxa" w:w="60"/>
+              <w:right w:type="dxa" w:w="100"/>
+            </w:tcMar>
+            <w:vAlign w:val="center"/>
+          </w:tcPr>
+          <w:p>
+            <w:r>
+              <w:rPr>
+                <w:sz w:val="19"/>
+                <w:szCs w:val="19"/>
+              </w:rPr>
+              <w:t xml:space="preserve">Tela de opções e localização</w:t>
+            </w:r>
+          </w:p>
+        </w:tc>
+        <w:tc>
+          <w:tcPr>
+            <w:tcW w:type="dxa" w:w="1349"/>
+            <w:tcBorders>
+              <w:top w:val="single" w:color="B7C3D0" w:sz="4"/>
+              <w:left w:val="single" w:color="B7C3D0" w:sz="4"/>
+              <w:bottom w:val="single" w:color="B7C3D0" w:sz="4"/>
+              <w:right w:val="single" w:color="B7C3D0" w:sz="4"/>
+            </w:tcBorders>
+            <w:tcMar>
+              <w:top w:type="dxa" w:w="60"/>
+              <w:left w:type="dxa" w:w="100"/>
+              <w:bottom w:type="dxa" w:w="60"/>
+              <w:right w:type="dxa" w:w="100"/>
+            </w:tcMar>
+            <w:vAlign w:val="center"/>
+          </w:tcPr>
+          <w:p>
+            <w:r>
+              <w:rPr>
+                <w:sz w:val="19"/>
+                <w:szCs w:val="19"/>
+              </w:rPr>
+              <w:t xml:space="preserve">Claude</w:t>
+            </w:r>
+          </w:p>
+        </w:tc>
+        <w:tc>
+          <w:tcPr>
+            <w:tcW w:type="dxa" w:w="1253"/>
+            <w:tcBorders>
+              <w:top w:val="single" w:color="B7C3D0" w:sz="4"/>
+              <w:left w:val="single" w:color="B7C3D0" w:sz="4"/>
+              <w:bottom w:val="single" w:color="B7C3D0" w:sz="4"/>
+              <w:right w:val="single" w:color="B7C3D0" w:sz="4"/>
+            </w:tcBorders>
+            <w:tcMar>
+              <w:top w:type="dxa" w:w="60"/>
+              <w:left w:type="dxa" w:w="100"/>
+              <w:bottom w:type="dxa" w:w="60"/>
+              <w:right w:type="dxa" w:w="100"/>
+            </w:tcMar>
+            <w:vAlign w:val="center"/>
+          </w:tcPr>
+          <w:p>
+            <w:r>
+              <w:rPr>
+                <w:sz w:val="19"/>
+                <w:szCs w:val="19"/>
+              </w:rPr>
+              <w:t xml:space="preserve">☐ Pendente</w:t>
+            </w:r>
+          </w:p>
+        </w:tc>
+        <w:tc>
+          <w:tcPr>
+            <w:tcW w:type="dxa" w:w="2024"/>
+            <w:tcBorders>
+              <w:top w:val="single" w:color="B7C3D0" w:sz="4"/>
+              <w:left w:val="single" w:color="B7C3D0" w:sz="4"/>
+              <w:bottom w:val="single" w:color="B7C3D0" w:sz="4"/>
+              <w:right w:val="single" w:color="B7C3D0" w:sz="4"/>
+            </w:tcBorders>
+            <w:tcMar>
+              <w:top w:type="dxa" w:w="60"/>
+              <w:left w:type="dxa" w:w="100"/>
+              <w:bottom w:type="dxa" w:w="60"/>
+              <w:right w:type="dxa" w:w="100"/>
+            </w:tcMar>
+            <w:vAlign w:val="center"/>
+          </w:tcPr>
+          <w:p/>
+        </w:tc>
+      </w:tr>
+      <w:tr>
+        <w:tc>
+          <w:tcPr>
+            <w:tcW w:type="dxa" w:w="771"/>
+            <w:tcBorders>
+              <w:top w:val="single" w:color="B7C3D0" w:sz="4"/>
+              <w:left w:val="single" w:color="B7C3D0" w:sz="4"/>
+              <w:bottom w:val="single" w:color="B7C3D0" w:sz="4"/>
+              <w:right w:val="single" w:color="B7C3D0" w:sz="4"/>
+            </w:tcBorders>
+            <w:tcMar>
+              <w:top w:type="dxa" w:w="60"/>
+              <w:left w:type="dxa" w:w="100"/>
+              <w:bottom w:type="dxa" w:w="60"/>
+              <w:right w:type="dxa" w:w="100"/>
+            </w:tcMar>
+            <w:vAlign w:val="center"/>
+          </w:tcPr>
+          <w:p>
+            <w:r>
+              <w:rPr>
+                <w:sz w:val="19"/>
+                <w:szCs w:val="19"/>
+              </w:rPr>
+              <w:t xml:space="preserve">F2.20</w:t>
             </w:r>
           </w:p>
         </w:tc>
@@ -19240,7 +19798,7 @@
                 <w:sz w:val="19"/>
                 <w:szCs w:val="19"/>
               </w:rPr>
-              <w:t xml:space="preserve">A definir</w:t>
+              <w:t xml:space="preserve">Claude (IA de áudio)</w:t>
             </w:r>
           </w:p>
         </w:tc>
@@ -23637,7 +24195,15 @@
             </w:tcMar>
             <w:vAlign w:val="center"/>
           </w:tcPr>
-          <w:p/>
+          <w:p>
+            <w:r>
+              <w:rPr>
+                <w:sz w:val="19"/>
+                <w:szCs w:val="19"/>
+              </w:rPr>
+              <w:t xml:space="preserve">assets/_tests/codex_test_01.png</w:t>
+            </w:r>
+          </w:p>
         </w:tc>
         <w:tc>
           <w:tcPr>
@@ -23656,7 +24222,15 @@
             </w:tcMar>
             <w:vAlign w:val="center"/>
           </w:tcPr>
-          <w:p/>
+          <w:p>
+            <w:r>
+              <w:rPr>
+                <w:sz w:val="19"/>
+                <w:szCs w:val="19"/>
+              </w:rPr>
+              <w:t xml:space="preserve">Teste de estilo</w:t>
+            </w:r>
+          </w:p>
         </w:tc>
         <w:tc>
           <w:tcPr>
@@ -23675,7 +24249,15 @@
             </w:tcMar>
             <w:vAlign w:val="center"/>
           </w:tcPr>
-          <w:p/>
+          <w:p>
+            <w:r>
+              <w:rPr>
+                <w:sz w:val="19"/>
+                <w:szCs w:val="19"/>
+              </w:rPr>
+              <w:t xml:space="preserve">F0</w:t>
+            </w:r>
+          </w:p>
         </w:tc>
         <w:tc>
           <w:tcPr>
@@ -23700,7 +24282,7 @@
                 <w:sz w:val="19"/>
                 <w:szCs w:val="19"/>
               </w:rPr>
-              <w:t xml:space="preserve">☐ Pendente</w:t>
+              <w:t xml:space="preserve">☑ Concluída</w:t>
             </w:r>
           </w:p>
         </w:tc>
@@ -23721,7 +24303,15 @@
             </w:tcMar>
             <w:vAlign w:val="center"/>
           </w:tcPr>
-          <w:p/>
+          <w:p>
+            <w:r>
+              <w:rPr>
+                <w:sz w:val="19"/>
+                <w:szCs w:val="19"/>
+              </w:rPr>
+              <w:t xml:space="preserve">Herói, 4 poses, 2056×765; precisa de tratamento de grade/paleta</w:t>
+            </w:r>
+          </w:p>
         </w:tc>
       </w:tr>
       <w:tr>
@@ -24499,7 +25089,7 @@
                 <w:sz w:val="19"/>
                 <w:szCs w:val="19"/>
               </w:rPr>
-              <w:t xml:space="preserve">Falta de áudio</w:t>
+              <w:t xml:space="preserve">Termos de uso do áudio por IA</w:t>
             </w:r>
           </w:p>
         </w:tc>
@@ -24553,7 +25143,7 @@
                 <w:sz w:val="19"/>
                 <w:szCs w:val="19"/>
               </w:rPr>
-              <w:t xml:space="preserve">Médio</w:t>
+              <w:t xml:space="preserve">Alto</w:t>
             </w:r>
           </w:p>
         </w:tc>
@@ -24580,7 +25170,7 @@
                 <w:sz w:val="19"/>
                 <w:szCs w:val="19"/>
               </w:rPr>
-              <w:t xml:space="preserve">Decidir fonte cedo (D-08); usar placeholders livres</w:t>
+              <w:t xml:space="preserve">Escolher ferramenta com licença comercial clara; guardar comprovantes e prompts</w:t>
             </w:r>
           </w:p>
         </w:tc>
@@ -25203,7 +25793,15 @@
             </w:tcMar>
             <w:vAlign w:val="center"/>
           </w:tcPr>
-          <w:p/>
+          <w:p>
+            <w:r>
+              <w:rPr>
+                <w:sz w:val="19"/>
+                <w:szCs w:val="19"/>
+              </w:rPr>
+              <w:t xml:space="preserve">Tom: mistura equilibrada. Mundo: fantasia clássica + steampunk. Título e premissa: pendentes</w:t>
+            </w:r>
+          </w:p>
         </w:tc>
         <w:tc>
           <w:tcPr>
@@ -25222,7 +25820,15 @@
             </w:tcMar>
             <w:vAlign w:val="center"/>
           </w:tcPr>
-          <w:p/>
+          <w:p>
+            <w:r>
+              <w:rPr>
+                <w:sz w:val="19"/>
+                <w:szCs w:val="19"/>
+              </w:rPr>
+              <w:t xml:space="preserve">24/09/2026</w:t>
+            </w:r>
+          </w:p>
         </w:tc>
       </w:tr>
       <w:tr>
@@ -25324,7 +25930,15 @@
             </w:tcMar>
             <w:vAlign w:val="center"/>
           </w:tcPr>
-          <w:p/>
+          <w:p>
+            <w:r>
+              <w:rPr>
+                <w:sz w:val="19"/>
+                <w:szCs w:val="19"/>
+              </w:rPr>
+              <w:t xml:space="preserve">Pixel art 16-bit</w:t>
+            </w:r>
+          </w:p>
         </w:tc>
         <w:tc>
           <w:tcPr>
@@ -25343,7 +25957,15 @@
             </w:tcMar>
             <w:vAlign w:val="center"/>
           </w:tcPr>
-          <w:p/>
+          <w:p>
+            <w:r>
+              <w:rPr>
+                <w:sz w:val="19"/>
+                <w:szCs w:val="19"/>
+              </w:rPr>
+              <w:t xml:space="preserve">24/09/2026</w:t>
+            </w:r>
+          </w:p>
         </w:tc>
       </w:tr>
       <w:tr>
@@ -25424,7 +26046,7 @@
                 <w:sz w:val="19"/>
                 <w:szCs w:val="19"/>
               </w:rPr>
-              <w:t xml:space="preserve">CTB (FFX) / ATB (FF7, CT)</w:t>
+              <w:t xml:space="preserve">CTB (FFX) / ATB (FF7, CT) / Híbrido</w:t>
             </w:r>
           </w:p>
         </w:tc>
@@ -25445,7 +26067,15 @@
             </w:tcMar>
             <w:vAlign w:val="center"/>
           </w:tcPr>
-          <w:p/>
+          <w:p>
+            <w:r>
+              <w:rPr>
+                <w:sz w:val="19"/>
+                <w:szCs w:val="19"/>
+              </w:rPr>
+              <w:t xml:space="preserve">Híbrido: CTB + timing</w:t>
+            </w:r>
+          </w:p>
         </w:tc>
         <w:tc>
           <w:tcPr>
@@ -25464,7 +26094,15 @@
             </w:tcMar>
             <w:vAlign w:val="center"/>
           </w:tcPr>
-          <w:p/>
+          <w:p>
+            <w:r>
+              <w:rPr>
+                <w:sz w:val="19"/>
+                <w:szCs w:val="19"/>
+              </w:rPr>
+              <w:t xml:space="preserve">24/09/2026</w:t>
+            </w:r>
+          </w:p>
         </w:tc>
       </w:tr>
       <w:tr>
@@ -25566,7 +26204,15 @@
             </w:tcMar>
             <w:vAlign w:val="center"/>
           </w:tcPr>
-          <w:p/>
+          <w:p>
+            <w:r>
+              <w:rPr>
+                <w:sz w:val="19"/>
+                <w:szCs w:val="19"/>
+              </w:rPr>
+              <w:t xml:space="preserve">No próprio mapa</w:t>
+            </w:r>
+          </w:p>
         </w:tc>
         <w:tc>
           <w:tcPr>
@@ -25585,7 +26231,15 @@
             </w:tcMar>
             <w:vAlign w:val="center"/>
           </w:tcPr>
-          <w:p/>
+          <w:p>
+            <w:r>
+              <w:rPr>
+                <w:sz w:val="19"/>
+                <w:szCs w:val="19"/>
+              </w:rPr>
+              <w:t xml:space="preserve">24/09/2026</w:t>
+            </w:r>
+          </w:p>
         </w:tc>
       </w:tr>
       <w:tr>
@@ -25666,7 +26320,7 @@
                 <w:sz w:val="19"/>
                 <w:szCs w:val="19"/>
               </w:rPr>
-              <w:t xml:space="preserve">Tabuleiro (Sphere Grid) / Gemas (Materia) / Híbrido</w:t>
+              <w:t xml:space="preserve">Tabuleiro / Gemas / Híbrido</w:t>
             </w:r>
           </w:p>
         </w:tc>
@@ -25687,7 +26341,15 @@
             </w:tcMar>
             <w:vAlign w:val="center"/>
           </w:tcPr>
-          <w:p/>
+          <w:p>
+            <w:r>
+              <w:rPr>
+                <w:sz w:val="19"/>
+                <w:szCs w:val="19"/>
+              </w:rPr>
+              <w:t xml:space="preserve">Híbrido: níveis + árvore + gemas</w:t>
+            </w:r>
+          </w:p>
         </w:tc>
         <w:tc>
           <w:tcPr>
@@ -25706,7 +26368,15 @@
             </w:tcMar>
             <w:vAlign w:val="center"/>
           </w:tcPr>
-          <w:p/>
+          <w:p>
+            <w:r>
+              <w:rPr>
+                <w:sz w:val="19"/>
+                <w:szCs w:val="19"/>
+              </w:rPr>
+              <w:t xml:space="preserve">24/09/2026</w:t>
+            </w:r>
+          </w:p>
         </w:tc>
       </w:tr>
       <w:tr>
@@ -25787,7 +26457,7 @@
                 <w:sz w:val="19"/>
                 <w:szCs w:val="19"/>
               </w:rPr>
-              <w:t xml:space="preserve">Sim / Não</w:t>
+              <w:t xml:space="preserve">Sim / Não / Parcial</w:t>
             </w:r>
           </w:p>
         </w:tc>
@@ -25808,7 +26478,15 @@
             </w:tcMar>
             <w:vAlign w:val="center"/>
           </w:tcPr>
-          <w:p/>
+          <w:p>
+            <w:r>
+              <w:rPr>
+                <w:sz w:val="19"/>
+                <w:szCs w:val="19"/>
+              </w:rPr>
+              <w:t xml:space="preserve">Não</w:t>
+            </w:r>
+          </w:p>
         </w:tc>
         <w:tc>
           <w:tcPr>
@@ -25827,7 +26505,15 @@
             </w:tcMar>
             <w:vAlign w:val="center"/>
           </w:tcPr>
-          <w:p/>
+          <w:p>
+            <w:r>
+              <w:rPr>
+                <w:sz w:val="19"/>
+                <w:szCs w:val="19"/>
+              </w:rPr>
+              <w:t xml:space="preserve">24/09/2026</w:t>
+            </w:r>
+          </w:p>
         </w:tc>
       </w:tr>
       <w:tr>
@@ -25929,7 +26615,15 @@
             </w:tcMar>
             <w:vAlign w:val="center"/>
           </w:tcPr>
-          <w:p/>
+          <w:p>
+            <w:r>
+              <w:rPr>
+                <w:sz w:val="19"/>
+                <w:szCs w:val="19"/>
+              </w:rPr>
+              <w:t xml:space="preserve">640×360 (escala inteira)</w:t>
+            </w:r>
+          </w:p>
         </w:tc>
         <w:tc>
           <w:tcPr>
@@ -25948,7 +26642,15 @@
             </w:tcMar>
             <w:vAlign w:val="center"/>
           </w:tcPr>
-          <w:p/>
+          <w:p>
+            <w:r>
+              <w:rPr>
+                <w:sz w:val="19"/>
+                <w:szCs w:val="19"/>
+              </w:rPr>
+              <w:t xml:space="preserve">24/09/2026</w:t>
+            </w:r>
+          </w:p>
         </w:tc>
       </w:tr>
       <w:tr>
@@ -26050,7 +26752,15 @@
             </w:tcMar>
             <w:vAlign w:val="center"/>
           </w:tcPr>
-          <w:p/>
+          <w:p>
+            <w:r>
+              <w:rPr>
+                <w:sz w:val="19"/>
+                <w:szCs w:val="19"/>
+              </w:rPr>
+              <w:t xml:space="preserve">IA (ferramenta a escolher)</w:t>
+            </w:r>
+          </w:p>
         </w:tc>
         <w:tc>
           <w:tcPr>
@@ -26069,7 +26779,152 @@
             </w:tcMar>
             <w:vAlign w:val="center"/>
           </w:tcPr>
-          <w:p/>
+          <w:p>
+            <w:r>
+              <w:rPr>
+                <w:sz w:val="19"/>
+                <w:szCs w:val="19"/>
+              </w:rPr>
+              <w:t xml:space="preserve">24/09/2026</w:t>
+            </w:r>
+          </w:p>
+        </w:tc>
+      </w:tr>
+      <w:tr>
+        <w:tc>
+          <w:tcPr>
+            <w:tcW w:type="dxa" w:w="867"/>
+            <w:tcBorders>
+              <w:top w:val="single" w:color="B7C3D0" w:sz="4"/>
+              <w:left w:val="single" w:color="B7C3D0" w:sz="4"/>
+              <w:bottom w:val="single" w:color="B7C3D0" w:sz="4"/>
+              <w:right w:val="single" w:color="B7C3D0" w:sz="4"/>
+            </w:tcBorders>
+            <w:tcMar>
+              <w:top w:type="dxa" w:w="60"/>
+              <w:left w:type="dxa" w:w="100"/>
+              <w:bottom w:type="dxa" w:w="60"/>
+              <w:right w:type="dxa" w:w="100"/>
+            </w:tcMar>
+            <w:vAlign w:val="center"/>
+          </w:tcPr>
+          <w:p>
+            <w:r>
+              <w:rPr>
+                <w:sz w:val="19"/>
+                <w:szCs w:val="19"/>
+              </w:rPr>
+              <w:t xml:space="preserve">D-09</w:t>
+            </w:r>
+          </w:p>
+        </w:tc>
+        <w:tc>
+          <w:tcPr>
+            <w:tcW w:type="dxa" w:w="2120"/>
+            <w:tcBorders>
+              <w:top w:val="single" w:color="B7C3D0" w:sz="4"/>
+              <w:left w:val="single" w:color="B7C3D0" w:sz="4"/>
+              <w:bottom w:val="single" w:color="B7C3D0" w:sz="4"/>
+              <w:right w:val="single" w:color="B7C3D0" w:sz="4"/>
+            </w:tcBorders>
+            <w:tcMar>
+              <w:top w:type="dxa" w:w="60"/>
+              <w:left w:type="dxa" w:w="100"/>
+              <w:bottom w:type="dxa" w:w="60"/>
+              <w:right w:type="dxa" w:w="100"/>
+            </w:tcMar>
+            <w:vAlign w:val="center"/>
+          </w:tcPr>
+          <w:p>
+            <w:r>
+              <w:rPr>
+                <w:sz w:val="19"/>
+                <w:szCs w:val="19"/>
+              </w:rPr>
+              <w:t xml:space="preserve">Integração com o Codex</w:t>
+            </w:r>
+          </w:p>
+        </w:tc>
+        <w:tc>
+          <w:tcPr>
+            <w:tcW w:type="dxa" w:w="3662"/>
+            <w:tcBorders>
+              <w:top w:val="single" w:color="B7C3D0" w:sz="4"/>
+              <w:left w:val="single" w:color="B7C3D0" w:sz="4"/>
+              <w:bottom w:val="single" w:color="B7C3D0" w:sz="4"/>
+              <w:right w:val="single" w:color="B7C3D0" w:sz="4"/>
+            </w:tcBorders>
+            <w:tcMar>
+              <w:top w:type="dxa" w:w="60"/>
+              <w:left w:type="dxa" w:w="100"/>
+              <w:bottom w:type="dxa" w:w="60"/>
+              <w:right w:type="dxa" w:w="100"/>
+            </w:tcMar>
+            <w:vAlign w:val="center"/>
+          </w:tcPr>
+          <w:p>
+            <w:r>
+              <w:rPr>
+                <w:sz w:val="19"/>
+                <w:szCs w:val="19"/>
+              </w:rPr>
+              <w:t xml:space="preserve">MCP / CLI direto</w:t>
+            </w:r>
+          </w:p>
+        </w:tc>
+        <w:tc>
+          <w:tcPr>
+            <w:tcW w:type="dxa" w:w="1831"/>
+            <w:tcBorders>
+              <w:top w:val="single" w:color="B7C3D0" w:sz="4"/>
+              <w:left w:val="single" w:color="B7C3D0" w:sz="4"/>
+              <w:bottom w:val="single" w:color="B7C3D0" w:sz="4"/>
+              <w:right w:val="single" w:color="B7C3D0" w:sz="4"/>
+            </w:tcBorders>
+            <w:tcMar>
+              <w:top w:type="dxa" w:w="60"/>
+              <w:left w:type="dxa" w:w="100"/>
+              <w:bottom w:type="dxa" w:w="60"/>
+              <w:right w:type="dxa" w:w="100"/>
+            </w:tcMar>
+            <w:vAlign w:val="center"/>
+          </w:tcPr>
+          <w:p>
+            <w:r>
+              <w:rPr>
+                <w:sz w:val="19"/>
+                <w:szCs w:val="19"/>
+              </w:rPr>
+              <w:t xml:space="preserve">Codex CLI 0.156.1 via tools/gen_image.ps1 (a ponte MCP 0.114 é incompatível com os modelos da conta)</w:t>
+            </w:r>
+          </w:p>
+        </w:tc>
+        <w:tc>
+          <w:tcPr>
+            <w:tcW w:type="dxa" w:w="1158"/>
+            <w:tcBorders>
+              <w:top w:val="single" w:color="B7C3D0" w:sz="4"/>
+              <w:left w:val="single" w:color="B7C3D0" w:sz="4"/>
+              <w:bottom w:val="single" w:color="B7C3D0" w:sz="4"/>
+              <w:right w:val="single" w:color="B7C3D0" w:sz="4"/>
+            </w:tcBorders>
+            <w:tcMar>
+              <w:top w:type="dxa" w:w="60"/>
+              <w:left w:type="dxa" w:w="100"/>
+              <w:bottom w:type="dxa" w:w="60"/>
+              <w:right w:type="dxa" w:w="100"/>
+            </w:tcMar>
+            <w:vAlign w:val="center"/>
+          </w:tcPr>
+          <w:p>
+            <w:r>
+              <w:rPr>
+                <w:sz w:val="19"/>
+                <w:szCs w:val="19"/>
+              </w:rPr>
+              <w:t xml:space="preserve">24/09/2026</w:t>
+            </w:r>
+          </w:p>
         </w:tc>
       </w:tr>
     </w:tbl>
@@ -26280,6 +27135,89 @@
           </w:p>
         </w:tc>
       </w:tr>
+      <w:tr>
+        <w:tc>
+          <w:tcPr>
+            <w:tcW w:type="dxa" w:w="1157"/>
+            <w:tcBorders>
+              <w:top w:val="single" w:color="B7C3D0" w:sz="4"/>
+              <w:left w:val="single" w:color="B7C3D0" w:sz="4"/>
+              <w:bottom w:val="single" w:color="B7C3D0" w:sz="4"/>
+              <w:right w:val="single" w:color="B7C3D0" w:sz="4"/>
+            </w:tcBorders>
+            <w:tcMar>
+              <w:top w:type="dxa" w:w="60"/>
+              <w:left w:type="dxa" w:w="100"/>
+              <w:bottom w:type="dxa" w:w="60"/>
+              <w:right w:type="dxa" w:w="100"/>
+            </w:tcMar>
+            <w:vAlign w:val="center"/>
+          </w:tcPr>
+          <w:p>
+            <w:r>
+              <w:rPr>
+                <w:sz w:val="19"/>
+                <w:szCs w:val="19"/>
+              </w:rPr>
+              <w:t xml:space="preserve">0.2</w:t>
+            </w:r>
+          </w:p>
+        </w:tc>
+        <w:tc>
+          <w:tcPr>
+            <w:tcW w:type="dxa" w:w="1735"/>
+            <w:tcBorders>
+              <w:top w:val="single" w:color="B7C3D0" w:sz="4"/>
+              <w:left w:val="single" w:color="B7C3D0" w:sz="4"/>
+              <w:bottom w:val="single" w:color="B7C3D0" w:sz="4"/>
+              <w:right w:val="single" w:color="B7C3D0" w:sz="4"/>
+            </w:tcBorders>
+            <w:tcMar>
+              <w:top w:type="dxa" w:w="60"/>
+              <w:left w:type="dxa" w:w="100"/>
+              <w:bottom w:type="dxa" w:w="60"/>
+              <w:right w:type="dxa" w:w="100"/>
+            </w:tcMar>
+            <w:vAlign w:val="center"/>
+          </w:tcPr>
+          <w:p>
+            <w:r>
+              <w:rPr>
+                <w:sz w:val="19"/>
+                <w:szCs w:val="19"/>
+              </w:rPr>
+              <w:t xml:space="preserve">24/09/2026</w:t>
+            </w:r>
+          </w:p>
+        </w:tc>
+        <w:tc>
+          <w:tcPr>
+            <w:tcW w:type="dxa" w:w="6746"/>
+            <w:tcBorders>
+              <w:top w:val="single" w:color="B7C3D0" w:sz="4"/>
+              <w:left w:val="single" w:color="B7C3D0" w:sz="4"/>
+              <w:bottom w:val="single" w:color="B7C3D0" w:sz="4"/>
+              <w:right w:val="single" w:color="B7C3D0" w:sz="4"/>
+            </w:tcBorders>
+            <w:tcMar>
+              <w:top w:type="dxa" w:w="60"/>
+              <w:left w:type="dxa" w:w="100"/>
+              <w:bottom w:type="dxa" w:w="60"/>
+              <w:right w:type="dxa" w:w="100"/>
+            </w:tcMar>
+            <w:vAlign w:val="center"/>
+          </w:tcPr>
+          <w:p>
+            <w:r>
+              <w:rPr>
+                <w:sz w:val="19"/>
+                <w:szCs w:val="19"/>
+              </w:rPr>
+              <w:t xml:space="preserve">Decisões D-02 a D-09 registradas e D-01 parcial; projeto Godot, Git/GitHub e teste de imagem concluídos; seções de combate, progressão, arte e áudio atualizadas.</w:t>
+            </w:r>
+          </w:p>
+        </w:tc>
+      </w:tr>
     </w:tbl>
     <w:p>
       <w:pPr>
@@ -26304,7 +27242,7 @@
         <w:spacing w:after="60"/>
       </w:pPr>
       <w:r>
-        <w:t xml:space="preserve">Revisar este documento e responder às decisões D-01 a D-08.</w:t>
+        <w:t xml:space="preserve">Definir título e premissa da história (D-01) e esboçar o grupo principal.</w:t>
       </w:r>
     </w:p>
     <w:p>
@@ -26317,7 +27255,7 @@
         <w:spacing w:after="60"/>
       </w:pPr>
       <w:r>
-        <w:t xml:space="preserve">Inicializar Git e criar o projeto Godot com a estrutura de pastas.</w:t>
+        <w:t xml:space="preserve">Criar o Guia de Estilo: paleta fixa, tamanhos de sprite, prompt-base steampunk.</w:t>
       </w:r>
     </w:p>
     <w:p>
@@ -26330,7 +27268,33 @@
         <w:spacing w:after="60"/>
       </w:pPr>
       <w:r>
-        <w:t xml:space="preserve">Fazer um teste de geração de imagem no Codex MCP para definir o guia de estilo.</w:t>
+        <w:t xml:space="preserve">Escrever o GDD do combate híbrido (fórmulas, fila CTB, janelas de timing).</w:t>
+      </w:r>
+    </w:p>
+    <w:p>
+      <w:pPr>
+        <w:pStyle w:val="ListParagraph"/>
+        <w:numPr>
+          <w:ilvl w:val="0"/>
+          <w:numId w:val="5"/>
+        </w:numPr>
+        <w:spacing w:after="60"/>
+      </w:pPr>
+      <w:r>
+        <w:t xml:space="preserve">Configurar input map e framework de testes; iniciar a Fase 1.</w:t>
+      </w:r>
+    </w:p>
+    <w:p>
+      <w:pPr>
+        <w:pStyle w:val="ListParagraph"/>
+        <w:numPr>
+          <w:ilvl w:val="0"/>
+          <w:numId w:val="5"/>
+        </w:numPr>
+        <w:spacing w:after="60"/>
+      </w:pPr>
+      <w:r>
+        <w:t xml:space="preserve">Escolher a ferramenta de IA de áudio.</w:t>
       </w:r>
     </w:p>
     <w:sectPr>

</xml_diff>

<commit_message>
Record premise: O Coracao de Eter (D-01)
</commit_message>
<xml_diff>
--- a/docs/Planejamento_Projeto_RPG.docx
+++ b/docs/Planejamento_Projeto_RPG.docx
@@ -1216,17 +1216,26 @@
         <w:rPr>
           <w:b/>
           <w:bCs/>
-          <w:i/>
-          <w:iCs/>
         </w:rPr>
-        <w:t xml:space="preserve">Premissa e título:</w:t>
+        <w:t xml:space="preserve">Título provisório:</w:t>
       </w:r>
       <w:r>
+        <w:t xml:space="preserve"> O Coração de Éter.</w:t>
+      </w:r>
+    </w:p>
+    <w:p>
+      <w:pPr>
+        <w:spacing w:after="120"/>
+      </w:pPr>
+      <w:r>
         <w:rPr>
-          <w:i/>
-          <w:iCs/>
+          <w:b/>
+          <w:bCs/>
         </w:rPr>
-        <w:t xml:space="preserve"> a definir (ver 7. Narrativa).</w:t>
+        <w:t xml:space="preserve">Premissa:</w:t>
+      </w:r>
+      <w:r>
+        <w:t xml:space="preserve"> um império a vapor extrai o Éter — a energia vital do mundo — para mover suas máquinas, e a magia está morrendo. Um aprendiz de mecânico de uma cidade-oficina na fronteira do Império descobre que consegue ouvir as máquinas quando um autômato antigo desperta e diz o seu nome. No Ato 2, o grupo descobre que o verdadeiro inimigo não é o Império, e sim quem criou o Éter.</w:t>
       </w:r>
     </w:p>
     <w:p>
@@ -7436,7 +7445,15 @@
             </w:tcMar>
             <w:vAlign w:val="center"/>
           </w:tcPr>
-          <w:p/>
+          <w:p>
+            <w:r>
+              <w:rPr>
+                <w:sz w:val="19"/>
+                <w:szCs w:val="19"/>
+              </w:rPr>
+              <w:t xml:space="preserve">O Coração de Éter (provisório)</w:t>
+            </w:r>
+          </w:p>
         </w:tc>
         <w:tc>
           <w:tcPr>
@@ -7461,7 +7478,7 @@
                 <w:sz w:val="19"/>
                 <w:szCs w:val="19"/>
               </w:rPr>
-              <w:t xml:space="preserve">☐ Pendente</w:t>
+              <w:t xml:space="preserve">◐ Em andamento</w:t>
             </w:r>
           </w:p>
         </w:tc>
@@ -7511,7 +7528,15 @@
             </w:tcMar>
             <w:vAlign w:val="center"/>
           </w:tcPr>
-          <w:p/>
+          <w:p>
+            <w:r>
+              <w:rPr>
+                <w:sz w:val="19"/>
+                <w:szCs w:val="19"/>
+              </w:rPr>
+              <w:t xml:space="preserve">Império a vapor drena o Éter e a magia morre; aprendiz de mecânico que ouve máquinas é chamado pelo nome por um autômato antigo</w:t>
+            </w:r>
+          </w:p>
         </w:tc>
         <w:tc>
           <w:tcPr>
@@ -7536,7 +7561,7 @@
                 <w:sz w:val="19"/>
                 <w:szCs w:val="19"/>
               </w:rPr>
-              <w:t xml:space="preserve">☐ Pendente</w:t>
+              <w:t xml:space="preserve">☑ Concluída</w:t>
             </w:r>
           </w:p>
         </w:tc>
@@ -7586,7 +7611,15 @@
             </w:tcMar>
             <w:vAlign w:val="center"/>
           </w:tcPr>
-          <w:p/>
+          <w:p>
+            <w:r>
+              <w:rPr>
+                <w:sz w:val="19"/>
+                <w:szCs w:val="19"/>
+              </w:rPr>
+              <w:t xml:space="preserve">Progresso x natureza; o preço do progresso e o sacrifício</w:t>
+            </w:r>
+          </w:p>
         </w:tc>
         <w:tc>
           <w:tcPr>
@@ -7611,7 +7644,7 @@
                 <w:sz w:val="19"/>
                 <w:szCs w:val="19"/>
               </w:rPr>
-              <w:t xml:space="preserve">☐ Pendente</w:t>
+              <w:t xml:space="preserve">◐ Em andamento</w:t>
             </w:r>
           </w:p>
         </w:tc>
@@ -7910,7 +7943,15 @@
             </w:tcMar>
             <w:vAlign w:val="center"/>
           </w:tcPr>
-          <w:p/>
+          <w:p>
+            <w:r>
+              <w:rPr>
+                <w:sz w:val="19"/>
+                <w:szCs w:val="19"/>
+              </w:rPr>
+              <w:t xml:space="preserve">Aprendiz de mecânico de uma cidade-oficina na fronteira do Império; ouve as máquinas</w:t>
+            </w:r>
+          </w:p>
         </w:tc>
         <w:tc>
           <w:tcPr>
@@ -7935,7 +7976,7 @@
                 <w:sz w:val="19"/>
                 <w:szCs w:val="19"/>
               </w:rPr>
-              <w:t xml:space="preserve">☐ Pendente</w:t>
+              <w:t xml:space="preserve">◐ Em andamento</w:t>
             </w:r>
           </w:p>
         </w:tc>
@@ -8060,7 +8101,15 @@
             </w:tcMar>
             <w:vAlign w:val="center"/>
           </w:tcPr>
-          <w:p/>
+          <w:p>
+            <w:r>
+              <w:rPr>
+                <w:sz w:val="19"/>
+                <w:szCs w:val="19"/>
+              </w:rPr>
+              <w:t xml:space="preserve">Aparente: o Império. Real: o criador do Éter (revelado no Ato 2)</w:t>
+            </w:r>
+          </w:p>
         </w:tc>
         <w:tc>
           <w:tcPr>
@@ -8085,7 +8134,7 @@
                 <w:sz w:val="19"/>
                 <w:szCs w:val="19"/>
               </w:rPr>
-              <w:t xml:space="preserve">☐ Pendente</w:t>
+              <w:t xml:space="preserve">◐ Em andamento</w:t>
             </w:r>
           </w:p>
         </w:tc>
@@ -11793,7 +11842,7 @@
                 <w:sz w:val="19"/>
                 <w:szCs w:val="19"/>
               </w:rPr>
-              <w:t xml:space="preserve">◐ Em andamento</w:t>
+              <w:t xml:space="preserve">☑ Concluída</w:t>
             </w:r>
           </w:p>
         </w:tc>
@@ -11820,7 +11869,7 @@
                 <w:sz w:val="19"/>
                 <w:szCs w:val="19"/>
               </w:rPr>
-              <w:t xml:space="preserve">D-01: tom e mundo definidos; falta título e premissa</w:t>
+              <w:t xml:space="preserve">D-01: O Coração de Éter</w:t>
             </w:r>
           </w:p>
         </w:tc>
@@ -25799,7 +25848,7 @@
                 <w:sz w:val="19"/>
                 <w:szCs w:val="19"/>
               </w:rPr>
-              <w:t xml:space="preserve">Tom: mistura equilibrada. Mundo: fantasia clássica + steampunk. Título e premissa: pendentes</w:t>
+              <w:t xml:space="preserve">O Coração de Éter (título provisório). Tom: mistura equilibrada. Mundo: fantasia clássica + steampunk</w:t>
             </w:r>
           </w:p>
         </w:tc>
@@ -27213,7 +27262,7 @@
                 <w:sz w:val="19"/>
                 <w:szCs w:val="19"/>
               </w:rPr>
-              <w:t xml:space="preserve">Decisões D-02 a D-09 registradas e D-01 parcial; projeto Godot, Git/GitHub e teste de imagem concluídos; seções de combate, progressão, arte e áudio atualizadas.</w:t>
+              <w:t xml:space="preserve">Decisões D-01 a D-09 registradas (premissa: O Coração de Éter); projeto Godot, Git/GitHub e teste de imagem concluídos; seções de combate, progressão, arte e áudio atualizadas.</w:t>
             </w:r>
           </w:p>
         </w:tc>
@@ -27242,7 +27291,7 @@
         <w:spacing w:after="60"/>
       </w:pPr>
       <w:r>
-        <w:t xml:space="preserve">Definir título e premissa da história (D-01) e esboçar o grupo principal.</w:t>
+        <w:t xml:space="preserve">Detalhar a história de O Coração de Éter: protagonista, grupo principal, antagonista e estrutura em atos.</w:t>
       </w:r>
     </w:p>
     <w:p>

</xml_diff>

<commit_message>
Add story bible draft v0.1 (O Coracao de Eter)
</commit_message>
<xml_diff>
--- a/docs/Planejamento_Projeto_RPG.docx
+++ b/docs/Planejamento_Projeto_RPG.docx
@@ -8026,7 +8026,15 @@
             </w:tcMar>
             <w:vAlign w:val="center"/>
           </w:tcPr>
-          <w:p/>
+          <w:p>
+            <w:r>
+              <w:rPr>
+                <w:sz w:val="19"/>
+                <w:szCs w:val="19"/>
+              </w:rPr>
+              <w:t xml:space="preserve">Proposta: Kael, Eco, Lyra, Brann, Mira, Selene, Isolde (ver bíblia da história)</w:t>
+            </w:r>
+          </w:p>
         </w:tc>
         <w:tc>
           <w:tcPr>
@@ -8051,7 +8059,7 @@
                 <w:sz w:val="19"/>
                 <w:szCs w:val="19"/>
               </w:rPr>
-              <w:t xml:space="preserve">☐ Pendente</w:t>
+              <w:t xml:space="preserve">◐ Em andamento</w:t>
             </w:r>
           </w:p>
         </w:tc>
@@ -13873,7 +13881,7 @@
                 <w:sz w:val="19"/>
                 <w:szCs w:val="19"/>
               </w:rPr>
-              <w:t xml:space="preserve">☐ Pendente</w:t>
+              <w:t xml:space="preserve">◐ Em andamento</w:t>
             </w:r>
           </w:p>
         </w:tc>
@@ -13894,7 +13902,15 @@
             </w:tcMar>
             <w:vAlign w:val="center"/>
           </w:tcPr>
-          <w:p/>
+          <w:p>
+            <w:r>
+              <w:rPr>
+                <w:sz w:val="19"/>
+                <w:szCs w:val="19"/>
+              </w:rPr>
+              <w:t xml:space="preserve">Rascunho v0.1: docs/Historia_O_Coracao_de_Eter.docx</w:t>
+            </w:r>
+          </w:p>
         </w:tc>
       </w:tr>
       <w:tr>

</xml_diff>

<commit_message>
Style guide v0.1: Velmora 32 palette, prompt base, pixelize tool, official Kael reference
</commit_message>
<xml_diff>
--- a/docs/Planejamento_Projeto_RPG.docx
+++ b/docs/Planejamento_Projeto_RPG.docx
@@ -233,7 +233,7 @@
                 <w:sz w:val="19"/>
                 <w:szCs w:val="19"/>
               </w:rPr>
-              <w:t xml:space="preserve">0.4 — história aprovada</w:t>
+              <w:t xml:space="preserve">0.5 — guia de estilo</w:t>
             </w:r>
           </w:p>
         </w:tc>
@@ -4283,6 +4283,101 @@
           </w:tcPr>
           <w:p>
             <w:pPr>
+              <w:keepNext/>
+            </w:pPr>
+            <w:r>
+              <w:rPr>
+                <w:sz w:val="19"/>
+                <w:szCs w:val="19"/>
+              </w:rPr>
+              <w:t xml:space="preserve">tools/art/pixelize.mjs</w:t>
+            </w:r>
+          </w:p>
+        </w:tc>
+        <w:tc>
+          <w:tcPr>
+            <w:tcW w:type="dxa" w:w="4144"/>
+            <w:tcBorders>
+              <w:top w:val="single" w:color="B7C3D0" w:sz="4"/>
+              <w:left w:val="single" w:color="B7C3D0" w:sz="4"/>
+              <w:bottom w:val="single" w:color="B7C3D0" w:sz="4"/>
+              <w:right w:val="single" w:color="B7C3D0" w:sz="4"/>
+            </w:tcBorders>
+            <w:tcMar>
+              <w:top w:type="dxa" w:w="60"/>
+              <w:left w:type="dxa" w:w="100"/>
+              <w:bottom w:type="dxa" w:w="60"/>
+              <w:right w:type="dxa" w:w="100"/>
+            </w:tcMar>
+            <w:vAlign w:val="center"/>
+          </w:tcPr>
+          <w:p>
+            <w:pPr>
+              <w:keepNext/>
+            </w:pPr>
+            <w:r>
+              <w:rPr>
+                <w:sz w:val="19"/>
+                <w:szCs w:val="19"/>
+              </w:rPr>
+              <w:t xml:space="preserve">Converte imagem do Codex em sprite (fundo, grade, paleta)</w:t>
+            </w:r>
+          </w:p>
+        </w:tc>
+        <w:tc>
+          <w:tcPr>
+            <w:tcW w:type="dxa" w:w="3374"/>
+            <w:tcBorders>
+              <w:top w:val="single" w:color="B7C3D0" w:sz="4"/>
+              <w:left w:val="single" w:color="B7C3D0" w:sz="4"/>
+              <w:bottom w:val="single" w:color="B7C3D0" w:sz="4"/>
+              <w:right w:val="single" w:color="B7C3D0" w:sz="4"/>
+            </w:tcBorders>
+            <w:tcMar>
+              <w:top w:type="dxa" w:w="60"/>
+              <w:left w:type="dxa" w:w="100"/>
+              <w:bottom w:type="dxa" w:w="60"/>
+              <w:right w:type="dxa" w:w="100"/>
+            </w:tcMar>
+            <w:vAlign w:val="center"/>
+          </w:tcPr>
+          <w:p>
+            <w:pPr>
+              <w:keepNext/>
+            </w:pPr>
+            <w:r>
+              <w:rPr>
+                <w:sz w:val="19"/>
+                <w:szCs w:val="19"/>
+              </w:rPr>
+              <w:t xml:space="preserve">Node + @napi-rs/canvas</w:t>
+            </w:r>
+          </w:p>
+        </w:tc>
+      </w:tr>
+      <w:tr>
+        <w:trPr>
+          <w:cantSplit/>
+        </w:trPr>
+        <w:tc>
+          <w:tcPr>
+            <w:tcW w:type="dxa" w:w="2120"/>
+            <w:tcBorders>
+              <w:top w:val="single" w:color="B7C3D0" w:sz="4"/>
+              <w:left w:val="single" w:color="B7C3D0" w:sz="4"/>
+              <w:bottom w:val="single" w:color="B7C3D0" w:sz="4"/>
+              <w:right w:val="single" w:color="B7C3D0" w:sz="4"/>
+            </w:tcBorders>
+            <w:tcMar>
+              <w:top w:type="dxa" w:w="60"/>
+              <w:left w:type="dxa" w:w="100"/>
+              <w:bottom w:type="dxa" w:w="60"/>
+              <w:right w:type="dxa" w:w="100"/>
+            </w:tcMar>
+            <w:vAlign w:val="center"/>
+          </w:tcPr>
+          <w:p>
+            <w:pPr>
               <w:keepNext w:val="false"/>
             </w:pPr>
             <w:r>
@@ -4350,7 +4445,7 @@
                 <w:sz w:val="19"/>
                 <w:szCs w:val="19"/>
               </w:rPr>
-              <w:t xml:space="preserve">Opcional</w:t>
+              <w:t xml:space="preserve">Opcional; paleta velmora32.hex</w:t>
             </w:r>
           </w:p>
         </w:tc>
@@ -6707,7 +6802,7 @@
                 <w:sz w:val="19"/>
                 <w:szCs w:val="19"/>
               </w:rPr>
-              <w:t xml:space="preserve">~32×48 px</w:t>
+              <w:t xml:space="preserve">~32×56 px em célula 64×64 (ver Guia de Estilo)</w:t>
             </w:r>
           </w:p>
         </w:tc>
@@ -15587,7 +15682,7 @@
                 <w:sz w:val="19"/>
                 <w:szCs w:val="19"/>
               </w:rPr>
-              <w:t xml:space="preserve">☐ Pendente</w:t>
+              <w:t xml:space="preserve">◐ Em andamento</w:t>
             </w:r>
           </w:p>
         </w:tc>
@@ -15612,6 +15707,13 @@
             <w:pPr>
               <w:keepNext/>
             </w:pPr>
+            <w:r>
+              <w:rPr>
+                <w:sz w:val="19"/>
+                <w:szCs w:val="19"/>
+              </w:rPr>
+              <w:t xml:space="preserve">v0.1 aguardando aprovação: docs/Guia_de_Estilo.docx</w:t>
+            </w:r>
           </w:p>
         </w:tc>
       </w:tr>
@@ -27831,6 +27933,13 @@
             <w:pPr>
               <w:keepNext/>
             </w:pPr>
+            <w:r>
+              <w:rPr>
+                <w:sz w:val="19"/>
+                <w:szCs w:val="19"/>
+              </w:rPr>
+              <w:t xml:space="preserve">assets/_source/chr_kael_ref_raw_v1.png</w:t>
+            </w:r>
           </w:p>
         </w:tc>
         <w:tc>
@@ -27854,6 +27963,13 @@
             <w:pPr>
               <w:keepNext/>
             </w:pPr>
+            <w:r>
+              <w:rPr>
+                <w:sz w:val="19"/>
+                <w:szCs w:val="19"/>
+              </w:rPr>
+              <w:t xml:space="preserve">Referência (bruta)</w:t>
+            </w:r>
           </w:p>
         </w:tc>
         <w:tc>
@@ -27877,6 +27993,13 @@
             <w:pPr>
               <w:keepNext/>
             </w:pPr>
+            <w:r>
+              <w:rPr>
+                <w:sz w:val="19"/>
+                <w:szCs w:val="19"/>
+              </w:rPr>
+              <w:t xml:space="preserve">F0</w:t>
+            </w:r>
           </w:p>
         </w:tc>
         <w:tc>
@@ -27905,7 +28028,7 @@
                 <w:sz w:val="19"/>
                 <w:szCs w:val="19"/>
               </w:rPr>
-              <w:t xml:space="preserve">☐ Pendente</w:t>
+              <w:t xml:space="preserve">☑ Concluída</w:t>
             </w:r>
           </w:p>
         </w:tc>
@@ -27930,6 +28053,13 @@
             <w:pPr>
               <w:keepNext/>
             </w:pPr>
+            <w:r>
+              <w:rPr>
+                <w:sz w:val="19"/>
+                <w:szCs w:val="19"/>
+              </w:rPr>
+              <w:t xml:space="preserve">Kael oficial, 4 poses, fundo transparente</w:t>
+            </w:r>
           </w:p>
         </w:tc>
       </w:tr>
@@ -27988,6 +28118,13 @@
             <w:pPr>
               <w:keepNext w:val="false"/>
             </w:pPr>
+            <w:r>
+              <w:rPr>
+                <w:sz w:val="19"/>
+                <w:szCs w:val="19"/>
+              </w:rPr>
+              <w:t xml:space="preserve">assets/sprites/characters/kael/chr_kael_ref.png</w:t>
+            </w:r>
           </w:p>
         </w:tc>
         <w:tc>
@@ -28011,6 +28148,13 @@
             <w:pPr>
               <w:keepNext w:val="false"/>
             </w:pPr>
+            <w:r>
+              <w:rPr>
+                <w:sz w:val="19"/>
+                <w:szCs w:val="19"/>
+              </w:rPr>
+              <w:t xml:space="preserve">Sprite</w:t>
+            </w:r>
           </w:p>
         </w:tc>
         <w:tc>
@@ -28034,6 +28178,13 @@
             <w:pPr>
               <w:keepNext w:val="false"/>
             </w:pPr>
+            <w:r>
+              <w:rPr>
+                <w:sz w:val="19"/>
+                <w:szCs w:val="19"/>
+              </w:rPr>
+              <w:t xml:space="preserve">F0</w:t>
+            </w:r>
           </w:p>
         </w:tc>
         <w:tc>
@@ -28062,7 +28213,7 @@
                 <w:sz w:val="19"/>
                 <w:szCs w:val="19"/>
               </w:rPr>
-              <w:t xml:space="preserve">☐ Pendente</w:t>
+              <w:t xml:space="preserve">◐ Em andamento</w:t>
             </w:r>
           </w:p>
         </w:tc>
@@ -28087,6 +28238,13 @@
             <w:pPr>
               <w:keepNext w:val="false"/>
             </w:pPr>
+            <w:r>
+              <w:rPr>
+                <w:sz w:val="19"/>
+                <w:szCs w:val="19"/>
+              </w:rPr>
+              <w:t xml:space="preserve">4 quadros 64×64, velmora32; rosto da pose de combate pede retoque</w:t>
+            </w:r>
           </w:p>
         </w:tc>
       </w:tr>
@@ -31178,6 +31336,101 @@
           </w:tcPr>
           <w:p>
             <w:pPr>
+              <w:keepNext/>
+            </w:pPr>
+            <w:r>
+              <w:rPr>
+                <w:sz w:val="19"/>
+                <w:szCs w:val="19"/>
+              </w:rPr>
+              <w:t xml:space="preserve">0.4</w:t>
+            </w:r>
+          </w:p>
+        </w:tc>
+        <w:tc>
+          <w:tcPr>
+            <w:tcW w:type="dxa" w:w="1735"/>
+            <w:tcBorders>
+              <w:top w:val="single" w:color="B7C3D0" w:sz="4"/>
+              <w:left w:val="single" w:color="B7C3D0" w:sz="4"/>
+              <w:bottom w:val="single" w:color="B7C3D0" w:sz="4"/>
+              <w:right w:val="single" w:color="B7C3D0" w:sz="4"/>
+            </w:tcBorders>
+            <w:tcMar>
+              <w:top w:type="dxa" w:w="60"/>
+              <w:left w:type="dxa" w:w="100"/>
+              <w:bottom w:type="dxa" w:w="60"/>
+              <w:right w:type="dxa" w:w="100"/>
+            </w:tcMar>
+            <w:vAlign w:val="center"/>
+          </w:tcPr>
+          <w:p>
+            <w:pPr>
+              <w:keepNext/>
+            </w:pPr>
+            <w:r>
+              <w:rPr>
+                <w:sz w:val="19"/>
+                <w:szCs w:val="19"/>
+              </w:rPr>
+              <w:t xml:space="preserve">24/09/2026</w:t>
+            </w:r>
+          </w:p>
+        </w:tc>
+        <w:tc>
+          <w:tcPr>
+            <w:tcW w:type="dxa" w:w="6746"/>
+            <w:tcBorders>
+              <w:top w:val="single" w:color="B7C3D0" w:sz="4"/>
+              <w:left w:val="single" w:color="B7C3D0" w:sz="4"/>
+              <w:bottom w:val="single" w:color="B7C3D0" w:sz="4"/>
+              <w:right w:val="single" w:color="B7C3D0" w:sz="4"/>
+            </w:tcBorders>
+            <w:tcMar>
+              <w:top w:type="dxa" w:w="60"/>
+              <w:left w:type="dxa" w:w="100"/>
+              <w:bottom w:type="dxa" w:w="60"/>
+              <w:right w:type="dxa" w:w="100"/>
+            </w:tcMar>
+            <w:vAlign w:val="center"/>
+          </w:tcPr>
+          <w:p>
+            <w:pPr>
+              <w:keepNext/>
+            </w:pPr>
+            <w:r>
+              <w:rPr>
+                <w:sz w:val="19"/>
+                <w:szCs w:val="19"/>
+              </w:rPr>
+              <w:t xml:space="preserve">História aprovada (bíblia v0.2): morte simulada de Gerd, triângulo Kael–Lyra–Isolde; sistema de afinidade e matriz de finais adicionados.</w:t>
+            </w:r>
+          </w:p>
+        </w:tc>
+      </w:tr>
+      <w:tr>
+        <w:trPr>
+          <w:cantSplit/>
+        </w:trPr>
+        <w:tc>
+          <w:tcPr>
+            <w:tcW w:type="dxa" w:w="1157"/>
+            <w:tcBorders>
+              <w:top w:val="single" w:color="B7C3D0" w:sz="4"/>
+              <w:left w:val="single" w:color="B7C3D0" w:sz="4"/>
+              <w:bottom w:val="single" w:color="B7C3D0" w:sz="4"/>
+              <w:right w:val="single" w:color="B7C3D0" w:sz="4"/>
+            </w:tcBorders>
+            <w:tcMar>
+              <w:top w:type="dxa" w:w="60"/>
+              <w:left w:type="dxa" w:w="100"/>
+              <w:bottom w:type="dxa" w:w="60"/>
+              <w:right w:type="dxa" w:w="100"/>
+            </w:tcMar>
+            <w:vAlign w:val="center"/>
+          </w:tcPr>
+          <w:p>
+            <w:pPr>
               <w:keepNext w:val="false"/>
             </w:pPr>
             <w:r>
@@ -31185,7 +31438,7 @@
                 <w:sz w:val="19"/>
                 <w:szCs w:val="19"/>
               </w:rPr>
-              <w:t xml:space="preserve">0.4</w:t>
+              <w:t xml:space="preserve">0.5</w:t>
             </w:r>
           </w:p>
         </w:tc>
@@ -31245,7 +31498,7 @@
                 <w:sz w:val="19"/>
                 <w:szCs w:val="19"/>
               </w:rPr>
-              <w:t xml:space="preserve">História aprovada (bíblia v0.2): morte simulada de Gerd, triângulo Kael–Lyra–Isolde; sistema de afinidade e matriz de finais adicionados.</w:t>
+              <w:t xml:space="preserve">Guia de Estilo v0.1 (paleta Velmora 32, tamanhos, prompt-base, pipeline); referência oficial do Kael; ferramenta pixelize.mjs.</w:t>
             </w:r>
           </w:p>
         </w:tc>

</xml_diff>

<commit_message>
Planning doc v0.9: audio license, first test track, combat core
</commit_message>
<xml_diff>
--- a/docs/Planejamento_Projeto_RPG.docx
+++ b/docs/Planejamento_Projeto_RPG.docx
@@ -233,7 +233,7 @@
                 <w:sz w:val="19"/>
                 <w:szCs w:val="19"/>
               </w:rPr>
-              <w:t xml:space="preserve">0.8 — referências e áudio</w:t>
+              <w:t xml:space="preserve">0.9 — primeira música e núcleo do combate</w:t>
             </w:r>
           </w:p>
         </w:tc>
@@ -15731,7 +15731,7 @@
                 <w:sz w:val="19"/>
                 <w:szCs w:val="19"/>
               </w:rPr>
-              <w:t xml:space="preserve">◐ Em andamento</w:t>
+              <w:t xml:space="preserve">☑ Concluída</w:t>
             </w:r>
           </w:p>
         </w:tc>
@@ -15761,7 +15761,7 @@
                 <w:sz w:val="19"/>
                 <w:szCs w:val="19"/>
               </w:rPr>
-              <w:t xml:space="preserve">Suno via MCP da AceDataCloud conectado e testado; falta confirmar licença de uso comercial</w:t>
+              <w:t xml:space="preserve">Suno via MCP da AceDataCloud; conta paga dá direito comercial (confirmado pelo Diretor)</w:t>
             </w:r>
           </w:p>
         </w:tc>
@@ -17680,7 +17680,7 @@
                 <w:sz w:val="19"/>
                 <w:szCs w:val="19"/>
               </w:rPr>
-              <w:t xml:space="preserve">☐ Pendente</w:t>
+              <w:t xml:space="preserve">◐ Em andamento</w:t>
             </w:r>
           </w:p>
         </w:tc>
@@ -17705,6 +17705,13 @@
             <w:pPr>
               <w:keepNext/>
             </w:pPr>
+            <w:r>
+              <w:rPr>
+                <w:sz w:val="19"/>
+                <w:szCs w:val="19"/>
+              </w:rPr>
+              <w:t xml:space="preserve">Lógica pronta e testada (TurnQueue, DamageFormula); falta a interface</w:t>
+            </w:r>
           </w:p>
         </w:tc>
       </w:tr>
@@ -29030,6 +29037,376 @@
           </w:tcPr>
           <w:p>
             <w:pPr>
+              <w:keepNext/>
+            </w:pPr>
+            <w:r>
+              <w:rPr>
+                <w:sz w:val="19"/>
+                <w:szCs w:val="19"/>
+              </w:rPr>
+              <w:t xml:space="preserve">A-007</w:t>
+            </w:r>
+          </w:p>
+        </w:tc>
+        <w:tc>
+          <w:tcPr>
+            <w:tcW w:type="dxa" w:w="2891"/>
+            <w:tcBorders>
+              <w:top w:val="single" w:color="B7C3D0" w:sz="4"/>
+              <w:left w:val="single" w:color="B7C3D0" w:sz="4"/>
+              <w:bottom w:val="single" w:color="B7C3D0" w:sz="4"/>
+              <w:right w:val="single" w:color="B7C3D0" w:sz="4"/>
+            </w:tcBorders>
+            <w:tcMar>
+              <w:top w:type="dxa" w:w="60"/>
+              <w:left w:type="dxa" w:w="100"/>
+              <w:bottom w:type="dxa" w:w="60"/>
+              <w:right w:type="dxa" w:w="100"/>
+            </w:tcMar>
+            <w:vAlign w:val="center"/>
+          </w:tcPr>
+          <w:p>
+            <w:pPr>
+              <w:keepNext/>
+            </w:pPr>
+            <w:r>
+              <w:rPr>
+                <w:sz w:val="19"/>
+                <w:szCs w:val="19"/>
+              </w:rPr>
+              <w:t xml:space="preserve">assets/sprites/characters/lyra/chr_lyra_ref.png</w:t>
+            </w:r>
+          </w:p>
+        </w:tc>
+        <w:tc>
+          <w:tcPr>
+            <w:tcW w:type="dxa" w:w="1349"/>
+            <w:tcBorders>
+              <w:top w:val="single" w:color="B7C3D0" w:sz="4"/>
+              <w:left w:val="single" w:color="B7C3D0" w:sz="4"/>
+              <w:bottom w:val="single" w:color="B7C3D0" w:sz="4"/>
+              <w:right w:val="single" w:color="B7C3D0" w:sz="4"/>
+            </w:tcBorders>
+            <w:tcMar>
+              <w:top w:type="dxa" w:w="60"/>
+              <w:left w:type="dxa" w:w="100"/>
+              <w:bottom w:type="dxa" w:w="60"/>
+              <w:right w:type="dxa" w:w="100"/>
+            </w:tcMar>
+            <w:vAlign w:val="center"/>
+          </w:tcPr>
+          <w:p>
+            <w:pPr>
+              <w:keepNext/>
+            </w:pPr>
+            <w:r>
+              <w:rPr>
+                <w:sz w:val="19"/>
+                <w:szCs w:val="19"/>
+              </w:rPr>
+              <w:t xml:space="preserve">Sprite</w:t>
+            </w:r>
+          </w:p>
+        </w:tc>
+        <w:tc>
+          <w:tcPr>
+            <w:tcW w:type="dxa" w:w="867"/>
+            <w:tcBorders>
+              <w:top w:val="single" w:color="B7C3D0" w:sz="4"/>
+              <w:left w:val="single" w:color="B7C3D0" w:sz="4"/>
+              <w:bottom w:val="single" w:color="B7C3D0" w:sz="4"/>
+              <w:right w:val="single" w:color="B7C3D0" w:sz="4"/>
+            </w:tcBorders>
+            <w:tcMar>
+              <w:top w:type="dxa" w:w="60"/>
+              <w:left w:type="dxa" w:w="100"/>
+              <w:bottom w:type="dxa" w:w="60"/>
+              <w:right w:type="dxa" w:w="100"/>
+            </w:tcMar>
+            <w:vAlign w:val="center"/>
+          </w:tcPr>
+          <w:p>
+            <w:pPr>
+              <w:keepNext/>
+            </w:pPr>
+            <w:r>
+              <w:rPr>
+                <w:sz w:val="19"/>
+                <w:szCs w:val="19"/>
+              </w:rPr>
+              <w:t xml:space="preserve">F0</w:t>
+            </w:r>
+          </w:p>
+        </w:tc>
+        <w:tc>
+          <w:tcPr>
+            <w:tcW w:type="dxa" w:w="1446"/>
+            <w:tcBorders>
+              <w:top w:val="single" w:color="B7C3D0" w:sz="4"/>
+              <w:left w:val="single" w:color="B7C3D0" w:sz="4"/>
+              <w:bottom w:val="single" w:color="B7C3D0" w:sz="4"/>
+              <w:right w:val="single" w:color="B7C3D0" w:sz="4"/>
+            </w:tcBorders>
+            <w:tcMar>
+              <w:top w:type="dxa" w:w="60"/>
+              <w:left w:type="dxa" w:w="100"/>
+              <w:bottom w:type="dxa" w:w="60"/>
+              <w:right w:type="dxa" w:w="100"/>
+            </w:tcMar>
+            <w:vAlign w:val="center"/>
+          </w:tcPr>
+          <w:p>
+            <w:pPr>
+              <w:keepNext/>
+            </w:pPr>
+            <w:r>
+              <w:rPr>
+                <w:sz w:val="19"/>
+                <w:szCs w:val="19"/>
+              </w:rPr>
+              <w:t xml:space="preserve">☑ Concluída</w:t>
+            </w:r>
+          </w:p>
+        </w:tc>
+        <w:tc>
+          <w:tcPr>
+            <w:tcW w:type="dxa" w:w="2218"/>
+            <w:tcBorders>
+              <w:top w:val="single" w:color="B7C3D0" w:sz="4"/>
+              <w:left w:val="single" w:color="B7C3D0" w:sz="4"/>
+              <w:bottom w:val="single" w:color="B7C3D0" w:sz="4"/>
+              <w:right w:val="single" w:color="B7C3D0" w:sz="4"/>
+            </w:tcBorders>
+            <w:tcMar>
+              <w:top w:type="dxa" w:w="60"/>
+              <w:left w:type="dxa" w:w="100"/>
+              <w:bottom w:type="dxa" w:w="60"/>
+              <w:right w:type="dxa" w:w="100"/>
+            </w:tcMar>
+            <w:vAlign w:val="center"/>
+          </w:tcPr>
+          <w:p>
+            <w:pPr>
+              <w:keepNext/>
+            </w:pPr>
+            <w:r>
+              <w:rPr>
+                <w:sz w:val="19"/>
+                <w:szCs w:val="19"/>
+              </w:rPr>
+              <w:t xml:space="preserve">4 quadros 64×64</w:t>
+            </w:r>
+          </w:p>
+        </w:tc>
+      </w:tr>
+      <w:tr>
+        <w:trPr>
+          <w:cantSplit/>
+        </w:trPr>
+        <w:tc>
+          <w:tcPr>
+            <w:tcW w:type="dxa" w:w="867"/>
+            <w:tcBorders>
+              <w:top w:val="single" w:color="B7C3D0" w:sz="4"/>
+              <w:left w:val="single" w:color="B7C3D0" w:sz="4"/>
+              <w:bottom w:val="single" w:color="B7C3D0" w:sz="4"/>
+              <w:right w:val="single" w:color="B7C3D0" w:sz="4"/>
+            </w:tcBorders>
+            <w:tcMar>
+              <w:top w:type="dxa" w:w="60"/>
+              <w:left w:type="dxa" w:w="100"/>
+              <w:bottom w:type="dxa" w:w="60"/>
+              <w:right w:type="dxa" w:w="100"/>
+            </w:tcMar>
+            <w:vAlign w:val="center"/>
+          </w:tcPr>
+          <w:p>
+            <w:pPr>
+              <w:keepNext/>
+            </w:pPr>
+            <w:r>
+              <w:rPr>
+                <w:sz w:val="19"/>
+                <w:szCs w:val="19"/>
+              </w:rPr>
+              <w:t xml:space="preserve">A-008</w:t>
+            </w:r>
+          </w:p>
+        </w:tc>
+        <w:tc>
+          <w:tcPr>
+            <w:tcW w:type="dxa" w:w="2891"/>
+            <w:tcBorders>
+              <w:top w:val="single" w:color="B7C3D0" w:sz="4"/>
+              <w:left w:val="single" w:color="B7C3D0" w:sz="4"/>
+              <w:bottom w:val="single" w:color="B7C3D0" w:sz="4"/>
+              <w:right w:val="single" w:color="B7C3D0" w:sz="4"/>
+            </w:tcBorders>
+            <w:tcMar>
+              <w:top w:type="dxa" w:w="60"/>
+              <w:left w:type="dxa" w:w="100"/>
+              <w:bottom w:type="dxa" w:w="60"/>
+              <w:right w:type="dxa" w:w="100"/>
+            </w:tcMar>
+            <w:vAlign w:val="center"/>
+          </w:tcPr>
+          <w:p>
+            <w:pPr>
+              <w:keepNext/>
+            </w:pPr>
+            <w:r>
+              <w:rPr>
+                <w:sz w:val="19"/>
+                <w:szCs w:val="19"/>
+              </w:rPr>
+              <w:t xml:space="preserve">assets/audio/music/bgm_vila_caldeira_test_a.mp3</w:t>
+            </w:r>
+          </w:p>
+        </w:tc>
+        <w:tc>
+          <w:tcPr>
+            <w:tcW w:type="dxa" w:w="1349"/>
+            <w:tcBorders>
+              <w:top w:val="single" w:color="B7C3D0" w:sz="4"/>
+              <w:left w:val="single" w:color="B7C3D0" w:sz="4"/>
+              <w:bottom w:val="single" w:color="B7C3D0" w:sz="4"/>
+              <w:right w:val="single" w:color="B7C3D0" w:sz="4"/>
+            </w:tcBorders>
+            <w:tcMar>
+              <w:top w:type="dxa" w:w="60"/>
+              <w:left w:type="dxa" w:w="100"/>
+              <w:bottom w:type="dxa" w:w="60"/>
+              <w:right w:type="dxa" w:w="100"/>
+            </w:tcMar>
+            <w:vAlign w:val="center"/>
+          </w:tcPr>
+          <w:p>
+            <w:pPr>
+              <w:keepNext/>
+            </w:pPr>
+            <w:r>
+              <w:rPr>
+                <w:sz w:val="19"/>
+                <w:szCs w:val="19"/>
+              </w:rPr>
+              <w:t xml:space="preserve">Música (teste)</w:t>
+            </w:r>
+          </w:p>
+        </w:tc>
+        <w:tc>
+          <w:tcPr>
+            <w:tcW w:type="dxa" w:w="867"/>
+            <w:tcBorders>
+              <w:top w:val="single" w:color="B7C3D0" w:sz="4"/>
+              <w:left w:val="single" w:color="B7C3D0" w:sz="4"/>
+              <w:bottom w:val="single" w:color="B7C3D0" w:sz="4"/>
+              <w:right w:val="single" w:color="B7C3D0" w:sz="4"/>
+            </w:tcBorders>
+            <w:tcMar>
+              <w:top w:type="dxa" w:w="60"/>
+              <w:left w:type="dxa" w:w="100"/>
+              <w:bottom w:type="dxa" w:w="60"/>
+              <w:right w:type="dxa" w:w="100"/>
+            </w:tcMar>
+            <w:vAlign w:val="center"/>
+          </w:tcPr>
+          <w:p>
+            <w:pPr>
+              <w:keepNext/>
+            </w:pPr>
+            <w:r>
+              <w:rPr>
+                <w:sz w:val="19"/>
+                <w:szCs w:val="19"/>
+              </w:rPr>
+              <w:t xml:space="preserve">F0</w:t>
+            </w:r>
+          </w:p>
+        </w:tc>
+        <w:tc>
+          <w:tcPr>
+            <w:tcW w:type="dxa" w:w="1446"/>
+            <w:tcBorders>
+              <w:top w:val="single" w:color="B7C3D0" w:sz="4"/>
+              <w:left w:val="single" w:color="B7C3D0" w:sz="4"/>
+              <w:bottom w:val="single" w:color="B7C3D0" w:sz="4"/>
+              <w:right w:val="single" w:color="B7C3D0" w:sz="4"/>
+            </w:tcBorders>
+            <w:tcMar>
+              <w:top w:type="dxa" w:w="60"/>
+              <w:left w:type="dxa" w:w="100"/>
+              <w:bottom w:type="dxa" w:w="60"/>
+              <w:right w:type="dxa" w:w="100"/>
+            </w:tcMar>
+            <w:vAlign w:val="center"/>
+          </w:tcPr>
+          <w:p>
+            <w:pPr>
+              <w:keepNext/>
+            </w:pPr>
+            <w:r>
+              <w:rPr>
+                <w:sz w:val="19"/>
+                <w:szCs w:val="19"/>
+              </w:rPr>
+              <w:t xml:space="preserve">◐ Em andamento</w:t>
+            </w:r>
+          </w:p>
+        </w:tc>
+        <w:tc>
+          <w:tcPr>
+            <w:tcW w:type="dxa" w:w="2218"/>
+            <w:tcBorders>
+              <w:top w:val="single" w:color="B7C3D0" w:sz="4"/>
+              <w:left w:val="single" w:color="B7C3D0" w:sz="4"/>
+              <w:bottom w:val="single" w:color="B7C3D0" w:sz="4"/>
+              <w:right w:val="single" w:color="B7C3D0" w:sz="4"/>
+            </w:tcBorders>
+            <w:tcMar>
+              <w:top w:type="dxa" w:w="60"/>
+              <w:left w:type="dxa" w:w="100"/>
+              <w:bottom w:type="dxa" w:w="60"/>
+              <w:right w:type="dxa" w:w="100"/>
+            </w:tcMar>
+            <w:vAlign w:val="center"/>
+          </w:tcPr>
+          <w:p>
+            <w:pPr>
+              <w:keepNext/>
+            </w:pPr>
+            <w:r>
+              <w:rPr>
+                <w:sz w:val="19"/>
+                <w:szCs w:val="19"/>
+              </w:rPr>
+              <w:t xml:space="preserve">Suno chirp-v5-5, 60 s; aguardando avaliação do Diretor</w:t>
+            </w:r>
+          </w:p>
+        </w:tc>
+      </w:tr>
+      <w:tr>
+        <w:trPr>
+          <w:cantSplit/>
+        </w:trPr>
+        <w:tc>
+          <w:tcPr>
+            <w:tcW w:type="dxa" w:w="867"/>
+            <w:tcBorders>
+              <w:top w:val="single" w:color="B7C3D0" w:sz="4"/>
+              <w:left w:val="single" w:color="B7C3D0" w:sz="4"/>
+              <w:bottom w:val="single" w:color="B7C3D0" w:sz="4"/>
+              <w:right w:val="single" w:color="B7C3D0" w:sz="4"/>
+            </w:tcBorders>
+            <w:tcMar>
+              <w:top w:type="dxa" w:w="60"/>
+              <w:left w:type="dxa" w:w="100"/>
+              <w:bottom w:type="dxa" w:w="60"/>
+              <w:right w:type="dxa" w:w="100"/>
+            </w:tcMar>
+            <w:vAlign w:val="center"/>
+          </w:tcPr>
+          <w:p>
+            <w:pPr>
               <w:keepNext w:val="false"/>
             </w:pPr>
             <w:r>
@@ -29037,7 +29414,7 @@
                 <w:sz w:val="19"/>
                 <w:szCs w:val="19"/>
               </w:rPr>
-              <w:t xml:space="preserve">A-007</w:t>
+              <w:t xml:space="preserve">A-009</w:t>
             </w:r>
           </w:p>
         </w:tc>
@@ -29067,7 +29444,7 @@
                 <w:sz w:val="19"/>
                 <w:szCs w:val="19"/>
               </w:rPr>
-              <w:t xml:space="preserve">assets/sprites/characters/lyra/chr_lyra_ref.png</w:t>
+              <w:t xml:space="preserve">assets/audio/music/bgm_vila_caldeira_test_b.mp3</w:t>
             </w:r>
           </w:p>
         </w:tc>
@@ -29097,7 +29474,7 @@
                 <w:sz w:val="19"/>
                 <w:szCs w:val="19"/>
               </w:rPr>
-              <w:t xml:space="preserve">Sprite</w:t>
+              <w:t xml:space="preserve">Música (teste)</w:t>
             </w:r>
           </w:p>
         </w:tc>
@@ -29157,7 +29534,7 @@
                 <w:sz w:val="19"/>
                 <w:szCs w:val="19"/>
               </w:rPr>
-              <w:t xml:space="preserve">☑ Concluída</w:t>
+              <w:t xml:space="preserve">◐ Em andamento</w:t>
             </w:r>
           </w:p>
         </w:tc>
@@ -29187,7 +29564,7 @@
                 <w:sz w:val="19"/>
                 <w:szCs w:val="19"/>
               </w:rPr>
-              <w:t xml:space="preserve">4 quadros 64×64</w:t>
+              <w:t xml:space="preserve">Variação B, 55 s</w:t>
             </w:r>
           </w:p>
         </w:tc>
@@ -29797,7 +30174,7 @@
                 <w:sz w:val="19"/>
                 <w:szCs w:val="19"/>
               </w:rPr>
-              <w:t xml:space="preserve">Média</w:t>
+              <w:t xml:space="preserve">Baixa</w:t>
             </w:r>
           </w:p>
         </w:tc>
@@ -29857,7 +30234,7 @@
                 <w:sz w:val="19"/>
                 <w:szCs w:val="19"/>
               </w:rPr>
-              <w:t xml:space="preserve">Escolher ferramenta com licença comercial clara; guardar comprovantes e prompts</w:t>
+              <w:t xml:space="preserve">Conta paga com direito comercial (confirmado); manter a assinatura ativa ao gerar e guardar prompts e IDs das tarefas</w:t>
             </w:r>
           </w:p>
         </w:tc>
@@ -31647,7 +32024,7 @@
                 <w:sz w:val="19"/>
                 <w:szCs w:val="19"/>
               </w:rPr>
-              <w:t xml:space="preserve">IA: Suno via MCP da AceDataCloud (licença comercial a confirmar)</w:t>
+              <w:t xml:space="preserve">IA: Suno via MCP da AceDataCloud; conta paga com direito comercial sobre as músicas</w:t>
             </w:r>
           </w:p>
         </w:tc>
@@ -32660,6 +33037,101 @@
           </w:tcPr>
           <w:p>
             <w:pPr>
+              <w:keepNext/>
+            </w:pPr>
+            <w:r>
+              <w:rPr>
+                <w:sz w:val="19"/>
+                <w:szCs w:val="19"/>
+              </w:rPr>
+              <w:t xml:space="preserve">0.8</w:t>
+            </w:r>
+          </w:p>
+        </w:tc>
+        <w:tc>
+          <w:tcPr>
+            <w:tcW w:type="dxa" w:w="1735"/>
+            <w:tcBorders>
+              <w:top w:val="single" w:color="B7C3D0" w:sz="4"/>
+              <w:left w:val="single" w:color="B7C3D0" w:sz="4"/>
+              <w:bottom w:val="single" w:color="B7C3D0" w:sz="4"/>
+              <w:right w:val="single" w:color="B7C3D0" w:sz="4"/>
+            </w:tcBorders>
+            <w:tcMar>
+              <w:top w:type="dxa" w:w="60"/>
+              <w:left w:type="dxa" w:w="100"/>
+              <w:bottom w:type="dxa" w:w="60"/>
+              <w:right w:type="dxa" w:w="100"/>
+            </w:tcMar>
+            <w:vAlign w:val="center"/>
+          </w:tcPr>
+          <w:p>
+            <w:pPr>
+              <w:keepNext/>
+            </w:pPr>
+            <w:r>
+              <w:rPr>
+                <w:sz w:val="19"/>
+                <w:szCs w:val="19"/>
+              </w:rPr>
+              <w:t xml:space="preserve">24/09/2026</w:t>
+            </w:r>
+          </w:p>
+        </w:tc>
+        <w:tc>
+          <w:tcPr>
+            <w:tcW w:type="dxa" w:w="6746"/>
+            <w:tcBorders>
+              <w:top w:val="single" w:color="B7C3D0" w:sz="4"/>
+              <w:left w:val="single" w:color="B7C3D0" w:sz="4"/>
+              <w:bottom w:val="single" w:color="B7C3D0" w:sz="4"/>
+              <w:right w:val="single" w:color="B7C3D0" w:sz="4"/>
+            </w:tcBorders>
+            <w:tcMar>
+              <w:top w:type="dxa" w:w="60"/>
+              <w:left w:type="dxa" w:w="100"/>
+              <w:bottom w:type="dxa" w:w="60"/>
+              <w:right w:type="dxa" w:w="100"/>
+            </w:tcMar>
+            <w:vAlign w:val="center"/>
+          </w:tcPr>
+          <w:p>
+            <w:pPr>
+              <w:keepNext/>
+            </w:pPr>
+            <w:r>
+              <w:rPr>
+                <w:sz w:val="19"/>
+                <w:szCs w:val="19"/>
+              </w:rPr>
+              <w:t xml:space="preserve">Referências oficiais do Eco e da Lyra (3 personagens no total); ponte MCP do Codex testada; Suno MCP conectado e token validado.</w:t>
+            </w:r>
+          </w:p>
+        </w:tc>
+      </w:tr>
+      <w:tr>
+        <w:trPr>
+          <w:cantSplit/>
+        </w:trPr>
+        <w:tc>
+          <w:tcPr>
+            <w:tcW w:type="dxa" w:w="1157"/>
+            <w:tcBorders>
+              <w:top w:val="single" w:color="B7C3D0" w:sz="4"/>
+              <w:left w:val="single" w:color="B7C3D0" w:sz="4"/>
+              <w:bottom w:val="single" w:color="B7C3D0" w:sz="4"/>
+              <w:right w:val="single" w:color="B7C3D0" w:sz="4"/>
+            </w:tcBorders>
+            <w:tcMar>
+              <w:top w:type="dxa" w:w="60"/>
+              <w:left w:type="dxa" w:w="100"/>
+              <w:bottom w:type="dxa" w:w="60"/>
+              <w:right w:type="dxa" w:w="100"/>
+            </w:tcMar>
+            <w:vAlign w:val="center"/>
+          </w:tcPr>
+          <w:p>
+            <w:pPr>
               <w:keepNext w:val="false"/>
             </w:pPr>
             <w:r>
@@ -32667,7 +33139,7 @@
                 <w:sz w:val="19"/>
                 <w:szCs w:val="19"/>
               </w:rPr>
-              <w:t xml:space="preserve">0.8</w:t>
+              <w:t xml:space="preserve">0.9</w:t>
             </w:r>
           </w:p>
         </w:tc>
@@ -32727,7 +33199,7 @@
                 <w:sz w:val="19"/>
                 <w:szCs w:val="19"/>
               </w:rPr>
-              <w:t xml:space="preserve">Referências oficiais do Eco e da Lyra (3 personagens no total); ponte MCP do Codex testada; Suno MCP conectado e token validado.</w:t>
+              <w:t xml:space="preserve">Licença do áudio confirmada (conta paga); primeira música de teste (Vila Caldeira, 2 variações); TurnQueue e DamageFormula implementados com 25 testes novos.</w:t>
             </w:r>
           </w:p>
         </w:tc>

</xml_diff>

<commit_message>
Phase 0 done; Phase 1: player movement on AsciiMap test map with collision and camera
</commit_message>
<xml_diff>
--- a/docs/Planejamento_Projeto_RPG.docx
+++ b/docs/Planejamento_Projeto_RPG.docx
@@ -233,7 +233,7 @@
                 <w:sz w:val="19"/>
                 <w:szCs w:val="19"/>
               </w:rPr>
-              <w:t xml:space="preserve">0.9 — primeira música e núcleo do combate</w:t>
+              <w:t xml:space="preserve">1.0 — Fase 0 concluída</w:t>
             </w:r>
           </w:p>
         </w:tc>
@@ -623,7 +623,7 @@
                 <w:sz w:val="19"/>
                 <w:szCs w:val="19"/>
               </w:rPr>
-              <w:t xml:space="preserve">Fase 0 — Pré-produção</w:t>
+              <w:t xml:space="preserve">Fase 1 — Protótipo técnico</w:t>
             </w:r>
           </w:p>
         </w:tc>
@@ -688,7 +688,7 @@
                 <w:sz w:val="19"/>
                 <w:szCs w:val="19"/>
               </w:rPr>
-              <w:t xml:space="preserve">Em planejamento</w:t>
+              <w:t xml:space="preserve">Fase 0 concluída em 24/09/2026</w:t>
             </w:r>
           </w:p>
         </w:tc>
@@ -12445,7 +12445,7 @@
                 <w:sz w:val="19"/>
                 <w:szCs w:val="19"/>
               </w:rPr>
-              <w:t xml:space="preserve">◐ Em andamento</w:t>
+              <w:t xml:space="preserve">☑ Concluída</w:t>
             </w:r>
           </w:p>
         </w:tc>
@@ -12570,7 +12570,7 @@
                 <w:sz w:val="19"/>
                 <w:szCs w:val="19"/>
               </w:rPr>
-              <w:t xml:space="preserve">☐ Pendente</w:t>
+              <w:t xml:space="preserve">◐ Em andamento</w:t>
             </w:r>
           </w:p>
         </w:tc>
@@ -16644,7 +16644,7 @@
                 <w:sz w:val="19"/>
                 <w:szCs w:val="19"/>
               </w:rPr>
-              <w:t xml:space="preserve">☐ Pendente</w:t>
+              <w:t xml:space="preserve">◐ Em andamento</w:t>
             </w:r>
           </w:p>
         </w:tc>
@@ -16669,6 +16669,13 @@
             <w:pPr>
               <w:keepNext/>
             </w:pPr>
+            <w:r>
+              <w:rPr>
+                <w:sz w:val="19"/>
+                <w:szCs w:val="19"/>
+              </w:rPr>
+              <w:t xml:space="preserve">Movimento em 8 direções e corrida prontos; animação provisória (balanço) até existirem quadros de caminhada</w:t>
+            </w:r>
           </w:p>
         </w:tc>
       </w:tr>
@@ -16792,7 +16799,7 @@
                 <w:sz w:val="19"/>
                 <w:szCs w:val="19"/>
               </w:rPr>
-              <w:t xml:space="preserve">☐ Pendente</w:t>
+              <w:t xml:space="preserve">☑ Concluída</w:t>
             </w:r>
           </w:p>
         </w:tc>
@@ -16817,6 +16824,13 @@
             <w:pPr>
               <w:keepNext/>
             </w:pPr>
+            <w:r>
+              <w:rPr>
+                <w:sz w:val="19"/>
+                <w:szCs w:val="19"/>
+              </w:rPr>
+              <w:t xml:space="preserve">AsciiMap + tiles provisórios na paleta Velmora</w:t>
+            </w:r>
           </w:p>
         </w:tc>
       </w:tr>
@@ -16940,7 +16954,7 @@
                 <w:sz w:val="19"/>
                 <w:szCs w:val="19"/>
               </w:rPr>
-              <w:t xml:space="preserve">☐ Pendente</w:t>
+              <w:t xml:space="preserve">☑ Concluída</w:t>
             </w:r>
           </w:p>
         </w:tc>
@@ -16965,6 +16979,13 @@
             <w:pPr>
               <w:keepNext/>
             </w:pPr>
+            <w:r>
+              <w:rPr>
+                <w:sz w:val="19"/>
+                <w:szCs w:val="19"/>
+              </w:rPr>
+              <w:t xml:space="preserve">Suavizada, presa às bordas do mapa</w:t>
+            </w:r>
           </w:p>
         </w:tc>
       </w:tr>
@@ -29289,7 +29310,7 @@
                 <w:sz w:val="19"/>
                 <w:szCs w:val="19"/>
               </w:rPr>
-              <w:t xml:space="preserve">Música (teste)</w:t>
+              <w:t xml:space="preserve">Música</w:t>
             </w:r>
           </w:p>
         </w:tc>
@@ -29349,7 +29370,7 @@
                 <w:sz w:val="19"/>
                 <w:szCs w:val="19"/>
               </w:rPr>
-              <w:t xml:space="preserve">◐ Em andamento</w:t>
+              <w:t xml:space="preserve">☑ Concluída</w:t>
             </w:r>
           </w:p>
         </w:tc>
@@ -29379,7 +29400,7 @@
                 <w:sz w:val="19"/>
                 <w:szCs w:val="19"/>
               </w:rPr>
-              <w:t xml:space="preserve">Suno chirp-v5-5, 60 s; aguardando avaliação do Diretor</w:t>
+              <w:t xml:space="preserve">Aprovada: tema de Vila Caldeira (Suno chirp-v5-5, 60 s)</w:t>
             </w:r>
           </w:p>
         </w:tc>
@@ -29474,7 +29495,7 @@
                 <w:sz w:val="19"/>
                 <w:szCs w:val="19"/>
               </w:rPr>
-              <w:t xml:space="preserve">Música (teste)</w:t>
+              <w:t xml:space="preserve">Música (reserva)</w:t>
             </w:r>
           </w:p>
         </w:tc>
@@ -29534,7 +29555,7 @@
                 <w:sz w:val="19"/>
                 <w:szCs w:val="19"/>
               </w:rPr>
-              <w:t xml:space="preserve">◐ Em andamento</w:t>
+              <w:t xml:space="preserve">☑ Concluída</w:t>
             </w:r>
           </w:p>
         </w:tc>
@@ -29564,7 +29585,7 @@
                 <w:sz w:val="19"/>
                 <w:szCs w:val="19"/>
               </w:rPr>
-              <w:t xml:space="preserve">Variação B, 55 s</w:t>
+              <w:t xml:space="preserve">Variação B (55 s), guardada para uso futuro</w:t>
             </w:r>
           </w:p>
         </w:tc>
@@ -33132,6 +33153,101 @@
           </w:tcPr>
           <w:p>
             <w:pPr>
+              <w:keepNext/>
+            </w:pPr>
+            <w:r>
+              <w:rPr>
+                <w:sz w:val="19"/>
+                <w:szCs w:val="19"/>
+              </w:rPr>
+              <w:t xml:space="preserve">0.9</w:t>
+            </w:r>
+          </w:p>
+        </w:tc>
+        <w:tc>
+          <w:tcPr>
+            <w:tcW w:type="dxa" w:w="1735"/>
+            <w:tcBorders>
+              <w:top w:val="single" w:color="B7C3D0" w:sz="4"/>
+              <w:left w:val="single" w:color="B7C3D0" w:sz="4"/>
+              <w:bottom w:val="single" w:color="B7C3D0" w:sz="4"/>
+              <w:right w:val="single" w:color="B7C3D0" w:sz="4"/>
+            </w:tcBorders>
+            <w:tcMar>
+              <w:top w:type="dxa" w:w="60"/>
+              <w:left w:type="dxa" w:w="100"/>
+              <w:bottom w:type="dxa" w:w="60"/>
+              <w:right w:type="dxa" w:w="100"/>
+            </w:tcMar>
+            <w:vAlign w:val="center"/>
+          </w:tcPr>
+          <w:p>
+            <w:pPr>
+              <w:keepNext/>
+            </w:pPr>
+            <w:r>
+              <w:rPr>
+                <w:sz w:val="19"/>
+                <w:szCs w:val="19"/>
+              </w:rPr>
+              <w:t xml:space="preserve">24/09/2026</w:t>
+            </w:r>
+          </w:p>
+        </w:tc>
+        <w:tc>
+          <w:tcPr>
+            <w:tcW w:type="dxa" w:w="6746"/>
+            <w:tcBorders>
+              <w:top w:val="single" w:color="B7C3D0" w:sz="4"/>
+              <w:left w:val="single" w:color="B7C3D0" w:sz="4"/>
+              <w:bottom w:val="single" w:color="B7C3D0" w:sz="4"/>
+              <w:right w:val="single" w:color="B7C3D0" w:sz="4"/>
+            </w:tcBorders>
+            <w:tcMar>
+              <w:top w:type="dxa" w:w="60"/>
+              <w:left w:type="dxa" w:w="100"/>
+              <w:bottom w:type="dxa" w:w="60"/>
+              <w:right w:type="dxa" w:w="100"/>
+            </w:tcMar>
+            <w:vAlign w:val="center"/>
+          </w:tcPr>
+          <w:p>
+            <w:pPr>
+              <w:keepNext/>
+            </w:pPr>
+            <w:r>
+              <w:rPr>
+                <w:sz w:val="19"/>
+                <w:szCs w:val="19"/>
+              </w:rPr>
+              <w:t xml:space="preserve">Licença do áudio confirmada (conta paga); primeira música de teste (Vila Caldeira, 2 variações); TurnQueue e DamageFormula implementados com 25 testes novos.</w:t>
+            </w:r>
+          </w:p>
+        </w:tc>
+      </w:tr>
+      <w:tr>
+        <w:trPr>
+          <w:cantSplit/>
+        </w:trPr>
+        <w:tc>
+          <w:tcPr>
+            <w:tcW w:type="dxa" w:w="1157"/>
+            <w:tcBorders>
+              <w:top w:val="single" w:color="B7C3D0" w:sz="4"/>
+              <w:left w:val="single" w:color="B7C3D0" w:sz="4"/>
+              <w:bottom w:val="single" w:color="B7C3D0" w:sz="4"/>
+              <w:right w:val="single" w:color="B7C3D0" w:sz="4"/>
+            </w:tcBorders>
+            <w:tcMar>
+              <w:top w:type="dxa" w:w="60"/>
+              <w:left w:type="dxa" w:w="100"/>
+              <w:bottom w:type="dxa" w:w="60"/>
+              <w:right w:type="dxa" w:w="100"/>
+            </w:tcMar>
+            <w:vAlign w:val="center"/>
+          </w:tcPr>
+          <w:p>
+            <w:pPr>
               <w:keepNext w:val="false"/>
             </w:pPr>
             <w:r>
@@ -33139,7 +33255,7 @@
                 <w:sz w:val="19"/>
                 <w:szCs w:val="19"/>
               </w:rPr>
-              <w:t xml:space="preserve">0.9</w:t>
+              <w:t xml:space="preserve">1.0</w:t>
             </w:r>
           </w:p>
         </w:tc>
@@ -33199,7 +33315,7 @@
                 <w:sz w:val="19"/>
                 <w:szCs w:val="19"/>
               </w:rPr>
-              <w:t xml:space="preserve">Licença do áudio confirmada (conta paga); primeira música de teste (Vila Caldeira, 2 variações); TurnQueue e DamageFormula implementados com 25 testes novos.</w:t>
+              <w:t xml:space="preserve">Fase 0 concluída: tema de Vila Caldeira aprovado (versão A; B guardada como reserva). CLAUDE.md criado. Início da Fase 1: Kael andando no mapa de teste com colisão e câmera (39 testes).</w:t>
             </w:r>
           </w:p>
         </w:tc>
@@ -33228,7 +33344,7 @@
         <w:spacing w:after="60"/>
       </w:pPr>
       <w:r>
-        <w:t xml:space="preserve">Detalhar a história de O Coração de Éter: protagonista, grupo principal, antagonista e estrutura em atos.</w:t>
+        <w:t xml:space="preserve">Fase 1: Kael andando num mapa de teste com colisão e câmera (F1.01–F1.03).</w:t>
       </w:r>
     </w:p>
     <w:p>
@@ -33241,7 +33357,7 @@
         <w:spacing w:after="60"/>
       </w:pPr>
       <w:r>
-        <w:t xml:space="preserve">Criar o Guia de Estilo: paleta fixa, tamanhos de sprite, prompt-base steampunk.</w:t>
+        <w:t xml:space="preserve">Fase 1: conversa com NPC e transições de cena (F1.04–F1.05).</w:t>
       </w:r>
     </w:p>
     <w:p>
@@ -33254,7 +33370,7 @@
         <w:spacing w:after="60"/>
       </w:pPr>
       <w:r>
-        <w:t xml:space="preserve">Escrever o GDD do combate híbrido (fórmulas, fila CTB, janelas de timing).</w:t>
+        <w:t xml:space="preserve">Fase 1: inimigo no mapa, batalha mínima com fila CTB e timing, vitória/derrota (F1.06–F1.10).</w:t>
       </w:r>
     </w:p>
     <w:p>
@@ -33267,20 +33383,7 @@
         <w:spacing w:after="60"/>
       </w:pPr>
       <w:r>
-        <w:t xml:space="preserve">Configurar input map e framework de testes; iniciar a Fase 1.</w:t>
-      </w:r>
-    </w:p>
-    <w:p>
-      <w:pPr>
-        <w:pStyle w:val="ListParagraph"/>
-        <w:numPr>
-          <w:ilvl w:val="0"/>
-          <w:numId w:val="5"/>
-        </w:numPr>
-        <w:spacing w:after="60"/>
-      </w:pPr>
-      <w:r>
-        <w:t xml:space="preserve">Escolher a ferramenta de IA de áudio.</w:t>
+        <w:t xml:space="preserve">Playtest do protótipo com o Diretor (F1.12).</w:t>
       </w:r>
     </w:p>
     <w:sectPr>

</xml_diff>

<commit_message>
Kael walk cycle (Codex with reference), grid support in pixelize, player walk animation
</commit_message>
<xml_diff>
--- a/docs/Planejamento_Projeto_RPG.docx
+++ b/docs/Planejamento_Projeto_RPG.docx
@@ -16644,7 +16644,7 @@
                 <w:sz w:val="19"/>
                 <w:szCs w:val="19"/>
               </w:rPr>
-              <w:t xml:space="preserve">◐ Em andamento</w:t>
+              <w:t xml:space="preserve">☑ Concluída</w:t>
             </w:r>
           </w:p>
         </w:tc>
@@ -16674,7 +16674,7 @@
                 <w:sz w:val="19"/>
                 <w:szCs w:val="19"/>
               </w:rPr>
-              <w:t xml:space="preserve">Movimento em 8 direções e corrida prontos; animação provisória (balanço) até existirem quadros de caminhada</w:t>
+              <w:t xml:space="preserve">8 direções, corrida, ciclo de caminhada de 4 quadros × 3 direções (Codex com referência)</w:t>
             </w:r>
           </w:p>
         </w:tc>
@@ -29428,6 +29428,376 @@
           </w:tcPr>
           <w:p>
             <w:pPr>
+              <w:keepNext/>
+            </w:pPr>
+            <w:r>
+              <w:rPr>
+                <w:sz w:val="19"/>
+                <w:szCs w:val="19"/>
+              </w:rPr>
+              <w:t xml:space="preserve">A-009</w:t>
+            </w:r>
+          </w:p>
+        </w:tc>
+        <w:tc>
+          <w:tcPr>
+            <w:tcW w:type="dxa" w:w="2891"/>
+            <w:tcBorders>
+              <w:top w:val="single" w:color="B7C3D0" w:sz="4"/>
+              <w:left w:val="single" w:color="B7C3D0" w:sz="4"/>
+              <w:bottom w:val="single" w:color="B7C3D0" w:sz="4"/>
+              <w:right w:val="single" w:color="B7C3D0" w:sz="4"/>
+            </w:tcBorders>
+            <w:tcMar>
+              <w:top w:type="dxa" w:w="60"/>
+              <w:left w:type="dxa" w:w="100"/>
+              <w:bottom w:type="dxa" w:w="60"/>
+              <w:right w:type="dxa" w:w="100"/>
+            </w:tcMar>
+            <w:vAlign w:val="center"/>
+          </w:tcPr>
+          <w:p>
+            <w:pPr>
+              <w:keepNext/>
+            </w:pPr>
+            <w:r>
+              <w:rPr>
+                <w:sz w:val="19"/>
+                <w:szCs w:val="19"/>
+              </w:rPr>
+              <w:t xml:space="preserve">assets/audio/music/bgm_vila_caldeira_test_b.mp3</w:t>
+            </w:r>
+          </w:p>
+        </w:tc>
+        <w:tc>
+          <w:tcPr>
+            <w:tcW w:type="dxa" w:w="1349"/>
+            <w:tcBorders>
+              <w:top w:val="single" w:color="B7C3D0" w:sz="4"/>
+              <w:left w:val="single" w:color="B7C3D0" w:sz="4"/>
+              <w:bottom w:val="single" w:color="B7C3D0" w:sz="4"/>
+              <w:right w:val="single" w:color="B7C3D0" w:sz="4"/>
+            </w:tcBorders>
+            <w:tcMar>
+              <w:top w:type="dxa" w:w="60"/>
+              <w:left w:type="dxa" w:w="100"/>
+              <w:bottom w:type="dxa" w:w="60"/>
+              <w:right w:type="dxa" w:w="100"/>
+            </w:tcMar>
+            <w:vAlign w:val="center"/>
+          </w:tcPr>
+          <w:p>
+            <w:pPr>
+              <w:keepNext/>
+            </w:pPr>
+            <w:r>
+              <w:rPr>
+                <w:sz w:val="19"/>
+                <w:szCs w:val="19"/>
+              </w:rPr>
+              <w:t xml:space="preserve">Música (reserva)</w:t>
+            </w:r>
+          </w:p>
+        </w:tc>
+        <w:tc>
+          <w:tcPr>
+            <w:tcW w:type="dxa" w:w="867"/>
+            <w:tcBorders>
+              <w:top w:val="single" w:color="B7C3D0" w:sz="4"/>
+              <w:left w:val="single" w:color="B7C3D0" w:sz="4"/>
+              <w:bottom w:val="single" w:color="B7C3D0" w:sz="4"/>
+              <w:right w:val="single" w:color="B7C3D0" w:sz="4"/>
+            </w:tcBorders>
+            <w:tcMar>
+              <w:top w:type="dxa" w:w="60"/>
+              <w:left w:type="dxa" w:w="100"/>
+              <w:bottom w:type="dxa" w:w="60"/>
+              <w:right w:type="dxa" w:w="100"/>
+            </w:tcMar>
+            <w:vAlign w:val="center"/>
+          </w:tcPr>
+          <w:p>
+            <w:pPr>
+              <w:keepNext/>
+            </w:pPr>
+            <w:r>
+              <w:rPr>
+                <w:sz w:val="19"/>
+                <w:szCs w:val="19"/>
+              </w:rPr>
+              <w:t xml:space="preserve">F0</w:t>
+            </w:r>
+          </w:p>
+        </w:tc>
+        <w:tc>
+          <w:tcPr>
+            <w:tcW w:type="dxa" w:w="1446"/>
+            <w:tcBorders>
+              <w:top w:val="single" w:color="B7C3D0" w:sz="4"/>
+              <w:left w:val="single" w:color="B7C3D0" w:sz="4"/>
+              <w:bottom w:val="single" w:color="B7C3D0" w:sz="4"/>
+              <w:right w:val="single" w:color="B7C3D0" w:sz="4"/>
+            </w:tcBorders>
+            <w:tcMar>
+              <w:top w:type="dxa" w:w="60"/>
+              <w:left w:type="dxa" w:w="100"/>
+              <w:bottom w:type="dxa" w:w="60"/>
+              <w:right w:type="dxa" w:w="100"/>
+            </w:tcMar>
+            <w:vAlign w:val="center"/>
+          </w:tcPr>
+          <w:p>
+            <w:pPr>
+              <w:keepNext/>
+            </w:pPr>
+            <w:r>
+              <w:rPr>
+                <w:sz w:val="19"/>
+                <w:szCs w:val="19"/>
+              </w:rPr>
+              <w:t xml:space="preserve">☑ Concluída</w:t>
+            </w:r>
+          </w:p>
+        </w:tc>
+        <w:tc>
+          <w:tcPr>
+            <w:tcW w:type="dxa" w:w="2218"/>
+            <w:tcBorders>
+              <w:top w:val="single" w:color="B7C3D0" w:sz="4"/>
+              <w:left w:val="single" w:color="B7C3D0" w:sz="4"/>
+              <w:bottom w:val="single" w:color="B7C3D0" w:sz="4"/>
+              <w:right w:val="single" w:color="B7C3D0" w:sz="4"/>
+            </w:tcBorders>
+            <w:tcMar>
+              <w:top w:type="dxa" w:w="60"/>
+              <w:left w:type="dxa" w:w="100"/>
+              <w:bottom w:type="dxa" w:w="60"/>
+              <w:right w:type="dxa" w:w="100"/>
+            </w:tcMar>
+            <w:vAlign w:val="center"/>
+          </w:tcPr>
+          <w:p>
+            <w:pPr>
+              <w:keepNext/>
+            </w:pPr>
+            <w:r>
+              <w:rPr>
+                <w:sz w:val="19"/>
+                <w:szCs w:val="19"/>
+              </w:rPr>
+              <w:t xml:space="preserve">Variação B (55 s), guardada para uso futuro</w:t>
+            </w:r>
+          </w:p>
+        </w:tc>
+      </w:tr>
+      <w:tr>
+        <w:trPr>
+          <w:cantSplit/>
+        </w:trPr>
+        <w:tc>
+          <w:tcPr>
+            <w:tcW w:type="dxa" w:w="867"/>
+            <w:tcBorders>
+              <w:top w:val="single" w:color="B7C3D0" w:sz="4"/>
+              <w:left w:val="single" w:color="B7C3D0" w:sz="4"/>
+              <w:bottom w:val="single" w:color="B7C3D0" w:sz="4"/>
+              <w:right w:val="single" w:color="B7C3D0" w:sz="4"/>
+            </w:tcBorders>
+            <w:tcMar>
+              <w:top w:type="dxa" w:w="60"/>
+              <w:left w:type="dxa" w:w="100"/>
+              <w:bottom w:type="dxa" w:w="60"/>
+              <w:right w:type="dxa" w:w="100"/>
+            </w:tcMar>
+            <w:vAlign w:val="center"/>
+          </w:tcPr>
+          <w:p>
+            <w:pPr>
+              <w:keepNext/>
+            </w:pPr>
+            <w:r>
+              <w:rPr>
+                <w:sz w:val="19"/>
+                <w:szCs w:val="19"/>
+              </w:rPr>
+              <w:t xml:space="preserve">A-010</w:t>
+            </w:r>
+          </w:p>
+        </w:tc>
+        <w:tc>
+          <w:tcPr>
+            <w:tcW w:type="dxa" w:w="2891"/>
+            <w:tcBorders>
+              <w:top w:val="single" w:color="B7C3D0" w:sz="4"/>
+              <w:left w:val="single" w:color="B7C3D0" w:sz="4"/>
+              <w:bottom w:val="single" w:color="B7C3D0" w:sz="4"/>
+              <w:right w:val="single" w:color="B7C3D0" w:sz="4"/>
+            </w:tcBorders>
+            <w:tcMar>
+              <w:top w:type="dxa" w:w="60"/>
+              <w:left w:type="dxa" w:w="100"/>
+              <w:bottom w:type="dxa" w:w="60"/>
+              <w:right w:type="dxa" w:w="100"/>
+            </w:tcMar>
+            <w:vAlign w:val="center"/>
+          </w:tcPr>
+          <w:p>
+            <w:pPr>
+              <w:keepNext/>
+            </w:pPr>
+            <w:r>
+              <w:rPr>
+                <w:sz w:val="19"/>
+                <w:szCs w:val="19"/>
+              </w:rPr>
+              <w:t xml:space="preserve">assets/_source/chr_kael_walk_raw_v1.png</w:t>
+            </w:r>
+          </w:p>
+        </w:tc>
+        <w:tc>
+          <w:tcPr>
+            <w:tcW w:type="dxa" w:w="1349"/>
+            <w:tcBorders>
+              <w:top w:val="single" w:color="B7C3D0" w:sz="4"/>
+              <w:left w:val="single" w:color="B7C3D0" w:sz="4"/>
+              <w:bottom w:val="single" w:color="B7C3D0" w:sz="4"/>
+              <w:right w:val="single" w:color="B7C3D0" w:sz="4"/>
+            </w:tcBorders>
+            <w:tcMar>
+              <w:top w:type="dxa" w:w="60"/>
+              <w:left w:type="dxa" w:w="100"/>
+              <w:bottom w:type="dxa" w:w="60"/>
+              <w:right w:type="dxa" w:w="100"/>
+            </w:tcMar>
+            <w:vAlign w:val="center"/>
+          </w:tcPr>
+          <w:p>
+            <w:pPr>
+              <w:keepNext/>
+            </w:pPr>
+            <w:r>
+              <w:rPr>
+                <w:sz w:val="19"/>
+                <w:szCs w:val="19"/>
+              </w:rPr>
+              <w:t xml:space="preserve">Referência (bruta)</w:t>
+            </w:r>
+          </w:p>
+        </w:tc>
+        <w:tc>
+          <w:tcPr>
+            <w:tcW w:type="dxa" w:w="867"/>
+            <w:tcBorders>
+              <w:top w:val="single" w:color="B7C3D0" w:sz="4"/>
+              <w:left w:val="single" w:color="B7C3D0" w:sz="4"/>
+              <w:bottom w:val="single" w:color="B7C3D0" w:sz="4"/>
+              <w:right w:val="single" w:color="B7C3D0" w:sz="4"/>
+            </w:tcBorders>
+            <w:tcMar>
+              <w:top w:type="dxa" w:w="60"/>
+              <w:left w:type="dxa" w:w="100"/>
+              <w:bottom w:type="dxa" w:w="60"/>
+              <w:right w:type="dxa" w:w="100"/>
+            </w:tcMar>
+            <w:vAlign w:val="center"/>
+          </w:tcPr>
+          <w:p>
+            <w:pPr>
+              <w:keepNext/>
+            </w:pPr>
+            <w:r>
+              <w:rPr>
+                <w:sz w:val="19"/>
+                <w:szCs w:val="19"/>
+              </w:rPr>
+              <w:t xml:space="preserve">F1</w:t>
+            </w:r>
+          </w:p>
+        </w:tc>
+        <w:tc>
+          <w:tcPr>
+            <w:tcW w:type="dxa" w:w="1446"/>
+            <w:tcBorders>
+              <w:top w:val="single" w:color="B7C3D0" w:sz="4"/>
+              <w:left w:val="single" w:color="B7C3D0" w:sz="4"/>
+              <w:bottom w:val="single" w:color="B7C3D0" w:sz="4"/>
+              <w:right w:val="single" w:color="B7C3D0" w:sz="4"/>
+            </w:tcBorders>
+            <w:tcMar>
+              <w:top w:type="dxa" w:w="60"/>
+              <w:left w:type="dxa" w:w="100"/>
+              <w:bottom w:type="dxa" w:w="60"/>
+              <w:right w:type="dxa" w:w="100"/>
+            </w:tcMar>
+            <w:vAlign w:val="center"/>
+          </w:tcPr>
+          <w:p>
+            <w:pPr>
+              <w:keepNext/>
+            </w:pPr>
+            <w:r>
+              <w:rPr>
+                <w:sz w:val="19"/>
+                <w:szCs w:val="19"/>
+              </w:rPr>
+              <w:t xml:space="preserve">☑ Concluída</w:t>
+            </w:r>
+          </w:p>
+        </w:tc>
+        <w:tc>
+          <w:tcPr>
+            <w:tcW w:type="dxa" w:w="2218"/>
+            <w:tcBorders>
+              <w:top w:val="single" w:color="B7C3D0" w:sz="4"/>
+              <w:left w:val="single" w:color="B7C3D0" w:sz="4"/>
+              <w:bottom w:val="single" w:color="B7C3D0" w:sz="4"/>
+              <w:right w:val="single" w:color="B7C3D0" w:sz="4"/>
+            </w:tcBorders>
+            <w:tcMar>
+              <w:top w:type="dxa" w:w="60"/>
+              <w:left w:type="dxa" w:w="100"/>
+              <w:bottom w:type="dxa" w:w="60"/>
+              <w:right w:type="dxa" w:w="100"/>
+            </w:tcMar>
+            <w:vAlign w:val="center"/>
+          </w:tcPr>
+          <w:p>
+            <w:pPr>
+              <w:keepNext/>
+            </w:pPr>
+            <w:r>
+              <w:rPr>
+                <w:sz w:val="19"/>
+                <w:szCs w:val="19"/>
+              </w:rPr>
+              <w:t xml:space="preserve">Caminhada do Kael; gerada pela ponte MCP com a referência oficial anexada</w:t>
+            </w:r>
+          </w:p>
+        </w:tc>
+      </w:tr>
+      <w:tr>
+        <w:trPr>
+          <w:cantSplit/>
+        </w:trPr>
+        <w:tc>
+          <w:tcPr>
+            <w:tcW w:type="dxa" w:w="867"/>
+            <w:tcBorders>
+              <w:top w:val="single" w:color="B7C3D0" w:sz="4"/>
+              <w:left w:val="single" w:color="B7C3D0" w:sz="4"/>
+              <w:bottom w:val="single" w:color="B7C3D0" w:sz="4"/>
+              <w:right w:val="single" w:color="B7C3D0" w:sz="4"/>
+            </w:tcBorders>
+            <w:tcMar>
+              <w:top w:type="dxa" w:w="60"/>
+              <w:left w:type="dxa" w:w="100"/>
+              <w:bottom w:type="dxa" w:w="60"/>
+              <w:right w:type="dxa" w:w="100"/>
+            </w:tcMar>
+            <w:vAlign w:val="center"/>
+          </w:tcPr>
+          <w:p>
+            <w:pPr>
               <w:keepNext w:val="false"/>
             </w:pPr>
             <w:r>
@@ -29435,7 +29805,7 @@
                 <w:sz w:val="19"/>
                 <w:szCs w:val="19"/>
               </w:rPr>
-              <w:t xml:space="preserve">A-009</w:t>
+              <w:t xml:space="preserve">A-011</w:t>
             </w:r>
           </w:p>
         </w:tc>
@@ -29465,7 +29835,7 @@
                 <w:sz w:val="19"/>
                 <w:szCs w:val="19"/>
               </w:rPr>
-              <w:t xml:space="preserve">assets/audio/music/bgm_vila_caldeira_test_b.mp3</w:t>
+              <w:t xml:space="preserve">assets/sprites/characters/kael/chr_kael_walk.png</w:t>
             </w:r>
           </w:p>
         </w:tc>
@@ -29495,7 +29865,7 @@
                 <w:sz w:val="19"/>
                 <w:szCs w:val="19"/>
               </w:rPr>
-              <w:t xml:space="preserve">Música (reserva)</w:t>
+              <w:t xml:space="preserve">Sprite</w:t>
             </w:r>
           </w:p>
         </w:tc>
@@ -29525,7 +29895,7 @@
                 <w:sz w:val="19"/>
                 <w:szCs w:val="19"/>
               </w:rPr>
-              <w:t xml:space="preserve">F0</w:t>
+              <w:t xml:space="preserve">F1</w:t>
             </w:r>
           </w:p>
         </w:tc>
@@ -29585,7 +29955,7 @@
                 <w:sz w:val="19"/>
                 <w:szCs w:val="19"/>
               </w:rPr>
-              <w:t xml:space="preserve">Variação B (55 s), guardada para uso futuro</w:t>
+              <w:t xml:space="preserve">Grade 3 × 4 de 64×64 (baixo, esquerda, cima)</w:t>
             </w:r>
           </w:p>
         </w:tc>
@@ -33315,7 +33685,7 @@
                 <w:sz w:val="19"/>
                 <w:szCs w:val="19"/>
               </w:rPr>
-              <w:t xml:space="preserve">Fase 0 concluída: tema de Vila Caldeira aprovado (versão A; B guardada como reserva). CLAUDE.md criado. Início da Fase 1: Kael andando no mapa de teste com colisão e câmera (39 testes).</w:t>
+              <w:t xml:space="preserve">Fase 0 concluída: tema de Vila Caldeira aprovado (versão A; B guardada como reserva). CLAUDE.md criado. Início da Fase 1: Kael andando no mapa de teste com colisão e câmera; ciclo de caminhada; pixelize.mjs aceita grades (41 testes).</w:t>
             </w:r>
           </w:p>
         </w:tc>

</xml_diff>

<commit_message>
NPC dialogue: Gerd on test map, portraits, typewriter dialogue box, DialogueManager; SceneManager autoload
</commit_message>
<xml_diff>
--- a/docs/Planejamento_Projeto_RPG.docx
+++ b/docs/Planejamento_Projeto_RPG.docx
@@ -233,7 +233,7 @@
                 <w:sz w:val="19"/>
                 <w:szCs w:val="19"/>
               </w:rPr>
-              <w:t xml:space="preserve">1.0 — Fase 0 concluída</w:t>
+              <w:t xml:space="preserve">1.1 — conversa com NPC</w:t>
             </w:r>
           </w:p>
         </w:tc>
@@ -17109,7 +17109,7 @@
                 <w:sz w:val="19"/>
                 <w:szCs w:val="19"/>
               </w:rPr>
-              <w:t xml:space="preserve">☐ Pendente</w:t>
+              <w:t xml:space="preserve">☑ Concluída</w:t>
             </w:r>
           </w:p>
         </w:tc>
@@ -17134,6 +17134,13 @@
             <w:pPr>
               <w:keepNext/>
             </w:pPr>
+            <w:r>
+              <w:rPr>
+                <w:sz w:val="19"/>
+                <w:szCs w:val="19"/>
+              </w:rPr>
+              <w:t xml:space="preserve">Mestre Gerd no mapa; caixa com retrato, nome e texto letra por letra; fonte Pixelify Sans (OFL)</w:t>
+            </w:r>
           </w:p>
         </w:tc>
       </w:tr>
@@ -29798,6 +29805,746 @@
           </w:tcPr>
           <w:p>
             <w:pPr>
+              <w:keepNext/>
+            </w:pPr>
+            <w:r>
+              <w:rPr>
+                <w:sz w:val="19"/>
+                <w:szCs w:val="19"/>
+              </w:rPr>
+              <w:t xml:space="preserve">A-011</w:t>
+            </w:r>
+          </w:p>
+        </w:tc>
+        <w:tc>
+          <w:tcPr>
+            <w:tcW w:type="dxa" w:w="2891"/>
+            <w:tcBorders>
+              <w:top w:val="single" w:color="B7C3D0" w:sz="4"/>
+              <w:left w:val="single" w:color="B7C3D0" w:sz="4"/>
+              <w:bottom w:val="single" w:color="B7C3D0" w:sz="4"/>
+              <w:right w:val="single" w:color="B7C3D0" w:sz="4"/>
+            </w:tcBorders>
+            <w:tcMar>
+              <w:top w:type="dxa" w:w="60"/>
+              <w:left w:type="dxa" w:w="100"/>
+              <w:bottom w:type="dxa" w:w="60"/>
+              <w:right w:type="dxa" w:w="100"/>
+            </w:tcMar>
+            <w:vAlign w:val="center"/>
+          </w:tcPr>
+          <w:p>
+            <w:pPr>
+              <w:keepNext/>
+            </w:pPr>
+            <w:r>
+              <w:rPr>
+                <w:sz w:val="19"/>
+                <w:szCs w:val="19"/>
+              </w:rPr>
+              <w:t xml:space="preserve">assets/sprites/characters/kael/chr_kael_walk.png</w:t>
+            </w:r>
+          </w:p>
+        </w:tc>
+        <w:tc>
+          <w:tcPr>
+            <w:tcW w:type="dxa" w:w="1349"/>
+            <w:tcBorders>
+              <w:top w:val="single" w:color="B7C3D0" w:sz="4"/>
+              <w:left w:val="single" w:color="B7C3D0" w:sz="4"/>
+              <w:bottom w:val="single" w:color="B7C3D0" w:sz="4"/>
+              <w:right w:val="single" w:color="B7C3D0" w:sz="4"/>
+            </w:tcBorders>
+            <w:tcMar>
+              <w:top w:type="dxa" w:w="60"/>
+              <w:left w:type="dxa" w:w="100"/>
+              <w:bottom w:type="dxa" w:w="60"/>
+              <w:right w:type="dxa" w:w="100"/>
+            </w:tcMar>
+            <w:vAlign w:val="center"/>
+          </w:tcPr>
+          <w:p>
+            <w:pPr>
+              <w:keepNext/>
+            </w:pPr>
+            <w:r>
+              <w:rPr>
+                <w:sz w:val="19"/>
+                <w:szCs w:val="19"/>
+              </w:rPr>
+              <w:t xml:space="preserve">Sprite</w:t>
+            </w:r>
+          </w:p>
+        </w:tc>
+        <w:tc>
+          <w:tcPr>
+            <w:tcW w:type="dxa" w:w="867"/>
+            <w:tcBorders>
+              <w:top w:val="single" w:color="B7C3D0" w:sz="4"/>
+              <w:left w:val="single" w:color="B7C3D0" w:sz="4"/>
+              <w:bottom w:val="single" w:color="B7C3D0" w:sz="4"/>
+              <w:right w:val="single" w:color="B7C3D0" w:sz="4"/>
+            </w:tcBorders>
+            <w:tcMar>
+              <w:top w:type="dxa" w:w="60"/>
+              <w:left w:type="dxa" w:w="100"/>
+              <w:bottom w:type="dxa" w:w="60"/>
+              <w:right w:type="dxa" w:w="100"/>
+            </w:tcMar>
+            <w:vAlign w:val="center"/>
+          </w:tcPr>
+          <w:p>
+            <w:pPr>
+              <w:keepNext/>
+            </w:pPr>
+            <w:r>
+              <w:rPr>
+                <w:sz w:val="19"/>
+                <w:szCs w:val="19"/>
+              </w:rPr>
+              <w:t xml:space="preserve">F1</w:t>
+            </w:r>
+          </w:p>
+        </w:tc>
+        <w:tc>
+          <w:tcPr>
+            <w:tcW w:type="dxa" w:w="1446"/>
+            <w:tcBorders>
+              <w:top w:val="single" w:color="B7C3D0" w:sz="4"/>
+              <w:left w:val="single" w:color="B7C3D0" w:sz="4"/>
+              <w:bottom w:val="single" w:color="B7C3D0" w:sz="4"/>
+              <w:right w:val="single" w:color="B7C3D0" w:sz="4"/>
+            </w:tcBorders>
+            <w:tcMar>
+              <w:top w:type="dxa" w:w="60"/>
+              <w:left w:type="dxa" w:w="100"/>
+              <w:bottom w:type="dxa" w:w="60"/>
+              <w:right w:type="dxa" w:w="100"/>
+            </w:tcMar>
+            <w:vAlign w:val="center"/>
+          </w:tcPr>
+          <w:p>
+            <w:pPr>
+              <w:keepNext/>
+            </w:pPr>
+            <w:r>
+              <w:rPr>
+                <w:sz w:val="19"/>
+                <w:szCs w:val="19"/>
+              </w:rPr>
+              <w:t xml:space="preserve">☑ Concluída</w:t>
+            </w:r>
+          </w:p>
+        </w:tc>
+        <w:tc>
+          <w:tcPr>
+            <w:tcW w:type="dxa" w:w="2218"/>
+            <w:tcBorders>
+              <w:top w:val="single" w:color="B7C3D0" w:sz="4"/>
+              <w:left w:val="single" w:color="B7C3D0" w:sz="4"/>
+              <w:bottom w:val="single" w:color="B7C3D0" w:sz="4"/>
+              <w:right w:val="single" w:color="B7C3D0" w:sz="4"/>
+            </w:tcBorders>
+            <w:tcMar>
+              <w:top w:type="dxa" w:w="60"/>
+              <w:left w:type="dxa" w:w="100"/>
+              <w:bottom w:type="dxa" w:w="60"/>
+              <w:right w:type="dxa" w:w="100"/>
+            </w:tcMar>
+            <w:vAlign w:val="center"/>
+          </w:tcPr>
+          <w:p>
+            <w:pPr>
+              <w:keepNext/>
+            </w:pPr>
+            <w:r>
+              <w:rPr>
+                <w:sz w:val="19"/>
+                <w:szCs w:val="19"/>
+              </w:rPr>
+              <w:t xml:space="preserve">Grade 3 × 4 de 64×64 (baixo, esquerda, cima)</w:t>
+            </w:r>
+          </w:p>
+        </w:tc>
+      </w:tr>
+      <w:tr>
+        <w:trPr>
+          <w:cantSplit/>
+        </w:trPr>
+        <w:tc>
+          <w:tcPr>
+            <w:tcW w:type="dxa" w:w="867"/>
+            <w:tcBorders>
+              <w:top w:val="single" w:color="B7C3D0" w:sz="4"/>
+              <w:left w:val="single" w:color="B7C3D0" w:sz="4"/>
+              <w:bottom w:val="single" w:color="B7C3D0" w:sz="4"/>
+              <w:right w:val="single" w:color="B7C3D0" w:sz="4"/>
+            </w:tcBorders>
+            <w:tcMar>
+              <w:top w:type="dxa" w:w="60"/>
+              <w:left w:type="dxa" w:w="100"/>
+              <w:bottom w:type="dxa" w:w="60"/>
+              <w:right w:type="dxa" w:w="100"/>
+            </w:tcMar>
+            <w:vAlign w:val="center"/>
+          </w:tcPr>
+          <w:p>
+            <w:pPr>
+              <w:keepNext/>
+            </w:pPr>
+            <w:r>
+              <w:rPr>
+                <w:sz w:val="19"/>
+                <w:szCs w:val="19"/>
+              </w:rPr>
+              <w:t xml:space="preserve">A-012</w:t>
+            </w:r>
+          </w:p>
+        </w:tc>
+        <w:tc>
+          <w:tcPr>
+            <w:tcW w:type="dxa" w:w="2891"/>
+            <w:tcBorders>
+              <w:top w:val="single" w:color="B7C3D0" w:sz="4"/>
+              <w:left w:val="single" w:color="B7C3D0" w:sz="4"/>
+              <w:bottom w:val="single" w:color="B7C3D0" w:sz="4"/>
+              <w:right w:val="single" w:color="B7C3D0" w:sz="4"/>
+            </w:tcBorders>
+            <w:tcMar>
+              <w:top w:type="dxa" w:w="60"/>
+              <w:left w:type="dxa" w:w="100"/>
+              <w:bottom w:type="dxa" w:w="60"/>
+              <w:right w:type="dxa" w:w="100"/>
+            </w:tcMar>
+            <w:vAlign w:val="center"/>
+          </w:tcPr>
+          <w:p>
+            <w:pPr>
+              <w:keepNext/>
+            </w:pPr>
+            <w:r>
+              <w:rPr>
+                <w:sz w:val="19"/>
+                <w:szCs w:val="19"/>
+              </w:rPr>
+              <w:t xml:space="preserve">assets/sprites/characters/gerd/npc_gerd_ref.png</w:t>
+            </w:r>
+          </w:p>
+        </w:tc>
+        <w:tc>
+          <w:tcPr>
+            <w:tcW w:type="dxa" w:w="1349"/>
+            <w:tcBorders>
+              <w:top w:val="single" w:color="B7C3D0" w:sz="4"/>
+              <w:left w:val="single" w:color="B7C3D0" w:sz="4"/>
+              <w:bottom w:val="single" w:color="B7C3D0" w:sz="4"/>
+              <w:right w:val="single" w:color="B7C3D0" w:sz="4"/>
+            </w:tcBorders>
+            <w:tcMar>
+              <w:top w:type="dxa" w:w="60"/>
+              <w:left w:type="dxa" w:w="100"/>
+              <w:bottom w:type="dxa" w:w="60"/>
+              <w:right w:type="dxa" w:w="100"/>
+            </w:tcMar>
+            <w:vAlign w:val="center"/>
+          </w:tcPr>
+          <w:p>
+            <w:pPr>
+              <w:keepNext/>
+            </w:pPr>
+            <w:r>
+              <w:rPr>
+                <w:sz w:val="19"/>
+                <w:szCs w:val="19"/>
+              </w:rPr>
+              <w:t xml:space="preserve">Sprite</w:t>
+            </w:r>
+          </w:p>
+        </w:tc>
+        <w:tc>
+          <w:tcPr>
+            <w:tcW w:type="dxa" w:w="867"/>
+            <w:tcBorders>
+              <w:top w:val="single" w:color="B7C3D0" w:sz="4"/>
+              <w:left w:val="single" w:color="B7C3D0" w:sz="4"/>
+              <w:bottom w:val="single" w:color="B7C3D0" w:sz="4"/>
+              <w:right w:val="single" w:color="B7C3D0" w:sz="4"/>
+            </w:tcBorders>
+            <w:tcMar>
+              <w:top w:type="dxa" w:w="60"/>
+              <w:left w:type="dxa" w:w="100"/>
+              <w:bottom w:type="dxa" w:w="60"/>
+              <w:right w:type="dxa" w:w="100"/>
+            </w:tcMar>
+            <w:vAlign w:val="center"/>
+          </w:tcPr>
+          <w:p>
+            <w:pPr>
+              <w:keepNext/>
+            </w:pPr>
+            <w:r>
+              <w:rPr>
+                <w:sz w:val="19"/>
+                <w:szCs w:val="19"/>
+              </w:rPr>
+              <w:t xml:space="preserve">F1</w:t>
+            </w:r>
+          </w:p>
+        </w:tc>
+        <w:tc>
+          <w:tcPr>
+            <w:tcW w:type="dxa" w:w="1446"/>
+            <w:tcBorders>
+              <w:top w:val="single" w:color="B7C3D0" w:sz="4"/>
+              <w:left w:val="single" w:color="B7C3D0" w:sz="4"/>
+              <w:bottom w:val="single" w:color="B7C3D0" w:sz="4"/>
+              <w:right w:val="single" w:color="B7C3D0" w:sz="4"/>
+            </w:tcBorders>
+            <w:tcMar>
+              <w:top w:type="dxa" w:w="60"/>
+              <w:left w:type="dxa" w:w="100"/>
+              <w:bottom w:type="dxa" w:w="60"/>
+              <w:right w:type="dxa" w:w="100"/>
+            </w:tcMar>
+            <w:vAlign w:val="center"/>
+          </w:tcPr>
+          <w:p>
+            <w:pPr>
+              <w:keepNext/>
+            </w:pPr>
+            <w:r>
+              <w:rPr>
+                <w:sz w:val="19"/>
+                <w:szCs w:val="19"/>
+              </w:rPr>
+              <w:t xml:space="preserve">☑ Concluída</w:t>
+            </w:r>
+          </w:p>
+        </w:tc>
+        <w:tc>
+          <w:tcPr>
+            <w:tcW w:type="dxa" w:w="2218"/>
+            <w:tcBorders>
+              <w:top w:val="single" w:color="B7C3D0" w:sz="4"/>
+              <w:left w:val="single" w:color="B7C3D0" w:sz="4"/>
+              <w:bottom w:val="single" w:color="B7C3D0" w:sz="4"/>
+              <w:right w:val="single" w:color="B7C3D0" w:sz="4"/>
+            </w:tcBorders>
+            <w:tcMar>
+              <w:top w:type="dxa" w:w="60"/>
+              <w:left w:type="dxa" w:w="100"/>
+              <w:bottom w:type="dxa" w:w="60"/>
+              <w:right w:type="dxa" w:w="100"/>
+            </w:tcMar>
+            <w:vAlign w:val="center"/>
+          </w:tcPr>
+          <w:p>
+            <w:pPr>
+              <w:keepNext/>
+            </w:pPr>
+            <w:r>
+              <w:rPr>
+                <w:sz w:val="19"/>
+                <w:szCs w:val="19"/>
+              </w:rPr>
+              <w:t xml:space="preserve">Mestre Gerd, 4 poses (52 px, mais baixo que o Kael)</w:t>
+            </w:r>
+          </w:p>
+        </w:tc>
+      </w:tr>
+      <w:tr>
+        <w:trPr>
+          <w:cantSplit/>
+        </w:trPr>
+        <w:tc>
+          <w:tcPr>
+            <w:tcW w:type="dxa" w:w="867"/>
+            <w:tcBorders>
+              <w:top w:val="single" w:color="B7C3D0" w:sz="4"/>
+              <w:left w:val="single" w:color="B7C3D0" w:sz="4"/>
+              <w:bottom w:val="single" w:color="B7C3D0" w:sz="4"/>
+              <w:right w:val="single" w:color="B7C3D0" w:sz="4"/>
+            </w:tcBorders>
+            <w:tcMar>
+              <w:top w:type="dxa" w:w="60"/>
+              <w:left w:type="dxa" w:w="100"/>
+              <w:bottom w:type="dxa" w:w="60"/>
+              <w:right w:type="dxa" w:w="100"/>
+            </w:tcMar>
+            <w:vAlign w:val="center"/>
+          </w:tcPr>
+          <w:p>
+            <w:pPr>
+              <w:keepNext/>
+            </w:pPr>
+            <w:r>
+              <w:rPr>
+                <w:sz w:val="19"/>
+                <w:szCs w:val="19"/>
+              </w:rPr>
+              <w:t xml:space="preserve">A-013</w:t>
+            </w:r>
+          </w:p>
+        </w:tc>
+        <w:tc>
+          <w:tcPr>
+            <w:tcW w:type="dxa" w:w="2891"/>
+            <w:tcBorders>
+              <w:top w:val="single" w:color="B7C3D0" w:sz="4"/>
+              <w:left w:val="single" w:color="B7C3D0" w:sz="4"/>
+              <w:bottom w:val="single" w:color="B7C3D0" w:sz="4"/>
+              <w:right w:val="single" w:color="B7C3D0" w:sz="4"/>
+            </w:tcBorders>
+            <w:tcMar>
+              <w:top w:type="dxa" w:w="60"/>
+              <w:left w:type="dxa" w:w="100"/>
+              <w:bottom w:type="dxa" w:w="60"/>
+              <w:right w:type="dxa" w:w="100"/>
+            </w:tcMar>
+            <w:vAlign w:val="center"/>
+          </w:tcPr>
+          <w:p>
+            <w:pPr>
+              <w:keepNext/>
+            </w:pPr>
+            <w:r>
+              <w:rPr>
+                <w:sz w:val="19"/>
+                <w:szCs w:val="19"/>
+              </w:rPr>
+              <w:t xml:space="preserve">assets/portraits/por_kael_neutral.png</w:t>
+            </w:r>
+          </w:p>
+        </w:tc>
+        <w:tc>
+          <w:tcPr>
+            <w:tcW w:type="dxa" w:w="1349"/>
+            <w:tcBorders>
+              <w:top w:val="single" w:color="B7C3D0" w:sz="4"/>
+              <w:left w:val="single" w:color="B7C3D0" w:sz="4"/>
+              <w:bottom w:val="single" w:color="B7C3D0" w:sz="4"/>
+              <w:right w:val="single" w:color="B7C3D0" w:sz="4"/>
+            </w:tcBorders>
+            <w:tcMar>
+              <w:top w:type="dxa" w:w="60"/>
+              <w:left w:type="dxa" w:w="100"/>
+              <w:bottom w:type="dxa" w:w="60"/>
+              <w:right w:type="dxa" w:w="100"/>
+            </w:tcMar>
+            <w:vAlign w:val="center"/>
+          </w:tcPr>
+          <w:p>
+            <w:pPr>
+              <w:keepNext/>
+            </w:pPr>
+            <w:r>
+              <w:rPr>
+                <w:sz w:val="19"/>
+                <w:szCs w:val="19"/>
+              </w:rPr>
+              <w:t xml:space="preserve">Retrato</w:t>
+            </w:r>
+          </w:p>
+        </w:tc>
+        <w:tc>
+          <w:tcPr>
+            <w:tcW w:type="dxa" w:w="867"/>
+            <w:tcBorders>
+              <w:top w:val="single" w:color="B7C3D0" w:sz="4"/>
+              <w:left w:val="single" w:color="B7C3D0" w:sz="4"/>
+              <w:bottom w:val="single" w:color="B7C3D0" w:sz="4"/>
+              <w:right w:val="single" w:color="B7C3D0" w:sz="4"/>
+            </w:tcBorders>
+            <w:tcMar>
+              <w:top w:type="dxa" w:w="60"/>
+              <w:left w:type="dxa" w:w="100"/>
+              <w:bottom w:type="dxa" w:w="60"/>
+              <w:right w:type="dxa" w:w="100"/>
+            </w:tcMar>
+            <w:vAlign w:val="center"/>
+          </w:tcPr>
+          <w:p>
+            <w:pPr>
+              <w:keepNext/>
+            </w:pPr>
+            <w:r>
+              <w:rPr>
+                <w:sz w:val="19"/>
+                <w:szCs w:val="19"/>
+              </w:rPr>
+              <w:t xml:space="preserve">F1</w:t>
+            </w:r>
+          </w:p>
+        </w:tc>
+        <w:tc>
+          <w:tcPr>
+            <w:tcW w:type="dxa" w:w="1446"/>
+            <w:tcBorders>
+              <w:top w:val="single" w:color="B7C3D0" w:sz="4"/>
+              <w:left w:val="single" w:color="B7C3D0" w:sz="4"/>
+              <w:bottom w:val="single" w:color="B7C3D0" w:sz="4"/>
+              <w:right w:val="single" w:color="B7C3D0" w:sz="4"/>
+            </w:tcBorders>
+            <w:tcMar>
+              <w:top w:type="dxa" w:w="60"/>
+              <w:left w:type="dxa" w:w="100"/>
+              <w:bottom w:type="dxa" w:w="60"/>
+              <w:right w:type="dxa" w:w="100"/>
+            </w:tcMar>
+            <w:vAlign w:val="center"/>
+          </w:tcPr>
+          <w:p>
+            <w:pPr>
+              <w:keepNext/>
+            </w:pPr>
+            <w:r>
+              <w:rPr>
+                <w:sz w:val="19"/>
+                <w:szCs w:val="19"/>
+              </w:rPr>
+              <w:t xml:space="preserve">☑ Concluída</w:t>
+            </w:r>
+          </w:p>
+        </w:tc>
+        <w:tc>
+          <w:tcPr>
+            <w:tcW w:type="dxa" w:w="2218"/>
+            <w:tcBorders>
+              <w:top w:val="single" w:color="B7C3D0" w:sz="4"/>
+              <w:left w:val="single" w:color="B7C3D0" w:sz="4"/>
+              <w:bottom w:val="single" w:color="B7C3D0" w:sz="4"/>
+              <w:right w:val="single" w:color="B7C3D0" w:sz="4"/>
+            </w:tcBorders>
+            <w:tcMar>
+              <w:top w:type="dxa" w:w="60"/>
+              <w:left w:type="dxa" w:w="100"/>
+              <w:bottom w:type="dxa" w:w="60"/>
+              <w:right w:type="dxa" w:w="100"/>
+            </w:tcMar>
+            <w:vAlign w:val="center"/>
+          </w:tcPr>
+          <w:p>
+            <w:pPr>
+              <w:keepNext/>
+            </w:pPr>
+            <w:r>
+              <w:rPr>
+                <w:sz w:val="19"/>
+                <w:szCs w:val="19"/>
+              </w:rPr>
+              <w:t xml:space="preserve">64×64, gerado com a referência do Kael</w:t>
+            </w:r>
+          </w:p>
+        </w:tc>
+      </w:tr>
+      <w:tr>
+        <w:trPr>
+          <w:cantSplit/>
+        </w:trPr>
+        <w:tc>
+          <w:tcPr>
+            <w:tcW w:type="dxa" w:w="867"/>
+            <w:tcBorders>
+              <w:top w:val="single" w:color="B7C3D0" w:sz="4"/>
+              <w:left w:val="single" w:color="B7C3D0" w:sz="4"/>
+              <w:bottom w:val="single" w:color="B7C3D0" w:sz="4"/>
+              <w:right w:val="single" w:color="B7C3D0" w:sz="4"/>
+            </w:tcBorders>
+            <w:tcMar>
+              <w:top w:type="dxa" w:w="60"/>
+              <w:left w:type="dxa" w:w="100"/>
+              <w:bottom w:type="dxa" w:w="60"/>
+              <w:right w:type="dxa" w:w="100"/>
+            </w:tcMar>
+            <w:vAlign w:val="center"/>
+          </w:tcPr>
+          <w:p>
+            <w:pPr>
+              <w:keepNext/>
+            </w:pPr>
+            <w:r>
+              <w:rPr>
+                <w:sz w:val="19"/>
+                <w:szCs w:val="19"/>
+              </w:rPr>
+              <w:t xml:space="preserve">A-014</w:t>
+            </w:r>
+          </w:p>
+        </w:tc>
+        <w:tc>
+          <w:tcPr>
+            <w:tcW w:type="dxa" w:w="2891"/>
+            <w:tcBorders>
+              <w:top w:val="single" w:color="B7C3D0" w:sz="4"/>
+              <w:left w:val="single" w:color="B7C3D0" w:sz="4"/>
+              <w:bottom w:val="single" w:color="B7C3D0" w:sz="4"/>
+              <w:right w:val="single" w:color="B7C3D0" w:sz="4"/>
+            </w:tcBorders>
+            <w:tcMar>
+              <w:top w:type="dxa" w:w="60"/>
+              <w:left w:type="dxa" w:w="100"/>
+              <w:bottom w:type="dxa" w:w="60"/>
+              <w:right w:type="dxa" w:w="100"/>
+            </w:tcMar>
+            <w:vAlign w:val="center"/>
+          </w:tcPr>
+          <w:p>
+            <w:pPr>
+              <w:keepNext/>
+            </w:pPr>
+            <w:r>
+              <w:rPr>
+                <w:sz w:val="19"/>
+                <w:szCs w:val="19"/>
+              </w:rPr>
+              <w:t xml:space="preserve">assets/portraits/por_gerd_neutral.png</w:t>
+            </w:r>
+          </w:p>
+        </w:tc>
+        <w:tc>
+          <w:tcPr>
+            <w:tcW w:type="dxa" w:w="1349"/>
+            <w:tcBorders>
+              <w:top w:val="single" w:color="B7C3D0" w:sz="4"/>
+              <w:left w:val="single" w:color="B7C3D0" w:sz="4"/>
+              <w:bottom w:val="single" w:color="B7C3D0" w:sz="4"/>
+              <w:right w:val="single" w:color="B7C3D0" w:sz="4"/>
+            </w:tcBorders>
+            <w:tcMar>
+              <w:top w:type="dxa" w:w="60"/>
+              <w:left w:type="dxa" w:w="100"/>
+              <w:bottom w:type="dxa" w:w="60"/>
+              <w:right w:type="dxa" w:w="100"/>
+            </w:tcMar>
+            <w:vAlign w:val="center"/>
+          </w:tcPr>
+          <w:p>
+            <w:pPr>
+              <w:keepNext/>
+            </w:pPr>
+            <w:r>
+              <w:rPr>
+                <w:sz w:val="19"/>
+                <w:szCs w:val="19"/>
+              </w:rPr>
+              <w:t xml:space="preserve">Retrato</w:t>
+            </w:r>
+          </w:p>
+        </w:tc>
+        <w:tc>
+          <w:tcPr>
+            <w:tcW w:type="dxa" w:w="867"/>
+            <w:tcBorders>
+              <w:top w:val="single" w:color="B7C3D0" w:sz="4"/>
+              <w:left w:val="single" w:color="B7C3D0" w:sz="4"/>
+              <w:bottom w:val="single" w:color="B7C3D0" w:sz="4"/>
+              <w:right w:val="single" w:color="B7C3D0" w:sz="4"/>
+            </w:tcBorders>
+            <w:tcMar>
+              <w:top w:type="dxa" w:w="60"/>
+              <w:left w:type="dxa" w:w="100"/>
+              <w:bottom w:type="dxa" w:w="60"/>
+              <w:right w:type="dxa" w:w="100"/>
+            </w:tcMar>
+            <w:vAlign w:val="center"/>
+          </w:tcPr>
+          <w:p>
+            <w:pPr>
+              <w:keepNext/>
+            </w:pPr>
+            <w:r>
+              <w:rPr>
+                <w:sz w:val="19"/>
+                <w:szCs w:val="19"/>
+              </w:rPr>
+              <w:t xml:space="preserve">F1</w:t>
+            </w:r>
+          </w:p>
+        </w:tc>
+        <w:tc>
+          <w:tcPr>
+            <w:tcW w:type="dxa" w:w="1446"/>
+            <w:tcBorders>
+              <w:top w:val="single" w:color="B7C3D0" w:sz="4"/>
+              <w:left w:val="single" w:color="B7C3D0" w:sz="4"/>
+              <w:bottom w:val="single" w:color="B7C3D0" w:sz="4"/>
+              <w:right w:val="single" w:color="B7C3D0" w:sz="4"/>
+            </w:tcBorders>
+            <w:tcMar>
+              <w:top w:type="dxa" w:w="60"/>
+              <w:left w:type="dxa" w:w="100"/>
+              <w:bottom w:type="dxa" w:w="60"/>
+              <w:right w:type="dxa" w:w="100"/>
+            </w:tcMar>
+            <w:vAlign w:val="center"/>
+          </w:tcPr>
+          <w:p>
+            <w:pPr>
+              <w:keepNext/>
+            </w:pPr>
+            <w:r>
+              <w:rPr>
+                <w:sz w:val="19"/>
+                <w:szCs w:val="19"/>
+              </w:rPr>
+              <w:t xml:space="preserve">☑ Concluída</w:t>
+            </w:r>
+          </w:p>
+        </w:tc>
+        <w:tc>
+          <w:tcPr>
+            <w:tcW w:type="dxa" w:w="2218"/>
+            <w:tcBorders>
+              <w:top w:val="single" w:color="B7C3D0" w:sz="4"/>
+              <w:left w:val="single" w:color="B7C3D0" w:sz="4"/>
+              <w:bottom w:val="single" w:color="B7C3D0" w:sz="4"/>
+              <w:right w:val="single" w:color="B7C3D0" w:sz="4"/>
+            </w:tcBorders>
+            <w:tcMar>
+              <w:top w:type="dxa" w:w="60"/>
+              <w:left w:type="dxa" w:w="100"/>
+              <w:bottom w:type="dxa" w:w="60"/>
+              <w:right w:type="dxa" w:w="100"/>
+            </w:tcMar>
+            <w:vAlign w:val="center"/>
+          </w:tcPr>
+          <w:p>
+            <w:pPr>
+              <w:keepNext/>
+            </w:pPr>
+            <w:r>
+              <w:rPr>
+                <w:sz w:val="19"/>
+                <w:szCs w:val="19"/>
+              </w:rPr>
+              <w:t xml:space="preserve">64×64, gerado com a referência do Gerd</w:t>
+            </w:r>
+          </w:p>
+        </w:tc>
+      </w:tr>
+      <w:tr>
+        <w:trPr>
+          <w:cantSplit/>
+        </w:trPr>
+        <w:tc>
+          <w:tcPr>
+            <w:tcW w:type="dxa" w:w="867"/>
+            <w:tcBorders>
+              <w:top w:val="single" w:color="B7C3D0" w:sz="4"/>
+              <w:left w:val="single" w:color="B7C3D0" w:sz="4"/>
+              <w:bottom w:val="single" w:color="B7C3D0" w:sz="4"/>
+              <w:right w:val="single" w:color="B7C3D0" w:sz="4"/>
+            </w:tcBorders>
+            <w:tcMar>
+              <w:top w:type="dxa" w:w="60"/>
+              <w:left w:type="dxa" w:w="100"/>
+              <w:bottom w:type="dxa" w:w="60"/>
+              <w:right w:type="dxa" w:w="100"/>
+            </w:tcMar>
+            <w:vAlign w:val="center"/>
+          </w:tcPr>
+          <w:p>
+            <w:pPr>
               <w:keepNext w:val="false"/>
             </w:pPr>
             <w:r>
@@ -29805,7 +30552,7 @@
                 <w:sz w:val="19"/>
                 <w:szCs w:val="19"/>
               </w:rPr>
-              <w:t xml:space="preserve">A-011</w:t>
+              <w:t xml:space="preserve">A-015</w:t>
             </w:r>
           </w:p>
         </w:tc>
@@ -29835,7 +30582,7 @@
                 <w:sz w:val="19"/>
                 <w:szCs w:val="19"/>
               </w:rPr>
-              <w:t xml:space="preserve">assets/sprites/characters/kael/chr_kael_walk.png</w:t>
+              <w:t xml:space="preserve">assets/fonts/PixelifySans.ttf</w:t>
             </w:r>
           </w:p>
         </w:tc>
@@ -29865,7 +30612,7 @@
                 <w:sz w:val="19"/>
                 <w:szCs w:val="19"/>
               </w:rPr>
-              <w:t xml:space="preserve">Sprite</w:t>
+              <w:t xml:space="preserve">Fonte</w:t>
             </w:r>
           </w:p>
         </w:tc>
@@ -29955,7 +30702,7 @@
                 <w:sz w:val="19"/>
                 <w:szCs w:val="19"/>
               </w:rPr>
-              <w:t xml:space="preserve">Grade 3 × 4 de 64×64 (baixo, esquerda, cima)</w:t>
+              <w:t xml:space="preserve">Google Fonts, licença OFL 1.1 (texto em assets/fonts/)</w:t>
             </w:r>
           </w:p>
         </w:tc>
@@ -33618,6 +34365,101 @@
           </w:tcPr>
           <w:p>
             <w:pPr>
+              <w:keepNext/>
+            </w:pPr>
+            <w:r>
+              <w:rPr>
+                <w:sz w:val="19"/>
+                <w:szCs w:val="19"/>
+              </w:rPr>
+              <w:t xml:space="preserve">1.0</w:t>
+            </w:r>
+          </w:p>
+        </w:tc>
+        <w:tc>
+          <w:tcPr>
+            <w:tcW w:type="dxa" w:w="1735"/>
+            <w:tcBorders>
+              <w:top w:val="single" w:color="B7C3D0" w:sz="4"/>
+              <w:left w:val="single" w:color="B7C3D0" w:sz="4"/>
+              <w:bottom w:val="single" w:color="B7C3D0" w:sz="4"/>
+              <w:right w:val="single" w:color="B7C3D0" w:sz="4"/>
+            </w:tcBorders>
+            <w:tcMar>
+              <w:top w:type="dxa" w:w="60"/>
+              <w:left w:type="dxa" w:w="100"/>
+              <w:bottom w:type="dxa" w:w="60"/>
+              <w:right w:type="dxa" w:w="100"/>
+            </w:tcMar>
+            <w:vAlign w:val="center"/>
+          </w:tcPr>
+          <w:p>
+            <w:pPr>
+              <w:keepNext/>
+            </w:pPr>
+            <w:r>
+              <w:rPr>
+                <w:sz w:val="19"/>
+                <w:szCs w:val="19"/>
+              </w:rPr>
+              <w:t xml:space="preserve">24/09/2026</w:t>
+            </w:r>
+          </w:p>
+        </w:tc>
+        <w:tc>
+          <w:tcPr>
+            <w:tcW w:type="dxa" w:w="6746"/>
+            <w:tcBorders>
+              <w:top w:val="single" w:color="B7C3D0" w:sz="4"/>
+              <w:left w:val="single" w:color="B7C3D0" w:sz="4"/>
+              <w:bottom w:val="single" w:color="B7C3D0" w:sz="4"/>
+              <w:right w:val="single" w:color="B7C3D0" w:sz="4"/>
+            </w:tcBorders>
+            <w:tcMar>
+              <w:top w:type="dxa" w:w="60"/>
+              <w:left w:type="dxa" w:w="100"/>
+              <w:bottom w:type="dxa" w:w="60"/>
+              <w:right w:type="dxa" w:w="100"/>
+            </w:tcMar>
+            <w:vAlign w:val="center"/>
+          </w:tcPr>
+          <w:p>
+            <w:pPr>
+              <w:keepNext/>
+            </w:pPr>
+            <w:r>
+              <w:rPr>
+                <w:sz w:val="19"/>
+                <w:szCs w:val="19"/>
+              </w:rPr>
+              <w:t xml:space="preserve">Fase 0 concluída: tema de Vila Caldeira aprovado (versão A; B guardada como reserva). CLAUDE.md criado. Início da Fase 1: Kael andando no mapa de teste com colisão e câmera; ciclo de caminhada; pixelize.mjs aceita grades (41 testes).</w:t>
+            </w:r>
+          </w:p>
+        </w:tc>
+      </w:tr>
+      <w:tr>
+        <w:trPr>
+          <w:cantSplit/>
+        </w:trPr>
+        <w:tc>
+          <w:tcPr>
+            <w:tcW w:type="dxa" w:w="1157"/>
+            <w:tcBorders>
+              <w:top w:val="single" w:color="B7C3D0" w:sz="4"/>
+              <w:left w:val="single" w:color="B7C3D0" w:sz="4"/>
+              <w:bottom w:val="single" w:color="B7C3D0" w:sz="4"/>
+              <w:right w:val="single" w:color="B7C3D0" w:sz="4"/>
+            </w:tcBorders>
+            <w:tcMar>
+              <w:top w:type="dxa" w:w="60"/>
+              <w:left w:type="dxa" w:w="100"/>
+              <w:bottom w:type="dxa" w:w="60"/>
+              <w:right w:type="dxa" w:w="100"/>
+            </w:tcMar>
+            <w:vAlign w:val="center"/>
+          </w:tcPr>
+          <w:p>
+            <w:pPr>
               <w:keepNext w:val="false"/>
             </w:pPr>
             <w:r>
@@ -33625,7 +34467,7 @@
                 <w:sz w:val="19"/>
                 <w:szCs w:val="19"/>
               </w:rPr>
-              <w:t xml:space="preserve">1.0</w:t>
+              <w:t xml:space="preserve">1.1</w:t>
             </w:r>
           </w:p>
         </w:tc>
@@ -33685,7 +34527,7 @@
                 <w:sz w:val="19"/>
                 <w:szCs w:val="19"/>
               </w:rPr>
-              <w:t xml:space="preserve">Fase 0 concluída: tema de Vila Caldeira aprovado (versão A; B guardada como reserva). CLAUDE.md criado. Início da Fase 1: Kael andando no mapa de teste com colisão e câmera; ciclo de caminhada; pixelize.mjs aceita grades (41 testes).</w:t>
+              <w:t xml:space="preserve">Conversa com NPC: Mestre Gerd no mapa de teste, retratos do Kael e do Gerd, caixa de diálogo com texto letra por letra, DialogueManager (autoload).</w:t>
             </w:r>
           </w:p>
         </w:tc>

</xml_diff>

<commit_message>
Scene transitions: SceneManager fade, doors, spawn points, test house, AudioManager, FieldMap
</commit_message>
<xml_diff>
--- a/docs/Planejamento_Projeto_RPG.docx
+++ b/docs/Planejamento_Projeto_RPG.docx
@@ -233,7 +233,7 @@
                 <w:sz w:val="19"/>
                 <w:szCs w:val="19"/>
               </w:rPr>
-              <w:t xml:space="preserve">1.1 — conversa com NPC</w:t>
+              <w:t xml:space="preserve">1.2 — transições de cena</w:t>
             </w:r>
           </w:p>
         </w:tc>
@@ -17264,7 +17264,7 @@
                 <w:sz w:val="19"/>
                 <w:szCs w:val="19"/>
               </w:rPr>
-              <w:t xml:space="preserve">☐ Pendente</w:t>
+              <w:t xml:space="preserve">☑ Concluída</w:t>
             </w:r>
           </w:p>
         </w:tc>
@@ -17289,6 +17289,13 @@
             <w:pPr>
               <w:keepNext/>
             </w:pPr>
+            <w:r>
+              <w:rPr>
+                <w:sz w:val="19"/>
+                <w:szCs w:val="19"/>
+              </w:rPr>
+              <w:t xml:space="preserve">Portas (Warp), pontos de chegada, interior de casa; AudioManager mantém a música entre salas</w:t>
+            </w:r>
           </w:p>
         </w:tc>
       </w:tr>
@@ -34460,6 +34467,101 @@
           </w:tcPr>
           <w:p>
             <w:pPr>
+              <w:keepNext/>
+            </w:pPr>
+            <w:r>
+              <w:rPr>
+                <w:sz w:val="19"/>
+                <w:szCs w:val="19"/>
+              </w:rPr>
+              <w:t xml:space="preserve">1.1</w:t>
+            </w:r>
+          </w:p>
+        </w:tc>
+        <w:tc>
+          <w:tcPr>
+            <w:tcW w:type="dxa" w:w="1735"/>
+            <w:tcBorders>
+              <w:top w:val="single" w:color="B7C3D0" w:sz="4"/>
+              <w:left w:val="single" w:color="B7C3D0" w:sz="4"/>
+              <w:bottom w:val="single" w:color="B7C3D0" w:sz="4"/>
+              <w:right w:val="single" w:color="B7C3D0" w:sz="4"/>
+            </w:tcBorders>
+            <w:tcMar>
+              <w:top w:type="dxa" w:w="60"/>
+              <w:left w:type="dxa" w:w="100"/>
+              <w:bottom w:type="dxa" w:w="60"/>
+              <w:right w:type="dxa" w:w="100"/>
+            </w:tcMar>
+            <w:vAlign w:val="center"/>
+          </w:tcPr>
+          <w:p>
+            <w:pPr>
+              <w:keepNext/>
+            </w:pPr>
+            <w:r>
+              <w:rPr>
+                <w:sz w:val="19"/>
+                <w:szCs w:val="19"/>
+              </w:rPr>
+              <w:t xml:space="preserve">24/09/2026</w:t>
+            </w:r>
+          </w:p>
+        </w:tc>
+        <w:tc>
+          <w:tcPr>
+            <w:tcW w:type="dxa" w:w="6746"/>
+            <w:tcBorders>
+              <w:top w:val="single" w:color="B7C3D0" w:sz="4"/>
+              <w:left w:val="single" w:color="B7C3D0" w:sz="4"/>
+              <w:bottom w:val="single" w:color="B7C3D0" w:sz="4"/>
+              <w:right w:val="single" w:color="B7C3D0" w:sz="4"/>
+            </w:tcBorders>
+            <w:tcMar>
+              <w:top w:type="dxa" w:w="60"/>
+              <w:left w:type="dxa" w:w="100"/>
+              <w:bottom w:type="dxa" w:w="60"/>
+              <w:right w:type="dxa" w:w="100"/>
+            </w:tcMar>
+            <w:vAlign w:val="center"/>
+          </w:tcPr>
+          <w:p>
+            <w:pPr>
+              <w:keepNext/>
+            </w:pPr>
+            <w:r>
+              <w:rPr>
+                <w:sz w:val="19"/>
+                <w:szCs w:val="19"/>
+              </w:rPr>
+              <w:t xml:space="preserve">Conversa com NPC: Mestre Gerd no mapa de teste, retratos do Kael e do Gerd, caixa de diálogo com texto letra por letra, DialogueManager (autoload).</w:t>
+            </w:r>
+          </w:p>
+        </w:tc>
+      </w:tr>
+      <w:tr>
+        <w:trPr>
+          <w:cantSplit/>
+        </w:trPr>
+        <w:tc>
+          <w:tcPr>
+            <w:tcW w:type="dxa" w:w="1157"/>
+            <w:tcBorders>
+              <w:top w:val="single" w:color="B7C3D0" w:sz="4"/>
+              <w:left w:val="single" w:color="B7C3D0" w:sz="4"/>
+              <w:bottom w:val="single" w:color="B7C3D0" w:sz="4"/>
+              <w:right w:val="single" w:color="B7C3D0" w:sz="4"/>
+            </w:tcBorders>
+            <w:tcMar>
+              <w:top w:type="dxa" w:w="60"/>
+              <w:left w:type="dxa" w:w="100"/>
+              <w:bottom w:type="dxa" w:w="60"/>
+              <w:right w:type="dxa" w:w="100"/>
+            </w:tcMar>
+            <w:vAlign w:val="center"/>
+          </w:tcPr>
+          <w:p>
+            <w:pPr>
               <w:keepNext w:val="false"/>
             </w:pPr>
             <w:r>
@@ -34467,7 +34569,7 @@
                 <w:sz w:val="19"/>
                 <w:szCs w:val="19"/>
               </w:rPr>
-              <w:t xml:space="preserve">1.1</w:t>
+              <w:t xml:space="preserve">1.2</w:t>
             </w:r>
           </w:p>
         </w:tc>
@@ -34527,7 +34629,7 @@
                 <w:sz w:val="19"/>
                 <w:szCs w:val="19"/>
               </w:rPr>
-              <w:t xml:space="preserve">Conversa com NPC: Mestre Gerd no mapa de teste, retratos do Kael e do Gerd, caixa de diálogo com texto letra por letra, DialogueManager (autoload).</w:t>
+              <w:t xml:space="preserve">Transições de cena: SceneManager (fade), portas, pontos de chegada, casa de teste, AudioManager, FieldMap (56 testes).</w:t>
             </w:r>
           </w:p>
         </w:tc>

</xml_diff>

<commit_message>
First battle: field enemy, on-map battle scene, CTB order UI, command menu and targeting, timing prompt, victory/defeat; Brann and Oil Slime sprites
</commit_message>
<xml_diff>
--- a/docs/Planejamento_Projeto_RPG.docx
+++ b/docs/Planejamento_Projeto_RPG.docx
@@ -233,7 +233,7 @@
                 <w:sz w:val="19"/>
                 <w:szCs w:val="19"/>
               </w:rPr>
-              <w:t xml:space="preserve">1.2 — transições de cena</w:t>
+              <w:t xml:space="preserve">1.3 — primeira batalha</w:t>
             </w:r>
           </w:p>
         </w:tc>
@@ -17419,7 +17419,7 @@
                 <w:sz w:val="19"/>
                 <w:szCs w:val="19"/>
               </w:rPr>
-              <w:t xml:space="preserve">☐ Pendente</w:t>
+              <w:t xml:space="preserve">☑ Concluída</w:t>
             </w:r>
           </w:p>
         </w:tc>
@@ -17444,6 +17444,13 @@
             <w:pPr>
               <w:keepNext/>
             </w:pPr>
+            <w:r>
+              <w:rPr>
+                <w:sz w:val="19"/>
+                <w:szCs w:val="19"/>
+              </w:rPr>
+              <w:t xml:space="preserve">FieldEnemy com patrulha; batalha no próprio mapa (D-04)</w:t>
+            </w:r>
           </w:p>
         </w:tc>
       </w:tr>
@@ -17567,7 +17574,7 @@
                 <w:sz w:val="19"/>
                 <w:szCs w:val="19"/>
               </w:rPr>
-              <w:t xml:space="preserve">☐ Pendente</w:t>
+              <w:t xml:space="preserve">☑ Concluída</w:t>
             </w:r>
           </w:p>
         </w:tc>
@@ -17592,6 +17599,13 @@
             <w:pPr>
               <w:keepNext/>
             </w:pPr>
+            <w:r>
+              <w:rPr>
+                <w:sz w:val="19"/>
+                <w:szCs w:val="19"/>
+              </w:rPr>
+              <w:t xml:space="preserve">Kael, Lyra, Brann × 2 Slimes de Óleo; Atacar, Defender, Fogo</w:t>
+            </w:r>
           </w:p>
         </w:tc>
       </w:tr>
@@ -17715,7 +17729,7 @@
                 <w:sz w:val="19"/>
                 <w:szCs w:val="19"/>
               </w:rPr>
-              <w:t xml:space="preserve">◐ Em andamento</w:t>
+              <w:t xml:space="preserve">☑ Concluída</w:t>
             </w:r>
           </w:p>
         </w:tc>
@@ -17745,7 +17759,7 @@
                 <w:sz w:val="19"/>
                 <w:szCs w:val="19"/>
               </w:rPr>
-              <w:t xml:space="preserve">Lógica pronta e testada (TurnQueue, DamageFormula); falta a interface</w:t>
+              <w:t xml:space="preserve">Fila na tela com os próximos turnos</w:t>
             </w:r>
           </w:p>
         </w:tc>
@@ -17870,7 +17884,7 @@
                 <w:sz w:val="19"/>
                 <w:szCs w:val="19"/>
               </w:rPr>
-              <w:t xml:space="preserve">☐ Pendente</w:t>
+              <w:t xml:space="preserve">☑ Concluída</w:t>
             </w:r>
           </w:p>
         </w:tc>
@@ -17900,7 +17914,7 @@
                 <w:sz w:val="19"/>
                 <w:szCs w:val="19"/>
               </w:rPr>
-              <w:t xml:space="preserve">Validar a sensação do sistema híbrido</w:t>
+              <w:t xml:space="preserve">Anel que fecha no impacto: ataque e defesa (Perfeito/Bom)</w:t>
             </w:r>
           </w:p>
         </w:tc>
@@ -18025,7 +18039,7 @@
                 <w:sz w:val="19"/>
                 <w:szCs w:val="19"/>
               </w:rPr>
-              <w:t xml:space="preserve">☐ Pendente</w:t>
+              <w:t xml:space="preserve">☑ Concluída</w:t>
             </w:r>
           </w:p>
         </w:tc>
@@ -18050,6 +18064,13 @@
             <w:pPr>
               <w:keepNext/>
             </w:pPr>
+            <w:r>
+              <w:rPr>
+                <w:sz w:val="19"/>
+                <w:szCs w:val="19"/>
+              </w:rPr>
+              <w:t xml:space="preserve">Vitória com XP e moedas; derrota repete a batalha</w:t>
+            </w:r>
           </w:p>
         </w:tc>
       </w:tr>
@@ -18173,7 +18194,7 @@
                 <w:sz w:val="19"/>
                 <w:szCs w:val="19"/>
               </w:rPr>
-              <w:t xml:space="preserve">☐ Pendente</w:t>
+              <w:t xml:space="preserve">☑ Concluída</w:t>
             </w:r>
           </w:p>
         </w:tc>
@@ -18198,6 +18219,13 @@
             <w:pPr>
               <w:keepNext/>
             </w:pPr>
+            <w:r>
+              <w:rPr>
+                <w:sz w:val="19"/>
+                <w:szCs w:val="19"/>
+              </w:rPr>
+              <w:t xml:space="preserve">Kael, Gerd, Brann, Slime no jogo</w:t>
+            </w:r>
           </w:p>
         </w:tc>
       </w:tr>
@@ -30552,6 +30580,376 @@
           </w:tcPr>
           <w:p>
             <w:pPr>
+              <w:keepNext/>
+            </w:pPr>
+            <w:r>
+              <w:rPr>
+                <w:sz w:val="19"/>
+                <w:szCs w:val="19"/>
+              </w:rPr>
+              <w:t xml:space="preserve">A-015</w:t>
+            </w:r>
+          </w:p>
+        </w:tc>
+        <w:tc>
+          <w:tcPr>
+            <w:tcW w:type="dxa" w:w="2891"/>
+            <w:tcBorders>
+              <w:top w:val="single" w:color="B7C3D0" w:sz="4"/>
+              <w:left w:val="single" w:color="B7C3D0" w:sz="4"/>
+              <w:bottom w:val="single" w:color="B7C3D0" w:sz="4"/>
+              <w:right w:val="single" w:color="B7C3D0" w:sz="4"/>
+            </w:tcBorders>
+            <w:tcMar>
+              <w:top w:type="dxa" w:w="60"/>
+              <w:left w:type="dxa" w:w="100"/>
+              <w:bottom w:type="dxa" w:w="60"/>
+              <w:right w:type="dxa" w:w="100"/>
+            </w:tcMar>
+            <w:vAlign w:val="center"/>
+          </w:tcPr>
+          <w:p>
+            <w:pPr>
+              <w:keepNext/>
+            </w:pPr>
+            <w:r>
+              <w:rPr>
+                <w:sz w:val="19"/>
+                <w:szCs w:val="19"/>
+              </w:rPr>
+              <w:t xml:space="preserve">assets/fonts/PixelifySans.ttf</w:t>
+            </w:r>
+          </w:p>
+        </w:tc>
+        <w:tc>
+          <w:tcPr>
+            <w:tcW w:type="dxa" w:w="1349"/>
+            <w:tcBorders>
+              <w:top w:val="single" w:color="B7C3D0" w:sz="4"/>
+              <w:left w:val="single" w:color="B7C3D0" w:sz="4"/>
+              <w:bottom w:val="single" w:color="B7C3D0" w:sz="4"/>
+              <w:right w:val="single" w:color="B7C3D0" w:sz="4"/>
+            </w:tcBorders>
+            <w:tcMar>
+              <w:top w:type="dxa" w:w="60"/>
+              <w:left w:type="dxa" w:w="100"/>
+              <w:bottom w:type="dxa" w:w="60"/>
+              <w:right w:type="dxa" w:w="100"/>
+            </w:tcMar>
+            <w:vAlign w:val="center"/>
+          </w:tcPr>
+          <w:p>
+            <w:pPr>
+              <w:keepNext/>
+            </w:pPr>
+            <w:r>
+              <w:rPr>
+                <w:sz w:val="19"/>
+                <w:szCs w:val="19"/>
+              </w:rPr>
+              <w:t xml:space="preserve">Fonte</w:t>
+            </w:r>
+          </w:p>
+        </w:tc>
+        <w:tc>
+          <w:tcPr>
+            <w:tcW w:type="dxa" w:w="867"/>
+            <w:tcBorders>
+              <w:top w:val="single" w:color="B7C3D0" w:sz="4"/>
+              <w:left w:val="single" w:color="B7C3D0" w:sz="4"/>
+              <w:bottom w:val="single" w:color="B7C3D0" w:sz="4"/>
+              <w:right w:val="single" w:color="B7C3D0" w:sz="4"/>
+            </w:tcBorders>
+            <w:tcMar>
+              <w:top w:type="dxa" w:w="60"/>
+              <w:left w:type="dxa" w:w="100"/>
+              <w:bottom w:type="dxa" w:w="60"/>
+              <w:right w:type="dxa" w:w="100"/>
+            </w:tcMar>
+            <w:vAlign w:val="center"/>
+          </w:tcPr>
+          <w:p>
+            <w:pPr>
+              <w:keepNext/>
+            </w:pPr>
+            <w:r>
+              <w:rPr>
+                <w:sz w:val="19"/>
+                <w:szCs w:val="19"/>
+              </w:rPr>
+              <w:t xml:space="preserve">F1</w:t>
+            </w:r>
+          </w:p>
+        </w:tc>
+        <w:tc>
+          <w:tcPr>
+            <w:tcW w:type="dxa" w:w="1446"/>
+            <w:tcBorders>
+              <w:top w:val="single" w:color="B7C3D0" w:sz="4"/>
+              <w:left w:val="single" w:color="B7C3D0" w:sz="4"/>
+              <w:bottom w:val="single" w:color="B7C3D0" w:sz="4"/>
+              <w:right w:val="single" w:color="B7C3D0" w:sz="4"/>
+            </w:tcBorders>
+            <w:tcMar>
+              <w:top w:type="dxa" w:w="60"/>
+              <w:left w:type="dxa" w:w="100"/>
+              <w:bottom w:type="dxa" w:w="60"/>
+              <w:right w:type="dxa" w:w="100"/>
+            </w:tcMar>
+            <w:vAlign w:val="center"/>
+          </w:tcPr>
+          <w:p>
+            <w:pPr>
+              <w:keepNext/>
+            </w:pPr>
+            <w:r>
+              <w:rPr>
+                <w:sz w:val="19"/>
+                <w:szCs w:val="19"/>
+              </w:rPr>
+              <w:t xml:space="preserve">☑ Concluída</w:t>
+            </w:r>
+          </w:p>
+        </w:tc>
+        <w:tc>
+          <w:tcPr>
+            <w:tcW w:type="dxa" w:w="2218"/>
+            <w:tcBorders>
+              <w:top w:val="single" w:color="B7C3D0" w:sz="4"/>
+              <w:left w:val="single" w:color="B7C3D0" w:sz="4"/>
+              <w:bottom w:val="single" w:color="B7C3D0" w:sz="4"/>
+              <w:right w:val="single" w:color="B7C3D0" w:sz="4"/>
+            </w:tcBorders>
+            <w:tcMar>
+              <w:top w:type="dxa" w:w="60"/>
+              <w:left w:type="dxa" w:w="100"/>
+              <w:bottom w:type="dxa" w:w="60"/>
+              <w:right w:type="dxa" w:w="100"/>
+            </w:tcMar>
+            <w:vAlign w:val="center"/>
+          </w:tcPr>
+          <w:p>
+            <w:pPr>
+              <w:keepNext/>
+            </w:pPr>
+            <w:r>
+              <w:rPr>
+                <w:sz w:val="19"/>
+                <w:szCs w:val="19"/>
+              </w:rPr>
+              <w:t xml:space="preserve">Google Fonts, licença OFL 1.1 (texto em assets/fonts/)</w:t>
+            </w:r>
+          </w:p>
+        </w:tc>
+      </w:tr>
+      <w:tr>
+        <w:trPr>
+          <w:cantSplit/>
+        </w:trPr>
+        <w:tc>
+          <w:tcPr>
+            <w:tcW w:type="dxa" w:w="867"/>
+            <w:tcBorders>
+              <w:top w:val="single" w:color="B7C3D0" w:sz="4"/>
+              <w:left w:val="single" w:color="B7C3D0" w:sz="4"/>
+              <w:bottom w:val="single" w:color="B7C3D0" w:sz="4"/>
+              <w:right w:val="single" w:color="B7C3D0" w:sz="4"/>
+            </w:tcBorders>
+            <w:tcMar>
+              <w:top w:type="dxa" w:w="60"/>
+              <w:left w:type="dxa" w:w="100"/>
+              <w:bottom w:type="dxa" w:w="60"/>
+              <w:right w:type="dxa" w:w="100"/>
+            </w:tcMar>
+            <w:vAlign w:val="center"/>
+          </w:tcPr>
+          <w:p>
+            <w:pPr>
+              <w:keepNext/>
+            </w:pPr>
+            <w:r>
+              <w:rPr>
+                <w:sz w:val="19"/>
+                <w:szCs w:val="19"/>
+              </w:rPr>
+              <w:t xml:space="preserve">A-016</w:t>
+            </w:r>
+          </w:p>
+        </w:tc>
+        <w:tc>
+          <w:tcPr>
+            <w:tcW w:type="dxa" w:w="2891"/>
+            <w:tcBorders>
+              <w:top w:val="single" w:color="B7C3D0" w:sz="4"/>
+              <w:left w:val="single" w:color="B7C3D0" w:sz="4"/>
+              <w:bottom w:val="single" w:color="B7C3D0" w:sz="4"/>
+              <w:right w:val="single" w:color="B7C3D0" w:sz="4"/>
+            </w:tcBorders>
+            <w:tcMar>
+              <w:top w:type="dxa" w:w="60"/>
+              <w:left w:type="dxa" w:w="100"/>
+              <w:bottom w:type="dxa" w:w="60"/>
+              <w:right w:type="dxa" w:w="100"/>
+            </w:tcMar>
+            <w:vAlign w:val="center"/>
+          </w:tcPr>
+          <w:p>
+            <w:pPr>
+              <w:keepNext/>
+            </w:pPr>
+            <w:r>
+              <w:rPr>
+                <w:sz w:val="19"/>
+                <w:szCs w:val="19"/>
+              </w:rPr>
+              <w:t xml:space="preserve">assets/sprites/characters/brann/chr_brann_ref.png</w:t>
+            </w:r>
+          </w:p>
+        </w:tc>
+        <w:tc>
+          <w:tcPr>
+            <w:tcW w:type="dxa" w:w="1349"/>
+            <w:tcBorders>
+              <w:top w:val="single" w:color="B7C3D0" w:sz="4"/>
+              <w:left w:val="single" w:color="B7C3D0" w:sz="4"/>
+              <w:bottom w:val="single" w:color="B7C3D0" w:sz="4"/>
+              <w:right w:val="single" w:color="B7C3D0" w:sz="4"/>
+            </w:tcBorders>
+            <w:tcMar>
+              <w:top w:type="dxa" w:w="60"/>
+              <w:left w:type="dxa" w:w="100"/>
+              <w:bottom w:type="dxa" w:w="60"/>
+              <w:right w:type="dxa" w:w="100"/>
+            </w:tcMar>
+            <w:vAlign w:val="center"/>
+          </w:tcPr>
+          <w:p>
+            <w:pPr>
+              <w:keepNext/>
+            </w:pPr>
+            <w:r>
+              <w:rPr>
+                <w:sz w:val="19"/>
+                <w:szCs w:val="19"/>
+              </w:rPr>
+              <w:t xml:space="preserve">Sprite</w:t>
+            </w:r>
+          </w:p>
+        </w:tc>
+        <w:tc>
+          <w:tcPr>
+            <w:tcW w:type="dxa" w:w="867"/>
+            <w:tcBorders>
+              <w:top w:val="single" w:color="B7C3D0" w:sz="4"/>
+              <w:left w:val="single" w:color="B7C3D0" w:sz="4"/>
+              <w:bottom w:val="single" w:color="B7C3D0" w:sz="4"/>
+              <w:right w:val="single" w:color="B7C3D0" w:sz="4"/>
+            </w:tcBorders>
+            <w:tcMar>
+              <w:top w:type="dxa" w:w="60"/>
+              <w:left w:type="dxa" w:w="100"/>
+              <w:bottom w:type="dxa" w:w="60"/>
+              <w:right w:type="dxa" w:w="100"/>
+            </w:tcMar>
+            <w:vAlign w:val="center"/>
+          </w:tcPr>
+          <w:p>
+            <w:pPr>
+              <w:keepNext/>
+            </w:pPr>
+            <w:r>
+              <w:rPr>
+                <w:sz w:val="19"/>
+                <w:szCs w:val="19"/>
+              </w:rPr>
+              <w:t xml:space="preserve">F1</w:t>
+            </w:r>
+          </w:p>
+        </w:tc>
+        <w:tc>
+          <w:tcPr>
+            <w:tcW w:type="dxa" w:w="1446"/>
+            <w:tcBorders>
+              <w:top w:val="single" w:color="B7C3D0" w:sz="4"/>
+              <w:left w:val="single" w:color="B7C3D0" w:sz="4"/>
+              <w:bottom w:val="single" w:color="B7C3D0" w:sz="4"/>
+              <w:right w:val="single" w:color="B7C3D0" w:sz="4"/>
+            </w:tcBorders>
+            <w:tcMar>
+              <w:top w:type="dxa" w:w="60"/>
+              <w:left w:type="dxa" w:w="100"/>
+              <w:bottom w:type="dxa" w:w="60"/>
+              <w:right w:type="dxa" w:w="100"/>
+            </w:tcMar>
+            <w:vAlign w:val="center"/>
+          </w:tcPr>
+          <w:p>
+            <w:pPr>
+              <w:keepNext/>
+            </w:pPr>
+            <w:r>
+              <w:rPr>
+                <w:sz w:val="19"/>
+                <w:szCs w:val="19"/>
+              </w:rPr>
+              <w:t xml:space="preserve">☑ Concluída</w:t>
+            </w:r>
+          </w:p>
+        </w:tc>
+        <w:tc>
+          <w:tcPr>
+            <w:tcW w:type="dxa" w:w="2218"/>
+            <w:tcBorders>
+              <w:top w:val="single" w:color="B7C3D0" w:sz="4"/>
+              <w:left w:val="single" w:color="B7C3D0" w:sz="4"/>
+              <w:bottom w:val="single" w:color="B7C3D0" w:sz="4"/>
+              <w:right w:val="single" w:color="B7C3D0" w:sz="4"/>
+            </w:tcBorders>
+            <w:tcMar>
+              <w:top w:type="dxa" w:w="60"/>
+              <w:left w:type="dxa" w:w="100"/>
+              <w:bottom w:type="dxa" w:w="60"/>
+              <w:right w:type="dxa" w:w="100"/>
+            </w:tcMar>
+            <w:vAlign w:val="center"/>
+          </w:tcPr>
+          <w:p>
+            <w:pPr>
+              <w:keepNext/>
+            </w:pPr>
+            <w:r>
+              <w:rPr>
+                <w:sz w:val="19"/>
+                <w:szCs w:val="19"/>
+              </w:rPr>
+              <w:t xml:space="preserve">Brann, 4 poses; manopla a vapor</w:t>
+            </w:r>
+          </w:p>
+        </w:tc>
+      </w:tr>
+      <w:tr>
+        <w:trPr>
+          <w:cantSplit/>
+        </w:trPr>
+        <w:tc>
+          <w:tcPr>
+            <w:tcW w:type="dxa" w:w="867"/>
+            <w:tcBorders>
+              <w:top w:val="single" w:color="B7C3D0" w:sz="4"/>
+              <w:left w:val="single" w:color="B7C3D0" w:sz="4"/>
+              <w:bottom w:val="single" w:color="B7C3D0" w:sz="4"/>
+              <w:right w:val="single" w:color="B7C3D0" w:sz="4"/>
+            </w:tcBorders>
+            <w:tcMar>
+              <w:top w:type="dxa" w:w="60"/>
+              <w:left w:type="dxa" w:w="100"/>
+              <w:bottom w:type="dxa" w:w="60"/>
+              <w:right w:type="dxa" w:w="100"/>
+            </w:tcMar>
+            <w:vAlign w:val="center"/>
+          </w:tcPr>
+          <w:p>
+            <w:pPr>
               <w:keepNext w:val="false"/>
             </w:pPr>
             <w:r>
@@ -30559,7 +30957,7 @@
                 <w:sz w:val="19"/>
                 <w:szCs w:val="19"/>
               </w:rPr>
-              <w:t xml:space="preserve">A-015</w:t>
+              <w:t xml:space="preserve">A-017</w:t>
             </w:r>
           </w:p>
         </w:tc>
@@ -30589,7 +30987,7 @@
                 <w:sz w:val="19"/>
                 <w:szCs w:val="19"/>
               </w:rPr>
-              <w:t xml:space="preserve">assets/fonts/PixelifySans.ttf</w:t>
+              <w:t xml:space="preserve">assets/sprites/enemies/enm_oil_slime.png</w:t>
             </w:r>
           </w:p>
         </w:tc>
@@ -30619,7 +31017,7 @@
                 <w:sz w:val="19"/>
                 <w:szCs w:val="19"/>
               </w:rPr>
-              <w:t xml:space="preserve">Fonte</w:t>
+              <w:t xml:space="preserve">Sprite</w:t>
             </w:r>
           </w:p>
         </w:tc>
@@ -30709,7 +31107,7 @@
                 <w:sz w:val="19"/>
                 <w:szCs w:val="19"/>
               </w:rPr>
-              <w:t xml:space="preserve">Google Fonts, licença OFL 1.1 (texto em assets/fonts/)</w:t>
+              <w:t xml:space="preserve">Slime de Óleo: parado, respirando, ataque, dano (56×48)</w:t>
             </w:r>
           </w:p>
         </w:tc>
@@ -34562,6 +34960,101 @@
           </w:tcPr>
           <w:p>
             <w:pPr>
+              <w:keepNext/>
+            </w:pPr>
+            <w:r>
+              <w:rPr>
+                <w:sz w:val="19"/>
+                <w:szCs w:val="19"/>
+              </w:rPr>
+              <w:t xml:space="preserve">1.2</w:t>
+            </w:r>
+          </w:p>
+        </w:tc>
+        <w:tc>
+          <w:tcPr>
+            <w:tcW w:type="dxa" w:w="1735"/>
+            <w:tcBorders>
+              <w:top w:val="single" w:color="B7C3D0" w:sz="4"/>
+              <w:left w:val="single" w:color="B7C3D0" w:sz="4"/>
+              <w:bottom w:val="single" w:color="B7C3D0" w:sz="4"/>
+              <w:right w:val="single" w:color="B7C3D0" w:sz="4"/>
+            </w:tcBorders>
+            <w:tcMar>
+              <w:top w:type="dxa" w:w="60"/>
+              <w:left w:type="dxa" w:w="100"/>
+              <w:bottom w:type="dxa" w:w="60"/>
+              <w:right w:type="dxa" w:w="100"/>
+            </w:tcMar>
+            <w:vAlign w:val="center"/>
+          </w:tcPr>
+          <w:p>
+            <w:pPr>
+              <w:keepNext/>
+            </w:pPr>
+            <w:r>
+              <w:rPr>
+                <w:sz w:val="19"/>
+                <w:szCs w:val="19"/>
+              </w:rPr>
+              <w:t xml:space="preserve">24/09/2026</w:t>
+            </w:r>
+          </w:p>
+        </w:tc>
+        <w:tc>
+          <w:tcPr>
+            <w:tcW w:type="dxa" w:w="6746"/>
+            <w:tcBorders>
+              <w:top w:val="single" w:color="B7C3D0" w:sz="4"/>
+              <w:left w:val="single" w:color="B7C3D0" w:sz="4"/>
+              <w:bottom w:val="single" w:color="B7C3D0" w:sz="4"/>
+              <w:right w:val="single" w:color="B7C3D0" w:sz="4"/>
+            </w:tcBorders>
+            <w:tcMar>
+              <w:top w:type="dxa" w:w="60"/>
+              <w:left w:type="dxa" w:w="100"/>
+              <w:bottom w:type="dxa" w:w="60"/>
+              <w:right w:type="dxa" w:w="100"/>
+            </w:tcMar>
+            <w:vAlign w:val="center"/>
+          </w:tcPr>
+          <w:p>
+            <w:pPr>
+              <w:keepNext/>
+            </w:pPr>
+            <w:r>
+              <w:rPr>
+                <w:sz w:val="19"/>
+                <w:szCs w:val="19"/>
+              </w:rPr>
+              <w:t xml:space="preserve">Transições de cena: SceneManager (fade), portas, pontos de chegada, casa de teste, AudioManager, FieldMap (56 testes).</w:t>
+            </w:r>
+          </w:p>
+        </w:tc>
+      </w:tr>
+      <w:tr>
+        <w:trPr>
+          <w:cantSplit/>
+        </w:trPr>
+        <w:tc>
+          <w:tcPr>
+            <w:tcW w:type="dxa" w:w="1157"/>
+            <w:tcBorders>
+              <w:top w:val="single" w:color="B7C3D0" w:sz="4"/>
+              <w:left w:val="single" w:color="B7C3D0" w:sz="4"/>
+              <w:bottom w:val="single" w:color="B7C3D0" w:sz="4"/>
+              <w:right w:val="single" w:color="B7C3D0" w:sz="4"/>
+            </w:tcBorders>
+            <w:tcMar>
+              <w:top w:type="dxa" w:w="60"/>
+              <w:left w:type="dxa" w:w="100"/>
+              <w:bottom w:type="dxa" w:w="60"/>
+              <w:right w:type="dxa" w:w="100"/>
+            </w:tcMar>
+            <w:vAlign w:val="center"/>
+          </w:tcPr>
+          <w:p>
+            <w:pPr>
               <w:keepNext w:val="false"/>
             </w:pPr>
             <w:r>
@@ -34569,7 +35062,7 @@
                 <w:sz w:val="19"/>
                 <w:szCs w:val="19"/>
               </w:rPr>
-              <w:t xml:space="preserve">1.2</w:t>
+              <w:t xml:space="preserve">1.3</w:t>
             </w:r>
           </w:p>
         </w:tc>
@@ -34629,7 +35122,7 @@
                 <w:sz w:val="19"/>
                 <w:szCs w:val="19"/>
               </w:rPr>
-              <w:t xml:space="preserve">Transições de cena: SceneManager (fade), portas, pontos de chegada, casa de teste, AudioManager, FieldMap (56 testes).</w:t>
+              <w:t xml:space="preserve">Primeira batalha: inimigo no mapa, formação no próprio cenário, fila CTB, menu e alvo, timing de ataque e defesa, vitória/derrota; Brann e Slime de Óleo (76 testes).</w:t>
             </w:r>
           </w:p>
         </w:tc>

</xml_diff>

<commit_message>
Block B complete: battle menu with techs/items/swap/flee, hold/channel timing, status tags, Aether bars, encounter initiative/ambush, battle and victory music
</commit_message>
<xml_diff>
--- a/docs/Planejamento_Projeto_RPG.docx
+++ b/docs/Planejamento_Projeto_RPG.docx
@@ -623,7 +623,7 @@
                 <w:sz w:val="19"/>
                 <w:szCs w:val="19"/>
               </w:rPr>
-              <w:t xml:space="preserve">Fase 1 — Protótipo técnico</w:t>
+              <w:t xml:space="preserve">Fase 2 — Sistemas centrais</w:t>
             </w:r>
           </w:p>
         </w:tc>
@@ -688,7 +688,7 @@
                 <w:sz w:val="19"/>
                 <w:szCs w:val="19"/>
               </w:rPr>
-              <w:t xml:space="preserve">Fase 0 concluída em 24/09/2026</w:t>
+              <w:t xml:space="preserve">Fases 0 e 1 concluídas (24–25/09/2026)</w:t>
             </w:r>
           </w:p>
         </w:tc>
@@ -12570,7 +12570,7 @@
                 <w:sz w:val="19"/>
                 <w:szCs w:val="19"/>
               </w:rPr>
-              <w:t xml:space="preserve">◐ Em andamento</w:t>
+              <w:t xml:space="preserve">☑ Concluída</w:t>
             </w:r>
           </w:p>
         </w:tc>
@@ -12695,7 +12695,7 @@
                 <w:sz w:val="19"/>
                 <w:szCs w:val="19"/>
               </w:rPr>
-              <w:t xml:space="preserve">☐ Pendente</w:t>
+              <w:t xml:space="preserve">◐ Em andamento</w:t>
             </w:r>
           </w:p>
         </w:tc>
@@ -18349,7 +18349,7 @@
                 <w:sz w:val="19"/>
                 <w:szCs w:val="19"/>
               </w:rPr>
-              <w:t xml:space="preserve">☐ Pendente</w:t>
+              <w:t xml:space="preserve">☑ Concluída</w:t>
             </w:r>
           </w:p>
         </w:tc>
@@ -18374,6 +18374,13 @@
             <w:pPr>
               <w:keepNext w:val="false"/>
             </w:pPr>
+            <w:r>
+              <w:rPr>
+                <w:sz w:val="19"/>
+                <w:szCs w:val="19"/>
+              </w:rPr>
+              <w:t xml:space="preserve">Aprovado pelo Diretor em 25/09/2026</w:t>
+            </w:r>
           </w:p>
         </w:tc>
       </w:tr>
@@ -18443,7 +18450,7 @@
         <w:t xml:space="preserve">Objetivo:</w:t>
       </w:r>
       <w:r>
-        <w:t xml:space="preserve"> Implementar todos os sistemas principais com dados de teste.</w:t>
+        <w:t xml:space="preserve"> Implementar todos os sistemas principais com dados de teste. Ordem: A) base persistente (estado, níveis, salvar); B) combate completo; C) progressão (inventário, equipamento, gemas, árvores); D) mundo e interface (menu, lojas, diálogo, cutscenes, missões, opções).</w:t>
       </w:r>
     </w:p>
     <w:p>
@@ -18777,7 +18784,7 @@
                 <w:sz w:val="19"/>
                 <w:szCs w:val="19"/>
               </w:rPr>
-              <w:t xml:space="preserve">☐ Pendente</w:t>
+              <w:t xml:space="preserve">☑ Concluída</w:t>
             </w:r>
           </w:p>
         </w:tc>
@@ -18802,6 +18809,13 @@
             <w:pPr>
               <w:keepNext/>
             </w:pPr>
+            <w:r>
+              <w:rPr>
+                <w:sz w:val="19"/>
+                <w:szCs w:val="19"/>
+              </w:rPr>
+              <w:t xml:space="preserve">CombatantData, SkillData, ItemData, DualTechData, AIRule; gerador game/tools/build_data.gd; DataRegistry</w:t>
+            </w:r>
           </w:p>
         </w:tc>
       </w:tr>
@@ -18925,7 +18939,7 @@
                 <w:sz w:val="19"/>
                 <w:szCs w:val="19"/>
               </w:rPr>
-              <w:t xml:space="preserve">☐ Pendente</w:t>
+              <w:t xml:space="preserve">☑ Concluída</w:t>
             </w:r>
           </w:p>
         </w:tc>
@@ -18950,6 +18964,13 @@
             <w:pPr>
               <w:keepNext/>
             </w:pPr>
+            <w:r>
+              <w:rPr>
+                <w:sz w:val="19"/>
+                <w:szCs w:val="19"/>
+              </w:rPr>
+              <w:t xml:space="preserve">PartyMember: crescimento por nível, curva de XP, XP dividido (KO 50%)</w:t>
+            </w:r>
           </w:p>
         </w:tc>
       </w:tr>
@@ -19073,7 +19094,7 @@
                 <w:sz w:val="19"/>
                 <w:szCs w:val="19"/>
               </w:rPr>
-              <w:t xml:space="preserve">☐ Pendente</w:t>
+              <w:t xml:space="preserve">☑ Concluída</w:t>
             </w:r>
           </w:p>
         </w:tc>
@@ -19098,6 +19119,13 @@
             <w:pPr>
               <w:keepNext/>
             </w:pPr>
+            <w:r>
+              <w:rPr>
+                <w:sz w:val="19"/>
+                <w:szCs w:val="19"/>
+              </w:rPr>
+              <w:t xml:space="preserve">Menu Atacar/Técnicas/Itens/Defender/Trocar/Fugir; alvo único, todos, aliado caído; fuga; iniciativa/emboscada; música de batalha e vitória</w:t>
+            </w:r>
           </w:p>
         </w:tc>
       </w:tr>
@@ -19221,7 +19249,7 @@
                 <w:sz w:val="19"/>
                 <w:szCs w:val="19"/>
               </w:rPr>
-              <w:t xml:space="preserve">☐ Pendente</w:t>
+              <w:t xml:space="preserve">☑ Concluída</w:t>
             </w:r>
           </w:p>
         </w:tc>
@@ -19246,6 +19274,13 @@
             <w:pPr>
               <w:keepNext/>
             </w:pPr>
+            <w:r>
+              <w:rPr>
+                <w:sz w:val="19"/>
+                <w:szCs w:val="19"/>
+              </w:rPr>
+              <w:t xml:space="preserve">14 status do GDD, imunidades, resistência por Espírito, fator Éter regional</w:t>
+            </w:r>
           </w:p>
         </w:tc>
       </w:tr>
@@ -19369,7 +19404,7 @@
                 <w:sz w:val="19"/>
                 <w:szCs w:val="19"/>
               </w:rPr>
-              <w:t xml:space="preserve">☐ Pendente</w:t>
+              <w:t xml:space="preserve">☑ Concluída</w:t>
             </w:r>
           </w:p>
         </w:tc>
@@ -19394,6 +19429,13 @@
             <w:pPr>
               <w:keepNext/>
             </w:pPr>
+            <w:r>
+              <w:rPr>
+                <w:sz w:val="19"/>
+                <w:szCs w:val="19"/>
+              </w:rPr>
+              <w:t xml:space="preserve">Barra de Éter persistente; especial de Kael, Lyra, Brann e Eco</w:t>
+            </w:r>
           </w:p>
         </w:tc>
       </w:tr>
@@ -19517,7 +19559,7 @@
                 <w:sz w:val="19"/>
                 <w:szCs w:val="19"/>
               </w:rPr>
-              <w:t xml:space="preserve">☐ Pendente</w:t>
+              <w:t xml:space="preserve">☑ Concluída</w:t>
             </w:r>
           </w:p>
         </w:tc>
@@ -19542,6 +19584,13 @@
             <w:pPr>
               <w:keepNext/>
             </w:pPr>
+            <w:r>
+              <w:rPr>
+                <w:sz w:val="19"/>
+                <w:szCs w:val="19"/>
+              </w:rPr>
+              <w:t xml:space="preserve">Faísca Viva, Muralha de Ferro, Rugido da Terra (tripla); um timing por participante</w:t>
+            </w:r>
           </w:p>
         </w:tc>
       </w:tr>
@@ -19665,7 +19714,7 @@
                 <w:sz w:val="19"/>
                 <w:szCs w:val="19"/>
               </w:rPr>
-              <w:t xml:space="preserve">☐ Pendente</w:t>
+              <w:t xml:space="preserve">☑ Concluída</w:t>
             </w:r>
           </w:p>
         </w:tc>
@@ -19690,6 +19739,13 @@
             <w:pPr>
               <w:keepNext/>
             </w:pPr>
+            <w:r>
+              <w:rPr>
+                <w:sz w:val="19"/>
+                <w:szCs w:val="19"/>
+              </w:rPr>
+              <w:t xml:space="preserve">Regras por prioridade/condição/alvo, avisos de golpe forte (Sentinela)</w:t>
+            </w:r>
           </w:p>
         </w:tc>
       </w:tr>
@@ -19813,7 +19869,7 @@
                 <w:sz w:val="19"/>
                 <w:szCs w:val="19"/>
               </w:rPr>
-              <w:t xml:space="preserve">☐ Pendente</w:t>
+              <w:t xml:space="preserve">☑ Concluída</w:t>
             </w:r>
           </w:p>
         </w:tc>
@@ -19838,6 +19894,13 @@
             <w:pPr>
               <w:keepNext/>
             </w:pPr>
+            <w:r>
+              <w:rPr>
+                <w:sz w:val="19"/>
+                <w:szCs w:val="19"/>
+              </w:rPr>
+              <w:t xml:space="preserve">Reserva entra no turno (estilo FFX), uma troca por turno; Eco como 4º membro</w:t>
+            </w:r>
           </w:p>
         </w:tc>
       </w:tr>
@@ -21314,7 +21377,7 @@
                 <w:sz w:val="19"/>
                 <w:szCs w:val="19"/>
               </w:rPr>
-              <w:t xml:space="preserve">☐ Pendente</w:t>
+              <w:t xml:space="preserve">☑ Concluída</w:t>
             </w:r>
           </w:p>
         </w:tc>
@@ -21339,6 +21402,13 @@
             <w:pPr>
               <w:keepNext/>
             </w:pPr>
+            <w:r>
+              <w:rPr>
+                <w:sz w:val="19"/>
+                <w:szCs w:val="19"/>
+              </w:rPr>
+              <w:t xml:space="preserve">SaveManager: JSON versionado em user://saves; GameState (grupo, dinheiro, inventário, flags, tempo)</w:t>
+            </w:r>
           </w:p>
         </w:tc>
       </w:tr>

</xml_diff>

<commit_message>
Block D: title screen, main menu (items/equip/gems/tree/status/formation/quests/options/save), shop, inn, dialogue choices and affinity, quests, cutscenes, settings and localization; Vila Caldeira content
</commit_message>
<xml_diff>
--- a/docs/Planejamento_Projeto_RPG.docx
+++ b/docs/Planejamento_Projeto_RPG.docx
@@ -233,7 +233,7 @@
                 <w:sz w:val="19"/>
                 <w:szCs w:val="19"/>
               </w:rPr>
-              <w:t xml:space="preserve">1.3 — primeira batalha</w:t>
+              <w:t xml:space="preserve">2.0 — Fase 2 implementada (aguardando aprovação)</w:t>
             </w:r>
           </w:p>
         </w:tc>
@@ -20024,7 +20024,7 @@
                 <w:sz w:val="19"/>
                 <w:szCs w:val="19"/>
               </w:rPr>
-              <w:t xml:space="preserve">☐ Pendente</w:t>
+              <w:t xml:space="preserve">☑ Concluída</w:t>
             </w:r>
           </w:p>
         </w:tc>
@@ -20054,7 +20054,7 @@
                 <w:sz w:val="19"/>
                 <w:szCs w:val="19"/>
               </w:rPr>
-              <w:t xml:space="preserve">D-05</w:t>
+              <w:t xml:space="preserve">6 nós por herói; Pontos de Habilidade (2 por nível); tela no menu</w:t>
             </w:r>
           </w:p>
         </w:tc>
@@ -20179,7 +20179,7 @@
                 <w:sz w:val="19"/>
                 <w:szCs w:val="19"/>
               </w:rPr>
-              <w:t xml:space="preserve">☐ Pendente</w:t>
+              <w:t xml:space="preserve">☑ Concluída</w:t>
             </w:r>
           </w:p>
         </w:tc>
@@ -20209,7 +20209,7 @@
                 <w:sz w:val="19"/>
                 <w:szCs w:val="19"/>
               </w:rPr>
-              <w:t xml:space="preserve">D-05</w:t>
+              <w:t xml:space="preserve">6 gemas únicas com AP e 3 níveis; encaixes nas peças; tela no menu</w:t>
             </w:r>
           </w:p>
         </w:tc>
@@ -20334,7 +20334,7 @@
                 <w:sz w:val="19"/>
                 <w:szCs w:val="19"/>
               </w:rPr>
-              <w:t xml:space="preserve">☐ Pendente</w:t>
+              <w:t xml:space="preserve">☑ Concluída</w:t>
             </w:r>
           </w:p>
         </w:tc>
@@ -20359,6 +20359,13 @@
             <w:pPr>
               <w:keepNext/>
             </w:pPr>
+            <w:r>
+              <w:rPr>
+                <w:sz w:val="19"/>
+                <w:szCs w:val="19"/>
+              </w:rPr>
+              <w:t xml:space="preserve">Arma/armadura/acessório com comparação de atributos; 12 peças</w:t>
+            </w:r>
           </w:p>
         </w:tc>
       </w:tr>
@@ -20482,7 +20489,7 @@
                 <w:sz w:val="19"/>
                 <w:szCs w:val="19"/>
               </w:rPr>
-              <w:t xml:space="preserve">☐ Pendente</w:t>
+              <w:t xml:space="preserve">☑ Concluída</w:t>
             </w:r>
           </w:p>
         </w:tc>
@@ -20507,6 +20514,13 @@
             <w:pPr>
               <w:keepNext/>
             </w:pPr>
+            <w:r>
+              <w:rPr>
+                <w:sz w:val="19"/>
+                <w:szCs w:val="19"/>
+              </w:rPr>
+              <w:t xml:space="preserve">Loja comprar/vender (metade do preço); estalagem com descanso</w:t>
+            </w:r>
           </w:p>
         </w:tc>
       </w:tr>
@@ -20630,7 +20644,7 @@
                 <w:sz w:val="19"/>
                 <w:szCs w:val="19"/>
               </w:rPr>
-              <w:t xml:space="preserve">☐ Pendente</w:t>
+              <w:t xml:space="preserve">☑ Concluída</w:t>
             </w:r>
           </w:p>
         </w:tc>
@@ -20655,6 +20669,13 @@
             <w:pPr>
               <w:keepNext/>
             </w:pPr>
+            <w:r>
+              <w:rPr>
+                <w:sz w:val="19"/>
+                <w:szCs w:val="19"/>
+              </w:rPr>
+              <w:t xml:space="preserve">Itens, Equipar, Gemas, Árvore, Status, Formação, Missões, Opções, Salvar</w:t>
+            </w:r>
           </w:p>
         </w:tc>
       </w:tr>
@@ -20778,7 +20799,7 @@
                 <w:sz w:val="19"/>
                 <w:szCs w:val="19"/>
               </w:rPr>
-              <w:t xml:space="preserve">☐ Pendente</w:t>
+              <w:t xml:space="preserve">☑ Concluída</w:t>
             </w:r>
           </w:p>
         </w:tc>
@@ -20803,6 +20824,13 @@
             <w:pPr>
               <w:keepNext/>
             </w:pPr>
+            <w:r>
+              <w:rPr>
+                <w:sz w:val="19"/>
+                <w:szCs w:val="19"/>
+              </w:rPr>
+              <w:t xml:space="preserve">Escolhas com flags e afinidade; ramos por estado da história</w:t>
+            </w:r>
           </w:p>
         </w:tc>
       </w:tr>
@@ -20926,7 +20954,7 @@
                 <w:sz w:val="19"/>
                 <w:szCs w:val="19"/>
               </w:rPr>
-              <w:t xml:space="preserve">☐ Pendente</w:t>
+              <w:t xml:space="preserve">☑ Concluída</w:t>
             </w:r>
           </w:p>
         </w:tc>
@@ -20951,6 +20979,13 @@
             <w:pPr>
               <w:keepNext/>
             </w:pPr>
+            <w:r>
+              <w:rPr>
+                <w:sz w:val="19"/>
+                <w:szCs w:val="19"/>
+              </w:rPr>
+              <w:t xml:space="preserve">Passos em dados (falar, andar, virar, fade, flags, missão, item, música)</w:t>
+            </w:r>
           </w:p>
         </w:tc>
       </w:tr>
@@ -21074,7 +21109,7 @@
                 <w:sz w:val="19"/>
                 <w:szCs w:val="19"/>
               </w:rPr>
-              <w:t xml:space="preserve">☐ Pendente</w:t>
+              <w:t xml:space="preserve">☑ Concluída</w:t>
             </w:r>
           </w:p>
         </w:tc>
@@ -21099,6 +21134,13 @@
             <w:pPr>
               <w:keepNext/>
             </w:pPr>
+            <w:r>
+              <w:rPr>
+                <w:sz w:val="19"/>
+                <w:szCs w:val="19"/>
+              </w:rPr>
+              <w:t xml:space="preserve">QuestData, objetivos por eventos, recompensas, diário no menu</w:t>
+            </w:r>
           </w:p>
         </w:tc>
       </w:tr>
@@ -21222,7 +21264,7 @@
                 <w:sz w:val="19"/>
                 <w:szCs w:val="19"/>
               </w:rPr>
-              <w:t xml:space="preserve">☐ Pendente</w:t>
+              <w:t xml:space="preserve">☑ Concluída</w:t>
             </w:r>
           </w:p>
         </w:tc>
@@ -21252,7 +21294,7 @@
                 <w:sz w:val="19"/>
                 <w:szCs w:val="19"/>
               </w:rPr>
-              <w:t xml:space="preserve">H-06</w:t>
+              <w:t xml:space="preserve">Afinidade Lyra/Isolde por escolhas (epílogos ficam para a produção de conteúdo)</w:t>
             </w:r>
           </w:p>
         </w:tc>
@@ -21532,7 +21574,7 @@
                 <w:sz w:val="19"/>
                 <w:szCs w:val="19"/>
               </w:rPr>
-              <w:t xml:space="preserve">☐ Pendente</w:t>
+              <w:t xml:space="preserve">☑ Concluída</w:t>
             </w:r>
           </w:p>
         </w:tc>
@@ -21557,6 +21599,13 @@
             <w:pPr>
               <w:keepNext/>
             </w:pPr>
+            <w:r>
+              <w:rPr>
+                <w:sz w:val="19"/>
+                <w:szCs w:val="19"/>
+              </w:rPr>
+              <w:t xml:space="preserve">Pilha de músicas (batalha/mapa), volume</w:t>
+            </w:r>
           </w:p>
         </w:tc>
       </w:tr>
@@ -21680,7 +21729,7 @@
                 <w:sz w:val="19"/>
                 <w:szCs w:val="19"/>
               </w:rPr>
-              <w:t xml:space="preserve">☐ Pendente</w:t>
+              <w:t xml:space="preserve">☑ Concluída</w:t>
             </w:r>
           </w:p>
         </w:tc>
@@ -21705,6 +21754,13 @@
             <w:pPr>
               <w:keepNext/>
             </w:pPr>
+            <w:r>
+              <w:rPr>
+                <w:sz w:val="19"/>
+                <w:szCs w:val="19"/>
+              </w:rPr>
+              <w:t xml:space="preserve">Volume, texto, timing (fácil/normal/difícil/auto), tela cheia, idioma; menus em inglês via CSV</w:t>
+            </w:r>
           </w:p>
         </w:tc>
       </w:tr>
@@ -21828,7 +21884,7 @@
                 <w:sz w:val="19"/>
                 <w:szCs w:val="19"/>
               </w:rPr>
-              <w:t xml:space="preserve">☐ Pendente</w:t>
+              <w:t xml:space="preserve">☑ Concluída</w:t>
             </w:r>
           </w:p>
         </w:tc>
@@ -21853,6 +21909,13 @@
             <w:pPr>
               <w:keepNext w:val="false"/>
             </w:pPr>
+            <w:r>
+              <w:rPr>
+                <w:sz w:val="19"/>
+                <w:szCs w:val="19"/>
+              </w:rPr>
+              <w:t xml:space="preserve">155 testes GUT</w:t>
+            </w:r>
           </w:p>
         </w:tc>
       </w:tr>
@@ -28060,7 +28123,7 @@
           </w:tcPr>
           <w:p>
             <w:pPr>
-              <w:keepNext/>
+              <w:keepNext w:val="false"/>
             </w:pPr>
             <w:r>
               <w:rPr>
@@ -28090,7 +28153,7 @@
           </w:tcPr>
           <w:p>
             <w:pPr>
-              <w:keepNext/>
+              <w:keepNext w:val="false"/>
             </w:pPr>
             <w:r>
               <w:rPr>
@@ -28120,7 +28183,7 @@
           </w:tcPr>
           <w:p>
             <w:pPr>
-              <w:keepNext/>
+              <w:keepNext w:val="false"/>
             </w:pPr>
             <w:r>
               <w:rPr>
@@ -28150,7 +28213,7 @@
           </w:tcPr>
           <w:p>
             <w:pPr>
-              <w:keepNext/>
+              <w:keepNext w:val="false"/>
             </w:pPr>
             <w:r>
               <w:rPr>
@@ -28180,7 +28243,7 @@
           </w:tcPr>
           <w:p>
             <w:pPr>
-              <w:keepNext/>
+              <w:keepNext w:val="false"/>
             </w:pPr>
             <w:r>
               <w:rPr>
@@ -28210,7 +28273,7 @@
           </w:tcPr>
           <w:p>
             <w:pPr>
-              <w:keepNext/>
+              <w:keepNext w:val="false"/>
             </w:pPr>
             <w:r>
               <w:rPr>
@@ -28245,7 +28308,7 @@
           </w:tcPr>
           <w:p>
             <w:pPr>
-              <w:keepNext/>
+              <w:keepNext w:val="false"/>
             </w:pPr>
             <w:r>
               <w:rPr>
@@ -28275,7 +28338,7 @@
           </w:tcPr>
           <w:p>
             <w:pPr>
-              <w:keepNext/>
+              <w:keepNext w:val="false"/>
             </w:pPr>
             <w:r>
               <w:rPr>
@@ -28305,7 +28368,7 @@
           </w:tcPr>
           <w:p>
             <w:pPr>
-              <w:keepNext/>
+              <w:keepNext w:val="false"/>
             </w:pPr>
             <w:r>
               <w:rPr>
@@ -28335,7 +28398,7 @@
           </w:tcPr>
           <w:p>
             <w:pPr>
-              <w:keepNext/>
+              <w:keepNext w:val="false"/>
             </w:pPr>
             <w:r>
               <w:rPr>
@@ -28365,7 +28428,7 @@
           </w:tcPr>
           <w:p>
             <w:pPr>
-              <w:keepNext/>
+              <w:keepNext w:val="false"/>
             </w:pPr>
             <w:r>
               <w:rPr>
@@ -28395,7 +28458,7 @@
           </w:tcPr>
           <w:p>
             <w:pPr>
-              <w:keepNext/>
+              <w:keepNext w:val="false"/>
             </w:pPr>
             <w:r>
               <w:rPr>
@@ -28430,7 +28493,7 @@
           </w:tcPr>
           <w:p>
             <w:pPr>
-              <w:keepNext/>
+              <w:keepNext w:val="false"/>
             </w:pPr>
             <w:r>
               <w:rPr>
@@ -28460,7 +28523,7 @@
           </w:tcPr>
           <w:p>
             <w:pPr>
-              <w:keepNext/>
+              <w:keepNext w:val="false"/>
             </w:pPr>
             <w:r>
               <w:rPr>
@@ -28490,7 +28553,7 @@
           </w:tcPr>
           <w:p>
             <w:pPr>
-              <w:keepNext/>
+              <w:keepNext w:val="false"/>
             </w:pPr>
             <w:r>
               <w:rPr>
@@ -28520,7 +28583,7 @@
           </w:tcPr>
           <w:p>
             <w:pPr>
-              <w:keepNext/>
+              <w:keepNext w:val="false"/>
             </w:pPr>
             <w:r>
               <w:rPr>
@@ -28550,7 +28613,7 @@
           </w:tcPr>
           <w:p>
             <w:pPr>
-              <w:keepNext/>
+              <w:keepNext w:val="false"/>
             </w:pPr>
             <w:r>
               <w:rPr>
@@ -28580,7 +28643,7 @@
           </w:tcPr>
           <w:p>
             <w:pPr>
-              <w:keepNext/>
+              <w:keepNext w:val="false"/>
             </w:pPr>
             <w:r>
               <w:rPr>
@@ -28615,7 +28678,7 @@
           </w:tcPr>
           <w:p>
             <w:pPr>
-              <w:keepNext/>
+              <w:keepNext w:val="false"/>
             </w:pPr>
             <w:r>
               <w:rPr>
@@ -28645,7 +28708,7 @@
           </w:tcPr>
           <w:p>
             <w:pPr>
-              <w:keepNext/>
+              <w:keepNext w:val="false"/>
             </w:pPr>
             <w:r>
               <w:rPr>
@@ -28675,7 +28738,7 @@
           </w:tcPr>
           <w:p>
             <w:pPr>
-              <w:keepNext/>
+              <w:keepNext w:val="false"/>
             </w:pPr>
             <w:r>
               <w:rPr>
@@ -28705,7 +28768,7 @@
           </w:tcPr>
           <w:p>
             <w:pPr>
-              <w:keepNext/>
+              <w:keepNext w:val="false"/>
             </w:pPr>
             <w:r>
               <w:rPr>
@@ -28735,7 +28798,7 @@
           </w:tcPr>
           <w:p>
             <w:pPr>
-              <w:keepNext/>
+              <w:keepNext w:val="false"/>
             </w:pPr>
             <w:r>
               <w:rPr>
@@ -28765,7 +28828,7 @@
           </w:tcPr>
           <w:p>
             <w:pPr>
-              <w:keepNext/>
+              <w:keepNext w:val="false"/>
             </w:pPr>
             <w:r>
               <w:rPr>
@@ -28800,7 +28863,7 @@
           </w:tcPr>
           <w:p>
             <w:pPr>
-              <w:keepNext/>
+              <w:keepNext w:val="false"/>
             </w:pPr>
             <w:r>
               <w:rPr>
@@ -28830,7 +28893,7 @@
           </w:tcPr>
           <w:p>
             <w:pPr>
-              <w:keepNext/>
+              <w:keepNext w:val="false"/>
             </w:pPr>
             <w:r>
               <w:rPr>
@@ -28860,7 +28923,7 @@
           </w:tcPr>
           <w:p>
             <w:pPr>
-              <w:keepNext/>
+              <w:keepNext w:val="false"/>
             </w:pPr>
             <w:r>
               <w:rPr>
@@ -28890,7 +28953,7 @@
           </w:tcPr>
           <w:p>
             <w:pPr>
-              <w:keepNext/>
+              <w:keepNext w:val="false"/>
             </w:pPr>
             <w:r>
               <w:rPr>
@@ -28920,7 +28983,7 @@
           </w:tcPr>
           <w:p>
             <w:pPr>
-              <w:keepNext/>
+              <w:keepNext w:val="false"/>
             </w:pPr>
             <w:r>
               <w:rPr>
@@ -28950,7 +29013,7 @@
           </w:tcPr>
           <w:p>
             <w:pPr>
-              <w:keepNext/>
+              <w:keepNext w:val="false"/>
             </w:pPr>
             <w:r>
               <w:rPr>
@@ -28985,7 +29048,7 @@
           </w:tcPr>
           <w:p>
             <w:pPr>
-              <w:keepNext/>
+              <w:keepNext w:val="false"/>
             </w:pPr>
             <w:r>
               <w:rPr>
@@ -29015,7 +29078,7 @@
           </w:tcPr>
           <w:p>
             <w:pPr>
-              <w:keepNext/>
+              <w:keepNext w:val="false"/>
             </w:pPr>
             <w:r>
               <w:rPr>
@@ -29045,7 +29108,7 @@
           </w:tcPr>
           <w:p>
             <w:pPr>
-              <w:keepNext/>
+              <w:keepNext w:val="false"/>
             </w:pPr>
             <w:r>
               <w:rPr>
@@ -29075,7 +29138,7 @@
           </w:tcPr>
           <w:p>
             <w:pPr>
-              <w:keepNext/>
+              <w:keepNext w:val="false"/>
             </w:pPr>
             <w:r>
               <w:rPr>
@@ -29105,7 +29168,7 @@
           </w:tcPr>
           <w:p>
             <w:pPr>
-              <w:keepNext/>
+              <w:keepNext w:val="false"/>
             </w:pPr>
             <w:r>
               <w:rPr>
@@ -29135,7 +29198,7 @@
           </w:tcPr>
           <w:p>
             <w:pPr>
-              <w:keepNext/>
+              <w:keepNext w:val="false"/>
             </w:pPr>
             <w:r>
               <w:rPr>
@@ -29170,7 +29233,7 @@
           </w:tcPr>
           <w:p>
             <w:pPr>
-              <w:keepNext/>
+              <w:keepNext w:val="false"/>
             </w:pPr>
             <w:r>
               <w:rPr>
@@ -29200,7 +29263,7 @@
           </w:tcPr>
           <w:p>
             <w:pPr>
-              <w:keepNext/>
+              <w:keepNext w:val="false"/>
             </w:pPr>
             <w:r>
               <w:rPr>
@@ -29230,7 +29293,7 @@
           </w:tcPr>
           <w:p>
             <w:pPr>
-              <w:keepNext/>
+              <w:keepNext w:val="false"/>
             </w:pPr>
             <w:r>
               <w:rPr>
@@ -29260,7 +29323,7 @@
           </w:tcPr>
           <w:p>
             <w:pPr>
-              <w:keepNext/>
+              <w:keepNext w:val="false"/>
             </w:pPr>
             <w:r>
               <w:rPr>
@@ -29290,7 +29353,7 @@
           </w:tcPr>
           <w:p>
             <w:pPr>
-              <w:keepNext/>
+              <w:keepNext w:val="false"/>
             </w:pPr>
             <w:r>
               <w:rPr>
@@ -29320,7 +29383,7 @@
           </w:tcPr>
           <w:p>
             <w:pPr>
-              <w:keepNext/>
+              <w:keepNext w:val="false"/>
             </w:pPr>
             <w:r>
               <w:rPr>
@@ -29355,7 +29418,7 @@
           </w:tcPr>
           <w:p>
             <w:pPr>
-              <w:keepNext/>
+              <w:keepNext w:val="false"/>
             </w:pPr>
             <w:r>
               <w:rPr>
@@ -29385,7 +29448,7 @@
           </w:tcPr>
           <w:p>
             <w:pPr>
-              <w:keepNext/>
+              <w:keepNext w:val="false"/>
             </w:pPr>
             <w:r>
               <w:rPr>
@@ -29415,7 +29478,7 @@
           </w:tcPr>
           <w:p>
             <w:pPr>
-              <w:keepNext/>
+              <w:keepNext w:val="false"/>
             </w:pPr>
             <w:r>
               <w:rPr>
@@ -29445,7 +29508,7 @@
           </w:tcPr>
           <w:p>
             <w:pPr>
-              <w:keepNext/>
+              <w:keepNext w:val="false"/>
             </w:pPr>
             <w:r>
               <w:rPr>
@@ -29475,7 +29538,7 @@
           </w:tcPr>
           <w:p>
             <w:pPr>
-              <w:keepNext/>
+              <w:keepNext w:val="false"/>
             </w:pPr>
             <w:r>
               <w:rPr>
@@ -29505,7 +29568,7 @@
           </w:tcPr>
           <w:p>
             <w:pPr>
-              <w:keepNext/>
+              <w:keepNext w:val="false"/>
             </w:pPr>
             <w:r>
               <w:rPr>
@@ -29540,7 +29603,7 @@
           </w:tcPr>
           <w:p>
             <w:pPr>
-              <w:keepNext/>
+              <w:keepNext w:val="false"/>
             </w:pPr>
             <w:r>
               <w:rPr>
@@ -29570,7 +29633,7 @@
           </w:tcPr>
           <w:p>
             <w:pPr>
-              <w:keepNext/>
+              <w:keepNext w:val="false"/>
             </w:pPr>
             <w:r>
               <w:rPr>
@@ -29600,7 +29663,7 @@
           </w:tcPr>
           <w:p>
             <w:pPr>
-              <w:keepNext/>
+              <w:keepNext w:val="false"/>
             </w:pPr>
             <w:r>
               <w:rPr>
@@ -29630,7 +29693,7 @@
           </w:tcPr>
           <w:p>
             <w:pPr>
-              <w:keepNext/>
+              <w:keepNext w:val="false"/>
             </w:pPr>
             <w:r>
               <w:rPr>
@@ -29660,7 +29723,7 @@
           </w:tcPr>
           <w:p>
             <w:pPr>
-              <w:keepNext/>
+              <w:keepNext w:val="false"/>
             </w:pPr>
             <w:r>
               <w:rPr>
@@ -29690,7 +29753,7 @@
           </w:tcPr>
           <w:p>
             <w:pPr>
-              <w:keepNext/>
+              <w:keepNext w:val="false"/>
             </w:pPr>
             <w:r>
               <w:rPr>
@@ -29725,7 +29788,7 @@
           </w:tcPr>
           <w:p>
             <w:pPr>
-              <w:keepNext/>
+              <w:keepNext w:val="false"/>
             </w:pPr>
             <w:r>
               <w:rPr>
@@ -29755,7 +29818,7 @@
           </w:tcPr>
           <w:p>
             <w:pPr>
-              <w:keepNext/>
+              <w:keepNext w:val="false"/>
             </w:pPr>
             <w:r>
               <w:rPr>
@@ -29785,7 +29848,7 @@
           </w:tcPr>
           <w:p>
             <w:pPr>
-              <w:keepNext/>
+              <w:keepNext w:val="false"/>
             </w:pPr>
             <w:r>
               <w:rPr>
@@ -29815,7 +29878,7 @@
           </w:tcPr>
           <w:p>
             <w:pPr>
-              <w:keepNext/>
+              <w:keepNext w:val="false"/>
             </w:pPr>
             <w:r>
               <w:rPr>
@@ -29845,7 +29908,7 @@
           </w:tcPr>
           <w:p>
             <w:pPr>
-              <w:keepNext/>
+              <w:keepNext w:val="false"/>
             </w:pPr>
             <w:r>
               <w:rPr>
@@ -29875,7 +29938,7 @@
           </w:tcPr>
           <w:p>
             <w:pPr>
-              <w:keepNext/>
+              <w:keepNext w:val="false"/>
             </w:pPr>
             <w:r>
               <w:rPr>
@@ -29910,7 +29973,7 @@
           </w:tcPr>
           <w:p>
             <w:pPr>
-              <w:keepNext/>
+              <w:keepNext w:val="false"/>
             </w:pPr>
             <w:r>
               <w:rPr>
@@ -29940,7 +30003,7 @@
           </w:tcPr>
           <w:p>
             <w:pPr>
-              <w:keepNext/>
+              <w:keepNext w:val="false"/>
             </w:pPr>
             <w:r>
               <w:rPr>
@@ -29970,7 +30033,7 @@
           </w:tcPr>
           <w:p>
             <w:pPr>
-              <w:keepNext/>
+              <w:keepNext w:val="false"/>
             </w:pPr>
             <w:r>
               <w:rPr>
@@ -30000,7 +30063,7 @@
           </w:tcPr>
           <w:p>
             <w:pPr>
-              <w:keepNext/>
+              <w:keepNext w:val="false"/>
             </w:pPr>
             <w:r>
               <w:rPr>
@@ -30030,7 +30093,7 @@
           </w:tcPr>
           <w:p>
             <w:pPr>
-              <w:keepNext/>
+              <w:keepNext w:val="false"/>
             </w:pPr>
             <w:r>
               <w:rPr>
@@ -30060,7 +30123,7 @@
           </w:tcPr>
           <w:p>
             <w:pPr>
-              <w:keepNext/>
+              <w:keepNext w:val="false"/>
             </w:pPr>
             <w:r>
               <w:rPr>
@@ -30095,7 +30158,7 @@
           </w:tcPr>
           <w:p>
             <w:pPr>
-              <w:keepNext/>
+              <w:keepNext w:val="false"/>
             </w:pPr>
             <w:r>
               <w:rPr>
@@ -30125,7 +30188,7 @@
           </w:tcPr>
           <w:p>
             <w:pPr>
-              <w:keepNext/>
+              <w:keepNext w:val="false"/>
             </w:pPr>
             <w:r>
               <w:rPr>
@@ -30155,7 +30218,7 @@
           </w:tcPr>
           <w:p>
             <w:pPr>
-              <w:keepNext/>
+              <w:keepNext w:val="false"/>
             </w:pPr>
             <w:r>
               <w:rPr>
@@ -30185,7 +30248,7 @@
           </w:tcPr>
           <w:p>
             <w:pPr>
-              <w:keepNext/>
+              <w:keepNext w:val="false"/>
             </w:pPr>
             <w:r>
               <w:rPr>
@@ -30215,7 +30278,7 @@
           </w:tcPr>
           <w:p>
             <w:pPr>
-              <w:keepNext/>
+              <w:keepNext w:val="false"/>
             </w:pPr>
             <w:r>
               <w:rPr>
@@ -30245,7 +30308,7 @@
           </w:tcPr>
           <w:p>
             <w:pPr>
-              <w:keepNext/>
+              <w:keepNext w:val="false"/>
             </w:pPr>
             <w:r>
               <w:rPr>
@@ -30280,7 +30343,7 @@
           </w:tcPr>
           <w:p>
             <w:pPr>
-              <w:keepNext/>
+              <w:keepNext w:val="false"/>
             </w:pPr>
             <w:r>
               <w:rPr>
@@ -30310,7 +30373,7 @@
           </w:tcPr>
           <w:p>
             <w:pPr>
-              <w:keepNext/>
+              <w:keepNext w:val="false"/>
             </w:pPr>
             <w:r>
               <w:rPr>
@@ -30340,7 +30403,7 @@
           </w:tcPr>
           <w:p>
             <w:pPr>
-              <w:keepNext/>
+              <w:keepNext w:val="false"/>
             </w:pPr>
             <w:r>
               <w:rPr>
@@ -30370,7 +30433,7 @@
           </w:tcPr>
           <w:p>
             <w:pPr>
-              <w:keepNext/>
+              <w:keepNext w:val="false"/>
             </w:pPr>
             <w:r>
               <w:rPr>
@@ -30400,7 +30463,7 @@
           </w:tcPr>
           <w:p>
             <w:pPr>
-              <w:keepNext/>
+              <w:keepNext w:val="false"/>
             </w:pPr>
             <w:r>
               <w:rPr>
@@ -30430,7 +30493,7 @@
           </w:tcPr>
           <w:p>
             <w:pPr>
-              <w:keepNext/>
+              <w:keepNext w:val="false"/>
             </w:pPr>
             <w:r>
               <w:rPr>
@@ -30465,7 +30528,7 @@
           </w:tcPr>
           <w:p>
             <w:pPr>
-              <w:keepNext/>
+              <w:keepNext w:val="false"/>
             </w:pPr>
             <w:r>
               <w:rPr>
@@ -30495,7 +30558,7 @@
           </w:tcPr>
           <w:p>
             <w:pPr>
-              <w:keepNext/>
+              <w:keepNext w:val="false"/>
             </w:pPr>
             <w:r>
               <w:rPr>
@@ -30525,7 +30588,7 @@
           </w:tcPr>
           <w:p>
             <w:pPr>
-              <w:keepNext/>
+              <w:keepNext w:val="false"/>
             </w:pPr>
             <w:r>
               <w:rPr>
@@ -30555,7 +30618,7 @@
           </w:tcPr>
           <w:p>
             <w:pPr>
-              <w:keepNext/>
+              <w:keepNext w:val="false"/>
             </w:pPr>
             <w:r>
               <w:rPr>
@@ -30585,7 +30648,7 @@
           </w:tcPr>
           <w:p>
             <w:pPr>
-              <w:keepNext/>
+              <w:keepNext w:val="false"/>
             </w:pPr>
             <w:r>
               <w:rPr>
@@ -30615,7 +30678,7 @@
           </w:tcPr>
           <w:p>
             <w:pPr>
-              <w:keepNext/>
+              <w:keepNext w:val="false"/>
             </w:pPr>
             <w:r>
               <w:rPr>
@@ -30650,7 +30713,7 @@
           </w:tcPr>
           <w:p>
             <w:pPr>
-              <w:keepNext/>
+              <w:keepNext w:val="false"/>
             </w:pPr>
             <w:r>
               <w:rPr>
@@ -30680,7 +30743,7 @@
           </w:tcPr>
           <w:p>
             <w:pPr>
-              <w:keepNext/>
+              <w:keepNext w:val="false"/>
             </w:pPr>
             <w:r>
               <w:rPr>
@@ -30710,7 +30773,7 @@
           </w:tcPr>
           <w:p>
             <w:pPr>
-              <w:keepNext/>
+              <w:keepNext w:val="false"/>
             </w:pPr>
             <w:r>
               <w:rPr>
@@ -30740,7 +30803,7 @@
           </w:tcPr>
           <w:p>
             <w:pPr>
-              <w:keepNext/>
+              <w:keepNext w:val="false"/>
             </w:pPr>
             <w:r>
               <w:rPr>
@@ -30770,7 +30833,7 @@
           </w:tcPr>
           <w:p>
             <w:pPr>
-              <w:keepNext/>
+              <w:keepNext w:val="false"/>
             </w:pPr>
             <w:r>
               <w:rPr>
@@ -30800,7 +30863,7 @@
           </w:tcPr>
           <w:p>
             <w:pPr>
-              <w:keepNext/>
+              <w:keepNext w:val="false"/>
             </w:pPr>
             <w:r>
               <w:rPr>
@@ -30835,7 +30898,7 @@
           </w:tcPr>
           <w:p>
             <w:pPr>
-              <w:keepNext/>
+              <w:keepNext w:val="false"/>
             </w:pPr>
             <w:r>
               <w:rPr>
@@ -30865,7 +30928,7 @@
           </w:tcPr>
           <w:p>
             <w:pPr>
-              <w:keepNext/>
+              <w:keepNext w:val="false"/>
             </w:pPr>
             <w:r>
               <w:rPr>
@@ -30895,7 +30958,7 @@
           </w:tcPr>
           <w:p>
             <w:pPr>
-              <w:keepNext/>
+              <w:keepNext w:val="false"/>
             </w:pPr>
             <w:r>
               <w:rPr>
@@ -30925,7 +30988,7 @@
           </w:tcPr>
           <w:p>
             <w:pPr>
-              <w:keepNext/>
+              <w:keepNext w:val="false"/>
             </w:pPr>
             <w:r>
               <w:rPr>
@@ -30955,7 +31018,7 @@
           </w:tcPr>
           <w:p>
             <w:pPr>
-              <w:keepNext/>
+              <w:keepNext w:val="false"/>
             </w:pPr>
             <w:r>
               <w:rPr>
@@ -30985,7 +31048,7 @@
           </w:tcPr>
           <w:p>
             <w:pPr>
-              <w:keepNext/>
+              <w:keepNext w:val="false"/>
             </w:pPr>
             <w:r>
               <w:rPr>
@@ -31178,6 +31241,1301 @@
                 <w:szCs w:val="19"/>
               </w:rPr>
               <w:t xml:space="preserve">Slime de Óleo: parado, respirando, ataque, dano (56×48)</w:t>
+            </w:r>
+          </w:p>
+        </w:tc>
+      </w:tr>
+      <w:tr>
+        <w:trPr>
+          <w:cantSplit/>
+        </w:trPr>
+        <w:tc>
+          <w:tcPr>
+            <w:tcW w:type="dxa" w:w="867"/>
+            <w:tcBorders>
+              <w:top w:val="single" w:color="B7C3D0" w:sz="4"/>
+              <w:left w:val="single" w:color="B7C3D0" w:sz="4"/>
+              <w:bottom w:val="single" w:color="B7C3D0" w:sz="4"/>
+              <w:right w:val="single" w:color="B7C3D0" w:sz="4"/>
+            </w:tcBorders>
+            <w:tcMar>
+              <w:top w:type="dxa" w:w="60"/>
+              <w:left w:type="dxa" w:w="100"/>
+              <w:bottom w:type="dxa" w:w="60"/>
+              <w:right w:type="dxa" w:w="100"/>
+            </w:tcMar>
+            <w:vAlign w:val="center"/>
+          </w:tcPr>
+          <w:p>
+            <w:pPr>
+              <w:keepNext w:val="false"/>
+            </w:pPr>
+            <w:r>
+              <w:rPr>
+                <w:sz w:val="19"/>
+                <w:szCs w:val="19"/>
+              </w:rPr>
+              <w:t xml:space="preserve">A-018</w:t>
+            </w:r>
+          </w:p>
+        </w:tc>
+        <w:tc>
+          <w:tcPr>
+            <w:tcW w:type="dxa" w:w="2891"/>
+            <w:tcBorders>
+              <w:top w:val="single" w:color="B7C3D0" w:sz="4"/>
+              <w:left w:val="single" w:color="B7C3D0" w:sz="4"/>
+              <w:bottom w:val="single" w:color="B7C3D0" w:sz="4"/>
+              <w:right w:val="single" w:color="B7C3D0" w:sz="4"/>
+            </w:tcBorders>
+            <w:tcMar>
+              <w:top w:type="dxa" w:w="60"/>
+              <w:left w:type="dxa" w:w="100"/>
+              <w:bottom w:type="dxa" w:w="60"/>
+              <w:right w:type="dxa" w:w="100"/>
+            </w:tcMar>
+            <w:vAlign w:val="center"/>
+          </w:tcPr>
+          <w:p>
+            <w:pPr>
+              <w:keepNext w:val="false"/>
+            </w:pPr>
+            <w:r>
+              <w:rPr>
+                <w:sz w:val="19"/>
+                <w:szCs w:val="19"/>
+              </w:rPr>
+              <w:t xml:space="preserve">assets/sprites/enemies/enm_brass_sentinel.png</w:t>
+            </w:r>
+          </w:p>
+        </w:tc>
+        <w:tc>
+          <w:tcPr>
+            <w:tcW w:type="dxa" w:w="1349"/>
+            <w:tcBorders>
+              <w:top w:val="single" w:color="B7C3D0" w:sz="4"/>
+              <w:left w:val="single" w:color="B7C3D0" w:sz="4"/>
+              <w:bottom w:val="single" w:color="B7C3D0" w:sz="4"/>
+              <w:right w:val="single" w:color="B7C3D0" w:sz="4"/>
+            </w:tcBorders>
+            <w:tcMar>
+              <w:top w:type="dxa" w:w="60"/>
+              <w:left w:type="dxa" w:w="100"/>
+              <w:bottom w:type="dxa" w:w="60"/>
+              <w:right w:type="dxa" w:w="100"/>
+            </w:tcMar>
+            <w:vAlign w:val="center"/>
+          </w:tcPr>
+          <w:p>
+            <w:pPr>
+              <w:keepNext w:val="false"/>
+            </w:pPr>
+            <w:r>
+              <w:rPr>
+                <w:sz w:val="19"/>
+                <w:szCs w:val="19"/>
+              </w:rPr>
+              <w:t xml:space="preserve">Sprite</w:t>
+            </w:r>
+          </w:p>
+        </w:tc>
+        <w:tc>
+          <w:tcPr>
+            <w:tcW w:type="dxa" w:w="867"/>
+            <w:tcBorders>
+              <w:top w:val="single" w:color="B7C3D0" w:sz="4"/>
+              <w:left w:val="single" w:color="B7C3D0" w:sz="4"/>
+              <w:bottom w:val="single" w:color="B7C3D0" w:sz="4"/>
+              <w:right w:val="single" w:color="B7C3D0" w:sz="4"/>
+            </w:tcBorders>
+            <w:tcMar>
+              <w:top w:type="dxa" w:w="60"/>
+              <w:left w:type="dxa" w:w="100"/>
+              <w:bottom w:type="dxa" w:w="60"/>
+              <w:right w:type="dxa" w:w="100"/>
+            </w:tcMar>
+            <w:vAlign w:val="center"/>
+          </w:tcPr>
+          <w:p>
+            <w:pPr>
+              <w:keepNext w:val="false"/>
+            </w:pPr>
+            <w:r>
+              <w:rPr>
+                <w:sz w:val="19"/>
+                <w:szCs w:val="19"/>
+              </w:rPr>
+              <w:t xml:space="preserve">F2</w:t>
+            </w:r>
+          </w:p>
+        </w:tc>
+        <w:tc>
+          <w:tcPr>
+            <w:tcW w:type="dxa" w:w="1446"/>
+            <w:tcBorders>
+              <w:top w:val="single" w:color="B7C3D0" w:sz="4"/>
+              <w:left w:val="single" w:color="B7C3D0" w:sz="4"/>
+              <w:bottom w:val="single" w:color="B7C3D0" w:sz="4"/>
+              <w:right w:val="single" w:color="B7C3D0" w:sz="4"/>
+            </w:tcBorders>
+            <w:tcMar>
+              <w:top w:type="dxa" w:w="60"/>
+              <w:left w:type="dxa" w:w="100"/>
+              <w:bottom w:type="dxa" w:w="60"/>
+              <w:right w:type="dxa" w:w="100"/>
+            </w:tcMar>
+            <w:vAlign w:val="center"/>
+          </w:tcPr>
+          <w:p>
+            <w:pPr>
+              <w:keepNext w:val="false"/>
+            </w:pPr>
+            <w:r>
+              <w:rPr>
+                <w:sz w:val="19"/>
+                <w:szCs w:val="19"/>
+              </w:rPr>
+              <w:t xml:space="preserve">☑ Concluída</w:t>
+            </w:r>
+          </w:p>
+        </w:tc>
+        <w:tc>
+          <w:tcPr>
+            <w:tcW w:type="dxa" w:w="2218"/>
+            <w:tcBorders>
+              <w:top w:val="single" w:color="B7C3D0" w:sz="4"/>
+              <w:left w:val="single" w:color="B7C3D0" w:sz="4"/>
+              <w:bottom w:val="single" w:color="B7C3D0" w:sz="4"/>
+              <w:right w:val="single" w:color="B7C3D0" w:sz="4"/>
+            </w:tcBorders>
+            <w:tcMar>
+              <w:top w:type="dxa" w:w="60"/>
+              <w:left w:type="dxa" w:w="100"/>
+              <w:bottom w:type="dxa" w:w="60"/>
+              <w:right w:type="dxa" w:w="100"/>
+            </w:tcMar>
+            <w:vAlign w:val="center"/>
+          </w:tcPr>
+          <w:p>
+            <w:pPr>
+              <w:keepNext w:val="false"/>
+            </w:pPr>
+            <w:r>
+              <w:rPr>
+                <w:sz w:val="19"/>
+                <w:szCs w:val="19"/>
+              </w:rPr>
+              <w:t xml:space="preserve">Sentinela de Latão (inimigo mecânico, 72×48)</w:t>
+            </w:r>
+          </w:p>
+        </w:tc>
+      </w:tr>
+      <w:tr>
+        <w:trPr>
+          <w:cantSplit/>
+        </w:trPr>
+        <w:tc>
+          <w:tcPr>
+            <w:tcW w:type="dxa" w:w="867"/>
+            <w:tcBorders>
+              <w:top w:val="single" w:color="B7C3D0" w:sz="4"/>
+              <w:left w:val="single" w:color="B7C3D0" w:sz="4"/>
+              <w:bottom w:val="single" w:color="B7C3D0" w:sz="4"/>
+              <w:right w:val="single" w:color="B7C3D0" w:sz="4"/>
+            </w:tcBorders>
+            <w:tcMar>
+              <w:top w:type="dxa" w:w="60"/>
+              <w:left w:type="dxa" w:w="100"/>
+              <w:bottom w:type="dxa" w:w="60"/>
+              <w:right w:type="dxa" w:w="100"/>
+            </w:tcMar>
+            <w:vAlign w:val="center"/>
+          </w:tcPr>
+          <w:p>
+            <w:pPr>
+              <w:keepNext w:val="false"/>
+            </w:pPr>
+            <w:r>
+              <w:rPr>
+                <w:sz w:val="19"/>
+                <w:szCs w:val="19"/>
+              </w:rPr>
+              <w:t xml:space="preserve">A-019</w:t>
+            </w:r>
+          </w:p>
+        </w:tc>
+        <w:tc>
+          <w:tcPr>
+            <w:tcW w:type="dxa" w:w="2891"/>
+            <w:tcBorders>
+              <w:top w:val="single" w:color="B7C3D0" w:sz="4"/>
+              <w:left w:val="single" w:color="B7C3D0" w:sz="4"/>
+              <w:bottom w:val="single" w:color="B7C3D0" w:sz="4"/>
+              <w:right w:val="single" w:color="B7C3D0" w:sz="4"/>
+            </w:tcBorders>
+            <w:tcMar>
+              <w:top w:type="dxa" w:w="60"/>
+              <w:left w:type="dxa" w:w="100"/>
+              <w:bottom w:type="dxa" w:w="60"/>
+              <w:right w:type="dxa" w:w="100"/>
+            </w:tcMar>
+            <w:vAlign w:val="center"/>
+          </w:tcPr>
+          <w:p>
+            <w:pPr>
+              <w:keepNext w:val="false"/>
+            </w:pPr>
+            <w:r>
+              <w:rPr>
+                <w:sz w:val="19"/>
+                <w:szCs w:val="19"/>
+              </w:rPr>
+              <w:t xml:space="preserve">assets/ui/ico_items.png</w:t>
+            </w:r>
+          </w:p>
+        </w:tc>
+        <w:tc>
+          <w:tcPr>
+            <w:tcW w:type="dxa" w:w="1349"/>
+            <w:tcBorders>
+              <w:top w:val="single" w:color="B7C3D0" w:sz="4"/>
+              <w:left w:val="single" w:color="B7C3D0" w:sz="4"/>
+              <w:bottom w:val="single" w:color="B7C3D0" w:sz="4"/>
+              <w:right w:val="single" w:color="B7C3D0" w:sz="4"/>
+            </w:tcBorders>
+            <w:tcMar>
+              <w:top w:type="dxa" w:w="60"/>
+              <w:left w:type="dxa" w:w="100"/>
+              <w:bottom w:type="dxa" w:w="60"/>
+              <w:right w:type="dxa" w:w="100"/>
+            </w:tcMar>
+            <w:vAlign w:val="center"/>
+          </w:tcPr>
+          <w:p>
+            <w:pPr>
+              <w:keepNext w:val="false"/>
+            </w:pPr>
+            <w:r>
+              <w:rPr>
+                <w:sz w:val="19"/>
+                <w:szCs w:val="19"/>
+              </w:rPr>
+              <w:t xml:space="preserve">Ícones</w:t>
+            </w:r>
+          </w:p>
+        </w:tc>
+        <w:tc>
+          <w:tcPr>
+            <w:tcW w:type="dxa" w:w="867"/>
+            <w:tcBorders>
+              <w:top w:val="single" w:color="B7C3D0" w:sz="4"/>
+              <w:left w:val="single" w:color="B7C3D0" w:sz="4"/>
+              <w:bottom w:val="single" w:color="B7C3D0" w:sz="4"/>
+              <w:right w:val="single" w:color="B7C3D0" w:sz="4"/>
+            </w:tcBorders>
+            <w:tcMar>
+              <w:top w:type="dxa" w:w="60"/>
+              <w:left w:type="dxa" w:w="100"/>
+              <w:bottom w:type="dxa" w:w="60"/>
+              <w:right w:type="dxa" w:w="100"/>
+            </w:tcMar>
+            <w:vAlign w:val="center"/>
+          </w:tcPr>
+          <w:p>
+            <w:pPr>
+              <w:keepNext w:val="false"/>
+            </w:pPr>
+            <w:r>
+              <w:rPr>
+                <w:sz w:val="19"/>
+                <w:szCs w:val="19"/>
+              </w:rPr>
+              <w:t xml:space="preserve">F2</w:t>
+            </w:r>
+          </w:p>
+        </w:tc>
+        <w:tc>
+          <w:tcPr>
+            <w:tcW w:type="dxa" w:w="1446"/>
+            <w:tcBorders>
+              <w:top w:val="single" w:color="B7C3D0" w:sz="4"/>
+              <w:left w:val="single" w:color="B7C3D0" w:sz="4"/>
+              <w:bottom w:val="single" w:color="B7C3D0" w:sz="4"/>
+              <w:right w:val="single" w:color="B7C3D0" w:sz="4"/>
+            </w:tcBorders>
+            <w:tcMar>
+              <w:top w:type="dxa" w:w="60"/>
+              <w:left w:type="dxa" w:w="100"/>
+              <w:bottom w:type="dxa" w:w="60"/>
+              <w:right w:type="dxa" w:w="100"/>
+            </w:tcMar>
+            <w:vAlign w:val="center"/>
+          </w:tcPr>
+          <w:p>
+            <w:pPr>
+              <w:keepNext w:val="false"/>
+            </w:pPr>
+            <w:r>
+              <w:rPr>
+                <w:sz w:val="19"/>
+                <w:szCs w:val="19"/>
+              </w:rPr>
+              <w:t xml:space="preserve">☑ Concluída</w:t>
+            </w:r>
+          </w:p>
+        </w:tc>
+        <w:tc>
+          <w:tcPr>
+            <w:tcW w:type="dxa" w:w="2218"/>
+            <w:tcBorders>
+              <w:top w:val="single" w:color="B7C3D0" w:sz="4"/>
+              <w:left w:val="single" w:color="B7C3D0" w:sz="4"/>
+              <w:bottom w:val="single" w:color="B7C3D0" w:sz="4"/>
+              <w:right w:val="single" w:color="B7C3D0" w:sz="4"/>
+            </w:tcBorders>
+            <w:tcMar>
+              <w:top w:type="dxa" w:w="60"/>
+              <w:left w:type="dxa" w:w="100"/>
+              <w:bottom w:type="dxa" w:w="60"/>
+              <w:right w:type="dxa" w:w="100"/>
+            </w:tcMar>
+            <w:vAlign w:val="center"/>
+          </w:tcPr>
+          <w:p>
+            <w:pPr>
+              <w:keepNext w:val="false"/>
+            </w:pPr>
+            <w:r>
+              <w:rPr>
+                <w:sz w:val="19"/>
+                <w:szCs w:val="19"/>
+              </w:rPr>
+              <w:t xml:space="preserve">16 ícones 16×16: consumíveis, equipamentos, gemas</w:t>
+            </w:r>
+          </w:p>
+        </w:tc>
+      </w:tr>
+      <w:tr>
+        <w:trPr>
+          <w:cantSplit/>
+        </w:trPr>
+        <w:tc>
+          <w:tcPr>
+            <w:tcW w:type="dxa" w:w="867"/>
+            <w:tcBorders>
+              <w:top w:val="single" w:color="B7C3D0" w:sz="4"/>
+              <w:left w:val="single" w:color="B7C3D0" w:sz="4"/>
+              <w:bottom w:val="single" w:color="B7C3D0" w:sz="4"/>
+              <w:right w:val="single" w:color="B7C3D0" w:sz="4"/>
+            </w:tcBorders>
+            <w:tcMar>
+              <w:top w:type="dxa" w:w="60"/>
+              <w:left w:type="dxa" w:w="100"/>
+              <w:bottom w:type="dxa" w:w="60"/>
+              <w:right w:type="dxa" w:w="100"/>
+            </w:tcMar>
+            <w:vAlign w:val="center"/>
+          </w:tcPr>
+          <w:p>
+            <w:pPr>
+              <w:keepNext w:val="false"/>
+            </w:pPr>
+            <w:r>
+              <w:rPr>
+                <w:sz w:val="19"/>
+                <w:szCs w:val="19"/>
+              </w:rPr>
+              <w:t xml:space="preserve">A-020</w:t>
+            </w:r>
+          </w:p>
+        </w:tc>
+        <w:tc>
+          <w:tcPr>
+            <w:tcW w:type="dxa" w:w="2891"/>
+            <w:tcBorders>
+              <w:top w:val="single" w:color="B7C3D0" w:sz="4"/>
+              <w:left w:val="single" w:color="B7C3D0" w:sz="4"/>
+              <w:bottom w:val="single" w:color="B7C3D0" w:sz="4"/>
+              <w:right w:val="single" w:color="B7C3D0" w:sz="4"/>
+            </w:tcBorders>
+            <w:tcMar>
+              <w:top w:type="dxa" w:w="60"/>
+              <w:left w:type="dxa" w:w="100"/>
+              <w:bottom w:type="dxa" w:w="60"/>
+              <w:right w:type="dxa" w:w="100"/>
+            </w:tcMar>
+            <w:vAlign w:val="center"/>
+          </w:tcPr>
+          <w:p>
+            <w:pPr>
+              <w:keepNext w:val="false"/>
+            </w:pPr>
+            <w:r>
+              <w:rPr>
+                <w:sz w:val="19"/>
+                <w:szCs w:val="19"/>
+              </w:rPr>
+              <w:t xml:space="preserve">assets/sprites/characters/villagers/npc_villagers.png</w:t>
+            </w:r>
+          </w:p>
+        </w:tc>
+        <w:tc>
+          <w:tcPr>
+            <w:tcW w:type="dxa" w:w="1349"/>
+            <w:tcBorders>
+              <w:top w:val="single" w:color="B7C3D0" w:sz="4"/>
+              <w:left w:val="single" w:color="B7C3D0" w:sz="4"/>
+              <w:bottom w:val="single" w:color="B7C3D0" w:sz="4"/>
+              <w:right w:val="single" w:color="B7C3D0" w:sz="4"/>
+            </w:tcBorders>
+            <w:tcMar>
+              <w:top w:type="dxa" w:w="60"/>
+              <w:left w:type="dxa" w:w="100"/>
+              <w:bottom w:type="dxa" w:w="60"/>
+              <w:right w:type="dxa" w:w="100"/>
+            </w:tcMar>
+            <w:vAlign w:val="center"/>
+          </w:tcPr>
+          <w:p>
+            <w:pPr>
+              <w:keepNext w:val="false"/>
+            </w:pPr>
+            <w:r>
+              <w:rPr>
+                <w:sz w:val="19"/>
+                <w:szCs w:val="19"/>
+              </w:rPr>
+              <w:t xml:space="preserve">Sprite</w:t>
+            </w:r>
+          </w:p>
+        </w:tc>
+        <w:tc>
+          <w:tcPr>
+            <w:tcW w:type="dxa" w:w="867"/>
+            <w:tcBorders>
+              <w:top w:val="single" w:color="B7C3D0" w:sz="4"/>
+              <w:left w:val="single" w:color="B7C3D0" w:sz="4"/>
+              <w:bottom w:val="single" w:color="B7C3D0" w:sz="4"/>
+              <w:right w:val="single" w:color="B7C3D0" w:sz="4"/>
+            </w:tcBorders>
+            <w:tcMar>
+              <w:top w:type="dxa" w:w="60"/>
+              <w:left w:type="dxa" w:w="100"/>
+              <w:bottom w:type="dxa" w:w="60"/>
+              <w:right w:type="dxa" w:w="100"/>
+            </w:tcMar>
+            <w:vAlign w:val="center"/>
+          </w:tcPr>
+          <w:p>
+            <w:pPr>
+              <w:keepNext w:val="false"/>
+            </w:pPr>
+            <w:r>
+              <w:rPr>
+                <w:sz w:val="19"/>
+                <w:szCs w:val="19"/>
+              </w:rPr>
+              <w:t xml:space="preserve">F2</w:t>
+            </w:r>
+          </w:p>
+        </w:tc>
+        <w:tc>
+          <w:tcPr>
+            <w:tcW w:type="dxa" w:w="1446"/>
+            <w:tcBorders>
+              <w:top w:val="single" w:color="B7C3D0" w:sz="4"/>
+              <w:left w:val="single" w:color="B7C3D0" w:sz="4"/>
+              <w:bottom w:val="single" w:color="B7C3D0" w:sz="4"/>
+              <w:right w:val="single" w:color="B7C3D0" w:sz="4"/>
+            </w:tcBorders>
+            <w:tcMar>
+              <w:top w:type="dxa" w:w="60"/>
+              <w:left w:type="dxa" w:w="100"/>
+              <w:bottom w:type="dxa" w:w="60"/>
+              <w:right w:type="dxa" w:w="100"/>
+            </w:tcMar>
+            <w:vAlign w:val="center"/>
+          </w:tcPr>
+          <w:p>
+            <w:pPr>
+              <w:keepNext w:val="false"/>
+            </w:pPr>
+            <w:r>
+              <w:rPr>
+                <w:sz w:val="19"/>
+                <w:szCs w:val="19"/>
+              </w:rPr>
+              <w:t xml:space="preserve">☑ Concluída</w:t>
+            </w:r>
+          </w:p>
+        </w:tc>
+        <w:tc>
+          <w:tcPr>
+            <w:tcW w:type="dxa" w:w="2218"/>
+            <w:tcBorders>
+              <w:top w:val="single" w:color="B7C3D0" w:sz="4"/>
+              <w:left w:val="single" w:color="B7C3D0" w:sz="4"/>
+              <w:bottom w:val="single" w:color="B7C3D0" w:sz="4"/>
+              <w:right w:val="single" w:color="B7C3D0" w:sz="4"/>
+            </w:tcBorders>
+            <w:tcMar>
+              <w:top w:type="dxa" w:w="60"/>
+              <w:left w:type="dxa" w:w="100"/>
+              <w:bottom w:type="dxa" w:w="60"/>
+              <w:right w:type="dxa" w:w="100"/>
+            </w:tcMar>
+            <w:vAlign w:val="center"/>
+          </w:tcPr>
+          <w:p>
+            <w:pPr>
+              <w:keepNext w:val="false"/>
+            </w:pPr>
+            <w:r>
+              <w:rPr>
+                <w:sz w:val="19"/>
+                <w:szCs w:val="19"/>
+              </w:rPr>
+              <w:t xml:space="preserve">Lojista e estalajadeira (grade 2 × 4)</w:t>
+            </w:r>
+          </w:p>
+        </w:tc>
+      </w:tr>
+      <w:tr>
+        <w:trPr>
+          <w:cantSplit/>
+        </w:trPr>
+        <w:tc>
+          <w:tcPr>
+            <w:tcW w:type="dxa" w:w="867"/>
+            <w:tcBorders>
+              <w:top w:val="single" w:color="B7C3D0" w:sz="4"/>
+              <w:left w:val="single" w:color="B7C3D0" w:sz="4"/>
+              <w:bottom w:val="single" w:color="B7C3D0" w:sz="4"/>
+              <w:right w:val="single" w:color="B7C3D0" w:sz="4"/>
+            </w:tcBorders>
+            <w:tcMar>
+              <w:top w:type="dxa" w:w="60"/>
+              <w:left w:type="dxa" w:w="100"/>
+              <w:bottom w:type="dxa" w:w="60"/>
+              <w:right w:type="dxa" w:w="100"/>
+            </w:tcMar>
+            <w:vAlign w:val="center"/>
+          </w:tcPr>
+          <w:p>
+            <w:pPr>
+              <w:keepNext w:val="false"/>
+            </w:pPr>
+            <w:r>
+              <w:rPr>
+                <w:sz w:val="19"/>
+                <w:szCs w:val="19"/>
+              </w:rPr>
+              <w:t xml:space="preserve">A-021</w:t>
+            </w:r>
+          </w:p>
+        </w:tc>
+        <w:tc>
+          <w:tcPr>
+            <w:tcW w:type="dxa" w:w="2891"/>
+            <w:tcBorders>
+              <w:top w:val="single" w:color="B7C3D0" w:sz="4"/>
+              <w:left w:val="single" w:color="B7C3D0" w:sz="4"/>
+              <w:bottom w:val="single" w:color="B7C3D0" w:sz="4"/>
+              <w:right w:val="single" w:color="B7C3D0" w:sz="4"/>
+            </w:tcBorders>
+            <w:tcMar>
+              <w:top w:type="dxa" w:w="60"/>
+              <w:left w:type="dxa" w:w="100"/>
+              <w:bottom w:type="dxa" w:w="60"/>
+              <w:right w:type="dxa" w:w="100"/>
+            </w:tcMar>
+            <w:vAlign w:val="center"/>
+          </w:tcPr>
+          <w:p>
+            <w:pPr>
+              <w:keepNext w:val="false"/>
+            </w:pPr>
+            <w:r>
+              <w:rPr>
+                <w:sz w:val="19"/>
+                <w:szCs w:val="19"/>
+              </w:rPr>
+              <w:t xml:space="preserve">assets/ui/bg_title.png</w:t>
+            </w:r>
+          </w:p>
+        </w:tc>
+        <w:tc>
+          <w:tcPr>
+            <w:tcW w:type="dxa" w:w="1349"/>
+            <w:tcBorders>
+              <w:top w:val="single" w:color="B7C3D0" w:sz="4"/>
+              <w:left w:val="single" w:color="B7C3D0" w:sz="4"/>
+              <w:bottom w:val="single" w:color="B7C3D0" w:sz="4"/>
+              <w:right w:val="single" w:color="B7C3D0" w:sz="4"/>
+            </w:tcBorders>
+            <w:tcMar>
+              <w:top w:type="dxa" w:w="60"/>
+              <w:left w:type="dxa" w:w="100"/>
+              <w:bottom w:type="dxa" w:w="60"/>
+              <w:right w:type="dxa" w:w="100"/>
+            </w:tcMar>
+            <w:vAlign w:val="center"/>
+          </w:tcPr>
+          <w:p>
+            <w:pPr>
+              <w:keepNext w:val="false"/>
+            </w:pPr>
+            <w:r>
+              <w:rPr>
+                <w:sz w:val="19"/>
+                <w:szCs w:val="19"/>
+              </w:rPr>
+              <w:t xml:space="preserve">Arte</w:t>
+            </w:r>
+          </w:p>
+        </w:tc>
+        <w:tc>
+          <w:tcPr>
+            <w:tcW w:type="dxa" w:w="867"/>
+            <w:tcBorders>
+              <w:top w:val="single" w:color="B7C3D0" w:sz="4"/>
+              <w:left w:val="single" w:color="B7C3D0" w:sz="4"/>
+              <w:bottom w:val="single" w:color="B7C3D0" w:sz="4"/>
+              <w:right w:val="single" w:color="B7C3D0" w:sz="4"/>
+            </w:tcBorders>
+            <w:tcMar>
+              <w:top w:type="dxa" w:w="60"/>
+              <w:left w:type="dxa" w:w="100"/>
+              <w:bottom w:type="dxa" w:w="60"/>
+              <w:right w:type="dxa" w:w="100"/>
+            </w:tcMar>
+            <w:vAlign w:val="center"/>
+          </w:tcPr>
+          <w:p>
+            <w:pPr>
+              <w:keepNext w:val="false"/>
+            </w:pPr>
+            <w:r>
+              <w:rPr>
+                <w:sz w:val="19"/>
+                <w:szCs w:val="19"/>
+              </w:rPr>
+              <w:t xml:space="preserve">F2</w:t>
+            </w:r>
+          </w:p>
+        </w:tc>
+        <w:tc>
+          <w:tcPr>
+            <w:tcW w:type="dxa" w:w="1446"/>
+            <w:tcBorders>
+              <w:top w:val="single" w:color="B7C3D0" w:sz="4"/>
+              <w:left w:val="single" w:color="B7C3D0" w:sz="4"/>
+              <w:bottom w:val="single" w:color="B7C3D0" w:sz="4"/>
+              <w:right w:val="single" w:color="B7C3D0" w:sz="4"/>
+            </w:tcBorders>
+            <w:tcMar>
+              <w:top w:type="dxa" w:w="60"/>
+              <w:left w:type="dxa" w:w="100"/>
+              <w:bottom w:type="dxa" w:w="60"/>
+              <w:right w:type="dxa" w:w="100"/>
+            </w:tcMar>
+            <w:vAlign w:val="center"/>
+          </w:tcPr>
+          <w:p>
+            <w:pPr>
+              <w:keepNext w:val="false"/>
+            </w:pPr>
+            <w:r>
+              <w:rPr>
+                <w:sz w:val="19"/>
+                <w:szCs w:val="19"/>
+              </w:rPr>
+              <w:t xml:space="preserve">☑ Concluída</w:t>
+            </w:r>
+          </w:p>
+        </w:tc>
+        <w:tc>
+          <w:tcPr>
+            <w:tcW w:type="dxa" w:w="2218"/>
+            <w:tcBorders>
+              <w:top w:val="single" w:color="B7C3D0" w:sz="4"/>
+              <w:left w:val="single" w:color="B7C3D0" w:sz="4"/>
+              <w:bottom w:val="single" w:color="B7C3D0" w:sz="4"/>
+              <w:right w:val="single" w:color="B7C3D0" w:sz="4"/>
+            </w:tcBorders>
+            <w:tcMar>
+              <w:top w:type="dxa" w:w="60"/>
+              <w:left w:type="dxa" w:w="100"/>
+              <w:bottom w:type="dxa" w:w="60"/>
+              <w:right w:type="dxa" w:w="100"/>
+            </w:tcMar>
+            <w:vAlign w:val="center"/>
+          </w:tcPr>
+          <w:p>
+            <w:pPr>
+              <w:keepNext w:val="false"/>
+            </w:pPr>
+            <w:r>
+              <w:rPr>
+                <w:sz w:val="19"/>
+                <w:szCs w:val="19"/>
+              </w:rPr>
+              <w:t xml:space="preserve">Tela de título 640×360 (Kael, Eco e o Coração de Éter)</w:t>
+            </w:r>
+          </w:p>
+        </w:tc>
+      </w:tr>
+      <w:tr>
+        <w:trPr>
+          <w:cantSplit/>
+        </w:trPr>
+        <w:tc>
+          <w:tcPr>
+            <w:tcW w:type="dxa" w:w="867"/>
+            <w:tcBorders>
+              <w:top w:val="single" w:color="B7C3D0" w:sz="4"/>
+              <w:left w:val="single" w:color="B7C3D0" w:sz="4"/>
+              <w:bottom w:val="single" w:color="B7C3D0" w:sz="4"/>
+              <w:right w:val="single" w:color="B7C3D0" w:sz="4"/>
+            </w:tcBorders>
+            <w:tcMar>
+              <w:top w:type="dxa" w:w="60"/>
+              <w:left w:type="dxa" w:w="100"/>
+              <w:bottom w:type="dxa" w:w="60"/>
+              <w:right w:type="dxa" w:w="100"/>
+            </w:tcMar>
+            <w:vAlign w:val="center"/>
+          </w:tcPr>
+          <w:p>
+            <w:pPr>
+              <w:keepNext w:val="false"/>
+            </w:pPr>
+            <w:r>
+              <w:rPr>
+                <w:sz w:val="19"/>
+                <w:szCs w:val="19"/>
+              </w:rPr>
+              <w:t xml:space="preserve">A-022</w:t>
+            </w:r>
+          </w:p>
+        </w:tc>
+        <w:tc>
+          <w:tcPr>
+            <w:tcW w:type="dxa" w:w="2891"/>
+            <w:tcBorders>
+              <w:top w:val="single" w:color="B7C3D0" w:sz="4"/>
+              <w:left w:val="single" w:color="B7C3D0" w:sz="4"/>
+              <w:bottom w:val="single" w:color="B7C3D0" w:sz="4"/>
+              <w:right w:val="single" w:color="B7C3D0" w:sz="4"/>
+            </w:tcBorders>
+            <w:tcMar>
+              <w:top w:type="dxa" w:w="60"/>
+              <w:left w:type="dxa" w:w="100"/>
+              <w:bottom w:type="dxa" w:w="60"/>
+              <w:right w:type="dxa" w:w="100"/>
+            </w:tcMar>
+            <w:vAlign w:val="center"/>
+          </w:tcPr>
+          <w:p>
+            <w:pPr>
+              <w:keepNext w:val="false"/>
+            </w:pPr>
+            <w:r>
+              <w:rPr>
+                <w:sz w:val="19"/>
+                <w:szCs w:val="19"/>
+              </w:rPr>
+              <w:t xml:space="preserve">assets/audio/music/bgm_battle_a.mp3</w:t>
+            </w:r>
+          </w:p>
+        </w:tc>
+        <w:tc>
+          <w:tcPr>
+            <w:tcW w:type="dxa" w:w="1349"/>
+            <w:tcBorders>
+              <w:top w:val="single" w:color="B7C3D0" w:sz="4"/>
+              <w:left w:val="single" w:color="B7C3D0" w:sz="4"/>
+              <w:bottom w:val="single" w:color="B7C3D0" w:sz="4"/>
+              <w:right w:val="single" w:color="B7C3D0" w:sz="4"/>
+            </w:tcBorders>
+            <w:tcMar>
+              <w:top w:type="dxa" w:w="60"/>
+              <w:left w:type="dxa" w:w="100"/>
+              <w:bottom w:type="dxa" w:w="60"/>
+              <w:right w:type="dxa" w:w="100"/>
+            </w:tcMar>
+            <w:vAlign w:val="center"/>
+          </w:tcPr>
+          <w:p>
+            <w:pPr>
+              <w:keepNext w:val="false"/>
+            </w:pPr>
+            <w:r>
+              <w:rPr>
+                <w:sz w:val="19"/>
+                <w:szCs w:val="19"/>
+              </w:rPr>
+              <w:t xml:space="preserve">Música</w:t>
+            </w:r>
+          </w:p>
+        </w:tc>
+        <w:tc>
+          <w:tcPr>
+            <w:tcW w:type="dxa" w:w="867"/>
+            <w:tcBorders>
+              <w:top w:val="single" w:color="B7C3D0" w:sz="4"/>
+              <w:left w:val="single" w:color="B7C3D0" w:sz="4"/>
+              <w:bottom w:val="single" w:color="B7C3D0" w:sz="4"/>
+              <w:right w:val="single" w:color="B7C3D0" w:sz="4"/>
+            </w:tcBorders>
+            <w:tcMar>
+              <w:top w:type="dxa" w:w="60"/>
+              <w:left w:type="dxa" w:w="100"/>
+              <w:bottom w:type="dxa" w:w="60"/>
+              <w:right w:type="dxa" w:w="100"/>
+            </w:tcMar>
+            <w:vAlign w:val="center"/>
+          </w:tcPr>
+          <w:p>
+            <w:pPr>
+              <w:keepNext w:val="false"/>
+            </w:pPr>
+            <w:r>
+              <w:rPr>
+                <w:sz w:val="19"/>
+                <w:szCs w:val="19"/>
+              </w:rPr>
+              <w:t xml:space="preserve">F2</w:t>
+            </w:r>
+          </w:p>
+        </w:tc>
+        <w:tc>
+          <w:tcPr>
+            <w:tcW w:type="dxa" w:w="1446"/>
+            <w:tcBorders>
+              <w:top w:val="single" w:color="B7C3D0" w:sz="4"/>
+              <w:left w:val="single" w:color="B7C3D0" w:sz="4"/>
+              <w:bottom w:val="single" w:color="B7C3D0" w:sz="4"/>
+              <w:right w:val="single" w:color="B7C3D0" w:sz="4"/>
+            </w:tcBorders>
+            <w:tcMar>
+              <w:top w:type="dxa" w:w="60"/>
+              <w:left w:type="dxa" w:w="100"/>
+              <w:bottom w:type="dxa" w:w="60"/>
+              <w:right w:type="dxa" w:w="100"/>
+            </w:tcMar>
+            <w:vAlign w:val="center"/>
+          </w:tcPr>
+          <w:p>
+            <w:pPr>
+              <w:keepNext w:val="false"/>
+            </w:pPr>
+            <w:r>
+              <w:rPr>
+                <w:sz w:val="19"/>
+                <w:szCs w:val="19"/>
+              </w:rPr>
+              <w:t xml:space="preserve">◐ Em andamento</w:t>
+            </w:r>
+          </w:p>
+        </w:tc>
+        <w:tc>
+          <w:tcPr>
+            <w:tcW w:type="dxa" w:w="2218"/>
+            <w:tcBorders>
+              <w:top w:val="single" w:color="B7C3D0" w:sz="4"/>
+              <w:left w:val="single" w:color="B7C3D0" w:sz="4"/>
+              <w:bottom w:val="single" w:color="B7C3D0" w:sz="4"/>
+              <w:right w:val="single" w:color="B7C3D0" w:sz="4"/>
+            </w:tcBorders>
+            <w:tcMar>
+              <w:top w:type="dxa" w:w="60"/>
+              <w:left w:type="dxa" w:w="100"/>
+              <w:bottom w:type="dxa" w:w="60"/>
+              <w:right w:type="dxa" w:w="100"/>
+            </w:tcMar>
+            <w:vAlign w:val="center"/>
+          </w:tcPr>
+          <w:p>
+            <w:pPr>
+              <w:keepNext w:val="false"/>
+            </w:pPr>
+            <w:r>
+              <w:rPr>
+                <w:sz w:val="19"/>
+                <w:szCs w:val="19"/>
+              </w:rPr>
+              <w:t xml:space="preserve">Tema de batalha (Suno, 90 s; variação B guardada) — aguardando avaliação</w:t>
+            </w:r>
+          </w:p>
+        </w:tc>
+      </w:tr>
+      <w:tr>
+        <w:trPr>
+          <w:cantSplit/>
+        </w:trPr>
+        <w:tc>
+          <w:tcPr>
+            <w:tcW w:type="dxa" w:w="867"/>
+            <w:tcBorders>
+              <w:top w:val="single" w:color="B7C3D0" w:sz="4"/>
+              <w:left w:val="single" w:color="B7C3D0" w:sz="4"/>
+              <w:bottom w:val="single" w:color="B7C3D0" w:sz="4"/>
+              <w:right w:val="single" w:color="B7C3D0" w:sz="4"/>
+            </w:tcBorders>
+            <w:tcMar>
+              <w:top w:type="dxa" w:w="60"/>
+              <w:left w:type="dxa" w:w="100"/>
+              <w:bottom w:type="dxa" w:w="60"/>
+              <w:right w:type="dxa" w:w="100"/>
+            </w:tcMar>
+            <w:vAlign w:val="center"/>
+          </w:tcPr>
+          <w:p>
+            <w:pPr>
+              <w:keepNext w:val="false"/>
+            </w:pPr>
+            <w:r>
+              <w:rPr>
+                <w:sz w:val="19"/>
+                <w:szCs w:val="19"/>
+              </w:rPr>
+              <w:t xml:space="preserve">A-023</w:t>
+            </w:r>
+          </w:p>
+        </w:tc>
+        <w:tc>
+          <w:tcPr>
+            <w:tcW w:type="dxa" w:w="2891"/>
+            <w:tcBorders>
+              <w:top w:val="single" w:color="B7C3D0" w:sz="4"/>
+              <w:left w:val="single" w:color="B7C3D0" w:sz="4"/>
+              <w:bottom w:val="single" w:color="B7C3D0" w:sz="4"/>
+              <w:right w:val="single" w:color="B7C3D0" w:sz="4"/>
+            </w:tcBorders>
+            <w:tcMar>
+              <w:top w:type="dxa" w:w="60"/>
+              <w:left w:type="dxa" w:w="100"/>
+              <w:bottom w:type="dxa" w:w="60"/>
+              <w:right w:type="dxa" w:w="100"/>
+            </w:tcMar>
+            <w:vAlign w:val="center"/>
+          </w:tcPr>
+          <w:p>
+            <w:pPr>
+              <w:keepNext w:val="false"/>
+            </w:pPr>
+            <w:r>
+              <w:rPr>
+                <w:sz w:val="19"/>
+                <w:szCs w:val="19"/>
+              </w:rPr>
+              <w:t xml:space="preserve">assets/audio/music/bgm_victory_a.mp3</w:t>
+            </w:r>
+          </w:p>
+        </w:tc>
+        <w:tc>
+          <w:tcPr>
+            <w:tcW w:type="dxa" w:w="1349"/>
+            <w:tcBorders>
+              <w:top w:val="single" w:color="B7C3D0" w:sz="4"/>
+              <w:left w:val="single" w:color="B7C3D0" w:sz="4"/>
+              <w:bottom w:val="single" w:color="B7C3D0" w:sz="4"/>
+              <w:right w:val="single" w:color="B7C3D0" w:sz="4"/>
+            </w:tcBorders>
+            <w:tcMar>
+              <w:top w:type="dxa" w:w="60"/>
+              <w:left w:type="dxa" w:w="100"/>
+              <w:bottom w:type="dxa" w:w="60"/>
+              <w:right w:type="dxa" w:w="100"/>
+            </w:tcMar>
+            <w:vAlign w:val="center"/>
+          </w:tcPr>
+          <w:p>
+            <w:pPr>
+              <w:keepNext w:val="false"/>
+            </w:pPr>
+            <w:r>
+              <w:rPr>
+                <w:sz w:val="19"/>
+                <w:szCs w:val="19"/>
+              </w:rPr>
+              <w:t xml:space="preserve">Música</w:t>
+            </w:r>
+          </w:p>
+        </w:tc>
+        <w:tc>
+          <w:tcPr>
+            <w:tcW w:type="dxa" w:w="867"/>
+            <w:tcBorders>
+              <w:top w:val="single" w:color="B7C3D0" w:sz="4"/>
+              <w:left w:val="single" w:color="B7C3D0" w:sz="4"/>
+              <w:bottom w:val="single" w:color="B7C3D0" w:sz="4"/>
+              <w:right w:val="single" w:color="B7C3D0" w:sz="4"/>
+            </w:tcBorders>
+            <w:tcMar>
+              <w:top w:type="dxa" w:w="60"/>
+              <w:left w:type="dxa" w:w="100"/>
+              <w:bottom w:type="dxa" w:w="60"/>
+              <w:right w:type="dxa" w:w="100"/>
+            </w:tcMar>
+            <w:vAlign w:val="center"/>
+          </w:tcPr>
+          <w:p>
+            <w:pPr>
+              <w:keepNext w:val="false"/>
+            </w:pPr>
+            <w:r>
+              <w:rPr>
+                <w:sz w:val="19"/>
+                <w:szCs w:val="19"/>
+              </w:rPr>
+              <w:t xml:space="preserve">F2</w:t>
+            </w:r>
+          </w:p>
+        </w:tc>
+        <w:tc>
+          <w:tcPr>
+            <w:tcW w:type="dxa" w:w="1446"/>
+            <w:tcBorders>
+              <w:top w:val="single" w:color="B7C3D0" w:sz="4"/>
+              <w:left w:val="single" w:color="B7C3D0" w:sz="4"/>
+              <w:bottom w:val="single" w:color="B7C3D0" w:sz="4"/>
+              <w:right w:val="single" w:color="B7C3D0" w:sz="4"/>
+            </w:tcBorders>
+            <w:tcMar>
+              <w:top w:type="dxa" w:w="60"/>
+              <w:left w:type="dxa" w:w="100"/>
+              <w:bottom w:type="dxa" w:w="60"/>
+              <w:right w:type="dxa" w:w="100"/>
+            </w:tcMar>
+            <w:vAlign w:val="center"/>
+          </w:tcPr>
+          <w:p>
+            <w:pPr>
+              <w:keepNext w:val="false"/>
+            </w:pPr>
+            <w:r>
+              <w:rPr>
+                <w:sz w:val="19"/>
+                <w:szCs w:val="19"/>
+              </w:rPr>
+              <w:t xml:space="preserve">◐ Em andamento</w:t>
+            </w:r>
+          </w:p>
+        </w:tc>
+        <w:tc>
+          <w:tcPr>
+            <w:tcW w:type="dxa" w:w="2218"/>
+            <w:tcBorders>
+              <w:top w:val="single" w:color="B7C3D0" w:sz="4"/>
+              <w:left w:val="single" w:color="B7C3D0" w:sz="4"/>
+              <w:bottom w:val="single" w:color="B7C3D0" w:sz="4"/>
+              <w:right w:val="single" w:color="B7C3D0" w:sz="4"/>
+            </w:tcBorders>
+            <w:tcMar>
+              <w:top w:type="dxa" w:w="60"/>
+              <w:left w:type="dxa" w:w="100"/>
+              <w:bottom w:type="dxa" w:w="60"/>
+              <w:right w:type="dxa" w:w="100"/>
+            </w:tcMar>
+            <w:vAlign w:val="center"/>
+          </w:tcPr>
+          <w:p>
+            <w:pPr>
+              <w:keepNext w:val="false"/>
+            </w:pPr>
+            <w:r>
+              <w:rPr>
+                <w:sz w:val="19"/>
+                <w:szCs w:val="19"/>
+              </w:rPr>
+              <w:t xml:space="preserve">Fanfarra de vitória (Suno, 30 s; variação B guardada) — aguardando avaliação</w:t>
+            </w:r>
+          </w:p>
+        </w:tc>
+      </w:tr>
+      <w:tr>
+        <w:trPr>
+          <w:cantSplit/>
+        </w:trPr>
+        <w:tc>
+          <w:tcPr>
+            <w:tcW w:type="dxa" w:w="867"/>
+            <w:tcBorders>
+              <w:top w:val="single" w:color="B7C3D0" w:sz="4"/>
+              <w:left w:val="single" w:color="B7C3D0" w:sz="4"/>
+              <w:bottom w:val="single" w:color="B7C3D0" w:sz="4"/>
+              <w:right w:val="single" w:color="B7C3D0" w:sz="4"/>
+            </w:tcBorders>
+            <w:tcMar>
+              <w:top w:type="dxa" w:w="60"/>
+              <w:left w:type="dxa" w:w="100"/>
+              <w:bottom w:type="dxa" w:w="60"/>
+              <w:right w:type="dxa" w:w="100"/>
+            </w:tcMar>
+            <w:vAlign w:val="center"/>
+          </w:tcPr>
+          <w:p>
+            <w:pPr>
+              <w:keepNext w:val="false"/>
+            </w:pPr>
+            <w:r>
+              <w:rPr>
+                <w:sz w:val="19"/>
+                <w:szCs w:val="19"/>
+              </w:rPr>
+              <w:t xml:space="preserve">A-024</w:t>
+            </w:r>
+          </w:p>
+        </w:tc>
+        <w:tc>
+          <w:tcPr>
+            <w:tcW w:type="dxa" w:w="2891"/>
+            <w:tcBorders>
+              <w:top w:val="single" w:color="B7C3D0" w:sz="4"/>
+              <w:left w:val="single" w:color="B7C3D0" w:sz="4"/>
+              <w:bottom w:val="single" w:color="B7C3D0" w:sz="4"/>
+              <w:right w:val="single" w:color="B7C3D0" w:sz="4"/>
+            </w:tcBorders>
+            <w:tcMar>
+              <w:top w:type="dxa" w:w="60"/>
+              <w:left w:type="dxa" w:w="100"/>
+              <w:bottom w:type="dxa" w:w="60"/>
+              <w:right w:type="dxa" w:w="100"/>
+            </w:tcMar>
+            <w:vAlign w:val="center"/>
+          </w:tcPr>
+          <w:p>
+            <w:pPr>
+              <w:keepNext w:val="false"/>
+            </w:pPr>
+            <w:r>
+              <w:rPr>
+                <w:sz w:val="19"/>
+                <w:szCs w:val="19"/>
+              </w:rPr>
+              <w:t xml:space="preserve">bgm_title (pendente)</w:t>
+            </w:r>
+          </w:p>
+        </w:tc>
+        <w:tc>
+          <w:tcPr>
+            <w:tcW w:type="dxa" w:w="1349"/>
+            <w:tcBorders>
+              <w:top w:val="single" w:color="B7C3D0" w:sz="4"/>
+              <w:left w:val="single" w:color="B7C3D0" w:sz="4"/>
+              <w:bottom w:val="single" w:color="B7C3D0" w:sz="4"/>
+              <w:right w:val="single" w:color="B7C3D0" w:sz="4"/>
+            </w:tcBorders>
+            <w:tcMar>
+              <w:top w:type="dxa" w:w="60"/>
+              <w:left w:type="dxa" w:w="100"/>
+              <w:bottom w:type="dxa" w:w="60"/>
+              <w:right w:type="dxa" w:w="100"/>
+            </w:tcMar>
+            <w:vAlign w:val="center"/>
+          </w:tcPr>
+          <w:p>
+            <w:pPr>
+              <w:keepNext w:val="false"/>
+            </w:pPr>
+            <w:r>
+              <w:rPr>
+                <w:sz w:val="19"/>
+                <w:szCs w:val="19"/>
+              </w:rPr>
+              <w:t xml:space="preserve">Música</w:t>
+            </w:r>
+          </w:p>
+        </w:tc>
+        <w:tc>
+          <w:tcPr>
+            <w:tcW w:type="dxa" w:w="867"/>
+            <w:tcBorders>
+              <w:top w:val="single" w:color="B7C3D0" w:sz="4"/>
+              <w:left w:val="single" w:color="B7C3D0" w:sz="4"/>
+              <w:bottom w:val="single" w:color="B7C3D0" w:sz="4"/>
+              <w:right w:val="single" w:color="B7C3D0" w:sz="4"/>
+            </w:tcBorders>
+            <w:tcMar>
+              <w:top w:type="dxa" w:w="60"/>
+              <w:left w:type="dxa" w:w="100"/>
+              <w:bottom w:type="dxa" w:w="60"/>
+              <w:right w:type="dxa" w:w="100"/>
+            </w:tcMar>
+            <w:vAlign w:val="center"/>
+          </w:tcPr>
+          <w:p>
+            <w:pPr>
+              <w:keepNext w:val="false"/>
+            </w:pPr>
+            <w:r>
+              <w:rPr>
+                <w:sz w:val="19"/>
+                <w:szCs w:val="19"/>
+              </w:rPr>
+              <w:t xml:space="preserve">F2</w:t>
+            </w:r>
+          </w:p>
+        </w:tc>
+        <w:tc>
+          <w:tcPr>
+            <w:tcW w:type="dxa" w:w="1446"/>
+            <w:tcBorders>
+              <w:top w:val="single" w:color="B7C3D0" w:sz="4"/>
+              <w:left w:val="single" w:color="B7C3D0" w:sz="4"/>
+              <w:bottom w:val="single" w:color="B7C3D0" w:sz="4"/>
+              <w:right w:val="single" w:color="B7C3D0" w:sz="4"/>
+            </w:tcBorders>
+            <w:tcMar>
+              <w:top w:type="dxa" w:w="60"/>
+              <w:left w:type="dxa" w:w="100"/>
+              <w:bottom w:type="dxa" w:w="60"/>
+              <w:right w:type="dxa" w:w="100"/>
+            </w:tcMar>
+            <w:vAlign w:val="center"/>
+          </w:tcPr>
+          <w:p>
+            <w:pPr>
+              <w:keepNext w:val="false"/>
+            </w:pPr>
+            <w:r>
+              <w:rPr>
+                <w:sz w:val="19"/>
+                <w:szCs w:val="19"/>
+              </w:rPr>
+              <w:t xml:space="preserve">⛔ Bloqueada</w:t>
+            </w:r>
+          </w:p>
+        </w:tc>
+        <w:tc>
+          <w:tcPr>
+            <w:tcW w:type="dxa" w:w="2218"/>
+            <w:tcBorders>
+              <w:top w:val="single" w:color="B7C3D0" w:sz="4"/>
+              <w:left w:val="single" w:color="B7C3D0" w:sz="4"/>
+              <w:bottom w:val="single" w:color="B7C3D0" w:sz="4"/>
+              <w:right w:val="single" w:color="B7C3D0" w:sz="4"/>
+            </w:tcBorders>
+            <w:tcMar>
+              <w:top w:type="dxa" w:w="60"/>
+              <w:left w:type="dxa" w:w="100"/>
+              <w:bottom w:type="dxa" w:w="60"/>
+              <w:right w:type="dxa" w:w="100"/>
+            </w:tcMar>
+            <w:vAlign w:val="center"/>
+          </w:tcPr>
+          <w:p>
+            <w:pPr>
+              <w:keepNext w:val="false"/>
+            </w:pPr>
+            <w:r>
+              <w:rPr>
+                <w:sz w:val="19"/>
+                <w:szCs w:val="19"/>
+              </w:rPr>
+              <w:t xml:space="preserve">Créditos da AceData esgotados; pedido pronto em _prompts/bgm_title_test.json</w:t>
             </w:r>
           </w:p>
         </w:tc>
@@ -35125,6 +36483,101 @@
           </w:tcPr>
           <w:p>
             <w:pPr>
+              <w:keepNext/>
+            </w:pPr>
+            <w:r>
+              <w:rPr>
+                <w:sz w:val="19"/>
+                <w:szCs w:val="19"/>
+              </w:rPr>
+              <w:t xml:space="preserve">1.3</w:t>
+            </w:r>
+          </w:p>
+        </w:tc>
+        <w:tc>
+          <w:tcPr>
+            <w:tcW w:type="dxa" w:w="1735"/>
+            <w:tcBorders>
+              <w:top w:val="single" w:color="B7C3D0" w:sz="4"/>
+              <w:left w:val="single" w:color="B7C3D0" w:sz="4"/>
+              <w:bottom w:val="single" w:color="B7C3D0" w:sz="4"/>
+              <w:right w:val="single" w:color="B7C3D0" w:sz="4"/>
+            </w:tcBorders>
+            <w:tcMar>
+              <w:top w:type="dxa" w:w="60"/>
+              <w:left w:type="dxa" w:w="100"/>
+              <w:bottom w:type="dxa" w:w="60"/>
+              <w:right w:type="dxa" w:w="100"/>
+            </w:tcMar>
+            <w:vAlign w:val="center"/>
+          </w:tcPr>
+          <w:p>
+            <w:pPr>
+              <w:keepNext/>
+            </w:pPr>
+            <w:r>
+              <w:rPr>
+                <w:sz w:val="19"/>
+                <w:szCs w:val="19"/>
+              </w:rPr>
+              <w:t xml:space="preserve">24/09/2026</w:t>
+            </w:r>
+          </w:p>
+        </w:tc>
+        <w:tc>
+          <w:tcPr>
+            <w:tcW w:type="dxa" w:w="6746"/>
+            <w:tcBorders>
+              <w:top w:val="single" w:color="B7C3D0" w:sz="4"/>
+              <w:left w:val="single" w:color="B7C3D0" w:sz="4"/>
+              <w:bottom w:val="single" w:color="B7C3D0" w:sz="4"/>
+              <w:right w:val="single" w:color="B7C3D0" w:sz="4"/>
+            </w:tcBorders>
+            <w:tcMar>
+              <w:top w:type="dxa" w:w="60"/>
+              <w:left w:type="dxa" w:w="100"/>
+              <w:bottom w:type="dxa" w:w="60"/>
+              <w:right w:type="dxa" w:w="100"/>
+            </w:tcMar>
+            <w:vAlign w:val="center"/>
+          </w:tcPr>
+          <w:p>
+            <w:pPr>
+              <w:keepNext/>
+            </w:pPr>
+            <w:r>
+              <w:rPr>
+                <w:sz w:val="19"/>
+                <w:szCs w:val="19"/>
+              </w:rPr>
+              <w:t xml:space="preserve">Primeira batalha: inimigo no mapa, formação no próprio cenário, fila CTB, menu e alvo, timing de ataque e defesa, vitória/derrota; Brann e Slime de Óleo (76 testes).</w:t>
+            </w:r>
+          </w:p>
+        </w:tc>
+      </w:tr>
+      <w:tr>
+        <w:trPr>
+          <w:cantSplit/>
+        </w:trPr>
+        <w:tc>
+          <w:tcPr>
+            <w:tcW w:type="dxa" w:w="1157"/>
+            <w:tcBorders>
+              <w:top w:val="single" w:color="B7C3D0" w:sz="4"/>
+              <w:left w:val="single" w:color="B7C3D0" w:sz="4"/>
+              <w:bottom w:val="single" w:color="B7C3D0" w:sz="4"/>
+              <w:right w:val="single" w:color="B7C3D0" w:sz="4"/>
+            </w:tcBorders>
+            <w:tcMar>
+              <w:top w:type="dxa" w:w="60"/>
+              <w:left w:type="dxa" w:w="100"/>
+              <w:bottom w:type="dxa" w:w="60"/>
+              <w:right w:type="dxa" w:w="100"/>
+            </w:tcMar>
+            <w:vAlign w:val="center"/>
+          </w:tcPr>
+          <w:p>
+            <w:pPr>
               <w:keepNext w:val="false"/>
             </w:pPr>
             <w:r>
@@ -35132,7 +36585,7 @@
                 <w:sz w:val="19"/>
                 <w:szCs w:val="19"/>
               </w:rPr>
-              <w:t xml:space="preserve">1.3</w:t>
+              <w:t xml:space="preserve">2.0</w:t>
             </w:r>
           </w:p>
         </w:tc>
@@ -35192,7 +36645,7 @@
                 <w:sz w:val="19"/>
                 <w:szCs w:val="19"/>
               </w:rPr>
-              <w:t xml:space="preserve">Primeira batalha: inimigo no mapa, formação no próprio cenário, fila CTB, menu e alvo, timing de ataque e defesa, vitória/derrota; Brann e Slime de Óleo (76 testes).</w:t>
+              <w:t xml:space="preserve">Fase 2 implementada em 4 blocos, aguardando aprovação do Diretor. A: GameState, níveis/XP, salvar. B: combate completo (status, itens, Barra de Éter, especiais, timing por personagem, IA por regras, troca, técnicas combinadas, fuga, iniciativa). C: equipamento, gemas, árvores. D: menu principal, loja, estalagem, diálogo com escolhas/afinidade, missões, cutscenes, opções, idioma, tela de título (155 testes).</w:t>
             </w:r>
           </w:p>
         </w:tc>
@@ -35221,7 +36674,7 @@
         <w:spacing w:after="60"/>
       </w:pPr>
       <w:r>
-        <w:t xml:space="preserve">Fase 1: Kael andando num mapa de teste com colisão e câmera (F1.01–F1.03).</w:t>
+        <w:t xml:space="preserve">Diretor: jogar e aprovar a Fase 2 (menu, loja, estalagem, missão do Gerd, Lyra, batalhas com a Sentinela).</w:t>
       </w:r>
     </w:p>
     <w:p>
@@ -35234,7 +36687,7 @@
         <w:spacing w:after="60"/>
       </w:pPr>
       <w:r>
-        <w:t xml:space="preserve">Fase 1: conversa com NPC e transições de cena (F1.04–F1.05).</w:t>
+        <w:t xml:space="preserve">Recarregar créditos da AceData e gerar o tema de título.</w:t>
       </w:r>
     </w:p>
     <w:p>
@@ -35247,20 +36700,7 @@
         <w:spacing w:after="60"/>
       </w:pPr>
       <w:r>
-        <w:t xml:space="preserve">Fase 1: inimigo no mapa, batalha mínima com fila CTB e timing, vitória/derrota (F1.06–F1.10).</w:t>
-      </w:r>
-    </w:p>
-    <w:p>
-      <w:pPr>
-        <w:pStyle w:val="ListParagraph"/>
-        <w:numPr>
-          <w:ilvl w:val="0"/>
-          <w:numId w:val="5"/>
-        </w:numPr>
-        <w:spacing w:after="60"/>
-      </w:pPr>
-      <w:r>
-        <w:t xml:space="preserve">Playtest do protótipo com o Diretor (F1.12).</w:t>
+        <w:t xml:space="preserve">Fase 3 (vertical slice): roteiro do prólogo, tilesets reais pelo Codex, Ferro-Velho do Sul, primeiro chefe.</w:t>
       </w:r>
     </w:p>
     <w:sectPr>

</xml_diff>

<commit_message>
Title theme generated with Suno (variant A on the title screen, B kept)
Co-Authored-By: Claude Opus 5.5 <noreply@anthropic.com>
</commit_message>
<xml_diff>
--- a/docs/Planejamento_Projeto_RPG.docx
+++ b/docs/Planejamento_Projeto_RPG.docx
@@ -32415,7 +32415,7 @@
                 <w:sz w:val="19"/>
                 <w:szCs w:val="19"/>
               </w:rPr>
-              <w:t xml:space="preserve">bgm_title (pendente)</w:t>
+              <w:t xml:space="preserve">assets/audio/music/bgm_title_a.mp3</w:t>
             </w:r>
           </w:p>
         </w:tc>
@@ -32505,7 +32505,7 @@
                 <w:sz w:val="19"/>
                 <w:szCs w:val="19"/>
               </w:rPr>
-              <w:t xml:space="preserve">⛔ Bloqueada</w:t>
+              <w:t xml:space="preserve">◐ Em andamento</w:t>
             </w:r>
           </w:p>
         </w:tc>
@@ -32535,7 +32535,7 @@
                 <w:sz w:val="19"/>
                 <w:szCs w:val="19"/>
               </w:rPr>
-              <w:t xml:space="preserve">Créditos da AceData esgotados; pedido pronto em _prompts/bgm_title_test.json</w:t>
+              <w:t xml:space="preserve">Tema de título (Suno, 90 s; variação B guardada) — aguardando avaliação</w:t>
             </w:r>
           </w:p>
         </w:tc>
@@ -36675,19 +36675,6 @@
       </w:pPr>
       <w:r>
         <w:t xml:space="preserve">Diretor: jogar e aprovar a Fase 2 (menu, loja, estalagem, missão do Gerd, Lyra, batalhas com a Sentinela).</w:t>
-      </w:r>
-    </w:p>
-    <w:p>
-      <w:pPr>
-        <w:pStyle w:val="ListParagraph"/>
-        <w:numPr>
-          <w:ilvl w:val="0"/>
-          <w:numId w:val="5"/>
-        </w:numPr>
-        <w:spacing w:after="60"/>
-      </w:pPr>
-      <w:r>
-        <w:t xml:space="preserve">Recarregar créditos da AceData e gerar o tema de título.</w:t>
       </w:r>
     </w:p>
     <w:p>

</xml_diff>

<commit_message>
Menus close with Esc/Start and X/B (Voltar row and key hint in options); battle themes A/B alternate; title uses theme B
Co-Authored-By: Claude Opus 5.5 <noreply@anthropic.com>
</commit_message>
<xml_diff>
--- a/docs/Planejamento_Projeto_RPG.docx
+++ b/docs/Planejamento_Projeto_RPG.docx
@@ -32045,7 +32045,7 @@
                 <w:sz w:val="19"/>
                 <w:szCs w:val="19"/>
               </w:rPr>
-              <w:t xml:space="preserve">assets/audio/music/bgm_battle_a.mp3</w:t>
+              <w:t xml:space="preserve">assets/audio/music/bgm_battle_a.mp3 + _b.mp3</w:t>
             </w:r>
           </w:p>
         </w:tc>
@@ -32135,7 +32135,7 @@
                 <w:sz w:val="19"/>
                 <w:szCs w:val="19"/>
               </w:rPr>
-              <w:t xml:space="preserve">◐ Em andamento</w:t>
+              <w:t xml:space="preserve">☑ Concluída</w:t>
             </w:r>
           </w:p>
         </w:tc>
@@ -32165,7 +32165,7 @@
                 <w:sz w:val="19"/>
                 <w:szCs w:val="19"/>
               </w:rPr>
-              <w:t xml:space="preserve">Tema de batalha (Suno, 90 s; variação B guardada) — aguardando avaliação</w:t>
+              <w:t xml:space="preserve">Temas de batalha (Suno, 90 s) — aprovados os dois; o jogo alterna A e B a cada batalha</w:t>
             </w:r>
           </w:p>
         </w:tc>
@@ -32415,7 +32415,7 @@
                 <w:sz w:val="19"/>
                 <w:szCs w:val="19"/>
               </w:rPr>
-              <w:t xml:space="preserve">assets/audio/music/bgm_title_a.mp3</w:t>
+              <w:t xml:space="preserve">assets/audio/music/bgm_title_b.mp3</w:t>
             </w:r>
           </w:p>
         </w:tc>
@@ -32505,7 +32505,7 @@
                 <w:sz w:val="19"/>
                 <w:szCs w:val="19"/>
               </w:rPr>
-              <w:t xml:space="preserve">◐ Em andamento</w:t>
+              <w:t xml:space="preserve">☑ Concluída</w:t>
             </w:r>
           </w:p>
         </w:tc>
@@ -32535,7 +32535,7 @@
                 <w:sz w:val="19"/>
                 <w:szCs w:val="19"/>
               </w:rPr>
-              <w:t xml:space="preserve">Tema de título (Suno, 90 s; variação B guardada) — aguardando avaliação</w:t>
+              <w:t xml:space="preserve">Tema de título (Suno, 90 s) — aprovada a variação B (A guardada)</w:t>
             </w:r>
           </w:p>
         </w:tc>

</xml_diff>

<commit_message>
Victory fanfare uses variant B
Co-Authored-By: Claude Opus 5.5 <noreply@anthropic.com>
</commit_message>
<xml_diff>
--- a/docs/Planejamento_Projeto_RPG.docx
+++ b/docs/Planejamento_Projeto_RPG.docx
@@ -32230,7 +32230,7 @@
                 <w:sz w:val="19"/>
                 <w:szCs w:val="19"/>
               </w:rPr>
-              <w:t xml:space="preserve">assets/audio/music/bgm_victory_a.mp3</w:t>
+              <w:t xml:space="preserve">assets/audio/music/bgm_victory_b.mp3</w:t>
             </w:r>
           </w:p>
         </w:tc>
@@ -32320,7 +32320,7 @@
                 <w:sz w:val="19"/>
                 <w:szCs w:val="19"/>
               </w:rPr>
-              <w:t xml:space="preserve">◐ Em andamento</w:t>
+              <w:t xml:space="preserve">☑ Concluída</w:t>
             </w:r>
           </w:p>
         </w:tc>
@@ -32350,7 +32350,7 @@
                 <w:sz w:val="19"/>
                 <w:szCs w:val="19"/>
               </w:rPr>
-              <w:t xml:space="preserve">Fanfarra de vitória (Suno, 30 s; variação B guardada) — aguardando avaliação</w:t>
+              <w:t xml:space="preserve">Fanfarra de vitória (Suno, 30 s) — aprovada a variação B (A guardada)</w:t>
             </w:r>
           </w:p>
         </w:tc>

</xml_diff>

<commit_message>
Phase 2 approved; Phase 3 start: prologue script draft (Roteiro_Prologo.docx), Vila Caldeira tileset and tiles.mjs slicer
Co-Authored-By: Claude Opus 5.5 <noreply@anthropic.com>
</commit_message>
<xml_diff>
--- a/docs/Planejamento_Projeto_RPG.docx
+++ b/docs/Planejamento_Projeto_RPG.docx
@@ -233,7 +233,7 @@
                 <w:sz w:val="19"/>
                 <w:szCs w:val="19"/>
               </w:rPr>
-              <w:t xml:space="preserve">2.0 — Fase 2 implementada (aguardando aprovação)</w:t>
+              <w:t xml:space="preserve">2.1 — Fase 2 aprovada; Fase 3 iniciada</w:t>
             </w:r>
           </w:p>
         </w:tc>
@@ -623,7 +623,7 @@
                 <w:sz w:val="19"/>
                 <w:szCs w:val="19"/>
               </w:rPr>
-              <w:t xml:space="preserve">Fase 2 — Sistemas centrais</w:t>
+              <w:t xml:space="preserve">Fase 3 — Vertical slice</w:t>
             </w:r>
           </w:p>
         </w:tc>
@@ -688,7 +688,7 @@
                 <w:sz w:val="19"/>
                 <w:szCs w:val="19"/>
               </w:rPr>
-              <w:t xml:space="preserve">Fases 0 e 1 concluídas (24–25/09/2026)</w:t>
+              <w:t xml:space="preserve">Fases 0, 1 e 2 concluídas (24–25/09/2026)</w:t>
             </w:r>
           </w:p>
         </w:tc>
@@ -22332,7 +22332,7 @@
                 <w:sz w:val="19"/>
                 <w:szCs w:val="19"/>
               </w:rPr>
-              <w:t xml:space="preserve">☐ Pendente</w:t>
+              <w:t xml:space="preserve">◐ Em andamento</w:t>
             </w:r>
           </w:p>
         </w:tc>
@@ -22357,6 +22357,13 @@
             <w:pPr>
               <w:keepNext/>
             </w:pPr>
+            <w:r>
+              <w:rPr>
+                <w:sz w:val="19"/>
+                <w:szCs w:val="19"/>
+              </w:rPr>
+              <w:t xml:space="preserve">Rascunho v0.1 em docs/Roteiro_Prologo.docx — aguardando aprovação</w:t>
+            </w:r>
           </w:p>
         </w:tc>
       </w:tr>
@@ -22628,7 +22635,7 @@
                 <w:sz w:val="19"/>
                 <w:szCs w:val="19"/>
               </w:rPr>
-              <w:t xml:space="preserve">☐ Pendente</w:t>
+              <w:t xml:space="preserve">◐ Em andamento</w:t>
             </w:r>
           </w:p>
         </w:tc>
@@ -22653,6 +22660,13 @@
             <w:pPr>
               <w:keepNext/>
             </w:pPr>
+            <w:r>
+              <w:rPr>
+                <w:sz w:val="19"/>
+                <w:szCs w:val="19"/>
+              </w:rPr>
+              <w:t xml:space="preserve">Vila Caldeira v1 (48 tiles, ferramenta tiles.mjs); Ferro-Velho a fazer</w:t>
+            </w:r>
           </w:p>
         </w:tc>
       </w:tr>
@@ -32540,6 +32554,191 @@
           </w:p>
         </w:tc>
       </w:tr>
+      <w:tr>
+        <w:trPr>
+          <w:cantSplit/>
+        </w:trPr>
+        <w:tc>
+          <w:tcPr>
+            <w:tcW w:type="dxa" w:w="867"/>
+            <w:tcBorders>
+              <w:top w:val="single" w:color="B7C3D0" w:sz="4"/>
+              <w:left w:val="single" w:color="B7C3D0" w:sz="4"/>
+              <w:bottom w:val="single" w:color="B7C3D0" w:sz="4"/>
+              <w:right w:val="single" w:color="B7C3D0" w:sz="4"/>
+            </w:tcBorders>
+            <w:tcMar>
+              <w:top w:type="dxa" w:w="60"/>
+              <w:left w:type="dxa" w:w="100"/>
+              <w:bottom w:type="dxa" w:w="60"/>
+              <w:right w:type="dxa" w:w="100"/>
+            </w:tcMar>
+            <w:vAlign w:val="center"/>
+          </w:tcPr>
+          <w:p>
+            <w:pPr>
+              <w:keepNext w:val="false"/>
+            </w:pPr>
+            <w:r>
+              <w:rPr>
+                <w:sz w:val="19"/>
+                <w:szCs w:val="19"/>
+              </w:rPr>
+              <w:t xml:space="preserve">A-025</w:t>
+            </w:r>
+          </w:p>
+        </w:tc>
+        <w:tc>
+          <w:tcPr>
+            <w:tcW w:type="dxa" w:w="2891"/>
+            <w:tcBorders>
+              <w:top w:val="single" w:color="B7C3D0" w:sz="4"/>
+              <w:left w:val="single" w:color="B7C3D0" w:sz="4"/>
+              <w:bottom w:val="single" w:color="B7C3D0" w:sz="4"/>
+              <w:right w:val="single" w:color="B7C3D0" w:sz="4"/>
+            </w:tcBorders>
+            <w:tcMar>
+              <w:top w:type="dxa" w:w="60"/>
+              <w:left w:type="dxa" w:w="100"/>
+              <w:bottom w:type="dxa" w:w="60"/>
+              <w:right w:type="dxa" w:w="100"/>
+            </w:tcMar>
+            <w:vAlign w:val="center"/>
+          </w:tcPr>
+          <w:p>
+            <w:pPr>
+              <w:keepNext w:val="false"/>
+            </w:pPr>
+            <w:r>
+              <w:rPr>
+                <w:sz w:val="19"/>
+                <w:szCs w:val="19"/>
+              </w:rPr>
+              <w:t xml:space="preserve">assets/tilesets/til_vila_caldeira.png</w:t>
+            </w:r>
+          </w:p>
+        </w:tc>
+        <w:tc>
+          <w:tcPr>
+            <w:tcW w:type="dxa" w:w="1349"/>
+            <w:tcBorders>
+              <w:top w:val="single" w:color="B7C3D0" w:sz="4"/>
+              <w:left w:val="single" w:color="B7C3D0" w:sz="4"/>
+              <w:bottom w:val="single" w:color="B7C3D0" w:sz="4"/>
+              <w:right w:val="single" w:color="B7C3D0" w:sz="4"/>
+            </w:tcBorders>
+            <w:tcMar>
+              <w:top w:type="dxa" w:w="60"/>
+              <w:left w:type="dxa" w:w="100"/>
+              <w:bottom w:type="dxa" w:w="60"/>
+              <w:right w:type="dxa" w:w="100"/>
+            </w:tcMar>
+            <w:vAlign w:val="center"/>
+          </w:tcPr>
+          <w:p>
+            <w:pPr>
+              <w:keepNext w:val="false"/>
+            </w:pPr>
+            <w:r>
+              <w:rPr>
+                <w:sz w:val="19"/>
+                <w:szCs w:val="19"/>
+              </w:rPr>
+              <w:t xml:space="preserve">Tileset</w:t>
+            </w:r>
+          </w:p>
+        </w:tc>
+        <w:tc>
+          <w:tcPr>
+            <w:tcW w:type="dxa" w:w="867"/>
+            <w:tcBorders>
+              <w:top w:val="single" w:color="B7C3D0" w:sz="4"/>
+              <w:left w:val="single" w:color="B7C3D0" w:sz="4"/>
+              <w:bottom w:val="single" w:color="B7C3D0" w:sz="4"/>
+              <w:right w:val="single" w:color="B7C3D0" w:sz="4"/>
+            </w:tcBorders>
+            <w:tcMar>
+              <w:top w:type="dxa" w:w="60"/>
+              <w:left w:type="dxa" w:w="100"/>
+              <w:bottom w:type="dxa" w:w="60"/>
+              <w:right w:type="dxa" w:w="100"/>
+            </w:tcMar>
+            <w:vAlign w:val="center"/>
+          </w:tcPr>
+          <w:p>
+            <w:pPr>
+              <w:keepNext w:val="false"/>
+            </w:pPr>
+            <w:r>
+              <w:rPr>
+                <w:sz w:val="19"/>
+                <w:szCs w:val="19"/>
+              </w:rPr>
+              <w:t xml:space="preserve">F3</w:t>
+            </w:r>
+          </w:p>
+        </w:tc>
+        <w:tc>
+          <w:tcPr>
+            <w:tcW w:type="dxa" w:w="1446"/>
+            <w:tcBorders>
+              <w:top w:val="single" w:color="B7C3D0" w:sz="4"/>
+              <w:left w:val="single" w:color="B7C3D0" w:sz="4"/>
+              <w:bottom w:val="single" w:color="B7C3D0" w:sz="4"/>
+              <w:right w:val="single" w:color="B7C3D0" w:sz="4"/>
+            </w:tcBorders>
+            <w:tcMar>
+              <w:top w:type="dxa" w:w="60"/>
+              <w:left w:type="dxa" w:w="100"/>
+              <w:bottom w:type="dxa" w:w="60"/>
+              <w:right w:type="dxa" w:w="100"/>
+            </w:tcMar>
+            <w:vAlign w:val="center"/>
+          </w:tcPr>
+          <w:p>
+            <w:pPr>
+              <w:keepNext w:val="false"/>
+            </w:pPr>
+            <w:r>
+              <w:rPr>
+                <w:sz w:val="19"/>
+                <w:szCs w:val="19"/>
+              </w:rPr>
+              <w:t xml:space="preserve">◐ Em andamento</w:t>
+            </w:r>
+          </w:p>
+        </w:tc>
+        <w:tc>
+          <w:tcPr>
+            <w:tcW w:type="dxa" w:w="2218"/>
+            <w:tcBorders>
+              <w:top w:val="single" w:color="B7C3D0" w:sz="4"/>
+              <w:left w:val="single" w:color="B7C3D0" w:sz="4"/>
+              <w:bottom w:val="single" w:color="B7C3D0" w:sz="4"/>
+              <w:right w:val="single" w:color="B7C3D0" w:sz="4"/>
+            </w:tcBorders>
+            <w:tcMar>
+              <w:top w:type="dxa" w:w="60"/>
+              <w:left w:type="dxa" w:w="100"/>
+              <w:bottom w:type="dxa" w:w="60"/>
+              <w:right w:type="dxa" w:w="100"/>
+            </w:tcMar>
+            <w:vAlign w:val="center"/>
+          </w:tcPr>
+          <w:p>
+            <w:pPr>
+              <w:keepNext w:val="false"/>
+            </w:pPr>
+            <w:r>
+              <w:rPr>
+                <w:sz w:val="19"/>
+                <w:szCs w:val="19"/>
+              </w:rPr>
+              <w:t xml:space="preserve">Vila Caldeira: 8×6 tiles 16×16 (chão, bordas, paredes, telhados, canos, objetos); gerado de _source/til_vila_caldeira_raw_v1.png</w:t>
+            </w:r>
+          </w:p>
+        </w:tc>
+      </w:tr>
     </w:tbl>
     <w:p>
       <w:pPr>
@@ -36578,6 +36777,101 @@
           </w:tcPr>
           <w:p>
             <w:pPr>
+              <w:keepNext/>
+            </w:pPr>
+            <w:r>
+              <w:rPr>
+                <w:sz w:val="19"/>
+                <w:szCs w:val="19"/>
+              </w:rPr>
+              <w:t xml:space="preserve">2.0</w:t>
+            </w:r>
+          </w:p>
+        </w:tc>
+        <w:tc>
+          <w:tcPr>
+            <w:tcW w:type="dxa" w:w="1735"/>
+            <w:tcBorders>
+              <w:top w:val="single" w:color="B7C3D0" w:sz="4"/>
+              <w:left w:val="single" w:color="B7C3D0" w:sz="4"/>
+              <w:bottom w:val="single" w:color="B7C3D0" w:sz="4"/>
+              <w:right w:val="single" w:color="B7C3D0" w:sz="4"/>
+            </w:tcBorders>
+            <w:tcMar>
+              <w:top w:type="dxa" w:w="60"/>
+              <w:left w:type="dxa" w:w="100"/>
+              <w:bottom w:type="dxa" w:w="60"/>
+              <w:right w:type="dxa" w:w="100"/>
+            </w:tcMar>
+            <w:vAlign w:val="center"/>
+          </w:tcPr>
+          <w:p>
+            <w:pPr>
+              <w:keepNext/>
+            </w:pPr>
+            <w:r>
+              <w:rPr>
+                <w:sz w:val="19"/>
+                <w:szCs w:val="19"/>
+              </w:rPr>
+              <w:t xml:space="preserve">24/09/2026</w:t>
+            </w:r>
+          </w:p>
+        </w:tc>
+        <w:tc>
+          <w:tcPr>
+            <w:tcW w:type="dxa" w:w="6746"/>
+            <w:tcBorders>
+              <w:top w:val="single" w:color="B7C3D0" w:sz="4"/>
+              <w:left w:val="single" w:color="B7C3D0" w:sz="4"/>
+              <w:bottom w:val="single" w:color="B7C3D0" w:sz="4"/>
+              <w:right w:val="single" w:color="B7C3D0" w:sz="4"/>
+            </w:tcBorders>
+            <w:tcMar>
+              <w:top w:type="dxa" w:w="60"/>
+              <w:left w:type="dxa" w:w="100"/>
+              <w:bottom w:type="dxa" w:w="60"/>
+              <w:right w:type="dxa" w:w="100"/>
+            </w:tcMar>
+            <w:vAlign w:val="center"/>
+          </w:tcPr>
+          <w:p>
+            <w:pPr>
+              <w:keepNext/>
+            </w:pPr>
+            <w:r>
+              <w:rPr>
+                <w:sz w:val="19"/>
+                <w:szCs w:val="19"/>
+              </w:rPr>
+              <w:t xml:space="preserve">Fase 2 implementada em 4 blocos. A: GameState, níveis/XP, salvar. B: combate completo (status, itens, Barra de Éter, especiais, timing por personagem, IA por regras, troca, técnicas combinadas, fuga, iniciativa). C: equipamento, gemas, árvores. D: menu principal, loja, estalagem, diálogo com escolhas/afinidade, missões, cutscenes, opções, idioma, tela de título (155 testes).</w:t>
+            </w:r>
+          </w:p>
+        </w:tc>
+      </w:tr>
+      <w:tr>
+        <w:trPr>
+          <w:cantSplit/>
+        </w:trPr>
+        <w:tc>
+          <w:tcPr>
+            <w:tcW w:type="dxa" w:w="1157"/>
+            <w:tcBorders>
+              <w:top w:val="single" w:color="B7C3D0" w:sz="4"/>
+              <w:left w:val="single" w:color="B7C3D0" w:sz="4"/>
+              <w:bottom w:val="single" w:color="B7C3D0" w:sz="4"/>
+              <w:right w:val="single" w:color="B7C3D0" w:sz="4"/>
+            </w:tcBorders>
+            <w:tcMar>
+              <w:top w:type="dxa" w:w="60"/>
+              <w:left w:type="dxa" w:w="100"/>
+              <w:bottom w:type="dxa" w:w="60"/>
+              <w:right w:type="dxa" w:w="100"/>
+            </w:tcMar>
+            <w:vAlign w:val="center"/>
+          </w:tcPr>
+          <w:p>
+            <w:pPr>
               <w:keepNext w:val="false"/>
             </w:pPr>
             <w:r>
@@ -36585,7 +36879,7 @@
                 <w:sz w:val="19"/>
                 <w:szCs w:val="19"/>
               </w:rPr>
-              <w:t xml:space="preserve">2.0</w:t>
+              <w:t xml:space="preserve">2.1</w:t>
             </w:r>
           </w:p>
         </w:tc>
@@ -36645,7 +36939,7 @@
                 <w:sz w:val="19"/>
                 <w:szCs w:val="19"/>
               </w:rPr>
-              <w:t xml:space="preserve">Fase 2 implementada em 4 blocos, aguardando aprovação do Diretor. A: GameState, níveis/XP, salvar. B: combate completo (status, itens, Barra de Éter, especiais, timing por personagem, IA por regras, troca, técnicas combinadas, fuga, iniciativa). C: equipamento, gemas, árvores. D: menu principal, loja, estalagem, diálogo com escolhas/afinidade, missões, cutscenes, opções, idioma, tela de título (155 testes).</w:t>
+              <w:t xml:space="preserve">Fase 2 aprovada pelo Diretor (músicas: título B, vitória B, batalha A e B alternadas; menus fecham com Esc/Start e X/B). Fase 3 iniciada: roteiro do prólogo v0.1 (docs/Roteiro_Prologo.docx) e tileset da Vila Caldeira (158 testes).</w:t>
             </w:r>
           </w:p>
         </w:tc>
@@ -36674,7 +36968,7 @@
         <w:spacing w:after="60"/>
       </w:pPr>
       <w:r>
-        <w:t xml:space="preserve">Diretor: jogar e aprovar a Fase 2 (menu, loja, estalagem, missão do Gerd, Lyra, batalhas com a Sentinela).</w:t>
+        <w:t xml:space="preserve">Diretor: ler e aprovar o Roteiro do Prólogo v0.1 (capítulo 9 lista as decisões: Gerd convidado, chefe Triturador, nomes novos).</w:t>
       </w:r>
     </w:p>
     <w:p>
@@ -36687,7 +36981,7 @@
         <w:spacing w:after="60"/>
       </w:pPr>
       <w:r>
-        <w:t xml:space="preserve">Fase 3 (vertical slice): roteiro do prólogo, tilesets reais pelo Codex, Ferro-Velho do Sul, primeiro chefe.</w:t>
+        <w:t xml:space="preserve">Claude: tileset do Ferro-Velho, mapas reais da vila e do ferro-velho, novos inimigos, chefe, cutscenes do prólogo; músicas novas (Ferro-Velho, Chefe, Império, Adeus) após o roteiro aprovado.</w:t>
       </w:r>
     </w:p>
     <w:sectPr>

</xml_diff>

<commit_message>
Prologue art: Triturador (3 parts), General Voss (map + battle), villagers sheet (Pip, Olavo, Ilse, Anselmo, soldier, cat); story integration tests; docs
Co-Authored-By: Claude Opus 5.5 <noreply@anthropic.com>
</commit_message>
<xml_diff>
--- a/docs/Planejamento_Projeto_RPG.docx
+++ b/docs/Planejamento_Projeto_RPG.docx
@@ -233,7 +233,7 @@
                 <w:sz w:val="19"/>
                 <w:szCs w:val="19"/>
               </w:rPr>
-              <w:t xml:space="preserve">2.1 — Fase 2 aprovada; Fase 3 iniciada</w:t>
+              <w:t xml:space="preserve">2.2 — Fase 3: prólogo jogável (aguardando teste do Diretor)</w:t>
             </w:r>
           </w:p>
         </w:tc>
@@ -22332,7 +22332,7 @@
                 <w:sz w:val="19"/>
                 <w:szCs w:val="19"/>
               </w:rPr>
-              <w:t xml:space="preserve">◐ Em andamento</w:t>
+              <w:t xml:space="preserve">☑ Concluída</w:t>
             </w:r>
           </w:p>
         </w:tc>
@@ -22362,7 +22362,7 @@
                 <w:sz w:val="19"/>
                 <w:szCs w:val="19"/>
               </w:rPr>
-              <w:t xml:space="preserve">Rascunho v0.1 em docs/Roteiro_Prologo.docx — aguardando aprovação</w:t>
+              <w:t xml:space="preserve">docs/Roteiro_Prologo.docx v0.1 aprovado</w:t>
             </w:r>
           </w:p>
         </w:tc>
@@ -22487,7 +22487,7 @@
                 <w:sz w:val="19"/>
                 <w:szCs w:val="19"/>
               </w:rPr>
-              <w:t xml:space="preserve">☐ Pendente</w:t>
+              <w:t xml:space="preserve">◐ Em andamento</w:t>
             </w:r>
           </w:p>
         </w:tc>
@@ -22512,6 +22512,13 @@
             <w:pPr>
               <w:keepNext/>
             </w:pPr>
+            <w:r>
+              <w:rPr>
+                <w:sz w:val="19"/>
+                <w:szCs w:val="19"/>
+              </w:rPr>
+              <w:t xml:space="preserve">Kael, Eco e Gerd com folhas de referência; faltam poses de batalha dedicadas (ataque, dano, KO)</w:t>
+            </w:r>
           </w:p>
         </w:tc>
       </w:tr>
@@ -22635,7 +22642,7 @@
                 <w:sz w:val="19"/>
                 <w:szCs w:val="19"/>
               </w:rPr>
-              <w:t xml:space="preserve">◐ Em andamento</w:t>
+              <w:t xml:space="preserve">☑ Concluída</w:t>
             </w:r>
           </w:p>
         </w:tc>
@@ -22665,7 +22672,7 @@
                 <w:sz w:val="19"/>
                 <w:szCs w:val="19"/>
               </w:rPr>
-              <w:t xml:space="preserve">Vila Caldeira v1 (48 tiles, ferramenta tiles.mjs); Ferro-Velho a fazer</w:t>
+              <w:t xml:space="preserve">Vila Caldeira e Ferro-Velho do Sul (48 tiles cada, tiles.mjs); 10 mapas gerados por build_maps.gd</w:t>
             </w:r>
           </w:p>
         </w:tc>
@@ -22790,7 +22797,7 @@
                 <w:sz w:val="19"/>
                 <w:szCs w:val="19"/>
               </w:rPr>
-              <w:t xml:space="preserve">☐ Pendente</w:t>
+              <w:t xml:space="preserve">☑ Concluída</w:t>
             </w:r>
           </w:p>
         </w:tc>
@@ -22815,6 +22822,13 @@
             <w:pPr>
               <w:keepNext/>
             </w:pPr>
+            <w:r>
+              <w:rPr>
+                <w:sz w:val="19"/>
+                <w:szCs w:val="19"/>
+              </w:rPr>
+              <w:t xml:space="preserve">7 comuns (Slime, Rato, Corvo ladrão, Aranha, Sentinela, Lâmpada, Soldado), chefe Triturador em 3 partes, luta roteirizada com Voss</w:t>
+            </w:r>
           </w:p>
         </w:tc>
       </w:tr>
@@ -23234,7 +23248,7 @@
                 <w:sz w:val="19"/>
                 <w:szCs w:val="19"/>
               </w:rPr>
-              <w:t xml:space="preserve">☐ Pendente</w:t>
+              <w:t xml:space="preserve">◐ Em andamento</w:t>
             </w:r>
           </w:p>
         </w:tc>
@@ -23259,6 +23273,13 @@
             <w:pPr>
               <w:keepNext/>
             </w:pPr>
+            <w:r>
+              <w:rPr>
+                <w:sz w:val="19"/>
+                <w:szCs w:val="19"/>
+              </w:rPr>
+              <w:t xml:space="preserve">Músicas prontas (Ferro-Velho, Chefe, Império, Adeus; A em uso, B guardada); SFX a definir</w:t>
+            </w:r>
           </w:p>
         </w:tc>
       </w:tr>
@@ -23382,7 +23403,7 @@
                 <w:sz w:val="19"/>
                 <w:szCs w:val="19"/>
               </w:rPr>
-              <w:t xml:space="preserve">☐ Pendente</w:t>
+              <w:t xml:space="preserve">☑ Concluída</w:t>
             </w:r>
           </w:p>
         </w:tc>
@@ -23407,6 +23428,13 @@
             <w:pPr>
               <w:keepNext/>
             </w:pPr>
+            <w:r>
+              <w:rPr>
+                <w:sz w:val="19"/>
+                <w:szCs w:val="19"/>
+              </w:rPr>
+              <w:t xml:space="preserve">12 cenas do roteiro (manhã, entrega, estrada, ferro-velho, despertar de Eco, chefe, jantar com escolha, Voss, despedida, fuga)</w:t>
+            </w:r>
           </w:p>
         </w:tc>
       </w:tr>
@@ -32704,6 +32732,931 @@
                 <w:sz w:val="19"/>
                 <w:szCs w:val="19"/>
               </w:rPr>
+              <w:t xml:space="preserve">☑ Concluída</w:t>
+            </w:r>
+          </w:p>
+        </w:tc>
+        <w:tc>
+          <w:tcPr>
+            <w:tcW w:type="dxa" w:w="2218"/>
+            <w:tcBorders>
+              <w:top w:val="single" w:color="B7C3D0" w:sz="4"/>
+              <w:left w:val="single" w:color="B7C3D0" w:sz="4"/>
+              <w:bottom w:val="single" w:color="B7C3D0" w:sz="4"/>
+              <w:right w:val="single" w:color="B7C3D0" w:sz="4"/>
+            </w:tcBorders>
+            <w:tcMar>
+              <w:top w:type="dxa" w:w="60"/>
+              <w:left w:type="dxa" w:w="100"/>
+              <w:bottom w:type="dxa" w:w="60"/>
+              <w:right w:type="dxa" w:w="100"/>
+            </w:tcMar>
+            <w:vAlign w:val="center"/>
+          </w:tcPr>
+          <w:p>
+            <w:pPr>
+              <w:keepNext w:val="false"/>
+            </w:pPr>
+            <w:r>
+              <w:rPr>
+                <w:sz w:val="19"/>
+                <w:szCs w:val="19"/>
+              </w:rPr>
+              <w:t xml:space="preserve">Vila Caldeira: 8×6 tiles 16×16 (chão, bordas, paredes, telhados, canos, objetos); gerado de _source/til_vila_caldeira_raw_v1.png</w:t>
+            </w:r>
+          </w:p>
+        </w:tc>
+      </w:tr>
+      <w:tr>
+        <w:trPr>
+          <w:cantSplit/>
+        </w:trPr>
+        <w:tc>
+          <w:tcPr>
+            <w:tcW w:type="dxa" w:w="867"/>
+            <w:tcBorders>
+              <w:top w:val="single" w:color="B7C3D0" w:sz="4"/>
+              <w:left w:val="single" w:color="B7C3D0" w:sz="4"/>
+              <w:bottom w:val="single" w:color="B7C3D0" w:sz="4"/>
+              <w:right w:val="single" w:color="B7C3D0" w:sz="4"/>
+            </w:tcBorders>
+            <w:tcMar>
+              <w:top w:type="dxa" w:w="60"/>
+              <w:left w:type="dxa" w:w="100"/>
+              <w:bottom w:type="dxa" w:w="60"/>
+              <w:right w:type="dxa" w:w="100"/>
+            </w:tcMar>
+            <w:vAlign w:val="center"/>
+          </w:tcPr>
+          <w:p>
+            <w:pPr>
+              <w:keepNext w:val="false"/>
+            </w:pPr>
+            <w:r>
+              <w:rPr>
+                <w:sz w:val="19"/>
+                <w:szCs w:val="19"/>
+              </w:rPr>
+              <w:t xml:space="preserve">A-026</w:t>
+            </w:r>
+          </w:p>
+        </w:tc>
+        <w:tc>
+          <w:tcPr>
+            <w:tcW w:type="dxa" w:w="2891"/>
+            <w:tcBorders>
+              <w:top w:val="single" w:color="B7C3D0" w:sz="4"/>
+              <w:left w:val="single" w:color="B7C3D0" w:sz="4"/>
+              <w:bottom w:val="single" w:color="B7C3D0" w:sz="4"/>
+              <w:right w:val="single" w:color="B7C3D0" w:sz="4"/>
+            </w:tcBorders>
+            <w:tcMar>
+              <w:top w:type="dxa" w:w="60"/>
+              <w:left w:type="dxa" w:w="100"/>
+              <w:bottom w:type="dxa" w:w="60"/>
+              <w:right w:type="dxa" w:w="100"/>
+            </w:tcMar>
+            <w:vAlign w:val="center"/>
+          </w:tcPr>
+          <w:p>
+            <w:pPr>
+              <w:keepNext w:val="false"/>
+            </w:pPr>
+            <w:r>
+              <w:rPr>
+                <w:sz w:val="19"/>
+                <w:szCs w:val="19"/>
+              </w:rPr>
+              <w:t xml:space="preserve">assets/tilesets/til_junkyard.png</w:t>
+            </w:r>
+          </w:p>
+        </w:tc>
+        <w:tc>
+          <w:tcPr>
+            <w:tcW w:type="dxa" w:w="1349"/>
+            <w:tcBorders>
+              <w:top w:val="single" w:color="B7C3D0" w:sz="4"/>
+              <w:left w:val="single" w:color="B7C3D0" w:sz="4"/>
+              <w:bottom w:val="single" w:color="B7C3D0" w:sz="4"/>
+              <w:right w:val="single" w:color="B7C3D0" w:sz="4"/>
+            </w:tcBorders>
+            <w:tcMar>
+              <w:top w:type="dxa" w:w="60"/>
+              <w:left w:type="dxa" w:w="100"/>
+              <w:bottom w:type="dxa" w:w="60"/>
+              <w:right w:type="dxa" w:w="100"/>
+            </w:tcMar>
+            <w:vAlign w:val="center"/>
+          </w:tcPr>
+          <w:p>
+            <w:pPr>
+              <w:keepNext w:val="false"/>
+            </w:pPr>
+            <w:r>
+              <w:rPr>
+                <w:sz w:val="19"/>
+                <w:szCs w:val="19"/>
+              </w:rPr>
+              <w:t xml:space="preserve">Tileset</w:t>
+            </w:r>
+          </w:p>
+        </w:tc>
+        <w:tc>
+          <w:tcPr>
+            <w:tcW w:type="dxa" w:w="867"/>
+            <w:tcBorders>
+              <w:top w:val="single" w:color="B7C3D0" w:sz="4"/>
+              <w:left w:val="single" w:color="B7C3D0" w:sz="4"/>
+              <w:bottom w:val="single" w:color="B7C3D0" w:sz="4"/>
+              <w:right w:val="single" w:color="B7C3D0" w:sz="4"/>
+            </w:tcBorders>
+            <w:tcMar>
+              <w:top w:type="dxa" w:w="60"/>
+              <w:left w:type="dxa" w:w="100"/>
+              <w:bottom w:type="dxa" w:w="60"/>
+              <w:right w:type="dxa" w:w="100"/>
+            </w:tcMar>
+            <w:vAlign w:val="center"/>
+          </w:tcPr>
+          <w:p>
+            <w:pPr>
+              <w:keepNext w:val="false"/>
+            </w:pPr>
+            <w:r>
+              <w:rPr>
+                <w:sz w:val="19"/>
+                <w:szCs w:val="19"/>
+              </w:rPr>
+              <w:t xml:space="preserve">F3</w:t>
+            </w:r>
+          </w:p>
+        </w:tc>
+        <w:tc>
+          <w:tcPr>
+            <w:tcW w:type="dxa" w:w="1446"/>
+            <w:tcBorders>
+              <w:top w:val="single" w:color="B7C3D0" w:sz="4"/>
+              <w:left w:val="single" w:color="B7C3D0" w:sz="4"/>
+              <w:bottom w:val="single" w:color="B7C3D0" w:sz="4"/>
+              <w:right w:val="single" w:color="B7C3D0" w:sz="4"/>
+            </w:tcBorders>
+            <w:tcMar>
+              <w:top w:type="dxa" w:w="60"/>
+              <w:left w:type="dxa" w:w="100"/>
+              <w:bottom w:type="dxa" w:w="60"/>
+              <w:right w:type="dxa" w:w="100"/>
+            </w:tcMar>
+            <w:vAlign w:val="center"/>
+          </w:tcPr>
+          <w:p>
+            <w:pPr>
+              <w:keepNext w:val="false"/>
+            </w:pPr>
+            <w:r>
+              <w:rPr>
+                <w:sz w:val="19"/>
+                <w:szCs w:val="19"/>
+              </w:rPr>
+              <w:t xml:space="preserve">☑ Concluída</w:t>
+            </w:r>
+          </w:p>
+        </w:tc>
+        <w:tc>
+          <w:tcPr>
+            <w:tcW w:type="dxa" w:w="2218"/>
+            <w:tcBorders>
+              <w:top w:val="single" w:color="B7C3D0" w:sz="4"/>
+              <w:left w:val="single" w:color="B7C3D0" w:sz="4"/>
+              <w:bottom w:val="single" w:color="B7C3D0" w:sz="4"/>
+              <w:right w:val="single" w:color="B7C3D0" w:sz="4"/>
+            </w:tcBorders>
+            <w:tcMar>
+              <w:top w:type="dxa" w:w="60"/>
+              <w:left w:type="dxa" w:w="100"/>
+              <w:bottom w:type="dxa" w:w="60"/>
+              <w:right w:type="dxa" w:w="100"/>
+            </w:tcMar>
+            <w:vAlign w:val="center"/>
+          </w:tcPr>
+          <w:p>
+            <w:pPr>
+              <w:keepNext w:val="false"/>
+            </w:pPr>
+            <w:r>
+              <w:rPr>
+                <w:sz w:val="19"/>
+                <w:szCs w:val="19"/>
+              </w:rPr>
+              <w:t xml:space="preserve">Ferro-Velho do Sul: sucata, esteira, engrenagens gigantes, ruína aetheliana, baús, alavanca, caldeira</w:t>
+            </w:r>
+          </w:p>
+        </w:tc>
+      </w:tr>
+      <w:tr>
+        <w:trPr>
+          <w:cantSplit/>
+        </w:trPr>
+        <w:tc>
+          <w:tcPr>
+            <w:tcW w:type="dxa" w:w="867"/>
+            <w:tcBorders>
+              <w:top w:val="single" w:color="B7C3D0" w:sz="4"/>
+              <w:left w:val="single" w:color="B7C3D0" w:sz="4"/>
+              <w:bottom w:val="single" w:color="B7C3D0" w:sz="4"/>
+              <w:right w:val="single" w:color="B7C3D0" w:sz="4"/>
+            </w:tcBorders>
+            <w:tcMar>
+              <w:top w:type="dxa" w:w="60"/>
+              <w:left w:type="dxa" w:w="100"/>
+              <w:bottom w:type="dxa" w:w="60"/>
+              <w:right w:type="dxa" w:w="100"/>
+            </w:tcMar>
+            <w:vAlign w:val="center"/>
+          </w:tcPr>
+          <w:p>
+            <w:pPr>
+              <w:keepNext w:val="false"/>
+            </w:pPr>
+            <w:r>
+              <w:rPr>
+                <w:sz w:val="19"/>
+                <w:szCs w:val="19"/>
+              </w:rPr>
+              <w:t xml:space="preserve">A-027</w:t>
+            </w:r>
+          </w:p>
+        </w:tc>
+        <w:tc>
+          <w:tcPr>
+            <w:tcW w:type="dxa" w:w="2891"/>
+            <w:tcBorders>
+              <w:top w:val="single" w:color="B7C3D0" w:sz="4"/>
+              <w:left w:val="single" w:color="B7C3D0" w:sz="4"/>
+              <w:bottom w:val="single" w:color="B7C3D0" w:sz="4"/>
+              <w:right w:val="single" w:color="B7C3D0" w:sz="4"/>
+            </w:tcBorders>
+            <w:tcMar>
+              <w:top w:type="dxa" w:w="60"/>
+              <w:left w:type="dxa" w:w="100"/>
+              <w:bottom w:type="dxa" w:w="60"/>
+              <w:right w:type="dxa" w:w="100"/>
+            </w:tcMar>
+            <w:vAlign w:val="center"/>
+          </w:tcPr>
+          <w:p>
+            <w:pPr>
+              <w:keepNext w:val="false"/>
+            </w:pPr>
+            <w:r>
+              <w:rPr>
+                <w:sz w:val="19"/>
+                <w:szCs w:val="19"/>
+              </w:rPr>
+              <w:t xml:space="preserve">assets/sprites/enemies/enm_gear_rat / scrap_crow / bolt_spider / wander_lamp</w:t>
+            </w:r>
+          </w:p>
+        </w:tc>
+        <w:tc>
+          <w:tcPr>
+            <w:tcW w:type="dxa" w:w="1349"/>
+            <w:tcBorders>
+              <w:top w:val="single" w:color="B7C3D0" w:sz="4"/>
+              <w:left w:val="single" w:color="B7C3D0" w:sz="4"/>
+              <w:bottom w:val="single" w:color="B7C3D0" w:sz="4"/>
+              <w:right w:val="single" w:color="B7C3D0" w:sz="4"/>
+            </w:tcBorders>
+            <w:tcMar>
+              <w:top w:type="dxa" w:w="60"/>
+              <w:left w:type="dxa" w:w="100"/>
+              <w:bottom w:type="dxa" w:w="60"/>
+              <w:right w:type="dxa" w:w="100"/>
+            </w:tcMar>
+            <w:vAlign w:val="center"/>
+          </w:tcPr>
+          <w:p>
+            <w:pPr>
+              <w:keepNext w:val="false"/>
+            </w:pPr>
+            <w:r>
+              <w:rPr>
+                <w:sz w:val="19"/>
+                <w:szCs w:val="19"/>
+              </w:rPr>
+              <w:t xml:space="preserve">Sprite</w:t>
+            </w:r>
+          </w:p>
+        </w:tc>
+        <w:tc>
+          <w:tcPr>
+            <w:tcW w:type="dxa" w:w="867"/>
+            <w:tcBorders>
+              <w:top w:val="single" w:color="B7C3D0" w:sz="4"/>
+              <w:left w:val="single" w:color="B7C3D0" w:sz="4"/>
+              <w:bottom w:val="single" w:color="B7C3D0" w:sz="4"/>
+              <w:right w:val="single" w:color="B7C3D0" w:sz="4"/>
+            </w:tcBorders>
+            <w:tcMar>
+              <w:top w:type="dxa" w:w="60"/>
+              <w:left w:type="dxa" w:w="100"/>
+              <w:bottom w:type="dxa" w:w="60"/>
+              <w:right w:type="dxa" w:w="100"/>
+            </w:tcMar>
+            <w:vAlign w:val="center"/>
+          </w:tcPr>
+          <w:p>
+            <w:pPr>
+              <w:keepNext w:val="false"/>
+            </w:pPr>
+            <w:r>
+              <w:rPr>
+                <w:sz w:val="19"/>
+                <w:szCs w:val="19"/>
+              </w:rPr>
+              <w:t xml:space="preserve">F3</w:t>
+            </w:r>
+          </w:p>
+        </w:tc>
+        <w:tc>
+          <w:tcPr>
+            <w:tcW w:type="dxa" w:w="1446"/>
+            <w:tcBorders>
+              <w:top w:val="single" w:color="B7C3D0" w:sz="4"/>
+              <w:left w:val="single" w:color="B7C3D0" w:sz="4"/>
+              <w:bottom w:val="single" w:color="B7C3D0" w:sz="4"/>
+              <w:right w:val="single" w:color="B7C3D0" w:sz="4"/>
+            </w:tcBorders>
+            <w:tcMar>
+              <w:top w:type="dxa" w:w="60"/>
+              <w:left w:type="dxa" w:w="100"/>
+              <w:bottom w:type="dxa" w:w="60"/>
+              <w:right w:type="dxa" w:w="100"/>
+            </w:tcMar>
+            <w:vAlign w:val="center"/>
+          </w:tcPr>
+          <w:p>
+            <w:pPr>
+              <w:keepNext w:val="false"/>
+            </w:pPr>
+            <w:r>
+              <w:rPr>
+                <w:sz w:val="19"/>
+                <w:szCs w:val="19"/>
+              </w:rPr>
+              <w:t xml:space="preserve">☑ Concluída</w:t>
+            </w:r>
+          </w:p>
+        </w:tc>
+        <w:tc>
+          <w:tcPr>
+            <w:tcW w:type="dxa" w:w="2218"/>
+            <w:tcBorders>
+              <w:top w:val="single" w:color="B7C3D0" w:sz="4"/>
+              <w:left w:val="single" w:color="B7C3D0" w:sz="4"/>
+              <w:bottom w:val="single" w:color="B7C3D0" w:sz="4"/>
+              <w:right w:val="single" w:color="B7C3D0" w:sz="4"/>
+            </w:tcBorders>
+            <w:tcMar>
+              <w:top w:type="dxa" w:w="60"/>
+              <w:left w:type="dxa" w:w="100"/>
+              <w:bottom w:type="dxa" w:w="60"/>
+              <w:right w:type="dxa" w:w="100"/>
+            </w:tcMar>
+            <w:vAlign w:val="center"/>
+          </w:tcPr>
+          <w:p>
+            <w:pPr>
+              <w:keepNext w:val="false"/>
+            </w:pPr>
+            <w:r>
+              <w:rPr>
+                <w:sz w:val="19"/>
+                <w:szCs w:val="19"/>
+              </w:rPr>
+              <w:t xml:space="preserve">Inimigos comuns do prólogo, 4 quadros cada</w:t>
+            </w:r>
+          </w:p>
+        </w:tc>
+      </w:tr>
+      <w:tr>
+        <w:trPr>
+          <w:cantSplit/>
+        </w:trPr>
+        <w:tc>
+          <w:tcPr>
+            <w:tcW w:type="dxa" w:w="867"/>
+            <w:tcBorders>
+              <w:top w:val="single" w:color="B7C3D0" w:sz="4"/>
+              <w:left w:val="single" w:color="B7C3D0" w:sz="4"/>
+              <w:bottom w:val="single" w:color="B7C3D0" w:sz="4"/>
+              <w:right w:val="single" w:color="B7C3D0" w:sz="4"/>
+            </w:tcBorders>
+            <w:tcMar>
+              <w:top w:type="dxa" w:w="60"/>
+              <w:left w:type="dxa" w:w="100"/>
+              <w:bottom w:type="dxa" w:w="60"/>
+              <w:right w:type="dxa" w:w="100"/>
+            </w:tcMar>
+            <w:vAlign w:val="center"/>
+          </w:tcPr>
+          <w:p>
+            <w:pPr>
+              <w:keepNext w:val="false"/>
+            </w:pPr>
+            <w:r>
+              <w:rPr>
+                <w:sz w:val="19"/>
+                <w:szCs w:val="19"/>
+              </w:rPr>
+              <w:t xml:space="preserve">A-028</w:t>
+            </w:r>
+          </w:p>
+        </w:tc>
+        <w:tc>
+          <w:tcPr>
+            <w:tcW w:type="dxa" w:w="2891"/>
+            <w:tcBorders>
+              <w:top w:val="single" w:color="B7C3D0" w:sz="4"/>
+              <w:left w:val="single" w:color="B7C3D0" w:sz="4"/>
+              <w:bottom w:val="single" w:color="B7C3D0" w:sz="4"/>
+              <w:right w:val="single" w:color="B7C3D0" w:sz="4"/>
+            </w:tcBorders>
+            <w:tcMar>
+              <w:top w:type="dxa" w:w="60"/>
+              <w:left w:type="dxa" w:w="100"/>
+              <w:bottom w:type="dxa" w:w="60"/>
+              <w:right w:type="dxa" w:w="100"/>
+            </w:tcMar>
+            <w:vAlign w:val="center"/>
+          </w:tcPr>
+          <w:p>
+            <w:pPr>
+              <w:keepNext w:val="false"/>
+            </w:pPr>
+            <w:r>
+              <w:rPr>
+                <w:sz w:val="19"/>
+                <w:szCs w:val="19"/>
+              </w:rPr>
+              <w:t xml:space="preserve">assets/sprites/enemies/enm_crusher_core / claw_up / claw_down</w:t>
+            </w:r>
+          </w:p>
+        </w:tc>
+        <w:tc>
+          <w:tcPr>
+            <w:tcW w:type="dxa" w:w="1349"/>
+            <w:tcBorders>
+              <w:top w:val="single" w:color="B7C3D0" w:sz="4"/>
+              <w:left w:val="single" w:color="B7C3D0" w:sz="4"/>
+              <w:bottom w:val="single" w:color="B7C3D0" w:sz="4"/>
+              <w:right w:val="single" w:color="B7C3D0" w:sz="4"/>
+            </w:tcBorders>
+            <w:tcMar>
+              <w:top w:type="dxa" w:w="60"/>
+              <w:left w:type="dxa" w:w="100"/>
+              <w:bottom w:type="dxa" w:w="60"/>
+              <w:right w:type="dxa" w:w="100"/>
+            </w:tcMar>
+            <w:vAlign w:val="center"/>
+          </w:tcPr>
+          <w:p>
+            <w:pPr>
+              <w:keepNext w:val="false"/>
+            </w:pPr>
+            <w:r>
+              <w:rPr>
+                <w:sz w:val="19"/>
+                <w:szCs w:val="19"/>
+              </w:rPr>
+              <w:t xml:space="preserve">Sprite</w:t>
+            </w:r>
+          </w:p>
+        </w:tc>
+        <w:tc>
+          <w:tcPr>
+            <w:tcW w:type="dxa" w:w="867"/>
+            <w:tcBorders>
+              <w:top w:val="single" w:color="B7C3D0" w:sz="4"/>
+              <w:left w:val="single" w:color="B7C3D0" w:sz="4"/>
+              <w:bottom w:val="single" w:color="B7C3D0" w:sz="4"/>
+              <w:right w:val="single" w:color="B7C3D0" w:sz="4"/>
+            </w:tcBorders>
+            <w:tcMar>
+              <w:top w:type="dxa" w:w="60"/>
+              <w:left w:type="dxa" w:w="100"/>
+              <w:bottom w:type="dxa" w:w="60"/>
+              <w:right w:type="dxa" w:w="100"/>
+            </w:tcMar>
+            <w:vAlign w:val="center"/>
+          </w:tcPr>
+          <w:p>
+            <w:pPr>
+              <w:keepNext w:val="false"/>
+            </w:pPr>
+            <w:r>
+              <w:rPr>
+                <w:sz w:val="19"/>
+                <w:szCs w:val="19"/>
+              </w:rPr>
+              <w:t xml:space="preserve">F3</w:t>
+            </w:r>
+          </w:p>
+        </w:tc>
+        <w:tc>
+          <w:tcPr>
+            <w:tcW w:type="dxa" w:w="1446"/>
+            <w:tcBorders>
+              <w:top w:val="single" w:color="B7C3D0" w:sz="4"/>
+              <w:left w:val="single" w:color="B7C3D0" w:sz="4"/>
+              <w:bottom w:val="single" w:color="B7C3D0" w:sz="4"/>
+              <w:right w:val="single" w:color="B7C3D0" w:sz="4"/>
+            </w:tcBorders>
+            <w:tcMar>
+              <w:top w:type="dxa" w:w="60"/>
+              <w:left w:type="dxa" w:w="100"/>
+              <w:bottom w:type="dxa" w:w="60"/>
+              <w:right w:type="dxa" w:w="100"/>
+            </w:tcMar>
+            <w:vAlign w:val="center"/>
+          </w:tcPr>
+          <w:p>
+            <w:pPr>
+              <w:keepNext w:val="false"/>
+            </w:pPr>
+            <w:r>
+              <w:rPr>
+                <w:sz w:val="19"/>
+                <w:szCs w:val="19"/>
+              </w:rPr>
+              <w:t xml:space="preserve">☑ Concluída</w:t>
+            </w:r>
+          </w:p>
+        </w:tc>
+        <w:tc>
+          <w:tcPr>
+            <w:tcW w:type="dxa" w:w="2218"/>
+            <w:tcBorders>
+              <w:top w:val="single" w:color="B7C3D0" w:sz="4"/>
+              <w:left w:val="single" w:color="B7C3D0" w:sz="4"/>
+              <w:bottom w:val="single" w:color="B7C3D0" w:sz="4"/>
+              <w:right w:val="single" w:color="B7C3D0" w:sz="4"/>
+            </w:tcBorders>
+            <w:tcMar>
+              <w:top w:type="dxa" w:w="60"/>
+              <w:left w:type="dxa" w:w="100"/>
+              <w:bottom w:type="dxa" w:w="60"/>
+              <w:right w:type="dxa" w:w="100"/>
+            </w:tcMar>
+            <w:vAlign w:val="center"/>
+          </w:tcPr>
+          <w:p>
+            <w:pPr>
+              <w:keepNext w:val="false"/>
+            </w:pPr>
+            <w:r>
+              <w:rPr>
+                <w:sz w:val="19"/>
+                <w:szCs w:val="19"/>
+              </w:rPr>
+              <w:t xml:space="preserve">Chefe Triturador em 3 partes (núcleo 104×115 e duas garras)</w:t>
+            </w:r>
+          </w:p>
+        </w:tc>
+      </w:tr>
+      <w:tr>
+        <w:trPr>
+          <w:cantSplit/>
+        </w:trPr>
+        <w:tc>
+          <w:tcPr>
+            <w:tcW w:type="dxa" w:w="867"/>
+            <w:tcBorders>
+              <w:top w:val="single" w:color="B7C3D0" w:sz="4"/>
+              <w:left w:val="single" w:color="B7C3D0" w:sz="4"/>
+              <w:bottom w:val="single" w:color="B7C3D0" w:sz="4"/>
+              <w:right w:val="single" w:color="B7C3D0" w:sz="4"/>
+            </w:tcBorders>
+            <w:tcMar>
+              <w:top w:type="dxa" w:w="60"/>
+              <w:left w:type="dxa" w:w="100"/>
+              <w:bottom w:type="dxa" w:w="60"/>
+              <w:right w:type="dxa" w:w="100"/>
+            </w:tcMar>
+            <w:vAlign w:val="center"/>
+          </w:tcPr>
+          <w:p>
+            <w:pPr>
+              <w:keepNext w:val="false"/>
+            </w:pPr>
+            <w:r>
+              <w:rPr>
+                <w:sz w:val="19"/>
+                <w:szCs w:val="19"/>
+              </w:rPr>
+              <w:t xml:space="preserve">A-029</w:t>
+            </w:r>
+          </w:p>
+        </w:tc>
+        <w:tc>
+          <w:tcPr>
+            <w:tcW w:type="dxa" w:w="2891"/>
+            <w:tcBorders>
+              <w:top w:val="single" w:color="B7C3D0" w:sz="4"/>
+              <w:left w:val="single" w:color="B7C3D0" w:sz="4"/>
+              <w:bottom w:val="single" w:color="B7C3D0" w:sz="4"/>
+              <w:right w:val="single" w:color="B7C3D0" w:sz="4"/>
+            </w:tcBorders>
+            <w:tcMar>
+              <w:top w:type="dxa" w:w="60"/>
+              <w:left w:type="dxa" w:w="100"/>
+              <w:bottom w:type="dxa" w:w="60"/>
+              <w:right w:type="dxa" w:w="100"/>
+            </w:tcMar>
+            <w:vAlign w:val="center"/>
+          </w:tcPr>
+          <w:p>
+            <w:pPr>
+              <w:keepNext w:val="false"/>
+            </w:pPr>
+            <w:r>
+              <w:rPr>
+                <w:sz w:val="19"/>
+                <w:szCs w:val="19"/>
+              </w:rPr>
+              <w:t xml:space="preserve">assets/sprites/characters/voss + enemies/enm_voss</w:t>
+            </w:r>
+          </w:p>
+        </w:tc>
+        <w:tc>
+          <w:tcPr>
+            <w:tcW w:type="dxa" w:w="1349"/>
+            <w:tcBorders>
+              <w:top w:val="single" w:color="B7C3D0" w:sz="4"/>
+              <w:left w:val="single" w:color="B7C3D0" w:sz="4"/>
+              <w:bottom w:val="single" w:color="B7C3D0" w:sz="4"/>
+              <w:right w:val="single" w:color="B7C3D0" w:sz="4"/>
+            </w:tcBorders>
+            <w:tcMar>
+              <w:top w:type="dxa" w:w="60"/>
+              <w:left w:type="dxa" w:w="100"/>
+              <w:bottom w:type="dxa" w:w="60"/>
+              <w:right w:type="dxa" w:w="100"/>
+            </w:tcMar>
+            <w:vAlign w:val="center"/>
+          </w:tcPr>
+          <w:p>
+            <w:pPr>
+              <w:keepNext w:val="false"/>
+            </w:pPr>
+            <w:r>
+              <w:rPr>
+                <w:sz w:val="19"/>
+                <w:szCs w:val="19"/>
+              </w:rPr>
+              <w:t xml:space="preserve">Sprite</w:t>
+            </w:r>
+          </w:p>
+        </w:tc>
+        <w:tc>
+          <w:tcPr>
+            <w:tcW w:type="dxa" w:w="867"/>
+            <w:tcBorders>
+              <w:top w:val="single" w:color="B7C3D0" w:sz="4"/>
+              <w:left w:val="single" w:color="B7C3D0" w:sz="4"/>
+              <w:bottom w:val="single" w:color="B7C3D0" w:sz="4"/>
+              <w:right w:val="single" w:color="B7C3D0" w:sz="4"/>
+            </w:tcBorders>
+            <w:tcMar>
+              <w:top w:type="dxa" w:w="60"/>
+              <w:left w:type="dxa" w:w="100"/>
+              <w:bottom w:type="dxa" w:w="60"/>
+              <w:right w:type="dxa" w:w="100"/>
+            </w:tcMar>
+            <w:vAlign w:val="center"/>
+          </w:tcPr>
+          <w:p>
+            <w:pPr>
+              <w:keepNext w:val="false"/>
+            </w:pPr>
+            <w:r>
+              <w:rPr>
+                <w:sz w:val="19"/>
+                <w:szCs w:val="19"/>
+              </w:rPr>
+              <w:t xml:space="preserve">F3</w:t>
+            </w:r>
+          </w:p>
+        </w:tc>
+        <w:tc>
+          <w:tcPr>
+            <w:tcW w:type="dxa" w:w="1446"/>
+            <w:tcBorders>
+              <w:top w:val="single" w:color="B7C3D0" w:sz="4"/>
+              <w:left w:val="single" w:color="B7C3D0" w:sz="4"/>
+              <w:bottom w:val="single" w:color="B7C3D0" w:sz="4"/>
+              <w:right w:val="single" w:color="B7C3D0" w:sz="4"/>
+            </w:tcBorders>
+            <w:tcMar>
+              <w:top w:type="dxa" w:w="60"/>
+              <w:left w:type="dxa" w:w="100"/>
+              <w:bottom w:type="dxa" w:w="60"/>
+              <w:right w:type="dxa" w:w="100"/>
+            </w:tcMar>
+            <w:vAlign w:val="center"/>
+          </w:tcPr>
+          <w:p>
+            <w:pPr>
+              <w:keepNext w:val="false"/>
+            </w:pPr>
+            <w:r>
+              <w:rPr>
+                <w:sz w:val="19"/>
+                <w:szCs w:val="19"/>
+              </w:rPr>
+              <w:t xml:space="preserve">☑ Concluída</w:t>
+            </w:r>
+          </w:p>
+        </w:tc>
+        <w:tc>
+          <w:tcPr>
+            <w:tcW w:type="dxa" w:w="2218"/>
+            <w:tcBorders>
+              <w:top w:val="single" w:color="B7C3D0" w:sz="4"/>
+              <w:left w:val="single" w:color="B7C3D0" w:sz="4"/>
+              <w:bottom w:val="single" w:color="B7C3D0" w:sz="4"/>
+              <w:right w:val="single" w:color="B7C3D0" w:sz="4"/>
+            </w:tcBorders>
+            <w:tcMar>
+              <w:top w:type="dxa" w:w="60"/>
+              <w:left w:type="dxa" w:w="100"/>
+              <w:bottom w:type="dxa" w:w="60"/>
+              <w:right w:type="dxa" w:w="100"/>
+            </w:tcMar>
+            <w:vAlign w:val="center"/>
+          </w:tcPr>
+          <w:p>
+            <w:pPr>
+              <w:keepNext w:val="false"/>
+            </w:pPr>
+            <w:r>
+              <w:rPr>
+                <w:sz w:val="19"/>
+                <w:szCs w:val="19"/>
+              </w:rPr>
+              <w:t xml:space="preserve">General Voss: 4 poses de mapa e 3 de batalha</w:t>
+            </w:r>
+          </w:p>
+        </w:tc>
+      </w:tr>
+      <w:tr>
+        <w:trPr>
+          <w:cantSplit/>
+        </w:trPr>
+        <w:tc>
+          <w:tcPr>
+            <w:tcW w:type="dxa" w:w="867"/>
+            <w:tcBorders>
+              <w:top w:val="single" w:color="B7C3D0" w:sz="4"/>
+              <w:left w:val="single" w:color="B7C3D0" w:sz="4"/>
+              <w:bottom w:val="single" w:color="B7C3D0" w:sz="4"/>
+              <w:right w:val="single" w:color="B7C3D0" w:sz="4"/>
+            </w:tcBorders>
+            <w:tcMar>
+              <w:top w:type="dxa" w:w="60"/>
+              <w:left w:type="dxa" w:w="100"/>
+              <w:bottom w:type="dxa" w:w="60"/>
+              <w:right w:type="dxa" w:w="100"/>
+            </w:tcMar>
+            <w:vAlign w:val="center"/>
+          </w:tcPr>
+          <w:p>
+            <w:pPr>
+              <w:keepNext w:val="false"/>
+            </w:pPr>
+            <w:r>
+              <w:rPr>
+                <w:sz w:val="19"/>
+                <w:szCs w:val="19"/>
+              </w:rPr>
+              <w:t xml:space="preserve">A-030</w:t>
+            </w:r>
+          </w:p>
+        </w:tc>
+        <w:tc>
+          <w:tcPr>
+            <w:tcW w:type="dxa" w:w="2891"/>
+            <w:tcBorders>
+              <w:top w:val="single" w:color="B7C3D0" w:sz="4"/>
+              <w:left w:val="single" w:color="B7C3D0" w:sz="4"/>
+              <w:bottom w:val="single" w:color="B7C3D0" w:sz="4"/>
+              <w:right w:val="single" w:color="B7C3D0" w:sz="4"/>
+            </w:tcBorders>
+            <w:tcMar>
+              <w:top w:type="dxa" w:w="60"/>
+              <w:left w:type="dxa" w:w="100"/>
+              <w:bottom w:type="dxa" w:w="60"/>
+              <w:right w:type="dxa" w:w="100"/>
+            </w:tcMar>
+            <w:vAlign w:val="center"/>
+          </w:tcPr>
+          <w:p>
+            <w:pPr>
+              <w:keepNext w:val="false"/>
+            </w:pPr>
+            <w:r>
+              <w:rPr>
+                <w:sz w:val="19"/>
+                <w:szCs w:val="19"/>
+              </w:rPr>
+              <w:t xml:space="preserve">assets/audio/music/bgm_junkyard / boss / empire / farewell (_a, _b)</w:t>
+            </w:r>
+          </w:p>
+        </w:tc>
+        <w:tc>
+          <w:tcPr>
+            <w:tcW w:type="dxa" w:w="1349"/>
+            <w:tcBorders>
+              <w:top w:val="single" w:color="B7C3D0" w:sz="4"/>
+              <w:left w:val="single" w:color="B7C3D0" w:sz="4"/>
+              <w:bottom w:val="single" w:color="B7C3D0" w:sz="4"/>
+              <w:right w:val="single" w:color="B7C3D0" w:sz="4"/>
+            </w:tcBorders>
+            <w:tcMar>
+              <w:top w:type="dxa" w:w="60"/>
+              <w:left w:type="dxa" w:w="100"/>
+              <w:bottom w:type="dxa" w:w="60"/>
+              <w:right w:type="dxa" w:w="100"/>
+            </w:tcMar>
+            <w:vAlign w:val="center"/>
+          </w:tcPr>
+          <w:p>
+            <w:pPr>
+              <w:keepNext w:val="false"/>
+            </w:pPr>
+            <w:r>
+              <w:rPr>
+                <w:sz w:val="19"/>
+                <w:szCs w:val="19"/>
+              </w:rPr>
+              <w:t xml:space="preserve">Música</w:t>
+            </w:r>
+          </w:p>
+        </w:tc>
+        <w:tc>
+          <w:tcPr>
+            <w:tcW w:type="dxa" w:w="867"/>
+            <w:tcBorders>
+              <w:top w:val="single" w:color="B7C3D0" w:sz="4"/>
+              <w:left w:val="single" w:color="B7C3D0" w:sz="4"/>
+              <w:bottom w:val="single" w:color="B7C3D0" w:sz="4"/>
+              <w:right w:val="single" w:color="B7C3D0" w:sz="4"/>
+            </w:tcBorders>
+            <w:tcMar>
+              <w:top w:type="dxa" w:w="60"/>
+              <w:left w:type="dxa" w:w="100"/>
+              <w:bottom w:type="dxa" w:w="60"/>
+              <w:right w:type="dxa" w:w="100"/>
+            </w:tcMar>
+            <w:vAlign w:val="center"/>
+          </w:tcPr>
+          <w:p>
+            <w:pPr>
+              <w:keepNext w:val="false"/>
+            </w:pPr>
+            <w:r>
+              <w:rPr>
+                <w:sz w:val="19"/>
+                <w:szCs w:val="19"/>
+              </w:rPr>
+              <w:t xml:space="preserve">F3</w:t>
+            </w:r>
+          </w:p>
+        </w:tc>
+        <w:tc>
+          <w:tcPr>
+            <w:tcW w:type="dxa" w:w="1446"/>
+            <w:tcBorders>
+              <w:top w:val="single" w:color="B7C3D0" w:sz="4"/>
+              <w:left w:val="single" w:color="B7C3D0" w:sz="4"/>
+              <w:bottom w:val="single" w:color="B7C3D0" w:sz="4"/>
+              <w:right w:val="single" w:color="B7C3D0" w:sz="4"/>
+            </w:tcBorders>
+            <w:tcMar>
+              <w:top w:type="dxa" w:w="60"/>
+              <w:left w:type="dxa" w:w="100"/>
+              <w:bottom w:type="dxa" w:w="60"/>
+              <w:right w:type="dxa" w:w="100"/>
+            </w:tcMar>
+            <w:vAlign w:val="center"/>
+          </w:tcPr>
+          <w:p>
+            <w:pPr>
+              <w:keepNext w:val="false"/>
+            </w:pPr>
+            <w:r>
+              <w:rPr>
+                <w:sz w:val="19"/>
+                <w:szCs w:val="19"/>
+              </w:rPr>
               <w:t xml:space="preserve">◐ Em andamento</w:t>
             </w:r>
           </w:p>
@@ -32734,7 +33687,7 @@
                 <w:sz w:val="19"/>
                 <w:szCs w:val="19"/>
               </w:rPr>
-              <w:t xml:space="preserve">Vila Caldeira: 8×6 tiles 16×16 (chão, bordas, paredes, telhados, canos, objetos); gerado de _source/til_vila_caldeira_raw_v1.png</w:t>
+              <w:t xml:space="preserve">Suno: Ferro-Velho, Chefe, Tema do Império, Adeus — versão A em uso, aguardando avaliação</w:t>
             </w:r>
           </w:p>
         </w:tc>
@@ -36872,6 +37825,101 @@
           </w:tcPr>
           <w:p>
             <w:pPr>
+              <w:keepNext/>
+            </w:pPr>
+            <w:r>
+              <w:rPr>
+                <w:sz w:val="19"/>
+                <w:szCs w:val="19"/>
+              </w:rPr>
+              <w:t xml:space="preserve">2.1</w:t>
+            </w:r>
+          </w:p>
+        </w:tc>
+        <w:tc>
+          <w:tcPr>
+            <w:tcW w:type="dxa" w:w="1735"/>
+            <w:tcBorders>
+              <w:top w:val="single" w:color="B7C3D0" w:sz="4"/>
+              <w:left w:val="single" w:color="B7C3D0" w:sz="4"/>
+              <w:bottom w:val="single" w:color="B7C3D0" w:sz="4"/>
+              <w:right w:val="single" w:color="B7C3D0" w:sz="4"/>
+            </w:tcBorders>
+            <w:tcMar>
+              <w:top w:type="dxa" w:w="60"/>
+              <w:left w:type="dxa" w:w="100"/>
+              <w:bottom w:type="dxa" w:w="60"/>
+              <w:right w:type="dxa" w:w="100"/>
+            </w:tcMar>
+            <w:vAlign w:val="center"/>
+          </w:tcPr>
+          <w:p>
+            <w:pPr>
+              <w:keepNext/>
+            </w:pPr>
+            <w:r>
+              <w:rPr>
+                <w:sz w:val="19"/>
+                <w:szCs w:val="19"/>
+              </w:rPr>
+              <w:t xml:space="preserve">24/09/2026</w:t>
+            </w:r>
+          </w:p>
+        </w:tc>
+        <w:tc>
+          <w:tcPr>
+            <w:tcW w:type="dxa" w:w="6746"/>
+            <w:tcBorders>
+              <w:top w:val="single" w:color="B7C3D0" w:sz="4"/>
+              <w:left w:val="single" w:color="B7C3D0" w:sz="4"/>
+              <w:bottom w:val="single" w:color="B7C3D0" w:sz="4"/>
+              <w:right w:val="single" w:color="B7C3D0" w:sz="4"/>
+            </w:tcBorders>
+            <w:tcMar>
+              <w:top w:type="dxa" w:w="60"/>
+              <w:left w:type="dxa" w:w="100"/>
+              <w:bottom w:type="dxa" w:w="60"/>
+              <w:right w:type="dxa" w:w="100"/>
+            </w:tcMar>
+            <w:vAlign w:val="center"/>
+          </w:tcPr>
+          <w:p>
+            <w:pPr>
+              <w:keepNext/>
+            </w:pPr>
+            <w:r>
+              <w:rPr>
+                <w:sz w:val="19"/>
+                <w:szCs w:val="19"/>
+              </w:rPr>
+              <w:t xml:space="preserve">Fase 2 aprovada pelo Diretor (músicas: título B, vitória B, batalha A e B alternadas; menus fecham com Esc/Start e X/B). Fase 3 iniciada: roteiro do prólogo v0.1 (docs/Roteiro_Prologo.docx) e tileset da Vila Caldeira (158 testes).</w:t>
+            </w:r>
+          </w:p>
+        </w:tc>
+      </w:tr>
+      <w:tr>
+        <w:trPr>
+          <w:cantSplit/>
+        </w:trPr>
+        <w:tc>
+          <w:tcPr>
+            <w:tcW w:type="dxa" w:w="1157"/>
+            <w:tcBorders>
+              <w:top w:val="single" w:color="B7C3D0" w:sz="4"/>
+              <w:left w:val="single" w:color="B7C3D0" w:sz="4"/>
+              <w:bottom w:val="single" w:color="B7C3D0" w:sz="4"/>
+              <w:right w:val="single" w:color="B7C3D0" w:sz="4"/>
+            </w:tcBorders>
+            <w:tcMar>
+              <w:top w:type="dxa" w:w="60"/>
+              <w:left w:type="dxa" w:w="100"/>
+              <w:bottom w:type="dxa" w:w="60"/>
+              <w:right w:type="dxa" w:w="100"/>
+            </w:tcMar>
+            <w:vAlign w:val="center"/>
+          </w:tcPr>
+          <w:p>
+            <w:pPr>
               <w:keepNext w:val="false"/>
             </w:pPr>
             <w:r>
@@ -36879,7 +37927,7 @@
                 <w:sz w:val="19"/>
                 <w:szCs w:val="19"/>
               </w:rPr>
-              <w:t xml:space="preserve">2.1</w:t>
+              <w:t xml:space="preserve">2.2</w:t>
             </w:r>
           </w:p>
         </w:tc>
@@ -36939,7 +37987,7 @@
                 <w:sz w:val="19"/>
                 <w:szCs w:val="19"/>
               </w:rPr>
-              <w:t xml:space="preserve">Fase 2 aprovada pelo Diretor (músicas: título B, vitória B, batalha A e B alternadas; menus fecham com Esc/Start e X/B). Fase 3 iniciada: roteiro do prólogo v0.1 (docs/Roteiro_Prologo.docx) e tileset da Vila Caldeira (158 testes).</w:t>
+              <w:t xml:space="preserve">Prólogo jogável do início ao fim: 10 mapas (vila, 3 interiores, estrada, ferro-velho em 3 áreas, câmara), 12 cutscenes, Gerd convidado, Eco, chefe em partes, corvo ladrão, luta roteirizada com Voss, missões do gato e das molas, cena de fim de capítulo. Novos sistemas: objetos de mapa (baú, alavanca, bloco, ponto de salvamento), portões por flag, tint noturno. 4 músicas novas (171 testes).</w:t>
             </w:r>
           </w:p>
         </w:tc>
@@ -36968,7 +38016,7 @@
         <w:spacing w:after="60"/>
       </w:pPr>
       <w:r>
-        <w:t xml:space="preserve">Diretor: ler e aprovar o Roteiro do Prólogo v0.1 (capítulo 9 lista as decisões: Gerd convidado, chefe Triturador, nomes novos).</w:t>
+        <w:t xml:space="preserve">Diretor: jogar o prólogo (Novo jogo) e avaliar ritmo, dificuldade, mapas e as 4 músicas novas (A/B).</w:t>
       </w:r>
     </w:p>
     <w:p>
@@ -36981,7 +38029,7 @@
         <w:spacing w:after="60"/>
       </w:pPr>
       <w:r>
-        <w:t xml:space="preserve">Claude: tileset do Ferro-Velho, mapas reais da vila e do ferro-velho, novos inimigos, chefe, cutscenes do prólogo; músicas novas (Ferro-Velho, Chefe, Império, Adeus) após o roteiro aprovado.</w:t>
+        <w:t xml:space="preserve">Claude: poses de batalha dedicadas, UI final, efeitos visuais, SFX, balanceamento com o feedback do Diretor; depois playtest externo.</w:t>
       </w:r>
     </w:p>
     <w:sectPr>

</xml_diff>

<commit_message>
Eco and Voss portraits wired into dialogue; asset log
Co-Authored-By: Claude Opus 5.5 <noreply@anthropic.com>
</commit_message>
<xml_diff>
--- a/docs/Planejamento_Projeto_RPG.docx
+++ b/docs/Planejamento_Projeto_RPG.docx
@@ -33692,6 +33692,746 @@
           </w:p>
         </w:tc>
       </w:tr>
+      <w:tr>
+        <w:trPr>
+          <w:cantSplit/>
+        </w:trPr>
+        <w:tc>
+          <w:tcPr>
+            <w:tcW w:type="dxa" w:w="867"/>
+            <w:tcBorders>
+              <w:top w:val="single" w:color="B7C3D0" w:sz="4"/>
+              <w:left w:val="single" w:color="B7C3D0" w:sz="4"/>
+              <w:bottom w:val="single" w:color="B7C3D0" w:sz="4"/>
+              <w:right w:val="single" w:color="B7C3D0" w:sz="4"/>
+            </w:tcBorders>
+            <w:tcMar>
+              <w:top w:type="dxa" w:w="60"/>
+              <w:left w:type="dxa" w:w="100"/>
+              <w:bottom w:type="dxa" w:w="60"/>
+              <w:right w:type="dxa" w:w="100"/>
+            </w:tcMar>
+            <w:vAlign w:val="center"/>
+          </w:tcPr>
+          <w:p>
+            <w:pPr>
+              <w:keepNext w:val="false"/>
+            </w:pPr>
+            <w:r>
+              <w:rPr>
+                <w:sz w:val="19"/>
+                <w:szCs w:val="19"/>
+              </w:rPr>
+              <w:t xml:space="preserve">A-031</w:t>
+            </w:r>
+          </w:p>
+        </w:tc>
+        <w:tc>
+          <w:tcPr>
+            <w:tcW w:type="dxa" w:w="2891"/>
+            <w:tcBorders>
+              <w:top w:val="single" w:color="B7C3D0" w:sz="4"/>
+              <w:left w:val="single" w:color="B7C3D0" w:sz="4"/>
+              <w:bottom w:val="single" w:color="B7C3D0" w:sz="4"/>
+              <w:right w:val="single" w:color="B7C3D0" w:sz="4"/>
+            </w:tcBorders>
+            <w:tcMar>
+              <w:top w:type="dxa" w:w="60"/>
+              <w:left w:type="dxa" w:w="100"/>
+              <w:bottom w:type="dxa" w:w="60"/>
+              <w:right w:type="dxa" w:w="100"/>
+            </w:tcMar>
+            <w:vAlign w:val="center"/>
+          </w:tcPr>
+          <w:p>
+            <w:pPr>
+              <w:keepNext w:val="false"/>
+            </w:pPr>
+            <w:r>
+              <w:rPr>
+                <w:sz w:val="19"/>
+                <w:szCs w:val="19"/>
+              </w:rPr>
+              <w:t xml:space="preserve">assets/sprites/characters/villagers/npc_villagers2.png</w:t>
+            </w:r>
+          </w:p>
+        </w:tc>
+        <w:tc>
+          <w:tcPr>
+            <w:tcW w:type="dxa" w:w="1349"/>
+            <w:tcBorders>
+              <w:top w:val="single" w:color="B7C3D0" w:sz="4"/>
+              <w:left w:val="single" w:color="B7C3D0" w:sz="4"/>
+              <w:bottom w:val="single" w:color="B7C3D0" w:sz="4"/>
+              <w:right w:val="single" w:color="B7C3D0" w:sz="4"/>
+            </w:tcBorders>
+            <w:tcMar>
+              <w:top w:type="dxa" w:w="60"/>
+              <w:left w:type="dxa" w:w="100"/>
+              <w:bottom w:type="dxa" w:w="60"/>
+              <w:right w:type="dxa" w:w="100"/>
+            </w:tcMar>
+            <w:vAlign w:val="center"/>
+          </w:tcPr>
+          <w:p>
+            <w:pPr>
+              <w:keepNext w:val="false"/>
+            </w:pPr>
+            <w:r>
+              <w:rPr>
+                <w:sz w:val="19"/>
+                <w:szCs w:val="19"/>
+              </w:rPr>
+              <w:t xml:space="preserve">Sprite</w:t>
+            </w:r>
+          </w:p>
+        </w:tc>
+        <w:tc>
+          <w:tcPr>
+            <w:tcW w:type="dxa" w:w="867"/>
+            <w:tcBorders>
+              <w:top w:val="single" w:color="B7C3D0" w:sz="4"/>
+              <w:left w:val="single" w:color="B7C3D0" w:sz="4"/>
+              <w:bottom w:val="single" w:color="B7C3D0" w:sz="4"/>
+              <w:right w:val="single" w:color="B7C3D0" w:sz="4"/>
+            </w:tcBorders>
+            <w:tcMar>
+              <w:top w:type="dxa" w:w="60"/>
+              <w:left w:type="dxa" w:w="100"/>
+              <w:bottom w:type="dxa" w:w="60"/>
+              <w:right w:type="dxa" w:w="100"/>
+            </w:tcMar>
+            <w:vAlign w:val="center"/>
+          </w:tcPr>
+          <w:p>
+            <w:pPr>
+              <w:keepNext w:val="false"/>
+            </w:pPr>
+            <w:r>
+              <w:rPr>
+                <w:sz w:val="19"/>
+                <w:szCs w:val="19"/>
+              </w:rPr>
+              <w:t xml:space="preserve">F3</w:t>
+            </w:r>
+          </w:p>
+        </w:tc>
+        <w:tc>
+          <w:tcPr>
+            <w:tcW w:type="dxa" w:w="1446"/>
+            <w:tcBorders>
+              <w:top w:val="single" w:color="B7C3D0" w:sz="4"/>
+              <w:left w:val="single" w:color="B7C3D0" w:sz="4"/>
+              <w:bottom w:val="single" w:color="B7C3D0" w:sz="4"/>
+              <w:right w:val="single" w:color="B7C3D0" w:sz="4"/>
+            </w:tcBorders>
+            <w:tcMar>
+              <w:top w:type="dxa" w:w="60"/>
+              <w:left w:type="dxa" w:w="100"/>
+              <w:bottom w:type="dxa" w:w="60"/>
+              <w:right w:type="dxa" w:w="100"/>
+            </w:tcMar>
+            <w:vAlign w:val="center"/>
+          </w:tcPr>
+          <w:p>
+            <w:pPr>
+              <w:keepNext w:val="false"/>
+            </w:pPr>
+            <w:r>
+              <w:rPr>
+                <w:sz w:val="19"/>
+                <w:szCs w:val="19"/>
+              </w:rPr>
+              <w:t xml:space="preserve">☑ Concluída</w:t>
+            </w:r>
+          </w:p>
+        </w:tc>
+        <w:tc>
+          <w:tcPr>
+            <w:tcW w:type="dxa" w:w="2218"/>
+            <w:tcBorders>
+              <w:top w:val="single" w:color="B7C3D0" w:sz="4"/>
+              <w:left w:val="single" w:color="B7C3D0" w:sz="4"/>
+              <w:bottom w:val="single" w:color="B7C3D0" w:sz="4"/>
+              <w:right w:val="single" w:color="B7C3D0" w:sz="4"/>
+            </w:tcBorders>
+            <w:tcMar>
+              <w:top w:type="dxa" w:w="60"/>
+              <w:left w:type="dxa" w:w="100"/>
+              <w:bottom w:type="dxa" w:w="60"/>
+              <w:right w:type="dxa" w:w="100"/>
+            </w:tcMar>
+            <w:vAlign w:val="center"/>
+          </w:tcPr>
+          <w:p>
+            <w:pPr>
+              <w:keepNext w:val="false"/>
+            </w:pPr>
+            <w:r>
+              <w:rPr>
+                <w:sz w:val="19"/>
+                <w:szCs w:val="19"/>
+              </w:rPr>
+              <w:t xml:space="preserve">Pip, Guarda Olavo, Velha Ilse, Sr. Anselmo, soldado imperial e o gato Fuligem (4 direções)</w:t>
+            </w:r>
+          </w:p>
+        </w:tc>
+      </w:tr>
+      <w:tr>
+        <w:trPr>
+          <w:cantSplit/>
+        </w:trPr>
+        <w:tc>
+          <w:tcPr>
+            <w:tcW w:type="dxa" w:w="867"/>
+            <w:tcBorders>
+              <w:top w:val="single" w:color="B7C3D0" w:sz="4"/>
+              <w:left w:val="single" w:color="B7C3D0" w:sz="4"/>
+              <w:bottom w:val="single" w:color="B7C3D0" w:sz="4"/>
+              <w:right w:val="single" w:color="B7C3D0" w:sz="4"/>
+            </w:tcBorders>
+            <w:tcMar>
+              <w:top w:type="dxa" w:w="60"/>
+              <w:left w:type="dxa" w:w="100"/>
+              <w:bottom w:type="dxa" w:w="60"/>
+              <w:right w:type="dxa" w:w="100"/>
+            </w:tcMar>
+            <w:vAlign w:val="center"/>
+          </w:tcPr>
+          <w:p>
+            <w:pPr>
+              <w:keepNext w:val="false"/>
+            </w:pPr>
+            <w:r>
+              <w:rPr>
+                <w:sz w:val="19"/>
+                <w:szCs w:val="19"/>
+              </w:rPr>
+              <w:t xml:space="preserve">A-032</w:t>
+            </w:r>
+          </w:p>
+        </w:tc>
+        <w:tc>
+          <w:tcPr>
+            <w:tcW w:type="dxa" w:w="2891"/>
+            <w:tcBorders>
+              <w:top w:val="single" w:color="B7C3D0" w:sz="4"/>
+              <w:left w:val="single" w:color="B7C3D0" w:sz="4"/>
+              <w:bottom w:val="single" w:color="B7C3D0" w:sz="4"/>
+              <w:right w:val="single" w:color="B7C3D0" w:sz="4"/>
+            </w:tcBorders>
+            <w:tcMar>
+              <w:top w:type="dxa" w:w="60"/>
+              <w:left w:type="dxa" w:w="100"/>
+              <w:bottom w:type="dxa" w:w="60"/>
+              <w:right w:type="dxa" w:w="100"/>
+            </w:tcMar>
+            <w:vAlign w:val="center"/>
+          </w:tcPr>
+          <w:p>
+            <w:pPr>
+              <w:keepNext w:val="false"/>
+            </w:pPr>
+            <w:r>
+              <w:rPr>
+                <w:sz w:val="19"/>
+                <w:szCs w:val="19"/>
+              </w:rPr>
+              <w:t xml:space="preserve">assets/sprites/enemies/enm_imperial_soldier.png</w:t>
+            </w:r>
+          </w:p>
+        </w:tc>
+        <w:tc>
+          <w:tcPr>
+            <w:tcW w:type="dxa" w:w="1349"/>
+            <w:tcBorders>
+              <w:top w:val="single" w:color="B7C3D0" w:sz="4"/>
+              <w:left w:val="single" w:color="B7C3D0" w:sz="4"/>
+              <w:bottom w:val="single" w:color="B7C3D0" w:sz="4"/>
+              <w:right w:val="single" w:color="B7C3D0" w:sz="4"/>
+            </w:tcBorders>
+            <w:tcMar>
+              <w:top w:type="dxa" w:w="60"/>
+              <w:left w:type="dxa" w:w="100"/>
+              <w:bottom w:type="dxa" w:w="60"/>
+              <w:right w:type="dxa" w:w="100"/>
+            </w:tcMar>
+            <w:vAlign w:val="center"/>
+          </w:tcPr>
+          <w:p>
+            <w:pPr>
+              <w:keepNext w:val="false"/>
+            </w:pPr>
+            <w:r>
+              <w:rPr>
+                <w:sz w:val="19"/>
+                <w:szCs w:val="19"/>
+              </w:rPr>
+              <w:t xml:space="preserve">Sprite</w:t>
+            </w:r>
+          </w:p>
+        </w:tc>
+        <w:tc>
+          <w:tcPr>
+            <w:tcW w:type="dxa" w:w="867"/>
+            <w:tcBorders>
+              <w:top w:val="single" w:color="B7C3D0" w:sz="4"/>
+              <w:left w:val="single" w:color="B7C3D0" w:sz="4"/>
+              <w:bottom w:val="single" w:color="B7C3D0" w:sz="4"/>
+              <w:right w:val="single" w:color="B7C3D0" w:sz="4"/>
+            </w:tcBorders>
+            <w:tcMar>
+              <w:top w:type="dxa" w:w="60"/>
+              <w:left w:type="dxa" w:w="100"/>
+              <w:bottom w:type="dxa" w:w="60"/>
+              <w:right w:type="dxa" w:w="100"/>
+            </w:tcMar>
+            <w:vAlign w:val="center"/>
+          </w:tcPr>
+          <w:p>
+            <w:pPr>
+              <w:keepNext w:val="false"/>
+            </w:pPr>
+            <w:r>
+              <w:rPr>
+                <w:sz w:val="19"/>
+                <w:szCs w:val="19"/>
+              </w:rPr>
+              <w:t xml:space="preserve">F3</w:t>
+            </w:r>
+          </w:p>
+        </w:tc>
+        <w:tc>
+          <w:tcPr>
+            <w:tcW w:type="dxa" w:w="1446"/>
+            <w:tcBorders>
+              <w:top w:val="single" w:color="B7C3D0" w:sz="4"/>
+              <w:left w:val="single" w:color="B7C3D0" w:sz="4"/>
+              <w:bottom w:val="single" w:color="B7C3D0" w:sz="4"/>
+              <w:right w:val="single" w:color="B7C3D0" w:sz="4"/>
+            </w:tcBorders>
+            <w:tcMar>
+              <w:top w:type="dxa" w:w="60"/>
+              <w:left w:type="dxa" w:w="100"/>
+              <w:bottom w:type="dxa" w:w="60"/>
+              <w:right w:type="dxa" w:w="100"/>
+            </w:tcMar>
+            <w:vAlign w:val="center"/>
+          </w:tcPr>
+          <w:p>
+            <w:pPr>
+              <w:keepNext w:val="false"/>
+            </w:pPr>
+            <w:r>
+              <w:rPr>
+                <w:sz w:val="19"/>
+                <w:szCs w:val="19"/>
+              </w:rPr>
+              <w:t xml:space="preserve">☑ Concluída</w:t>
+            </w:r>
+          </w:p>
+        </w:tc>
+        <w:tc>
+          <w:tcPr>
+            <w:tcW w:type="dxa" w:w="2218"/>
+            <w:tcBorders>
+              <w:top w:val="single" w:color="B7C3D0" w:sz="4"/>
+              <w:left w:val="single" w:color="B7C3D0" w:sz="4"/>
+              <w:bottom w:val="single" w:color="B7C3D0" w:sz="4"/>
+              <w:right w:val="single" w:color="B7C3D0" w:sz="4"/>
+            </w:tcBorders>
+            <w:tcMar>
+              <w:top w:type="dxa" w:w="60"/>
+              <w:left w:type="dxa" w:w="100"/>
+              <w:bottom w:type="dxa" w:w="60"/>
+              <w:right w:type="dxa" w:w="100"/>
+            </w:tcMar>
+            <w:vAlign w:val="center"/>
+          </w:tcPr>
+          <w:p>
+            <w:pPr>
+              <w:keepNext w:val="false"/>
+            </w:pPr>
+            <w:r>
+              <w:rPr>
+                <w:sz w:val="19"/>
+                <w:szCs w:val="19"/>
+              </w:rPr>
+              <w:t xml:space="preserve">Soldado imperial de batalha (4 quadros)</w:t>
+            </w:r>
+          </w:p>
+        </w:tc>
+      </w:tr>
+      <w:tr>
+        <w:trPr>
+          <w:cantSplit/>
+        </w:trPr>
+        <w:tc>
+          <w:tcPr>
+            <w:tcW w:type="dxa" w:w="867"/>
+            <w:tcBorders>
+              <w:top w:val="single" w:color="B7C3D0" w:sz="4"/>
+              <w:left w:val="single" w:color="B7C3D0" w:sz="4"/>
+              <w:bottom w:val="single" w:color="B7C3D0" w:sz="4"/>
+              <w:right w:val="single" w:color="B7C3D0" w:sz="4"/>
+            </w:tcBorders>
+            <w:tcMar>
+              <w:top w:type="dxa" w:w="60"/>
+              <w:left w:type="dxa" w:w="100"/>
+              <w:bottom w:type="dxa" w:w="60"/>
+              <w:right w:type="dxa" w:w="100"/>
+            </w:tcMar>
+            <w:vAlign w:val="center"/>
+          </w:tcPr>
+          <w:p>
+            <w:pPr>
+              <w:keepNext w:val="false"/>
+            </w:pPr>
+            <w:r>
+              <w:rPr>
+                <w:sz w:val="19"/>
+                <w:szCs w:val="19"/>
+              </w:rPr>
+              <w:t xml:space="preserve">A-033</w:t>
+            </w:r>
+          </w:p>
+        </w:tc>
+        <w:tc>
+          <w:tcPr>
+            <w:tcW w:type="dxa" w:w="2891"/>
+            <w:tcBorders>
+              <w:top w:val="single" w:color="B7C3D0" w:sz="4"/>
+              <w:left w:val="single" w:color="B7C3D0" w:sz="4"/>
+              <w:bottom w:val="single" w:color="B7C3D0" w:sz="4"/>
+              <w:right w:val="single" w:color="B7C3D0" w:sz="4"/>
+            </w:tcBorders>
+            <w:tcMar>
+              <w:top w:type="dxa" w:w="60"/>
+              <w:left w:type="dxa" w:w="100"/>
+              <w:bottom w:type="dxa" w:w="60"/>
+              <w:right w:type="dxa" w:w="100"/>
+            </w:tcMar>
+            <w:vAlign w:val="center"/>
+          </w:tcPr>
+          <w:p>
+            <w:pPr>
+              <w:keepNext w:val="false"/>
+            </w:pPr>
+            <w:r>
+              <w:rPr>
+                <w:sz w:val="19"/>
+                <w:szCs w:val="19"/>
+              </w:rPr>
+              <w:t xml:space="preserve">assets/portraits/por_eco_neutral.png, por_voss_neutral.png</w:t>
+            </w:r>
+          </w:p>
+        </w:tc>
+        <w:tc>
+          <w:tcPr>
+            <w:tcW w:type="dxa" w:w="1349"/>
+            <w:tcBorders>
+              <w:top w:val="single" w:color="B7C3D0" w:sz="4"/>
+              <w:left w:val="single" w:color="B7C3D0" w:sz="4"/>
+              <w:bottom w:val="single" w:color="B7C3D0" w:sz="4"/>
+              <w:right w:val="single" w:color="B7C3D0" w:sz="4"/>
+            </w:tcBorders>
+            <w:tcMar>
+              <w:top w:type="dxa" w:w="60"/>
+              <w:left w:type="dxa" w:w="100"/>
+              <w:bottom w:type="dxa" w:w="60"/>
+              <w:right w:type="dxa" w:w="100"/>
+            </w:tcMar>
+            <w:vAlign w:val="center"/>
+          </w:tcPr>
+          <w:p>
+            <w:pPr>
+              <w:keepNext w:val="false"/>
+            </w:pPr>
+            <w:r>
+              <w:rPr>
+                <w:sz w:val="19"/>
+                <w:szCs w:val="19"/>
+              </w:rPr>
+              <w:t xml:space="preserve">Retrato</w:t>
+            </w:r>
+          </w:p>
+        </w:tc>
+        <w:tc>
+          <w:tcPr>
+            <w:tcW w:type="dxa" w:w="867"/>
+            <w:tcBorders>
+              <w:top w:val="single" w:color="B7C3D0" w:sz="4"/>
+              <w:left w:val="single" w:color="B7C3D0" w:sz="4"/>
+              <w:bottom w:val="single" w:color="B7C3D0" w:sz="4"/>
+              <w:right w:val="single" w:color="B7C3D0" w:sz="4"/>
+            </w:tcBorders>
+            <w:tcMar>
+              <w:top w:type="dxa" w:w="60"/>
+              <w:left w:type="dxa" w:w="100"/>
+              <w:bottom w:type="dxa" w:w="60"/>
+              <w:right w:type="dxa" w:w="100"/>
+            </w:tcMar>
+            <w:vAlign w:val="center"/>
+          </w:tcPr>
+          <w:p>
+            <w:pPr>
+              <w:keepNext w:val="false"/>
+            </w:pPr>
+            <w:r>
+              <w:rPr>
+                <w:sz w:val="19"/>
+                <w:szCs w:val="19"/>
+              </w:rPr>
+              <w:t xml:space="preserve">F3</w:t>
+            </w:r>
+          </w:p>
+        </w:tc>
+        <w:tc>
+          <w:tcPr>
+            <w:tcW w:type="dxa" w:w="1446"/>
+            <w:tcBorders>
+              <w:top w:val="single" w:color="B7C3D0" w:sz="4"/>
+              <w:left w:val="single" w:color="B7C3D0" w:sz="4"/>
+              <w:bottom w:val="single" w:color="B7C3D0" w:sz="4"/>
+              <w:right w:val="single" w:color="B7C3D0" w:sz="4"/>
+            </w:tcBorders>
+            <w:tcMar>
+              <w:top w:type="dxa" w:w="60"/>
+              <w:left w:type="dxa" w:w="100"/>
+              <w:bottom w:type="dxa" w:w="60"/>
+              <w:right w:type="dxa" w:w="100"/>
+            </w:tcMar>
+            <w:vAlign w:val="center"/>
+          </w:tcPr>
+          <w:p>
+            <w:pPr>
+              <w:keepNext w:val="false"/>
+            </w:pPr>
+            <w:r>
+              <w:rPr>
+                <w:sz w:val="19"/>
+                <w:szCs w:val="19"/>
+              </w:rPr>
+              <w:t xml:space="preserve">☑ Concluída</w:t>
+            </w:r>
+          </w:p>
+        </w:tc>
+        <w:tc>
+          <w:tcPr>
+            <w:tcW w:type="dxa" w:w="2218"/>
+            <w:tcBorders>
+              <w:top w:val="single" w:color="B7C3D0" w:sz="4"/>
+              <w:left w:val="single" w:color="B7C3D0" w:sz="4"/>
+              <w:bottom w:val="single" w:color="B7C3D0" w:sz="4"/>
+              <w:right w:val="single" w:color="B7C3D0" w:sz="4"/>
+            </w:tcBorders>
+            <w:tcMar>
+              <w:top w:type="dxa" w:w="60"/>
+              <w:left w:type="dxa" w:w="100"/>
+              <w:bottom w:type="dxa" w:w="60"/>
+              <w:right w:type="dxa" w:w="100"/>
+            </w:tcMar>
+            <w:vAlign w:val="center"/>
+          </w:tcPr>
+          <w:p>
+            <w:pPr>
+              <w:keepNext w:val="false"/>
+            </w:pPr>
+            <w:r>
+              <w:rPr>
+                <w:sz w:val="19"/>
+                <w:szCs w:val="19"/>
+              </w:rPr>
+              <w:t xml:space="preserve">Retratos de diálogo de Eco e Voss (gerados com a referência anexada)</w:t>
+            </w:r>
+          </w:p>
+        </w:tc>
+      </w:tr>
+      <w:tr>
+        <w:trPr>
+          <w:cantSplit/>
+        </w:trPr>
+        <w:tc>
+          <w:tcPr>
+            <w:tcW w:type="dxa" w:w="867"/>
+            <w:tcBorders>
+              <w:top w:val="single" w:color="B7C3D0" w:sz="4"/>
+              <w:left w:val="single" w:color="B7C3D0" w:sz="4"/>
+              <w:bottom w:val="single" w:color="B7C3D0" w:sz="4"/>
+              <w:right w:val="single" w:color="B7C3D0" w:sz="4"/>
+            </w:tcBorders>
+            <w:tcMar>
+              <w:top w:type="dxa" w:w="60"/>
+              <w:left w:type="dxa" w:w="100"/>
+              <w:bottom w:type="dxa" w:w="60"/>
+              <w:right w:type="dxa" w:w="100"/>
+            </w:tcMar>
+            <w:vAlign w:val="center"/>
+          </w:tcPr>
+          <w:p>
+            <w:pPr>
+              <w:keepNext w:val="false"/>
+            </w:pPr>
+            <w:r>
+              <w:rPr>
+                <w:sz w:val="19"/>
+                <w:szCs w:val="19"/>
+              </w:rPr>
+              <w:t xml:space="preserve">A-034</w:t>
+            </w:r>
+          </w:p>
+        </w:tc>
+        <w:tc>
+          <w:tcPr>
+            <w:tcW w:type="dxa" w:w="2891"/>
+            <w:tcBorders>
+              <w:top w:val="single" w:color="B7C3D0" w:sz="4"/>
+              <w:left w:val="single" w:color="B7C3D0" w:sz="4"/>
+              <w:bottom w:val="single" w:color="B7C3D0" w:sz="4"/>
+              <w:right w:val="single" w:color="B7C3D0" w:sz="4"/>
+            </w:tcBorders>
+            <w:tcMar>
+              <w:top w:type="dxa" w:w="60"/>
+              <w:left w:type="dxa" w:w="100"/>
+              <w:bottom w:type="dxa" w:w="60"/>
+              <w:right w:type="dxa" w:w="100"/>
+            </w:tcMar>
+            <w:vAlign w:val="center"/>
+          </w:tcPr>
+          <w:p>
+            <w:pPr>
+              <w:keepNext w:val="false"/>
+            </w:pPr>
+            <w:r>
+              <w:rPr>
+                <w:sz w:val="19"/>
+                <w:szCs w:val="19"/>
+              </w:rPr>
+              <w:t xml:space="preserve">assets/ui/ico_items.png (linha 5)</w:t>
+            </w:r>
+          </w:p>
+        </w:tc>
+        <w:tc>
+          <w:tcPr>
+            <w:tcW w:type="dxa" w:w="1349"/>
+            <w:tcBorders>
+              <w:top w:val="single" w:color="B7C3D0" w:sz="4"/>
+              <w:left w:val="single" w:color="B7C3D0" w:sz="4"/>
+              <w:bottom w:val="single" w:color="B7C3D0" w:sz="4"/>
+              <w:right w:val="single" w:color="B7C3D0" w:sz="4"/>
+            </w:tcBorders>
+            <w:tcMar>
+              <w:top w:type="dxa" w:w="60"/>
+              <w:left w:type="dxa" w:w="100"/>
+              <w:bottom w:type="dxa" w:w="60"/>
+              <w:right w:type="dxa" w:w="100"/>
+            </w:tcMar>
+            <w:vAlign w:val="center"/>
+          </w:tcPr>
+          <w:p>
+            <w:pPr>
+              <w:keepNext w:val="false"/>
+            </w:pPr>
+            <w:r>
+              <w:rPr>
+                <w:sz w:val="19"/>
+                <w:szCs w:val="19"/>
+              </w:rPr>
+              <w:t xml:space="preserve">Ícones</w:t>
+            </w:r>
+          </w:p>
+        </w:tc>
+        <w:tc>
+          <w:tcPr>
+            <w:tcW w:type="dxa" w:w="867"/>
+            <w:tcBorders>
+              <w:top w:val="single" w:color="B7C3D0" w:sz="4"/>
+              <w:left w:val="single" w:color="B7C3D0" w:sz="4"/>
+              <w:bottom w:val="single" w:color="B7C3D0" w:sz="4"/>
+              <w:right w:val="single" w:color="B7C3D0" w:sz="4"/>
+            </w:tcBorders>
+            <w:tcMar>
+              <w:top w:type="dxa" w:w="60"/>
+              <w:left w:type="dxa" w:w="100"/>
+              <w:bottom w:type="dxa" w:w="60"/>
+              <w:right w:type="dxa" w:w="100"/>
+            </w:tcMar>
+            <w:vAlign w:val="center"/>
+          </w:tcPr>
+          <w:p>
+            <w:pPr>
+              <w:keepNext w:val="false"/>
+            </w:pPr>
+            <w:r>
+              <w:rPr>
+                <w:sz w:val="19"/>
+                <w:szCs w:val="19"/>
+              </w:rPr>
+              <w:t xml:space="preserve">F3</w:t>
+            </w:r>
+          </w:p>
+        </w:tc>
+        <w:tc>
+          <w:tcPr>
+            <w:tcW w:type="dxa" w:w="1446"/>
+            <w:tcBorders>
+              <w:top w:val="single" w:color="B7C3D0" w:sz="4"/>
+              <w:left w:val="single" w:color="B7C3D0" w:sz="4"/>
+              <w:bottom w:val="single" w:color="B7C3D0" w:sz="4"/>
+              <w:right w:val="single" w:color="B7C3D0" w:sz="4"/>
+            </w:tcBorders>
+            <w:tcMar>
+              <w:top w:type="dxa" w:w="60"/>
+              <w:left w:type="dxa" w:w="100"/>
+              <w:bottom w:type="dxa" w:w="60"/>
+              <w:right w:type="dxa" w:w="100"/>
+            </w:tcMar>
+            <w:vAlign w:val="center"/>
+          </w:tcPr>
+          <w:p>
+            <w:pPr>
+              <w:keepNext w:val="false"/>
+            </w:pPr>
+            <w:r>
+              <w:rPr>
+                <w:sz w:val="19"/>
+                <w:szCs w:val="19"/>
+              </w:rPr>
+              <w:t xml:space="preserve">☑ Concluída</w:t>
+            </w:r>
+          </w:p>
+        </w:tc>
+        <w:tc>
+          <w:tcPr>
+            <w:tcW w:type="dxa" w:w="2218"/>
+            <w:tcBorders>
+              <w:top w:val="single" w:color="B7C3D0" w:sz="4"/>
+              <w:left w:val="single" w:color="B7C3D0" w:sz="4"/>
+              <w:bottom w:val="single" w:color="B7C3D0" w:sz="4"/>
+              <w:right w:val="single" w:color="B7C3D0" w:sz="4"/>
+            </w:tcBorders>
+            <w:tcMar>
+              <w:top w:type="dxa" w:w="60"/>
+              <w:left w:type="dxa" w:w="100"/>
+              <w:bottom w:type="dxa" w:w="60"/>
+              <w:right w:type="dxa" w:w="100"/>
+            </w:tcMar>
+            <w:vAlign w:val="center"/>
+          </w:tcPr>
+          <w:p>
+            <w:pPr>
+              <w:keepNext w:val="false"/>
+            </w:pPr>
+            <w:r>
+              <w:rPr>
+                <w:sz w:val="19"/>
+                <w:szCs w:val="19"/>
+              </w:rPr>
+              <w:t xml:space="preserve">Caixa de engrenagens, válvula de bronze, mola de latão, chave de oficina</w:t>
+            </w:r>
+          </w:p>
+        </w:tc>
+      </w:tr>
     </w:tbl>
     <w:p>
       <w:pPr>

</xml_diff>

<commit_message>
Gerd battle poses, battle VFX sheet (8 effects), brass UI skin (window frame 9-slice + hand cursor) for menus, lists, dialogue and battle HUD; tiles.mjs --uniform
Co-Authored-By: Claude Opus 5.5 <noreply@anthropic.com>
</commit_message>
<xml_diff>
--- a/docs/Planejamento_Projeto_RPG.docx
+++ b/docs/Planejamento_Projeto_RPG.docx
@@ -22487,7 +22487,7 @@
                 <w:sz w:val="19"/>
                 <w:szCs w:val="19"/>
               </w:rPr>
-              <w:t xml:space="preserve">◐ Em andamento</w:t>
+              <w:t xml:space="preserve">☑ Concluída</w:t>
             </w:r>
           </w:p>
         </w:tc>
@@ -22517,7 +22517,7 @@
                 <w:sz w:val="19"/>
                 <w:szCs w:val="19"/>
               </w:rPr>
-              <w:t xml:space="preserve">Kael, Eco e Gerd com folhas de referência; faltam poses de batalha dedicadas (ataque, dano, KO)</w:t>
+              <w:t xml:space="preserve">Kael, Eco e Gerd: referência, retratos e 6 poses de batalha (parado, ataque, técnica, dano, KO, vitória)</w:t>
             </w:r>
           </w:p>
         </w:tc>
@@ -22952,7 +22952,7 @@
                 <w:sz w:val="19"/>
                 <w:szCs w:val="19"/>
               </w:rPr>
-              <w:t xml:space="preserve">☐ Pendente</w:t>
+              <w:t xml:space="preserve">◐ Em andamento</w:t>
             </w:r>
           </w:p>
         </w:tc>
@@ -22977,6 +22977,13 @@
             <w:pPr>
               <w:keepNext/>
             </w:pPr>
+            <w:r>
+              <w:rPr>
+                <w:sz w:val="19"/>
+                <w:szCs w:val="19"/>
+              </w:rPr>
+              <w:t xml:space="preserve">Fonte dos números trocada (Press Start 2P); moldura de latão e cursor em produção</w:t>
+            </w:r>
           </w:p>
         </w:tc>
       </w:tr>
@@ -23100,7 +23107,7 @@
                 <w:sz w:val="19"/>
                 <w:szCs w:val="19"/>
               </w:rPr>
-              <w:t xml:space="preserve">☐ Pendente</w:t>
+              <w:t xml:space="preserve">◐ Em andamento</w:t>
             </w:r>
           </w:p>
         </w:tc>
@@ -23125,6 +23132,13 @@
             <w:pPr>
               <w:keepNext/>
             </w:pPr>
+            <w:r>
+              <w:rPr>
+                <w:sz w:val="19"/>
+                <w:szCs w:val="19"/>
+              </w:rPr>
+              <w:t xml:space="preserve">Sistema BattleVFX pronto (corte, impacto, fogo, gelo, raio, cura, vapor, explosão); folha de efeitos em produção</w:t>
+            </w:r>
           </w:p>
         </w:tc>
       </w:tr>
@@ -23248,7 +23262,7 @@
                 <w:sz w:val="19"/>
                 <w:szCs w:val="19"/>
               </w:rPr>
-              <w:t xml:space="preserve">◐ Em andamento</w:t>
+              <w:t xml:space="preserve">☑ Concluída</w:t>
             </w:r>
           </w:p>
         </w:tc>
@@ -23278,7 +23292,7 @@
                 <w:sz w:val="19"/>
                 <w:szCs w:val="19"/>
               </w:rPr>
-              <w:t xml:space="preserve">Músicas prontas (Ferro-Velho, Chefe, Império, Adeus; A em uso, B guardada); SFX a definir</w:t>
+              <w:t xml:space="preserve">Músicas escolhidas pelo Diretor (Ferro-Velho A, Chefe A, Império B, Adeus B); 32 efeitos sonoros CC0 (Kenney) em menus, batalha, mapa e cutscenes</w:t>
             </w:r>
           </w:p>
         </w:tc>
@@ -33567,7 +33581,7 @@
                 <w:sz w:val="19"/>
                 <w:szCs w:val="19"/>
               </w:rPr>
-              <w:t xml:space="preserve">assets/audio/music/bgm_junkyard / boss / empire / farewell (_a, _b)</w:t>
+              <w:t xml:space="preserve">assets/audio/music/bgm_junkyard_a / boss_a / empire_b / farewell_b</w:t>
             </w:r>
           </w:p>
         </w:tc>
@@ -33657,7 +33671,7 @@
                 <w:sz w:val="19"/>
                 <w:szCs w:val="19"/>
               </w:rPr>
-              <w:t xml:space="preserve">◐ Em andamento</w:t>
+              <w:t xml:space="preserve">☑ Concluída</w:t>
             </w:r>
           </w:p>
         </w:tc>
@@ -33687,7 +33701,7 @@
                 <w:sz w:val="19"/>
                 <w:szCs w:val="19"/>
               </w:rPr>
-              <w:t xml:space="preserve">Suno: Ferro-Velho, Chefe, Tema do Império, Adeus — versão A em uso, aguardando avaliação</w:t>
+              <w:t xml:space="preserve">Suno: Ferro-Velho (A), Chefe (A), Tema do Império (B), Adeus (B) — escolhas do Diretor; outras variações guardadas</w:t>
             </w:r>
           </w:p>
         </w:tc>
@@ -34428,6 +34442,561 @@
                 <w:szCs w:val="19"/>
               </w:rPr>
               <w:t xml:space="preserve">Caixa de engrenagens, válvula de bronze, mola de latão, chave de oficina</w:t>
+            </w:r>
+          </w:p>
+        </w:tc>
+      </w:tr>
+      <w:tr>
+        <w:trPr>
+          <w:cantSplit/>
+        </w:trPr>
+        <w:tc>
+          <w:tcPr>
+            <w:tcW w:type="dxa" w:w="867"/>
+            <w:tcBorders>
+              <w:top w:val="single" w:color="B7C3D0" w:sz="4"/>
+              <w:left w:val="single" w:color="B7C3D0" w:sz="4"/>
+              <w:bottom w:val="single" w:color="B7C3D0" w:sz="4"/>
+              <w:right w:val="single" w:color="B7C3D0" w:sz="4"/>
+            </w:tcBorders>
+            <w:tcMar>
+              <w:top w:type="dxa" w:w="60"/>
+              <w:left w:type="dxa" w:w="100"/>
+              <w:bottom w:type="dxa" w:w="60"/>
+              <w:right w:type="dxa" w:w="100"/>
+            </w:tcMar>
+            <w:vAlign w:val="center"/>
+          </w:tcPr>
+          <w:p>
+            <w:pPr>
+              <w:keepNext w:val="false"/>
+            </w:pPr>
+            <w:r>
+              <w:rPr>
+                <w:sz w:val="19"/>
+                <w:szCs w:val="19"/>
+              </w:rPr>
+              <w:t xml:space="preserve">A-035</w:t>
+            </w:r>
+          </w:p>
+        </w:tc>
+        <w:tc>
+          <w:tcPr>
+            <w:tcW w:type="dxa" w:w="2891"/>
+            <w:tcBorders>
+              <w:top w:val="single" w:color="B7C3D0" w:sz="4"/>
+              <w:left w:val="single" w:color="B7C3D0" w:sz="4"/>
+              <w:bottom w:val="single" w:color="B7C3D0" w:sz="4"/>
+              <w:right w:val="single" w:color="B7C3D0" w:sz="4"/>
+            </w:tcBorders>
+            <w:tcMar>
+              <w:top w:type="dxa" w:w="60"/>
+              <w:left w:type="dxa" w:w="100"/>
+              <w:bottom w:type="dxa" w:w="60"/>
+              <w:right w:type="dxa" w:w="100"/>
+            </w:tcMar>
+            <w:vAlign w:val="center"/>
+          </w:tcPr>
+          <w:p>
+            <w:pPr>
+              <w:keepNext w:val="false"/>
+            </w:pPr>
+            <w:r>
+              <w:rPr>
+                <w:sz w:val="19"/>
+                <w:szCs w:val="19"/>
+              </w:rPr>
+              <w:t xml:space="preserve">assets/sprites/characters/{kael,eco,gerd}/chr_*_battle.png</w:t>
+            </w:r>
+          </w:p>
+        </w:tc>
+        <w:tc>
+          <w:tcPr>
+            <w:tcW w:type="dxa" w:w="1349"/>
+            <w:tcBorders>
+              <w:top w:val="single" w:color="B7C3D0" w:sz="4"/>
+              <w:left w:val="single" w:color="B7C3D0" w:sz="4"/>
+              <w:bottom w:val="single" w:color="B7C3D0" w:sz="4"/>
+              <w:right w:val="single" w:color="B7C3D0" w:sz="4"/>
+            </w:tcBorders>
+            <w:tcMar>
+              <w:top w:type="dxa" w:w="60"/>
+              <w:left w:type="dxa" w:w="100"/>
+              <w:bottom w:type="dxa" w:w="60"/>
+              <w:right w:type="dxa" w:w="100"/>
+            </w:tcMar>
+            <w:vAlign w:val="center"/>
+          </w:tcPr>
+          <w:p>
+            <w:pPr>
+              <w:keepNext w:val="false"/>
+            </w:pPr>
+            <w:r>
+              <w:rPr>
+                <w:sz w:val="19"/>
+                <w:szCs w:val="19"/>
+              </w:rPr>
+              <w:t xml:space="preserve">Sprite</w:t>
+            </w:r>
+          </w:p>
+        </w:tc>
+        <w:tc>
+          <w:tcPr>
+            <w:tcW w:type="dxa" w:w="867"/>
+            <w:tcBorders>
+              <w:top w:val="single" w:color="B7C3D0" w:sz="4"/>
+              <w:left w:val="single" w:color="B7C3D0" w:sz="4"/>
+              <w:bottom w:val="single" w:color="B7C3D0" w:sz="4"/>
+              <w:right w:val="single" w:color="B7C3D0" w:sz="4"/>
+            </w:tcBorders>
+            <w:tcMar>
+              <w:top w:type="dxa" w:w="60"/>
+              <w:left w:type="dxa" w:w="100"/>
+              <w:bottom w:type="dxa" w:w="60"/>
+              <w:right w:type="dxa" w:w="100"/>
+            </w:tcMar>
+            <w:vAlign w:val="center"/>
+          </w:tcPr>
+          <w:p>
+            <w:pPr>
+              <w:keepNext w:val="false"/>
+            </w:pPr>
+            <w:r>
+              <w:rPr>
+                <w:sz w:val="19"/>
+                <w:szCs w:val="19"/>
+              </w:rPr>
+              <w:t xml:space="preserve">F3</w:t>
+            </w:r>
+          </w:p>
+        </w:tc>
+        <w:tc>
+          <w:tcPr>
+            <w:tcW w:type="dxa" w:w="1446"/>
+            <w:tcBorders>
+              <w:top w:val="single" w:color="B7C3D0" w:sz="4"/>
+              <w:left w:val="single" w:color="B7C3D0" w:sz="4"/>
+              <w:bottom w:val="single" w:color="B7C3D0" w:sz="4"/>
+              <w:right w:val="single" w:color="B7C3D0" w:sz="4"/>
+            </w:tcBorders>
+            <w:tcMar>
+              <w:top w:type="dxa" w:w="60"/>
+              <w:left w:type="dxa" w:w="100"/>
+              <w:bottom w:type="dxa" w:w="60"/>
+              <w:right w:type="dxa" w:w="100"/>
+            </w:tcMar>
+            <w:vAlign w:val="center"/>
+          </w:tcPr>
+          <w:p>
+            <w:pPr>
+              <w:keepNext w:val="false"/>
+            </w:pPr>
+            <w:r>
+              <w:rPr>
+                <w:sz w:val="19"/>
+                <w:szCs w:val="19"/>
+              </w:rPr>
+              <w:t xml:space="preserve">☑ Concluída</w:t>
+            </w:r>
+          </w:p>
+        </w:tc>
+        <w:tc>
+          <w:tcPr>
+            <w:tcW w:type="dxa" w:w="2218"/>
+            <w:tcBorders>
+              <w:top w:val="single" w:color="B7C3D0" w:sz="4"/>
+              <w:left w:val="single" w:color="B7C3D0" w:sz="4"/>
+              <w:bottom w:val="single" w:color="B7C3D0" w:sz="4"/>
+              <w:right w:val="single" w:color="B7C3D0" w:sz="4"/>
+            </w:tcBorders>
+            <w:tcMar>
+              <w:top w:type="dxa" w:w="60"/>
+              <w:left w:type="dxa" w:w="100"/>
+              <w:bottom w:type="dxa" w:w="60"/>
+              <w:right w:type="dxa" w:w="100"/>
+            </w:tcMar>
+            <w:vAlign w:val="center"/>
+          </w:tcPr>
+          <w:p>
+            <w:pPr>
+              <w:keepNext w:val="false"/>
+            </w:pPr>
+            <w:r>
+              <w:rPr>
+                <w:sz w:val="19"/>
+                <w:szCs w:val="19"/>
+              </w:rPr>
+              <w:t xml:space="preserve">Poses de batalha dos heróis do prólogo (grade 2 × 3), geradas com a referência anexada</w:t>
+            </w:r>
+          </w:p>
+        </w:tc>
+      </w:tr>
+      <w:tr>
+        <w:trPr>
+          <w:cantSplit/>
+        </w:trPr>
+        <w:tc>
+          <w:tcPr>
+            <w:tcW w:type="dxa" w:w="867"/>
+            <w:tcBorders>
+              <w:top w:val="single" w:color="B7C3D0" w:sz="4"/>
+              <w:left w:val="single" w:color="B7C3D0" w:sz="4"/>
+              <w:bottom w:val="single" w:color="B7C3D0" w:sz="4"/>
+              <w:right w:val="single" w:color="B7C3D0" w:sz="4"/>
+            </w:tcBorders>
+            <w:tcMar>
+              <w:top w:type="dxa" w:w="60"/>
+              <w:left w:type="dxa" w:w="100"/>
+              <w:bottom w:type="dxa" w:w="60"/>
+              <w:right w:type="dxa" w:w="100"/>
+            </w:tcMar>
+            <w:vAlign w:val="center"/>
+          </w:tcPr>
+          <w:p>
+            <w:pPr>
+              <w:keepNext w:val="false"/>
+            </w:pPr>
+            <w:r>
+              <w:rPr>
+                <w:sz w:val="19"/>
+                <w:szCs w:val="19"/>
+              </w:rPr>
+              <w:t xml:space="preserve">A-036</w:t>
+            </w:r>
+          </w:p>
+        </w:tc>
+        <w:tc>
+          <w:tcPr>
+            <w:tcW w:type="dxa" w:w="2891"/>
+            <w:tcBorders>
+              <w:top w:val="single" w:color="B7C3D0" w:sz="4"/>
+              <w:left w:val="single" w:color="B7C3D0" w:sz="4"/>
+              <w:bottom w:val="single" w:color="B7C3D0" w:sz="4"/>
+              <w:right w:val="single" w:color="B7C3D0" w:sz="4"/>
+            </w:tcBorders>
+            <w:tcMar>
+              <w:top w:type="dxa" w:w="60"/>
+              <w:left w:type="dxa" w:w="100"/>
+              <w:bottom w:type="dxa" w:w="60"/>
+              <w:right w:type="dxa" w:w="100"/>
+            </w:tcMar>
+            <w:vAlign w:val="center"/>
+          </w:tcPr>
+          <w:p>
+            <w:pPr>
+              <w:keepNext w:val="false"/>
+            </w:pPr>
+            <w:r>
+              <w:rPr>
+                <w:sz w:val="19"/>
+                <w:szCs w:val="19"/>
+              </w:rPr>
+              <w:t xml:space="preserve">assets/audio/sfx/*.ogg</w:t>
+            </w:r>
+          </w:p>
+        </w:tc>
+        <w:tc>
+          <w:tcPr>
+            <w:tcW w:type="dxa" w:w="1349"/>
+            <w:tcBorders>
+              <w:top w:val="single" w:color="B7C3D0" w:sz="4"/>
+              <w:left w:val="single" w:color="B7C3D0" w:sz="4"/>
+              <w:bottom w:val="single" w:color="B7C3D0" w:sz="4"/>
+              <w:right w:val="single" w:color="B7C3D0" w:sz="4"/>
+            </w:tcBorders>
+            <w:tcMar>
+              <w:top w:type="dxa" w:w="60"/>
+              <w:left w:type="dxa" w:w="100"/>
+              <w:bottom w:type="dxa" w:w="60"/>
+              <w:right w:type="dxa" w:w="100"/>
+            </w:tcMar>
+            <w:vAlign w:val="center"/>
+          </w:tcPr>
+          <w:p>
+            <w:pPr>
+              <w:keepNext w:val="false"/>
+            </w:pPr>
+            <w:r>
+              <w:rPr>
+                <w:sz w:val="19"/>
+                <w:szCs w:val="19"/>
+              </w:rPr>
+              <w:t xml:space="preserve">SFX</w:t>
+            </w:r>
+          </w:p>
+        </w:tc>
+        <w:tc>
+          <w:tcPr>
+            <w:tcW w:type="dxa" w:w="867"/>
+            <w:tcBorders>
+              <w:top w:val="single" w:color="B7C3D0" w:sz="4"/>
+              <w:left w:val="single" w:color="B7C3D0" w:sz="4"/>
+              <w:bottom w:val="single" w:color="B7C3D0" w:sz="4"/>
+              <w:right w:val="single" w:color="B7C3D0" w:sz="4"/>
+            </w:tcBorders>
+            <w:tcMar>
+              <w:top w:type="dxa" w:w="60"/>
+              <w:left w:type="dxa" w:w="100"/>
+              <w:bottom w:type="dxa" w:w="60"/>
+              <w:right w:type="dxa" w:w="100"/>
+            </w:tcMar>
+            <w:vAlign w:val="center"/>
+          </w:tcPr>
+          <w:p>
+            <w:pPr>
+              <w:keepNext w:val="false"/>
+            </w:pPr>
+            <w:r>
+              <w:rPr>
+                <w:sz w:val="19"/>
+                <w:szCs w:val="19"/>
+              </w:rPr>
+              <w:t xml:space="preserve">F3</w:t>
+            </w:r>
+          </w:p>
+        </w:tc>
+        <w:tc>
+          <w:tcPr>
+            <w:tcW w:type="dxa" w:w="1446"/>
+            <w:tcBorders>
+              <w:top w:val="single" w:color="B7C3D0" w:sz="4"/>
+              <w:left w:val="single" w:color="B7C3D0" w:sz="4"/>
+              <w:bottom w:val="single" w:color="B7C3D0" w:sz="4"/>
+              <w:right w:val="single" w:color="B7C3D0" w:sz="4"/>
+            </w:tcBorders>
+            <w:tcMar>
+              <w:top w:type="dxa" w:w="60"/>
+              <w:left w:type="dxa" w:w="100"/>
+              <w:bottom w:type="dxa" w:w="60"/>
+              <w:right w:type="dxa" w:w="100"/>
+            </w:tcMar>
+            <w:vAlign w:val="center"/>
+          </w:tcPr>
+          <w:p>
+            <w:pPr>
+              <w:keepNext w:val="false"/>
+            </w:pPr>
+            <w:r>
+              <w:rPr>
+                <w:sz w:val="19"/>
+                <w:szCs w:val="19"/>
+              </w:rPr>
+              <w:t xml:space="preserve">☑ Concluída</w:t>
+            </w:r>
+          </w:p>
+        </w:tc>
+        <w:tc>
+          <w:tcPr>
+            <w:tcW w:type="dxa" w:w="2218"/>
+            <w:tcBorders>
+              <w:top w:val="single" w:color="B7C3D0" w:sz="4"/>
+              <w:left w:val="single" w:color="B7C3D0" w:sz="4"/>
+              <w:bottom w:val="single" w:color="B7C3D0" w:sz="4"/>
+              <w:right w:val="single" w:color="B7C3D0" w:sz="4"/>
+            </w:tcBorders>
+            <w:tcMar>
+              <w:top w:type="dxa" w:w="60"/>
+              <w:left w:type="dxa" w:w="100"/>
+              <w:bottom w:type="dxa" w:w="60"/>
+              <w:right w:type="dxa" w:w="100"/>
+            </w:tcMar>
+            <w:vAlign w:val="center"/>
+          </w:tcPr>
+          <w:p>
+            <w:pPr>
+              <w:keepNext w:val="false"/>
+            </w:pPr>
+            <w:r>
+              <w:rPr>
+                <w:sz w:val="19"/>
+                <w:szCs w:val="19"/>
+              </w:rPr>
+              <w:t xml:space="preserve">Kenney (CC0): interface, RPG, impactos e sci-fi — licença em assets/audio/sfx/LICENSE_Kenney_CC0.txt</w:t>
+            </w:r>
+          </w:p>
+        </w:tc>
+      </w:tr>
+      <w:tr>
+        <w:trPr>
+          <w:cantSplit/>
+        </w:trPr>
+        <w:tc>
+          <w:tcPr>
+            <w:tcW w:type="dxa" w:w="867"/>
+            <w:tcBorders>
+              <w:top w:val="single" w:color="B7C3D0" w:sz="4"/>
+              <w:left w:val="single" w:color="B7C3D0" w:sz="4"/>
+              <w:bottom w:val="single" w:color="B7C3D0" w:sz="4"/>
+              <w:right w:val="single" w:color="B7C3D0" w:sz="4"/>
+            </w:tcBorders>
+            <w:tcMar>
+              <w:top w:type="dxa" w:w="60"/>
+              <w:left w:type="dxa" w:w="100"/>
+              <w:bottom w:type="dxa" w:w="60"/>
+              <w:right w:type="dxa" w:w="100"/>
+            </w:tcMar>
+            <w:vAlign w:val="center"/>
+          </w:tcPr>
+          <w:p>
+            <w:pPr>
+              <w:keepNext w:val="false"/>
+            </w:pPr>
+            <w:r>
+              <w:rPr>
+                <w:sz w:val="19"/>
+                <w:szCs w:val="19"/>
+              </w:rPr>
+              <w:t xml:space="preserve">A-037</w:t>
+            </w:r>
+          </w:p>
+        </w:tc>
+        <w:tc>
+          <w:tcPr>
+            <w:tcW w:type="dxa" w:w="2891"/>
+            <w:tcBorders>
+              <w:top w:val="single" w:color="B7C3D0" w:sz="4"/>
+              <w:left w:val="single" w:color="B7C3D0" w:sz="4"/>
+              <w:bottom w:val="single" w:color="B7C3D0" w:sz="4"/>
+              <w:right w:val="single" w:color="B7C3D0" w:sz="4"/>
+            </w:tcBorders>
+            <w:tcMar>
+              <w:top w:type="dxa" w:w="60"/>
+              <w:left w:type="dxa" w:w="100"/>
+              <w:bottom w:type="dxa" w:w="60"/>
+              <w:right w:type="dxa" w:w="100"/>
+            </w:tcMar>
+            <w:vAlign w:val="center"/>
+          </w:tcPr>
+          <w:p>
+            <w:pPr>
+              <w:keepNext w:val="false"/>
+            </w:pPr>
+            <w:r>
+              <w:rPr>
+                <w:sz w:val="19"/>
+                <w:szCs w:val="19"/>
+              </w:rPr>
+              <w:t xml:space="preserve">assets/fonts/PressStart2P-Regular.ttf</w:t>
+            </w:r>
+          </w:p>
+        </w:tc>
+        <w:tc>
+          <w:tcPr>
+            <w:tcW w:type="dxa" w:w="1349"/>
+            <w:tcBorders>
+              <w:top w:val="single" w:color="B7C3D0" w:sz="4"/>
+              <w:left w:val="single" w:color="B7C3D0" w:sz="4"/>
+              <w:bottom w:val="single" w:color="B7C3D0" w:sz="4"/>
+              <w:right w:val="single" w:color="B7C3D0" w:sz="4"/>
+            </w:tcBorders>
+            <w:tcMar>
+              <w:top w:type="dxa" w:w="60"/>
+              <w:left w:type="dxa" w:w="100"/>
+              <w:bottom w:type="dxa" w:w="60"/>
+              <w:right w:type="dxa" w:w="100"/>
+            </w:tcMar>
+            <w:vAlign w:val="center"/>
+          </w:tcPr>
+          <w:p>
+            <w:pPr>
+              <w:keepNext w:val="false"/>
+            </w:pPr>
+            <w:r>
+              <w:rPr>
+                <w:sz w:val="19"/>
+                <w:szCs w:val="19"/>
+              </w:rPr>
+              <w:t xml:space="preserve">Fonte</w:t>
+            </w:r>
+          </w:p>
+        </w:tc>
+        <w:tc>
+          <w:tcPr>
+            <w:tcW w:type="dxa" w:w="867"/>
+            <w:tcBorders>
+              <w:top w:val="single" w:color="B7C3D0" w:sz="4"/>
+              <w:left w:val="single" w:color="B7C3D0" w:sz="4"/>
+              <w:bottom w:val="single" w:color="B7C3D0" w:sz="4"/>
+              <w:right w:val="single" w:color="B7C3D0" w:sz="4"/>
+            </w:tcBorders>
+            <w:tcMar>
+              <w:top w:type="dxa" w:w="60"/>
+              <w:left w:type="dxa" w:w="100"/>
+              <w:bottom w:type="dxa" w:w="60"/>
+              <w:right w:type="dxa" w:w="100"/>
+            </w:tcMar>
+            <w:vAlign w:val="center"/>
+          </w:tcPr>
+          <w:p>
+            <w:pPr>
+              <w:keepNext w:val="false"/>
+            </w:pPr>
+            <w:r>
+              <w:rPr>
+                <w:sz w:val="19"/>
+                <w:szCs w:val="19"/>
+              </w:rPr>
+              <w:t xml:space="preserve">F3</w:t>
+            </w:r>
+          </w:p>
+        </w:tc>
+        <w:tc>
+          <w:tcPr>
+            <w:tcW w:type="dxa" w:w="1446"/>
+            <w:tcBorders>
+              <w:top w:val="single" w:color="B7C3D0" w:sz="4"/>
+              <w:left w:val="single" w:color="B7C3D0" w:sz="4"/>
+              <w:bottom w:val="single" w:color="B7C3D0" w:sz="4"/>
+              <w:right w:val="single" w:color="B7C3D0" w:sz="4"/>
+            </w:tcBorders>
+            <w:tcMar>
+              <w:top w:type="dxa" w:w="60"/>
+              <w:left w:type="dxa" w:w="100"/>
+              <w:bottom w:type="dxa" w:w="60"/>
+              <w:right w:type="dxa" w:w="100"/>
+            </w:tcMar>
+            <w:vAlign w:val="center"/>
+          </w:tcPr>
+          <w:p>
+            <w:pPr>
+              <w:keepNext w:val="false"/>
+            </w:pPr>
+            <w:r>
+              <w:rPr>
+                <w:sz w:val="19"/>
+                <w:szCs w:val="19"/>
+              </w:rPr>
+              <w:t xml:space="preserve">☑ Concluída</w:t>
+            </w:r>
+          </w:p>
+        </w:tc>
+        <w:tc>
+          <w:tcPr>
+            <w:tcW w:type="dxa" w:w="2218"/>
+            <w:tcBorders>
+              <w:top w:val="single" w:color="B7C3D0" w:sz="4"/>
+              <w:left w:val="single" w:color="B7C3D0" w:sz="4"/>
+              <w:bottom w:val="single" w:color="B7C3D0" w:sz="4"/>
+              <w:right w:val="single" w:color="B7C3D0" w:sz="4"/>
+            </w:tcBorders>
+            <w:tcMar>
+              <w:top w:type="dxa" w:w="60"/>
+              <w:left w:type="dxa" w:w="100"/>
+              <w:bottom w:type="dxa" w:w="60"/>
+              <w:right w:type="dxa" w:w="100"/>
+            </w:tcMar>
+            <w:vAlign w:val="center"/>
+          </w:tcPr>
+          <w:p>
+            <w:pPr>
+              <w:keepNext w:val="false"/>
+            </w:pPr>
+            <w:r>
+              <w:rPr>
+                <w:sz w:val="19"/>
+                <w:szCs w:val="19"/>
+              </w:rPr>
+              <w:t xml:space="preserve">Números (HP, dano, preços), licença OFL; decisão do Diretor</w:t>
             </w:r>
           </w:p>
         </w:tc>

</xml_diff>

<commit_message>
Field characters at 78% (re-pixelized from the raw sources: Kael/Eco 44 px, Gerd/villagers 41 px, Voss, villagers2), facade doors drawn 2x, small doors for room exits; planning doc v2.4
Co-Authored-By: Claude Opus 5.5 <noreply@anthropic.com>
</commit_message>
<xml_diff>
--- a/docs/Planejamento_Projeto_RPG.docx
+++ b/docs/Planejamento_Projeto_RPG.docx
@@ -233,7 +233,7 @@
                 <w:sz w:val="19"/>
                 <w:szCs w:val="19"/>
               </w:rPr>
-              <w:t xml:space="preserve">2.2 — Fase 3: prólogo jogável (aguardando teste do Diretor)</w:t>
+              <w:t xml:space="preserve">2.4 — Fase 3: escala de objetos e personagens ajustada pelo Diretor</w:t>
             </w:r>
           </w:p>
         </w:tc>
@@ -22952,7 +22952,7 @@
                 <w:sz w:val="19"/>
                 <w:szCs w:val="19"/>
               </w:rPr>
-              <w:t xml:space="preserve">◐ Em andamento</w:t>
+              <w:t xml:space="preserve">☑ Concluída</w:t>
             </w:r>
           </w:p>
         </w:tc>
@@ -22982,7 +22982,7 @@
                 <w:sz w:val="19"/>
                 <w:szCs w:val="19"/>
               </w:rPr>
-              <w:t xml:space="preserve">Fonte dos números trocada (Press Start 2P); moldura de latão e cursor em produção</w:t>
+              <w:t xml:space="preserve">Moldura de latão (9-slice) e cursor de mão em menus, listas, diálogo e batalha; texto em Jersey 10 (20 px), números em Press Start 2P</w:t>
             </w:r>
           </w:p>
         </w:tc>
@@ -23107,7 +23107,7 @@
                 <w:sz w:val="19"/>
                 <w:szCs w:val="19"/>
               </w:rPr>
-              <w:t xml:space="preserve">◐ Em andamento</w:t>
+              <w:t xml:space="preserve">☑ Concluída</w:t>
             </w:r>
           </w:p>
         </w:tc>
@@ -23137,7 +23137,7 @@
                 <w:sz w:val="19"/>
                 <w:szCs w:val="19"/>
               </w:rPr>
-              <w:t xml:space="preserve">Sistema BattleVFX pronto (corte, impacto, fogo, gelo, raio, cura, vapor, explosão); folha de efeitos em produção</w:t>
+              <w:t xml:space="preserve">8 efeitos animados (corte, impacto, fogo, gelo, raio, cura, vapor, explosão) ligados às ações; dirigível imperial e ruínas da oficina no mapa</w:t>
             </w:r>
           </w:p>
         </w:tc>
@@ -35001,6 +35001,931 @@
           </w:p>
         </w:tc>
       </w:tr>
+      <w:tr>
+        <w:trPr>
+          <w:cantSplit/>
+        </w:trPr>
+        <w:tc>
+          <w:tcPr>
+            <w:tcW w:type="dxa" w:w="867"/>
+            <w:tcBorders>
+              <w:top w:val="single" w:color="B7C3D0" w:sz="4"/>
+              <w:left w:val="single" w:color="B7C3D0" w:sz="4"/>
+              <w:bottom w:val="single" w:color="B7C3D0" w:sz="4"/>
+              <w:right w:val="single" w:color="B7C3D0" w:sz="4"/>
+            </w:tcBorders>
+            <w:tcMar>
+              <w:top w:type="dxa" w:w="60"/>
+              <w:left w:type="dxa" w:w="100"/>
+              <w:bottom w:type="dxa" w:w="60"/>
+              <w:right w:type="dxa" w:w="100"/>
+            </w:tcMar>
+            <w:vAlign w:val="center"/>
+          </w:tcPr>
+          <w:p>
+            <w:pPr>
+              <w:keepNext w:val="false"/>
+            </w:pPr>
+            <w:r>
+              <w:rPr>
+                <w:sz w:val="19"/>
+                <w:szCs w:val="19"/>
+              </w:rPr>
+              <w:t xml:space="preserve">A-038</w:t>
+            </w:r>
+          </w:p>
+        </w:tc>
+        <w:tc>
+          <w:tcPr>
+            <w:tcW w:type="dxa" w:w="2891"/>
+            <w:tcBorders>
+              <w:top w:val="single" w:color="B7C3D0" w:sz="4"/>
+              <w:left w:val="single" w:color="B7C3D0" w:sz="4"/>
+              <w:bottom w:val="single" w:color="B7C3D0" w:sz="4"/>
+              <w:right w:val="single" w:color="B7C3D0" w:sz="4"/>
+            </w:tcBorders>
+            <w:tcMar>
+              <w:top w:type="dxa" w:w="60"/>
+              <w:left w:type="dxa" w:w="100"/>
+              <w:bottom w:type="dxa" w:w="60"/>
+              <w:right w:type="dxa" w:w="100"/>
+            </w:tcMar>
+            <w:vAlign w:val="center"/>
+          </w:tcPr>
+          <w:p>
+            <w:pPr>
+              <w:keepNext w:val="false"/>
+            </w:pPr>
+            <w:r>
+              <w:rPr>
+                <w:sz w:val="19"/>
+                <w:szCs w:val="19"/>
+              </w:rPr>
+              <w:t xml:space="preserve">assets/fonts/Jersey10-Regular.ttf</w:t>
+            </w:r>
+          </w:p>
+        </w:tc>
+        <w:tc>
+          <w:tcPr>
+            <w:tcW w:type="dxa" w:w="1349"/>
+            <w:tcBorders>
+              <w:top w:val="single" w:color="B7C3D0" w:sz="4"/>
+              <w:left w:val="single" w:color="B7C3D0" w:sz="4"/>
+              <w:bottom w:val="single" w:color="B7C3D0" w:sz="4"/>
+              <w:right w:val="single" w:color="B7C3D0" w:sz="4"/>
+            </w:tcBorders>
+            <w:tcMar>
+              <w:top w:type="dxa" w:w="60"/>
+              <w:left w:type="dxa" w:w="100"/>
+              <w:bottom w:type="dxa" w:w="60"/>
+              <w:right w:type="dxa" w:w="100"/>
+            </w:tcMar>
+            <w:vAlign w:val="center"/>
+          </w:tcPr>
+          <w:p>
+            <w:pPr>
+              <w:keepNext w:val="false"/>
+            </w:pPr>
+            <w:r>
+              <w:rPr>
+                <w:sz w:val="19"/>
+                <w:szCs w:val="19"/>
+              </w:rPr>
+              <w:t xml:space="preserve">Fonte</w:t>
+            </w:r>
+          </w:p>
+        </w:tc>
+        <w:tc>
+          <w:tcPr>
+            <w:tcW w:type="dxa" w:w="867"/>
+            <w:tcBorders>
+              <w:top w:val="single" w:color="B7C3D0" w:sz="4"/>
+              <w:left w:val="single" w:color="B7C3D0" w:sz="4"/>
+              <w:bottom w:val="single" w:color="B7C3D0" w:sz="4"/>
+              <w:right w:val="single" w:color="B7C3D0" w:sz="4"/>
+            </w:tcBorders>
+            <w:tcMar>
+              <w:top w:type="dxa" w:w="60"/>
+              <w:left w:type="dxa" w:w="100"/>
+              <w:bottom w:type="dxa" w:w="60"/>
+              <w:right w:type="dxa" w:w="100"/>
+            </w:tcMar>
+            <w:vAlign w:val="center"/>
+          </w:tcPr>
+          <w:p>
+            <w:pPr>
+              <w:keepNext w:val="false"/>
+            </w:pPr>
+            <w:r>
+              <w:rPr>
+                <w:sz w:val="19"/>
+                <w:szCs w:val="19"/>
+              </w:rPr>
+              <w:t xml:space="preserve">F3</w:t>
+            </w:r>
+          </w:p>
+        </w:tc>
+        <w:tc>
+          <w:tcPr>
+            <w:tcW w:type="dxa" w:w="1446"/>
+            <w:tcBorders>
+              <w:top w:val="single" w:color="B7C3D0" w:sz="4"/>
+              <w:left w:val="single" w:color="B7C3D0" w:sz="4"/>
+              <w:bottom w:val="single" w:color="B7C3D0" w:sz="4"/>
+              <w:right w:val="single" w:color="B7C3D0" w:sz="4"/>
+            </w:tcBorders>
+            <w:tcMar>
+              <w:top w:type="dxa" w:w="60"/>
+              <w:left w:type="dxa" w:w="100"/>
+              <w:bottom w:type="dxa" w:w="60"/>
+              <w:right w:type="dxa" w:w="100"/>
+            </w:tcMar>
+            <w:vAlign w:val="center"/>
+          </w:tcPr>
+          <w:p>
+            <w:pPr>
+              <w:keepNext w:val="false"/>
+            </w:pPr>
+            <w:r>
+              <w:rPr>
+                <w:sz w:val="19"/>
+                <w:szCs w:val="19"/>
+              </w:rPr>
+              <w:t xml:space="preserve">☑ Concluída</w:t>
+            </w:r>
+          </w:p>
+        </w:tc>
+        <w:tc>
+          <w:tcPr>
+            <w:tcW w:type="dxa" w:w="2218"/>
+            <w:tcBorders>
+              <w:top w:val="single" w:color="B7C3D0" w:sz="4"/>
+              <w:left w:val="single" w:color="B7C3D0" w:sz="4"/>
+              <w:bottom w:val="single" w:color="B7C3D0" w:sz="4"/>
+              <w:right w:val="single" w:color="B7C3D0" w:sz="4"/>
+            </w:tcBorders>
+            <w:tcMar>
+              <w:top w:type="dxa" w:w="60"/>
+              <w:left w:type="dxa" w:w="100"/>
+              <w:bottom w:type="dxa" w:w="60"/>
+              <w:right w:type="dxa" w:w="100"/>
+            </w:tcMar>
+            <w:vAlign w:val="center"/>
+          </w:tcPr>
+          <w:p>
+            <w:pPr>
+              <w:keepNext w:val="false"/>
+            </w:pPr>
+            <w:r>
+              <w:rPr>
+                <w:sz w:val="19"/>
+                <w:szCs w:val="19"/>
+              </w:rPr>
+              <w:t xml:space="preserve">Texto da interface e diálogos a 20 px (2× a grade), licença OFL — substitui Pixelify, que desenhava "fi" como "A"</w:t>
+            </w:r>
+          </w:p>
+        </w:tc>
+      </w:tr>
+      <w:tr>
+        <w:trPr>
+          <w:cantSplit/>
+        </w:trPr>
+        <w:tc>
+          <w:tcPr>
+            <w:tcW w:type="dxa" w:w="867"/>
+            <w:tcBorders>
+              <w:top w:val="single" w:color="B7C3D0" w:sz="4"/>
+              <w:left w:val="single" w:color="B7C3D0" w:sz="4"/>
+              <w:bottom w:val="single" w:color="B7C3D0" w:sz="4"/>
+              <w:right w:val="single" w:color="B7C3D0" w:sz="4"/>
+            </w:tcBorders>
+            <w:tcMar>
+              <w:top w:type="dxa" w:w="60"/>
+              <w:left w:type="dxa" w:w="100"/>
+              <w:bottom w:type="dxa" w:w="60"/>
+              <w:right w:type="dxa" w:w="100"/>
+            </w:tcMar>
+            <w:vAlign w:val="center"/>
+          </w:tcPr>
+          <w:p>
+            <w:pPr>
+              <w:keepNext w:val="false"/>
+            </w:pPr>
+            <w:r>
+              <w:rPr>
+                <w:sz w:val="19"/>
+                <w:szCs w:val="19"/>
+              </w:rPr>
+              <w:t xml:space="preserve">A-039</w:t>
+            </w:r>
+          </w:p>
+        </w:tc>
+        <w:tc>
+          <w:tcPr>
+            <w:tcW w:type="dxa" w:w="2891"/>
+            <w:tcBorders>
+              <w:top w:val="single" w:color="B7C3D0" w:sz="4"/>
+              <w:left w:val="single" w:color="B7C3D0" w:sz="4"/>
+              <w:bottom w:val="single" w:color="B7C3D0" w:sz="4"/>
+              <w:right w:val="single" w:color="B7C3D0" w:sz="4"/>
+            </w:tcBorders>
+            <w:tcMar>
+              <w:top w:type="dxa" w:w="60"/>
+              <w:left w:type="dxa" w:w="100"/>
+              <w:bottom w:type="dxa" w:w="60"/>
+              <w:right w:type="dxa" w:w="100"/>
+            </w:tcMar>
+            <w:vAlign w:val="center"/>
+          </w:tcPr>
+          <w:p>
+            <w:pPr>
+              <w:keepNext w:val="false"/>
+            </w:pPr>
+            <w:r>
+              <w:rPr>
+                <w:sz w:val="19"/>
+                <w:szCs w:val="19"/>
+              </w:rPr>
+              <w:t xml:space="preserve">assets/vfx/vfx_battle.png</w:t>
+            </w:r>
+          </w:p>
+        </w:tc>
+        <w:tc>
+          <w:tcPr>
+            <w:tcW w:type="dxa" w:w="1349"/>
+            <w:tcBorders>
+              <w:top w:val="single" w:color="B7C3D0" w:sz="4"/>
+              <w:left w:val="single" w:color="B7C3D0" w:sz="4"/>
+              <w:bottom w:val="single" w:color="B7C3D0" w:sz="4"/>
+              <w:right w:val="single" w:color="B7C3D0" w:sz="4"/>
+            </w:tcBorders>
+            <w:tcMar>
+              <w:top w:type="dxa" w:w="60"/>
+              <w:left w:type="dxa" w:w="100"/>
+              <w:bottom w:type="dxa" w:w="60"/>
+              <w:right w:type="dxa" w:w="100"/>
+            </w:tcMar>
+            <w:vAlign w:val="center"/>
+          </w:tcPr>
+          <w:p>
+            <w:pPr>
+              <w:keepNext w:val="false"/>
+            </w:pPr>
+            <w:r>
+              <w:rPr>
+                <w:sz w:val="19"/>
+                <w:szCs w:val="19"/>
+              </w:rPr>
+              <w:t xml:space="preserve">VFX</w:t>
+            </w:r>
+          </w:p>
+        </w:tc>
+        <w:tc>
+          <w:tcPr>
+            <w:tcW w:type="dxa" w:w="867"/>
+            <w:tcBorders>
+              <w:top w:val="single" w:color="B7C3D0" w:sz="4"/>
+              <w:left w:val="single" w:color="B7C3D0" w:sz="4"/>
+              <w:bottom w:val="single" w:color="B7C3D0" w:sz="4"/>
+              <w:right w:val="single" w:color="B7C3D0" w:sz="4"/>
+            </w:tcBorders>
+            <w:tcMar>
+              <w:top w:type="dxa" w:w="60"/>
+              <w:left w:type="dxa" w:w="100"/>
+              <w:bottom w:type="dxa" w:w="60"/>
+              <w:right w:type="dxa" w:w="100"/>
+            </w:tcMar>
+            <w:vAlign w:val="center"/>
+          </w:tcPr>
+          <w:p>
+            <w:pPr>
+              <w:keepNext w:val="false"/>
+            </w:pPr>
+            <w:r>
+              <w:rPr>
+                <w:sz w:val="19"/>
+                <w:szCs w:val="19"/>
+              </w:rPr>
+              <w:t xml:space="preserve">F3</w:t>
+            </w:r>
+          </w:p>
+        </w:tc>
+        <w:tc>
+          <w:tcPr>
+            <w:tcW w:type="dxa" w:w="1446"/>
+            <w:tcBorders>
+              <w:top w:val="single" w:color="B7C3D0" w:sz="4"/>
+              <w:left w:val="single" w:color="B7C3D0" w:sz="4"/>
+              <w:bottom w:val="single" w:color="B7C3D0" w:sz="4"/>
+              <w:right w:val="single" w:color="B7C3D0" w:sz="4"/>
+            </w:tcBorders>
+            <w:tcMar>
+              <w:top w:type="dxa" w:w="60"/>
+              <w:left w:type="dxa" w:w="100"/>
+              <w:bottom w:type="dxa" w:w="60"/>
+              <w:right w:type="dxa" w:w="100"/>
+            </w:tcMar>
+            <w:vAlign w:val="center"/>
+          </w:tcPr>
+          <w:p>
+            <w:pPr>
+              <w:keepNext w:val="false"/>
+            </w:pPr>
+            <w:r>
+              <w:rPr>
+                <w:sz w:val="19"/>
+                <w:szCs w:val="19"/>
+              </w:rPr>
+              <w:t xml:space="preserve">☑ Concluída</w:t>
+            </w:r>
+          </w:p>
+        </w:tc>
+        <w:tc>
+          <w:tcPr>
+            <w:tcW w:type="dxa" w:w="2218"/>
+            <w:tcBorders>
+              <w:top w:val="single" w:color="B7C3D0" w:sz="4"/>
+              <w:left w:val="single" w:color="B7C3D0" w:sz="4"/>
+              <w:bottom w:val="single" w:color="B7C3D0" w:sz="4"/>
+              <w:right w:val="single" w:color="B7C3D0" w:sz="4"/>
+            </w:tcBorders>
+            <w:tcMar>
+              <w:top w:type="dxa" w:w="60"/>
+              <w:left w:type="dxa" w:w="100"/>
+              <w:bottom w:type="dxa" w:w="60"/>
+              <w:right w:type="dxa" w:w="100"/>
+            </w:tcMar>
+            <w:vAlign w:val="center"/>
+          </w:tcPr>
+          <w:p>
+            <w:pPr>
+              <w:keepNext w:val="false"/>
+            </w:pPr>
+            <w:r>
+              <w:rPr>
+                <w:sz w:val="19"/>
+                <w:szCs w:val="19"/>
+              </w:rPr>
+              <w:t xml:space="preserve">8 efeitos × 4 quadros (células de 48 px)</w:t>
+            </w:r>
+          </w:p>
+        </w:tc>
+      </w:tr>
+      <w:tr>
+        <w:trPr>
+          <w:cantSplit/>
+        </w:trPr>
+        <w:tc>
+          <w:tcPr>
+            <w:tcW w:type="dxa" w:w="867"/>
+            <w:tcBorders>
+              <w:top w:val="single" w:color="B7C3D0" w:sz="4"/>
+              <w:left w:val="single" w:color="B7C3D0" w:sz="4"/>
+              <w:bottom w:val="single" w:color="B7C3D0" w:sz="4"/>
+              <w:right w:val="single" w:color="B7C3D0" w:sz="4"/>
+            </w:tcBorders>
+            <w:tcMar>
+              <w:top w:type="dxa" w:w="60"/>
+              <w:left w:type="dxa" w:w="100"/>
+              <w:bottom w:type="dxa" w:w="60"/>
+              <w:right w:type="dxa" w:w="100"/>
+            </w:tcMar>
+            <w:vAlign w:val="center"/>
+          </w:tcPr>
+          <w:p>
+            <w:pPr>
+              <w:keepNext w:val="false"/>
+            </w:pPr>
+            <w:r>
+              <w:rPr>
+                <w:sz w:val="19"/>
+                <w:szCs w:val="19"/>
+              </w:rPr>
+              <w:t xml:space="preserve">A-040</w:t>
+            </w:r>
+          </w:p>
+        </w:tc>
+        <w:tc>
+          <w:tcPr>
+            <w:tcW w:type="dxa" w:w="2891"/>
+            <w:tcBorders>
+              <w:top w:val="single" w:color="B7C3D0" w:sz="4"/>
+              <w:left w:val="single" w:color="B7C3D0" w:sz="4"/>
+              <w:bottom w:val="single" w:color="B7C3D0" w:sz="4"/>
+              <w:right w:val="single" w:color="B7C3D0" w:sz="4"/>
+            </w:tcBorders>
+            <w:tcMar>
+              <w:top w:type="dxa" w:w="60"/>
+              <w:left w:type="dxa" w:w="100"/>
+              <w:bottom w:type="dxa" w:w="60"/>
+              <w:right w:type="dxa" w:w="100"/>
+            </w:tcMar>
+            <w:vAlign w:val="center"/>
+          </w:tcPr>
+          <w:p>
+            <w:pPr>
+              <w:keepNext w:val="false"/>
+            </w:pPr>
+            <w:r>
+              <w:rPr>
+                <w:sz w:val="19"/>
+                <w:szCs w:val="19"/>
+              </w:rPr>
+              <w:t xml:space="preserve">assets/ui/ui_window.png, ui_cursor.png</w:t>
+            </w:r>
+          </w:p>
+        </w:tc>
+        <w:tc>
+          <w:tcPr>
+            <w:tcW w:type="dxa" w:w="1349"/>
+            <w:tcBorders>
+              <w:top w:val="single" w:color="B7C3D0" w:sz="4"/>
+              <w:left w:val="single" w:color="B7C3D0" w:sz="4"/>
+              <w:bottom w:val="single" w:color="B7C3D0" w:sz="4"/>
+              <w:right w:val="single" w:color="B7C3D0" w:sz="4"/>
+            </w:tcBorders>
+            <w:tcMar>
+              <w:top w:type="dxa" w:w="60"/>
+              <w:left w:type="dxa" w:w="100"/>
+              <w:bottom w:type="dxa" w:w="60"/>
+              <w:right w:type="dxa" w:w="100"/>
+            </w:tcMar>
+            <w:vAlign w:val="center"/>
+          </w:tcPr>
+          <w:p>
+            <w:pPr>
+              <w:keepNext w:val="false"/>
+            </w:pPr>
+            <w:r>
+              <w:rPr>
+                <w:sz w:val="19"/>
+                <w:szCs w:val="19"/>
+              </w:rPr>
+              <w:t xml:space="preserve">UI</w:t>
+            </w:r>
+          </w:p>
+        </w:tc>
+        <w:tc>
+          <w:tcPr>
+            <w:tcW w:type="dxa" w:w="867"/>
+            <w:tcBorders>
+              <w:top w:val="single" w:color="B7C3D0" w:sz="4"/>
+              <w:left w:val="single" w:color="B7C3D0" w:sz="4"/>
+              <w:bottom w:val="single" w:color="B7C3D0" w:sz="4"/>
+              <w:right w:val="single" w:color="B7C3D0" w:sz="4"/>
+            </w:tcBorders>
+            <w:tcMar>
+              <w:top w:type="dxa" w:w="60"/>
+              <w:left w:type="dxa" w:w="100"/>
+              <w:bottom w:type="dxa" w:w="60"/>
+              <w:right w:type="dxa" w:w="100"/>
+            </w:tcMar>
+            <w:vAlign w:val="center"/>
+          </w:tcPr>
+          <w:p>
+            <w:pPr>
+              <w:keepNext w:val="false"/>
+            </w:pPr>
+            <w:r>
+              <w:rPr>
+                <w:sz w:val="19"/>
+                <w:szCs w:val="19"/>
+              </w:rPr>
+              <w:t xml:space="preserve">F3</w:t>
+            </w:r>
+          </w:p>
+        </w:tc>
+        <w:tc>
+          <w:tcPr>
+            <w:tcW w:type="dxa" w:w="1446"/>
+            <w:tcBorders>
+              <w:top w:val="single" w:color="B7C3D0" w:sz="4"/>
+              <w:left w:val="single" w:color="B7C3D0" w:sz="4"/>
+              <w:bottom w:val="single" w:color="B7C3D0" w:sz="4"/>
+              <w:right w:val="single" w:color="B7C3D0" w:sz="4"/>
+            </w:tcBorders>
+            <w:tcMar>
+              <w:top w:type="dxa" w:w="60"/>
+              <w:left w:type="dxa" w:w="100"/>
+              <w:bottom w:type="dxa" w:w="60"/>
+              <w:right w:type="dxa" w:w="100"/>
+            </w:tcMar>
+            <w:vAlign w:val="center"/>
+          </w:tcPr>
+          <w:p>
+            <w:pPr>
+              <w:keepNext w:val="false"/>
+            </w:pPr>
+            <w:r>
+              <w:rPr>
+                <w:sz w:val="19"/>
+                <w:szCs w:val="19"/>
+              </w:rPr>
+              <w:t xml:space="preserve">☑ Concluída</w:t>
+            </w:r>
+          </w:p>
+        </w:tc>
+        <w:tc>
+          <w:tcPr>
+            <w:tcW w:type="dxa" w:w="2218"/>
+            <w:tcBorders>
+              <w:top w:val="single" w:color="B7C3D0" w:sz="4"/>
+              <w:left w:val="single" w:color="B7C3D0" w:sz="4"/>
+              <w:bottom w:val="single" w:color="B7C3D0" w:sz="4"/>
+              <w:right w:val="single" w:color="B7C3D0" w:sz="4"/>
+            </w:tcBorders>
+            <w:tcMar>
+              <w:top w:type="dxa" w:w="60"/>
+              <w:left w:type="dxa" w:w="100"/>
+              <w:bottom w:type="dxa" w:w="60"/>
+              <w:right w:type="dxa" w:w="100"/>
+            </w:tcMar>
+            <w:vAlign w:val="center"/>
+          </w:tcPr>
+          <w:p>
+            <w:pPr>
+              <w:keepNext w:val="false"/>
+            </w:pPr>
+            <w:r>
+              <w:rPr>
+                <w:sz w:val="19"/>
+                <w:szCs w:val="19"/>
+              </w:rPr>
+              <w:t xml:space="preserve">Moldura de latão 9-slice e cursor de mão</w:t>
+            </w:r>
+          </w:p>
+        </w:tc>
+      </w:tr>
+      <w:tr>
+        <w:trPr>
+          <w:cantSplit/>
+        </w:trPr>
+        <w:tc>
+          <w:tcPr>
+            <w:tcW w:type="dxa" w:w="867"/>
+            <w:tcBorders>
+              <w:top w:val="single" w:color="B7C3D0" w:sz="4"/>
+              <w:left w:val="single" w:color="B7C3D0" w:sz="4"/>
+              <w:bottom w:val="single" w:color="B7C3D0" w:sz="4"/>
+              <w:right w:val="single" w:color="B7C3D0" w:sz="4"/>
+            </w:tcBorders>
+            <w:tcMar>
+              <w:top w:type="dxa" w:w="60"/>
+              <w:left w:type="dxa" w:w="100"/>
+              <w:bottom w:type="dxa" w:w="60"/>
+              <w:right w:type="dxa" w:w="100"/>
+            </w:tcMar>
+            <w:vAlign w:val="center"/>
+          </w:tcPr>
+          <w:p>
+            <w:pPr>
+              <w:keepNext w:val="false"/>
+            </w:pPr>
+            <w:r>
+              <w:rPr>
+                <w:sz w:val="19"/>
+                <w:szCs w:val="19"/>
+              </w:rPr>
+              <w:t xml:space="preserve">A-041</w:t>
+            </w:r>
+          </w:p>
+        </w:tc>
+        <w:tc>
+          <w:tcPr>
+            <w:tcW w:type="dxa" w:w="2891"/>
+            <w:tcBorders>
+              <w:top w:val="single" w:color="B7C3D0" w:sz="4"/>
+              <w:left w:val="single" w:color="B7C3D0" w:sz="4"/>
+              <w:bottom w:val="single" w:color="B7C3D0" w:sz="4"/>
+              <w:right w:val="single" w:color="B7C3D0" w:sz="4"/>
+            </w:tcBorders>
+            <w:tcMar>
+              <w:top w:type="dxa" w:w="60"/>
+              <w:left w:type="dxa" w:w="100"/>
+              <w:bottom w:type="dxa" w:w="60"/>
+              <w:right w:type="dxa" w:w="100"/>
+            </w:tcMar>
+            <w:vAlign w:val="center"/>
+          </w:tcPr>
+          <w:p>
+            <w:pPr>
+              <w:keepNext w:val="false"/>
+            </w:pPr>
+            <w:r>
+              <w:rPr>
+                <w:sz w:val="19"/>
+                <w:szCs w:val="19"/>
+              </w:rPr>
+              <w:t xml:space="preserve">assets/sprites/objects/obj_airship.png, obj_workshop_ruins.png</w:t>
+            </w:r>
+          </w:p>
+        </w:tc>
+        <w:tc>
+          <w:tcPr>
+            <w:tcW w:type="dxa" w:w="1349"/>
+            <w:tcBorders>
+              <w:top w:val="single" w:color="B7C3D0" w:sz="4"/>
+              <w:left w:val="single" w:color="B7C3D0" w:sz="4"/>
+              <w:bottom w:val="single" w:color="B7C3D0" w:sz="4"/>
+              <w:right w:val="single" w:color="B7C3D0" w:sz="4"/>
+            </w:tcBorders>
+            <w:tcMar>
+              <w:top w:type="dxa" w:w="60"/>
+              <w:left w:type="dxa" w:w="100"/>
+              <w:bottom w:type="dxa" w:w="60"/>
+              <w:right w:type="dxa" w:w="100"/>
+            </w:tcMar>
+            <w:vAlign w:val="center"/>
+          </w:tcPr>
+          <w:p>
+            <w:pPr>
+              <w:keepNext w:val="false"/>
+            </w:pPr>
+            <w:r>
+              <w:rPr>
+                <w:sz w:val="19"/>
+                <w:szCs w:val="19"/>
+              </w:rPr>
+              <w:t xml:space="preserve">Sprite</w:t>
+            </w:r>
+          </w:p>
+        </w:tc>
+        <w:tc>
+          <w:tcPr>
+            <w:tcW w:type="dxa" w:w="867"/>
+            <w:tcBorders>
+              <w:top w:val="single" w:color="B7C3D0" w:sz="4"/>
+              <w:left w:val="single" w:color="B7C3D0" w:sz="4"/>
+              <w:bottom w:val="single" w:color="B7C3D0" w:sz="4"/>
+              <w:right w:val="single" w:color="B7C3D0" w:sz="4"/>
+            </w:tcBorders>
+            <w:tcMar>
+              <w:top w:type="dxa" w:w="60"/>
+              <w:left w:type="dxa" w:w="100"/>
+              <w:bottom w:type="dxa" w:w="60"/>
+              <w:right w:type="dxa" w:w="100"/>
+            </w:tcMar>
+            <w:vAlign w:val="center"/>
+          </w:tcPr>
+          <w:p>
+            <w:pPr>
+              <w:keepNext w:val="false"/>
+            </w:pPr>
+            <w:r>
+              <w:rPr>
+                <w:sz w:val="19"/>
+                <w:szCs w:val="19"/>
+              </w:rPr>
+              <w:t xml:space="preserve">F3</w:t>
+            </w:r>
+          </w:p>
+        </w:tc>
+        <w:tc>
+          <w:tcPr>
+            <w:tcW w:type="dxa" w:w="1446"/>
+            <w:tcBorders>
+              <w:top w:val="single" w:color="B7C3D0" w:sz="4"/>
+              <w:left w:val="single" w:color="B7C3D0" w:sz="4"/>
+              <w:bottom w:val="single" w:color="B7C3D0" w:sz="4"/>
+              <w:right w:val="single" w:color="B7C3D0" w:sz="4"/>
+            </w:tcBorders>
+            <w:tcMar>
+              <w:top w:type="dxa" w:w="60"/>
+              <w:left w:type="dxa" w:w="100"/>
+              <w:bottom w:type="dxa" w:w="60"/>
+              <w:right w:type="dxa" w:w="100"/>
+            </w:tcMar>
+            <w:vAlign w:val="center"/>
+          </w:tcPr>
+          <w:p>
+            <w:pPr>
+              <w:keepNext w:val="false"/>
+            </w:pPr>
+            <w:r>
+              <w:rPr>
+                <w:sz w:val="19"/>
+                <w:szCs w:val="19"/>
+              </w:rPr>
+              <w:t xml:space="preserve">☑ Concluída</w:t>
+            </w:r>
+          </w:p>
+        </w:tc>
+        <w:tc>
+          <w:tcPr>
+            <w:tcW w:type="dxa" w:w="2218"/>
+            <w:tcBorders>
+              <w:top w:val="single" w:color="B7C3D0" w:sz="4"/>
+              <w:left w:val="single" w:color="B7C3D0" w:sz="4"/>
+              <w:bottom w:val="single" w:color="B7C3D0" w:sz="4"/>
+              <w:right w:val="single" w:color="B7C3D0" w:sz="4"/>
+            </w:tcBorders>
+            <w:tcMar>
+              <w:top w:type="dxa" w:w="60"/>
+              <w:left w:type="dxa" w:w="100"/>
+              <w:bottom w:type="dxa" w:w="60"/>
+              <w:right w:type="dxa" w:w="100"/>
+            </w:tcMar>
+            <w:vAlign w:val="center"/>
+          </w:tcPr>
+          <w:p>
+            <w:pPr>
+              <w:keepNext w:val="false"/>
+            </w:pPr>
+            <w:r>
+              <w:rPr>
+                <w:sz w:val="19"/>
+                <w:szCs w:val="19"/>
+              </w:rPr>
+              <w:t xml:space="preserve">Dirigível imperial sobre a praça e ruínas da oficina após a explosão</w:t>
+            </w:r>
+          </w:p>
+        </w:tc>
+      </w:tr>
+      <w:tr>
+        <w:trPr>
+          <w:cantSplit/>
+        </w:trPr>
+        <w:tc>
+          <w:tcPr>
+            <w:tcW w:type="dxa" w:w="867"/>
+            <w:tcBorders>
+              <w:top w:val="single" w:color="B7C3D0" w:sz="4"/>
+              <w:left w:val="single" w:color="B7C3D0" w:sz="4"/>
+              <w:bottom w:val="single" w:color="B7C3D0" w:sz="4"/>
+              <w:right w:val="single" w:color="B7C3D0" w:sz="4"/>
+            </w:tcBorders>
+            <w:tcMar>
+              <w:top w:type="dxa" w:w="60"/>
+              <w:left w:type="dxa" w:w="100"/>
+              <w:bottom w:type="dxa" w:w="60"/>
+              <w:right w:type="dxa" w:w="100"/>
+            </w:tcMar>
+            <w:vAlign w:val="center"/>
+          </w:tcPr>
+          <w:p>
+            <w:pPr>
+              <w:keepNext w:val="false"/>
+            </w:pPr>
+            <w:r>
+              <w:rPr>
+                <w:sz w:val="19"/>
+                <w:szCs w:val="19"/>
+              </w:rPr>
+              <w:t xml:space="preserve">A-042</w:t>
+            </w:r>
+          </w:p>
+        </w:tc>
+        <w:tc>
+          <w:tcPr>
+            <w:tcW w:type="dxa" w:w="2891"/>
+            <w:tcBorders>
+              <w:top w:val="single" w:color="B7C3D0" w:sz="4"/>
+              <w:left w:val="single" w:color="B7C3D0" w:sz="4"/>
+              <w:bottom w:val="single" w:color="B7C3D0" w:sz="4"/>
+              <w:right w:val="single" w:color="B7C3D0" w:sz="4"/>
+            </w:tcBorders>
+            <w:tcMar>
+              <w:top w:type="dxa" w:w="60"/>
+              <w:left w:type="dxa" w:w="100"/>
+              <w:bottom w:type="dxa" w:w="60"/>
+              <w:right w:type="dxa" w:w="100"/>
+            </w:tcMar>
+            <w:vAlign w:val="center"/>
+          </w:tcPr>
+          <w:p>
+            <w:pPr>
+              <w:keepNext w:val="false"/>
+            </w:pPr>
+            <w:r>
+              <w:rPr>
+                <w:sz w:val="19"/>
+                <w:szCs w:val="19"/>
+              </w:rPr>
+              <w:t xml:space="preserve">sprites de mapa (Kael, Gerd, Eco, moradores, soldados, Voss)</w:t>
+            </w:r>
+          </w:p>
+        </w:tc>
+        <w:tc>
+          <w:tcPr>
+            <w:tcW w:type="dxa" w:w="1349"/>
+            <w:tcBorders>
+              <w:top w:val="single" w:color="B7C3D0" w:sz="4"/>
+              <w:left w:val="single" w:color="B7C3D0" w:sz="4"/>
+              <w:bottom w:val="single" w:color="B7C3D0" w:sz="4"/>
+              <w:right w:val="single" w:color="B7C3D0" w:sz="4"/>
+            </w:tcBorders>
+            <w:tcMar>
+              <w:top w:type="dxa" w:w="60"/>
+              <w:left w:type="dxa" w:w="100"/>
+              <w:bottom w:type="dxa" w:w="60"/>
+              <w:right w:type="dxa" w:w="100"/>
+            </w:tcMar>
+            <w:vAlign w:val="center"/>
+          </w:tcPr>
+          <w:p>
+            <w:pPr>
+              <w:keepNext w:val="false"/>
+            </w:pPr>
+            <w:r>
+              <w:rPr>
+                <w:sz w:val="19"/>
+                <w:szCs w:val="19"/>
+              </w:rPr>
+              <w:t xml:space="preserve">Sprite</w:t>
+            </w:r>
+          </w:p>
+        </w:tc>
+        <w:tc>
+          <w:tcPr>
+            <w:tcW w:type="dxa" w:w="867"/>
+            <w:tcBorders>
+              <w:top w:val="single" w:color="B7C3D0" w:sz="4"/>
+              <w:left w:val="single" w:color="B7C3D0" w:sz="4"/>
+              <w:bottom w:val="single" w:color="B7C3D0" w:sz="4"/>
+              <w:right w:val="single" w:color="B7C3D0" w:sz="4"/>
+            </w:tcBorders>
+            <w:tcMar>
+              <w:top w:type="dxa" w:w="60"/>
+              <w:left w:type="dxa" w:w="100"/>
+              <w:bottom w:type="dxa" w:w="60"/>
+              <w:right w:type="dxa" w:w="100"/>
+            </w:tcMar>
+            <w:vAlign w:val="center"/>
+          </w:tcPr>
+          <w:p>
+            <w:pPr>
+              <w:keepNext w:val="false"/>
+            </w:pPr>
+            <w:r>
+              <w:rPr>
+                <w:sz w:val="19"/>
+                <w:szCs w:val="19"/>
+              </w:rPr>
+              <w:t xml:space="preserve">F3</w:t>
+            </w:r>
+          </w:p>
+        </w:tc>
+        <w:tc>
+          <w:tcPr>
+            <w:tcW w:type="dxa" w:w="1446"/>
+            <w:tcBorders>
+              <w:top w:val="single" w:color="B7C3D0" w:sz="4"/>
+              <w:left w:val="single" w:color="B7C3D0" w:sz="4"/>
+              <w:bottom w:val="single" w:color="B7C3D0" w:sz="4"/>
+              <w:right w:val="single" w:color="B7C3D0" w:sz="4"/>
+            </w:tcBorders>
+            <w:tcMar>
+              <w:top w:type="dxa" w:w="60"/>
+              <w:left w:type="dxa" w:w="100"/>
+              <w:bottom w:type="dxa" w:w="60"/>
+              <w:right w:type="dxa" w:w="100"/>
+            </w:tcMar>
+            <w:vAlign w:val="center"/>
+          </w:tcPr>
+          <w:p>
+            <w:pPr>
+              <w:keepNext w:val="false"/>
+            </w:pPr>
+            <w:r>
+              <w:rPr>
+                <w:sz w:val="19"/>
+                <w:szCs w:val="19"/>
+              </w:rPr>
+              <w:t xml:space="preserve">☑ Concluída</w:t>
+            </w:r>
+          </w:p>
+        </w:tc>
+        <w:tc>
+          <w:tcPr>
+            <w:tcW w:type="dxa" w:w="2218"/>
+            <w:tcBorders>
+              <w:top w:val="single" w:color="B7C3D0" w:sz="4"/>
+              <w:left w:val="single" w:color="B7C3D0" w:sz="4"/>
+              <w:bottom w:val="single" w:color="B7C3D0" w:sz="4"/>
+              <w:right w:val="single" w:color="B7C3D0" w:sz="4"/>
+            </w:tcBorders>
+            <w:tcMar>
+              <w:top w:type="dxa" w:w="60"/>
+              <w:left w:type="dxa" w:w="100"/>
+              <w:bottom w:type="dxa" w:w="60"/>
+              <w:right w:type="dxa" w:w="100"/>
+            </w:tcMar>
+            <w:vAlign w:val="center"/>
+          </w:tcPr>
+          <w:p>
+            <w:pPr>
+              <w:keepNext w:val="false"/>
+            </w:pPr>
+            <w:r>
+              <w:rPr>
+                <w:sz w:val="19"/>
+                <w:szCs w:val="19"/>
+              </w:rPr>
+              <w:t xml:space="preserve">Reconvertidos a 78% (Kael 44 px) para combinar com os objetos de cenário em 2×; portas das fachadas em 2×</w:t>
+            </w:r>
+          </w:p>
+        </w:tc>
+      </w:tr>
     </w:tbl>
     <w:p>
       <w:pPr>
@@ -39229,6 +40154,196 @@
           </w:tcPr>
           <w:p>
             <w:pPr>
+              <w:keepNext/>
+            </w:pPr>
+            <w:r>
+              <w:rPr>
+                <w:sz w:val="19"/>
+                <w:szCs w:val="19"/>
+              </w:rPr>
+              <w:t xml:space="preserve">2.2</w:t>
+            </w:r>
+          </w:p>
+        </w:tc>
+        <w:tc>
+          <w:tcPr>
+            <w:tcW w:type="dxa" w:w="1735"/>
+            <w:tcBorders>
+              <w:top w:val="single" w:color="B7C3D0" w:sz="4"/>
+              <w:left w:val="single" w:color="B7C3D0" w:sz="4"/>
+              <w:bottom w:val="single" w:color="B7C3D0" w:sz="4"/>
+              <w:right w:val="single" w:color="B7C3D0" w:sz="4"/>
+            </w:tcBorders>
+            <w:tcMar>
+              <w:top w:type="dxa" w:w="60"/>
+              <w:left w:type="dxa" w:w="100"/>
+              <w:bottom w:type="dxa" w:w="60"/>
+              <w:right w:type="dxa" w:w="100"/>
+            </w:tcMar>
+            <w:vAlign w:val="center"/>
+          </w:tcPr>
+          <w:p>
+            <w:pPr>
+              <w:keepNext/>
+            </w:pPr>
+            <w:r>
+              <w:rPr>
+                <w:sz w:val="19"/>
+                <w:szCs w:val="19"/>
+              </w:rPr>
+              <w:t xml:space="preserve">24/09/2026</w:t>
+            </w:r>
+          </w:p>
+        </w:tc>
+        <w:tc>
+          <w:tcPr>
+            <w:tcW w:type="dxa" w:w="6746"/>
+            <w:tcBorders>
+              <w:top w:val="single" w:color="B7C3D0" w:sz="4"/>
+              <w:left w:val="single" w:color="B7C3D0" w:sz="4"/>
+              <w:bottom w:val="single" w:color="B7C3D0" w:sz="4"/>
+              <w:right w:val="single" w:color="B7C3D0" w:sz="4"/>
+            </w:tcBorders>
+            <w:tcMar>
+              <w:top w:type="dxa" w:w="60"/>
+              <w:left w:type="dxa" w:w="100"/>
+              <w:bottom w:type="dxa" w:w="60"/>
+              <w:right w:type="dxa" w:w="100"/>
+            </w:tcMar>
+            <w:vAlign w:val="center"/>
+          </w:tcPr>
+          <w:p>
+            <w:pPr>
+              <w:keepNext/>
+            </w:pPr>
+            <w:r>
+              <w:rPr>
+                <w:sz w:val="19"/>
+                <w:szCs w:val="19"/>
+              </w:rPr>
+              <w:t xml:space="preserve">Prólogo jogável do início ao fim: 10 mapas (vila, 3 interiores, estrada, ferro-velho em 3 áreas, câmara), 12 cutscenes, Gerd convidado, Eco, chefe em partes, corvo ladrão, luta roteirizada com Voss, missões do gato e das molas, cena de fim de capítulo. Novos sistemas: objetos de mapa (baú, alavanca, bloco, ponto de salvamento), portões por flag, tint noturno. 4 músicas novas (171 testes).</w:t>
+            </w:r>
+          </w:p>
+        </w:tc>
+      </w:tr>
+      <w:tr>
+        <w:trPr>
+          <w:cantSplit/>
+        </w:trPr>
+        <w:tc>
+          <w:tcPr>
+            <w:tcW w:type="dxa" w:w="1157"/>
+            <w:tcBorders>
+              <w:top w:val="single" w:color="B7C3D0" w:sz="4"/>
+              <w:left w:val="single" w:color="B7C3D0" w:sz="4"/>
+              <w:bottom w:val="single" w:color="B7C3D0" w:sz="4"/>
+              <w:right w:val="single" w:color="B7C3D0" w:sz="4"/>
+            </w:tcBorders>
+            <w:tcMar>
+              <w:top w:type="dxa" w:w="60"/>
+              <w:left w:type="dxa" w:w="100"/>
+              <w:bottom w:type="dxa" w:w="60"/>
+              <w:right w:type="dxa" w:w="100"/>
+            </w:tcMar>
+            <w:vAlign w:val="center"/>
+          </w:tcPr>
+          <w:p>
+            <w:pPr>
+              <w:keepNext/>
+            </w:pPr>
+            <w:r>
+              <w:rPr>
+                <w:sz w:val="19"/>
+                <w:szCs w:val="19"/>
+              </w:rPr>
+              <w:t xml:space="preserve">2.3</w:t>
+            </w:r>
+          </w:p>
+        </w:tc>
+        <w:tc>
+          <w:tcPr>
+            <w:tcW w:type="dxa" w:w="1735"/>
+            <w:tcBorders>
+              <w:top w:val="single" w:color="B7C3D0" w:sz="4"/>
+              <w:left w:val="single" w:color="B7C3D0" w:sz="4"/>
+              <w:bottom w:val="single" w:color="B7C3D0" w:sz="4"/>
+              <w:right w:val="single" w:color="B7C3D0" w:sz="4"/>
+            </w:tcBorders>
+            <w:tcMar>
+              <w:top w:type="dxa" w:w="60"/>
+              <w:left w:type="dxa" w:w="100"/>
+              <w:bottom w:type="dxa" w:w="60"/>
+              <w:right w:type="dxa" w:w="100"/>
+            </w:tcMar>
+            <w:vAlign w:val="center"/>
+          </w:tcPr>
+          <w:p>
+            <w:pPr>
+              <w:keepNext/>
+            </w:pPr>
+            <w:r>
+              <w:rPr>
+                <w:sz w:val="19"/>
+                <w:szCs w:val="19"/>
+              </w:rPr>
+              <w:t xml:space="preserve">24/09/2026</w:t>
+            </w:r>
+          </w:p>
+        </w:tc>
+        <w:tc>
+          <w:tcPr>
+            <w:tcW w:type="dxa" w:w="6746"/>
+            <w:tcBorders>
+              <w:top w:val="single" w:color="B7C3D0" w:sz="4"/>
+              <w:left w:val="single" w:color="B7C3D0" w:sz="4"/>
+              <w:bottom w:val="single" w:color="B7C3D0" w:sz="4"/>
+              <w:right w:val="single" w:color="B7C3D0" w:sz="4"/>
+            </w:tcBorders>
+            <w:tcMar>
+              <w:top w:type="dxa" w:w="60"/>
+              <w:left w:type="dxa" w:w="100"/>
+              <w:bottom w:type="dxa" w:w="60"/>
+              <w:right w:type="dxa" w:w="100"/>
+            </w:tcMar>
+            <w:vAlign w:val="center"/>
+          </w:tcPr>
+          <w:p>
+            <w:pPr>
+              <w:keepNext/>
+            </w:pPr>
+            <w:r>
+              <w:rPr>
+                <w:sz w:val="19"/>
+                <w:szCs w:val="19"/>
+              </w:rPr>
+              <w:t xml:space="preserve">Escolhas do Diretor aplicadas (músicas, SFX de banco CC0, fonte). Poses de batalha de Kael, Eco e Gerd; efeitos visuais; moldura e cursor de latão; dirigível e ruínas. Correções do playtest: retorno do uso de itens no menu, saída da câmara do Eco, fonte dos diálogos (172 testes).</w:t>
+            </w:r>
+          </w:p>
+        </w:tc>
+      </w:tr>
+      <w:tr>
+        <w:trPr>
+          <w:cantSplit/>
+        </w:trPr>
+        <w:tc>
+          <w:tcPr>
+            <w:tcW w:type="dxa" w:w="1157"/>
+            <w:tcBorders>
+              <w:top w:val="single" w:color="B7C3D0" w:sz="4"/>
+              <w:left w:val="single" w:color="B7C3D0" w:sz="4"/>
+              <w:bottom w:val="single" w:color="B7C3D0" w:sz="4"/>
+              <w:right w:val="single" w:color="B7C3D0" w:sz="4"/>
+            </w:tcBorders>
+            <w:tcMar>
+              <w:top w:type="dxa" w:w="60"/>
+              <w:left w:type="dxa" w:w="100"/>
+              <w:bottom w:type="dxa" w:w="60"/>
+              <w:right w:type="dxa" w:w="100"/>
+            </w:tcMar>
+            <w:vAlign w:val="center"/>
+          </w:tcPr>
+          <w:p>
+            <w:pPr>
               <w:keepNext w:val="false"/>
             </w:pPr>
             <w:r>
@@ -39236,7 +40351,7 @@
                 <w:sz w:val="19"/>
                 <w:szCs w:val="19"/>
               </w:rPr>
-              <w:t xml:space="preserve">2.2</w:t>
+              <w:t xml:space="preserve">2.4</w:t>
             </w:r>
           </w:p>
         </w:tc>
@@ -39296,7 +40411,7 @@
                 <w:sz w:val="19"/>
                 <w:szCs w:val="19"/>
               </w:rPr>
-              <w:t xml:space="preserve">Prólogo jogável do início ao fim: 10 mapas (vila, 3 interiores, estrada, ferro-velho em 3 áreas, câmara), 12 cutscenes, Gerd convidado, Eco, chefe em partes, corvo ladrão, luta roteirizada com Voss, missões do gato e das molas, cena de fim de capítulo. Novos sistemas: objetos de mapa (baú, alavanca, bloco, ponto de salvamento), portões por flag, tint noturno. 4 músicas novas (171 testes).</w:t>
+              <w:t xml:space="preserve">Pedido do Diretor após o teste: objetos de cenário e interativos (baús, caldeira de salvar, cama, alavanca, caixas, lampiões, árvores, máquinas) em 2×; personagens do mapa a 78%; portas das casas em 2× (173 testes).</w:t>
             </w:r>
           </w:p>
         </w:tc>
@@ -39325,7 +40440,7 @@
         <w:spacing w:after="60"/>
       </w:pPr>
       <w:r>
-        <w:t xml:space="preserve">Diretor: jogar o prólogo (Novo jogo) e avaliar ritmo, dificuldade, mapas e as 4 músicas novas (A/B).</w:t>
+        <w:t xml:space="preserve">Diretor: jogar de novo o prólogo (fonte nova, poses, efeitos, sons) e dar o aval do vertical slice.</w:t>
       </w:r>
     </w:p>
     <w:p>
@@ -39338,7 +40453,7 @@
         <w:spacing w:after="60"/>
       </w:pPr>
       <w:r>
-        <w:t xml:space="preserve">Claude: poses de batalha dedicadas, UI final, efeitos visuais, SFX, balanceamento com o feedback do Diretor; depois playtest externo.</w:t>
+        <w:t xml:space="preserve">Playtest externo (2–3 pessoas) e ajustes finais de balanceamento; depois revisar o escopo do jogo completo.</w:t>
       </w:r>
     </w:p>
     <w:sectPr>

</xml_diff>

<commit_message>
Phase 3 closed (vertical slice approved after external playtest); planning v3.0; CLAUDE.md status points to Phase 4 / Act 1
Co-Authored-By: Claude Opus 5.5 <noreply@anthropic.com>
</commit_message>
<xml_diff>
--- a/docs/Planejamento_Projeto_RPG.docx
+++ b/docs/Planejamento_Projeto_RPG.docx
@@ -233,7 +233,7 @@
                 <w:sz w:val="19"/>
                 <w:szCs w:val="19"/>
               </w:rPr>
-              <w:t xml:space="preserve">2.4 — Fase 3: escala de objetos e personagens ajustada pelo Diretor</w:t>
+              <w:t xml:space="preserve">3.0 — Fase 3 concluída; início da Fase 4</w:t>
             </w:r>
           </w:p>
         </w:tc>
@@ -623,7 +623,7 @@
                 <w:sz w:val="19"/>
                 <w:szCs w:val="19"/>
               </w:rPr>
-              <w:t xml:space="preserve">Fase 3 — Vertical slice</w:t>
+              <w:t xml:space="preserve">Fase 4 — Produção de conteúdo (início: Ato 1)</w:t>
             </w:r>
           </w:p>
         </w:tc>
@@ -688,7 +688,7 @@
                 <w:sz w:val="19"/>
                 <w:szCs w:val="19"/>
               </w:rPr>
-              <w:t xml:space="preserve">Fases 0, 1 e 2 concluídas (24–25/09/2026)</w:t>
+              <w:t xml:space="preserve">Fases 0 a 3 concluídas (24–25/09/2026); vertical slice (prólogo) aprovado</w:t>
             </w:r>
           </w:p>
         </w:tc>
@@ -23572,7 +23572,7 @@
                 <w:sz w:val="19"/>
                 <w:szCs w:val="19"/>
               </w:rPr>
-              <w:t xml:space="preserve">☐ Pendente</w:t>
+              <w:t xml:space="preserve">☑ Concluída</w:t>
             </w:r>
           </w:p>
         </w:tc>
@@ -23597,6 +23597,13 @@
             <w:pPr>
               <w:keepNext/>
             </w:pPr>
+            <w:r>
+              <w:rPr>
+                <w:sz w:val="19"/>
+                <w:szCs w:val="19"/>
+              </w:rPr>
+              <w:t xml:space="preserve">Simulação de 300 lutas por encontro (tools/sim_prologue.gd) + ajustes do playtest</w:t>
+            </w:r>
           </w:p>
         </w:tc>
       </w:tr>
@@ -23720,7 +23727,7 @@
                 <w:sz w:val="19"/>
                 <w:szCs w:val="19"/>
               </w:rPr>
-              <w:t xml:space="preserve">☐ Pendente</w:t>
+              <w:t xml:space="preserve">☑ Concluída</w:t>
             </w:r>
           </w:p>
         </w:tc>
@@ -23745,6 +23752,13 @@
             <w:pPr>
               <w:keepNext w:val="false"/>
             </w:pPr>
+            <w:r>
+              <w:rPr>
+                <w:sz w:val="19"/>
+                <w:szCs w:val="19"/>
+              </w:rPr>
+              <w:t xml:space="preserve">Feito; ajustes aplicados (poção, saída da câmara, fonte, escala de objetos/personagens, portas)</w:t>
+            </w:r>
           </w:p>
         </w:tc>
       </w:tr>
@@ -40344,6 +40358,101 @@
           </w:tcPr>
           <w:p>
             <w:pPr>
+              <w:keepNext/>
+            </w:pPr>
+            <w:r>
+              <w:rPr>
+                <w:sz w:val="19"/>
+                <w:szCs w:val="19"/>
+              </w:rPr>
+              <w:t xml:space="preserve">3.0</w:t>
+            </w:r>
+          </w:p>
+        </w:tc>
+        <w:tc>
+          <w:tcPr>
+            <w:tcW w:type="dxa" w:w="1735"/>
+            <w:tcBorders>
+              <w:top w:val="single" w:color="B7C3D0" w:sz="4"/>
+              <w:left w:val="single" w:color="B7C3D0" w:sz="4"/>
+              <w:bottom w:val="single" w:color="B7C3D0" w:sz="4"/>
+              <w:right w:val="single" w:color="B7C3D0" w:sz="4"/>
+            </w:tcBorders>
+            <w:tcMar>
+              <w:top w:type="dxa" w:w="60"/>
+              <w:left w:type="dxa" w:w="100"/>
+              <w:bottom w:type="dxa" w:w="60"/>
+              <w:right w:type="dxa" w:w="100"/>
+            </w:tcMar>
+            <w:vAlign w:val="center"/>
+          </w:tcPr>
+          <w:p>
+            <w:pPr>
+              <w:keepNext/>
+            </w:pPr>
+            <w:r>
+              <w:rPr>
+                <w:sz w:val="19"/>
+                <w:szCs w:val="19"/>
+              </w:rPr>
+              <w:t xml:space="preserve">24/09/2026</w:t>
+            </w:r>
+          </w:p>
+        </w:tc>
+        <w:tc>
+          <w:tcPr>
+            <w:tcW w:type="dxa" w:w="6746"/>
+            <w:tcBorders>
+              <w:top w:val="single" w:color="B7C3D0" w:sz="4"/>
+              <w:left w:val="single" w:color="B7C3D0" w:sz="4"/>
+              <w:bottom w:val="single" w:color="B7C3D0" w:sz="4"/>
+              <w:right w:val="single" w:color="B7C3D0" w:sz="4"/>
+            </w:tcBorders>
+            <w:tcMar>
+              <w:top w:type="dxa" w:w="60"/>
+              <w:left w:type="dxa" w:w="100"/>
+              <w:bottom w:type="dxa" w:w="60"/>
+              <w:right w:type="dxa" w:w="100"/>
+            </w:tcMar>
+            <w:vAlign w:val="center"/>
+          </w:tcPr>
+          <w:p>
+            <w:pPr>
+              <w:keepNext/>
+            </w:pPr>
+            <w:r>
+              <w:rPr>
+                <w:sz w:val="19"/>
+                <w:szCs w:val="19"/>
+              </w:rPr>
+              <w:t xml:space="preserve">Fase 3 concluída e aprovada pelo Diretor após o playtest externo. Próximo: Fase 4, começando pelo Ato 1 (Floresta de Sylvaran, entrada da Lyra).</w:t>
+            </w:r>
+          </w:p>
+        </w:tc>
+      </w:tr>
+      <w:tr>
+        <w:trPr>
+          <w:cantSplit/>
+        </w:trPr>
+        <w:tc>
+          <w:tcPr>
+            <w:tcW w:type="dxa" w:w="1157"/>
+            <w:tcBorders>
+              <w:top w:val="single" w:color="B7C3D0" w:sz="4"/>
+              <w:left w:val="single" w:color="B7C3D0" w:sz="4"/>
+              <w:bottom w:val="single" w:color="B7C3D0" w:sz="4"/>
+              <w:right w:val="single" w:color="B7C3D0" w:sz="4"/>
+            </w:tcBorders>
+            <w:tcMar>
+              <w:top w:type="dxa" w:w="60"/>
+              <w:left w:type="dxa" w:w="100"/>
+              <w:bottom w:type="dxa" w:w="60"/>
+              <w:right w:type="dxa" w:w="100"/>
+            </w:tcMar>
+            <w:vAlign w:val="center"/>
+          </w:tcPr>
+          <w:p>
+            <w:pPr>
               <w:keepNext w:val="false"/>
             </w:pPr>
             <w:r>
@@ -40440,7 +40549,7 @@
         <w:spacing w:after="60"/>
       </w:pPr>
       <w:r>
-        <w:t xml:space="preserve">Diretor: jogar de novo o prólogo (fonte nova, poses, efeitos, sons) e dar o aval do vertical slice.</w:t>
+        <w:t xml:space="preserve">Fase 4 — Ato 1: roteiro detalhado do Ato 1 (como o Roteiro do Prólogo), para aprovação do Diretor.</w:t>
       </w:r>
     </w:p>
     <w:p>
@@ -40453,7 +40562,7 @@
         <w:spacing w:after="60"/>
       </w:pPr>
       <w:r>
-        <w:t xml:space="preserve">Playtest externo (2–3 pessoas) e ajustes finais de balanceamento; depois revisar o escopo do jogo completo.</w:t>
+        <w:t xml:space="preserve">Depois: Floresta de Sylvaran (tileset, mapas, inimigos, chefe), entrada da Lyra, e em seguida Cinzamar/Brann, Porto Névoa/Mira, Catedral de Lumen/Selene e a Grande Bomba.</w:t>
       </w:r>
     </w:p>
     <w:sectPr>

</xml_diff>